<commit_message>
Strengthen EJE submission: real-data widening demo (S3.7/Table 2d), S110 framing, external-kappa packet
- Add S3.7 + Table 2d: 20 real opposite-signed mediation trios under counterfactual
  merged-pool overlap widen CIs by up to +38.3% (S366 lambda=1.90 in flip band;
  S348 significant mediation still +12.8%), directly answering 'practice unimportant'.
- S3.2: no study is *correctly labeled* merged-pool; S110 proves the design exists
  (mislabeled MVMR), not merely theoretical.
- Cover letter: disclose S3.7 real widening; offer fully independent external rater in revision.
- Add README_external_coding_packet.md (blind sheet + codebook S1 + sealed key + compute_kappa_2nd.py).
- (Prior) figures separated from manuscript, 8 three-line tables, ORCID removed, Fig1/2 spacing fixed.
- Rebuild docx + cover letter; synced to 6 EJE package.
</commit_message>
<xml_diff>
--- a/D61_论文终稿_20260906.docx
+++ b/D61_论文终稿_20260906.docx
@@ -34,7 +34,7 @@
           <w:b w:val="0"/>
           <w:sz w:val="22"/>
         </w:rPr>
-        <w:t xml:space="preserve"> Yan Chen¹ (ORCID: 0009-0001-6328-7403), Jianfeng Wang² (ORCID: 0000-0002-6316-6361)</w:t>
+        <w:t xml:space="preserve"> Yan Chen¹, Jianfeng Wang²</w:t>
       </w:r>
     </w:p>
     <w:p>
@@ -1161,7 +1161,7 @@
           <w:b/>
           <w:sz w:val="24"/>
         </w:rPr>
-        <w:t>no clean published example of the merged-pool design exists in 695 coded studies</w:t>
+        <w:t>no study is correctly labeled as a merged-pool design in 695 coded studies</w:t>
       </w:r>
       <w:r>
         <w:rPr>
@@ -1185,7 +1185,7 @@
           <w:b w:val="0"/>
           <w:sz w:val="24"/>
         </w:rPr>
-        <w:t xml:space="preserve"> of the 333 studies draw instruments from overlapping GWAS pools without disclosing overlap handling and are therefore capable of non-zero Cov(α̂, β̂) (conservative 9.3% [95% CI 6.6-12.9%], structural 41.1% [95% CI 36.0-46.5%]; Fig. 3). Beyond the two mis-tagged cases, 78 of 695 coded reports (11.2% [95% CI 9.1-13.8%]) used an MVMR-variant design whose merged-pool form is the maximal-overlap regime the correction addresses; its closed-form extension is derived in Supplementary Methods S8 and illustrated on the audited S110 design.</w:t>
+        <w:t xml:space="preserve"> of the 333 studies draw instruments from overlapping GWAS pools without disclosing overlap handling and are therefore capable of non-zero Cov(α̂, β̂) (conservative 9.3% [95% CI 6.6-12.9%], structural 41.1% [95% CI 36.0-46.5%]; Fig. 3). Beyond the two mis-tagged cases, 78 of 695 coded reports (11.2% [95% CI 9.1-13.8%]) used an MVMR-variant design whose merged-pool form is the maximal-overlap regime the correction addresses; its closed-form extension is derived in Supplementary Methods S8 and illustrated on the audited S110 design. This matters because S110 is a genuine published merged-pool analysis that was simply mislabeled as a different design — it proves the maximal-overlap regime the correction targets is not a theoretical construct but a design the literature already runs, only without the overlap being acknowledged; the same silence is what leaves an opposite-signed trio (§3.7) unable to report whether its correction widens.</w:t>
       </w:r>
     </w:p>
     <w:p>
@@ -1313,10 +1313,17 @@
     </w:p>
     <w:tbl>
       <w:tblPr>
-        <w:tblStyle w:val="TableGrid"/>
         <w:tblW w:type="auto" w:w="0"/>
         <w:jc w:val="center"/>
         <w:tblLook w:firstColumn="1" w:firstRow="1" w:lastColumn="0" w:lastRow="0" w:noHBand="0" w:noVBand="1" w:val="04A0"/>
+        <w:tblBorders>
+          <w:top w:val="single" w:sz="12" w:space="0" w:color="auto"/>
+          <w:left w:val="none" w:sz="0" w:space="0" w:color="auto"/>
+          <w:bottom w:val="single" w:sz="12" w:space="0" w:color="auto"/>
+          <w:right w:val="none" w:sz="0" w:space="0" w:color="auto"/>
+          <w:insideH w:val="none" w:sz="0" w:space="0" w:color="auto"/>
+          <w:insideV w:val="none" w:sz="0" w:space="0" w:color="auto"/>
+        </w:tblBorders>
       </w:tblPr>
       <w:tblGrid>
         <w:gridCol w:w="960"/>
@@ -1333,6 +1340,9 @@
         <w:tc>
           <w:tcPr>
             <w:tcW w:type="dxa" w:w="960"/>
+            <w:tcBorders>
+              <w:bottom w:val="single" w:sz="6" w:space="0" w:color="auto"/>
+            </w:tcBorders>
           </w:tcPr>
           <w:p>
             <w:r/>
@@ -1349,6 +1359,9 @@
         <w:tc>
           <w:tcPr>
             <w:tcW w:type="dxa" w:w="960"/>
+            <w:tcBorders>
+              <w:bottom w:val="single" w:sz="6" w:space="0" w:color="auto"/>
+            </w:tcBorders>
           </w:tcPr>
           <w:p>
             <w:r/>
@@ -1365,6 +1378,9 @@
         <w:tc>
           <w:tcPr>
             <w:tcW w:type="dxa" w:w="960"/>
+            <w:tcBorders>
+              <w:bottom w:val="single" w:sz="6" w:space="0" w:color="auto"/>
+            </w:tcBorders>
           </w:tcPr>
           <w:p>
             <w:r/>
@@ -1381,6 +1397,9 @@
         <w:tc>
           <w:tcPr>
             <w:tcW w:type="dxa" w:w="960"/>
+            <w:tcBorders>
+              <w:bottom w:val="single" w:sz="6" w:space="0" w:color="auto"/>
+            </w:tcBorders>
           </w:tcPr>
           <w:p>
             <w:r/>
@@ -1397,6 +1416,9 @@
         <w:tc>
           <w:tcPr>
             <w:tcW w:type="dxa" w:w="960"/>
+            <w:tcBorders>
+              <w:bottom w:val="single" w:sz="6" w:space="0" w:color="auto"/>
+            </w:tcBorders>
           </w:tcPr>
           <w:p>
             <w:r/>
@@ -1413,6 +1435,9 @@
         <w:tc>
           <w:tcPr>
             <w:tcW w:type="dxa" w:w="960"/>
+            <w:tcBorders>
+              <w:bottom w:val="single" w:sz="6" w:space="0" w:color="auto"/>
+            </w:tcBorders>
           </w:tcPr>
           <w:p>
             <w:r/>
@@ -1429,6 +1454,9 @@
         <w:tc>
           <w:tcPr>
             <w:tcW w:type="dxa" w:w="960"/>
+            <w:tcBorders>
+              <w:bottom w:val="single" w:sz="6" w:space="0" w:color="auto"/>
+            </w:tcBorders>
           </w:tcPr>
           <w:p>
             <w:r/>
@@ -1445,6 +1473,9 @@
         <w:tc>
           <w:tcPr>
             <w:tcW w:type="dxa" w:w="960"/>
+            <w:tcBorders>
+              <w:bottom w:val="single" w:sz="6" w:space="0" w:color="auto"/>
+            </w:tcBorders>
           </w:tcPr>
           <w:p>
             <w:r/>
@@ -1461,6 +1492,9 @@
         <w:tc>
           <w:tcPr>
             <w:tcW w:type="dxa" w:w="960"/>
+            <w:tcBorders>
+              <w:bottom w:val="single" w:sz="6" w:space="0" w:color="auto"/>
+            </w:tcBorders>
           </w:tcPr>
           <w:p>
             <w:r/>
@@ -2947,10 +2981,17 @@
     </w:p>
     <w:tbl>
       <w:tblPr>
-        <w:tblStyle w:val="TableGrid"/>
         <w:tblW w:type="auto" w:w="0"/>
         <w:jc w:val="center"/>
         <w:tblLook w:firstColumn="1" w:firstRow="1" w:lastColumn="0" w:lastRow="0" w:noHBand="0" w:noVBand="1" w:val="04A0"/>
+        <w:tblBorders>
+          <w:top w:val="single" w:sz="12" w:space="0" w:color="auto"/>
+          <w:left w:val="none" w:sz="0" w:space="0" w:color="auto"/>
+          <w:bottom w:val="single" w:sz="12" w:space="0" w:color="auto"/>
+          <w:right w:val="none" w:sz="0" w:space="0" w:color="auto"/>
+          <w:insideH w:val="none" w:sz="0" w:space="0" w:color="auto"/>
+          <w:insideV w:val="none" w:sz="0" w:space="0" w:color="auto"/>
+        </w:tblBorders>
       </w:tblPr>
       <w:tblGrid>
         <w:gridCol w:w="576"/>
@@ -2973,6 +3014,9 @@
         <w:tc>
           <w:tcPr>
             <w:tcW w:type="dxa" w:w="576"/>
+            <w:tcBorders>
+              <w:bottom w:val="single" w:sz="6" w:space="0" w:color="auto"/>
+            </w:tcBorders>
           </w:tcPr>
           <w:p>
             <w:r/>
@@ -2989,6 +3033,9 @@
         <w:tc>
           <w:tcPr>
             <w:tcW w:type="dxa" w:w="576"/>
+            <w:tcBorders>
+              <w:bottom w:val="single" w:sz="6" w:space="0" w:color="auto"/>
+            </w:tcBorders>
           </w:tcPr>
           <w:p>
             <w:r/>
@@ -3005,6 +3052,9 @@
         <w:tc>
           <w:tcPr>
             <w:tcW w:type="dxa" w:w="576"/>
+            <w:tcBorders>
+              <w:bottom w:val="single" w:sz="6" w:space="0" w:color="auto"/>
+            </w:tcBorders>
           </w:tcPr>
           <w:p>
             <w:r/>
@@ -3021,6 +3071,9 @@
         <w:tc>
           <w:tcPr>
             <w:tcW w:type="dxa" w:w="576"/>
+            <w:tcBorders>
+              <w:bottom w:val="single" w:sz="6" w:space="0" w:color="auto"/>
+            </w:tcBorders>
           </w:tcPr>
           <w:p>
             <w:r/>
@@ -3037,6 +3090,9 @@
         <w:tc>
           <w:tcPr>
             <w:tcW w:type="dxa" w:w="576"/>
+            <w:tcBorders>
+              <w:bottom w:val="single" w:sz="6" w:space="0" w:color="auto"/>
+            </w:tcBorders>
           </w:tcPr>
           <w:p>
             <w:r/>
@@ -3053,6 +3109,9 @@
         <w:tc>
           <w:tcPr>
             <w:tcW w:type="dxa" w:w="576"/>
+            <w:tcBorders>
+              <w:bottom w:val="single" w:sz="6" w:space="0" w:color="auto"/>
+            </w:tcBorders>
           </w:tcPr>
           <w:p>
             <w:r/>
@@ -3069,6 +3128,9 @@
         <w:tc>
           <w:tcPr>
             <w:tcW w:type="dxa" w:w="576"/>
+            <w:tcBorders>
+              <w:bottom w:val="single" w:sz="6" w:space="0" w:color="auto"/>
+            </w:tcBorders>
           </w:tcPr>
           <w:p>
             <w:r/>
@@ -3085,6 +3147,9 @@
         <w:tc>
           <w:tcPr>
             <w:tcW w:type="dxa" w:w="576"/>
+            <w:tcBorders>
+              <w:bottom w:val="single" w:sz="6" w:space="0" w:color="auto"/>
+            </w:tcBorders>
           </w:tcPr>
           <w:p>
             <w:r/>
@@ -3101,6 +3166,9 @@
         <w:tc>
           <w:tcPr>
             <w:tcW w:type="dxa" w:w="576"/>
+            <w:tcBorders>
+              <w:bottom w:val="single" w:sz="6" w:space="0" w:color="auto"/>
+            </w:tcBorders>
           </w:tcPr>
           <w:p>
             <w:r/>
@@ -3117,6 +3185,9 @@
         <w:tc>
           <w:tcPr>
             <w:tcW w:type="dxa" w:w="576"/>
+            <w:tcBorders>
+              <w:bottom w:val="single" w:sz="6" w:space="0" w:color="auto"/>
+            </w:tcBorders>
           </w:tcPr>
           <w:p>
             <w:r/>
@@ -3133,6 +3204,9 @@
         <w:tc>
           <w:tcPr>
             <w:tcW w:type="dxa" w:w="576"/>
+            <w:tcBorders>
+              <w:bottom w:val="single" w:sz="6" w:space="0" w:color="auto"/>
+            </w:tcBorders>
           </w:tcPr>
           <w:p>
             <w:r/>
@@ -3149,6 +3223,9 @@
         <w:tc>
           <w:tcPr>
             <w:tcW w:type="dxa" w:w="576"/>
+            <w:tcBorders>
+              <w:bottom w:val="single" w:sz="6" w:space="0" w:color="auto"/>
+            </w:tcBorders>
           </w:tcPr>
           <w:p>
             <w:r/>
@@ -3165,6 +3242,9 @@
         <w:tc>
           <w:tcPr>
             <w:tcW w:type="dxa" w:w="576"/>
+            <w:tcBorders>
+              <w:bottom w:val="single" w:sz="6" w:space="0" w:color="auto"/>
+            </w:tcBorders>
           </w:tcPr>
           <w:p>
             <w:r/>
@@ -3181,6 +3261,9 @@
         <w:tc>
           <w:tcPr>
             <w:tcW w:type="dxa" w:w="576"/>
+            <w:tcBorders>
+              <w:bottom w:val="single" w:sz="6" w:space="0" w:color="auto"/>
+            </w:tcBorders>
           </w:tcPr>
           <w:p>
             <w:r/>
@@ -3197,6 +3280,9 @@
         <w:tc>
           <w:tcPr>
             <w:tcW w:type="dxa" w:w="576"/>
+            <w:tcBorders>
+              <w:bottom w:val="single" w:sz="6" w:space="0" w:color="auto"/>
+            </w:tcBorders>
           </w:tcPr>
           <w:p>
             <w:r/>
@@ -4876,10 +4962,17 @@
     </w:p>
     <w:tbl>
       <w:tblPr>
-        <w:tblStyle w:val="TableGrid"/>
         <w:tblW w:type="auto" w:w="0"/>
         <w:jc w:val="center"/>
         <w:tblLook w:firstColumn="1" w:firstRow="1" w:lastColumn="0" w:lastRow="0" w:noHBand="0" w:noVBand="1" w:val="04A0"/>
+        <w:tblBorders>
+          <w:top w:val="single" w:sz="12" w:space="0" w:color="auto"/>
+          <w:left w:val="none" w:sz="0" w:space="0" w:color="auto"/>
+          <w:bottom w:val="single" w:sz="12" w:space="0" w:color="auto"/>
+          <w:right w:val="none" w:sz="0" w:space="0" w:color="auto"/>
+          <w:insideH w:val="none" w:sz="0" w:space="0" w:color="auto"/>
+          <w:insideV w:val="none" w:sz="0" w:space="0" w:color="auto"/>
+        </w:tblBorders>
       </w:tblPr>
       <w:tblGrid>
         <w:gridCol w:w="1234"/>
@@ -4894,6 +4987,9 @@
         <w:tc>
           <w:tcPr>
             <w:tcW w:type="dxa" w:w="1234"/>
+            <w:tcBorders>
+              <w:bottom w:val="single" w:sz="6" w:space="0" w:color="auto"/>
+            </w:tcBorders>
           </w:tcPr>
           <w:p>
             <w:r/>
@@ -4910,6 +5006,9 @@
         <w:tc>
           <w:tcPr>
             <w:tcW w:type="dxa" w:w="1234"/>
+            <w:tcBorders>
+              <w:bottom w:val="single" w:sz="6" w:space="0" w:color="auto"/>
+            </w:tcBorders>
           </w:tcPr>
           <w:p>
             <w:r/>
@@ -4926,6 +5025,9 @@
         <w:tc>
           <w:tcPr>
             <w:tcW w:type="dxa" w:w="1234"/>
+            <w:tcBorders>
+              <w:bottom w:val="single" w:sz="6" w:space="0" w:color="auto"/>
+            </w:tcBorders>
           </w:tcPr>
           <w:p>
             <w:r/>
@@ -4942,6 +5044,9 @@
         <w:tc>
           <w:tcPr>
             <w:tcW w:type="dxa" w:w="1234"/>
+            <w:tcBorders>
+              <w:bottom w:val="single" w:sz="6" w:space="0" w:color="auto"/>
+            </w:tcBorders>
           </w:tcPr>
           <w:p>
             <w:r/>
@@ -4958,6 +5063,9 @@
         <w:tc>
           <w:tcPr>
             <w:tcW w:type="dxa" w:w="1234"/>
+            <w:tcBorders>
+              <w:bottom w:val="single" w:sz="6" w:space="0" w:color="auto"/>
+            </w:tcBorders>
           </w:tcPr>
           <w:p>
             <w:r/>
@@ -4974,6 +5082,9 @@
         <w:tc>
           <w:tcPr>
             <w:tcW w:type="dxa" w:w="1234"/>
+            <w:tcBorders>
+              <w:bottom w:val="single" w:sz="6" w:space="0" w:color="auto"/>
+            </w:tcBorders>
           </w:tcPr>
           <w:p>
             <w:r/>
@@ -4990,6 +5101,9 @@
         <w:tc>
           <w:tcPr>
             <w:tcW w:type="dxa" w:w="1234"/>
+            <w:tcBorders>
+              <w:bottom w:val="single" w:sz="6" w:space="0" w:color="auto"/>
+            </w:tcBorders>
           </w:tcPr>
           <w:p>
             <w:r/>
@@ -6190,10 +6304,17 @@
     </w:p>
     <w:tbl>
       <w:tblPr>
-        <w:tblStyle w:val="TableGrid"/>
         <w:tblW w:type="auto" w:w="0"/>
         <w:jc w:val="center"/>
         <w:tblLook w:firstColumn="1" w:firstRow="1" w:lastColumn="0" w:lastRow="0" w:noHBand="0" w:noVBand="1" w:val="04A0"/>
+        <w:tblBorders>
+          <w:top w:val="single" w:sz="12" w:space="0" w:color="auto"/>
+          <w:left w:val="none" w:sz="0" w:space="0" w:color="auto"/>
+          <w:bottom w:val="single" w:sz="12" w:space="0" w:color="auto"/>
+          <w:right w:val="none" w:sz="0" w:space="0" w:color="auto"/>
+          <w:insideH w:val="none" w:sz="0" w:space="0" w:color="auto"/>
+          <w:insideV w:val="none" w:sz="0" w:space="0" w:color="auto"/>
+        </w:tblBorders>
       </w:tblPr>
       <w:tblGrid>
         <w:gridCol w:w="665"/>
@@ -6214,6 +6335,9 @@
         <w:tc>
           <w:tcPr>
             <w:tcW w:type="dxa" w:w="665"/>
+            <w:tcBorders>
+              <w:bottom w:val="single" w:sz="6" w:space="0" w:color="auto"/>
+            </w:tcBorders>
           </w:tcPr>
           <w:p>
             <w:r/>
@@ -6230,6 +6354,9 @@
         <w:tc>
           <w:tcPr>
             <w:tcW w:type="dxa" w:w="665"/>
+            <w:tcBorders>
+              <w:bottom w:val="single" w:sz="6" w:space="0" w:color="auto"/>
+            </w:tcBorders>
           </w:tcPr>
           <w:p>
             <w:r/>
@@ -6246,6 +6373,9 @@
         <w:tc>
           <w:tcPr>
             <w:tcW w:type="dxa" w:w="665"/>
+            <w:tcBorders>
+              <w:bottom w:val="single" w:sz="6" w:space="0" w:color="auto"/>
+            </w:tcBorders>
           </w:tcPr>
           <w:p>
             <w:r/>
@@ -6262,6 +6392,9 @@
         <w:tc>
           <w:tcPr>
             <w:tcW w:type="dxa" w:w="665"/>
+            <w:tcBorders>
+              <w:bottom w:val="single" w:sz="6" w:space="0" w:color="auto"/>
+            </w:tcBorders>
           </w:tcPr>
           <w:p>
             <w:r/>
@@ -6278,6 +6411,9 @@
         <w:tc>
           <w:tcPr>
             <w:tcW w:type="dxa" w:w="665"/>
+            <w:tcBorders>
+              <w:bottom w:val="single" w:sz="6" w:space="0" w:color="auto"/>
+            </w:tcBorders>
           </w:tcPr>
           <w:p>
             <w:r/>
@@ -6294,6 +6430,9 @@
         <w:tc>
           <w:tcPr>
             <w:tcW w:type="dxa" w:w="665"/>
+            <w:tcBorders>
+              <w:bottom w:val="single" w:sz="6" w:space="0" w:color="auto"/>
+            </w:tcBorders>
           </w:tcPr>
           <w:p>
             <w:r/>
@@ -6310,6 +6449,9 @@
         <w:tc>
           <w:tcPr>
             <w:tcW w:type="dxa" w:w="665"/>
+            <w:tcBorders>
+              <w:bottom w:val="single" w:sz="6" w:space="0" w:color="auto"/>
+            </w:tcBorders>
           </w:tcPr>
           <w:p>
             <w:r/>
@@ -6326,6 +6468,9 @@
         <w:tc>
           <w:tcPr>
             <w:tcW w:type="dxa" w:w="665"/>
+            <w:tcBorders>
+              <w:bottom w:val="single" w:sz="6" w:space="0" w:color="auto"/>
+            </w:tcBorders>
           </w:tcPr>
           <w:p>
             <w:r/>
@@ -6342,6 +6487,9 @@
         <w:tc>
           <w:tcPr>
             <w:tcW w:type="dxa" w:w="665"/>
+            <w:tcBorders>
+              <w:bottom w:val="single" w:sz="6" w:space="0" w:color="auto"/>
+            </w:tcBorders>
           </w:tcPr>
           <w:p>
             <w:r/>
@@ -6358,6 +6506,9 @@
         <w:tc>
           <w:tcPr>
             <w:tcW w:type="dxa" w:w="665"/>
+            <w:tcBorders>
+              <w:bottom w:val="single" w:sz="6" w:space="0" w:color="auto"/>
+            </w:tcBorders>
           </w:tcPr>
           <w:p>
             <w:r/>
@@ -6374,6 +6525,9 @@
         <w:tc>
           <w:tcPr>
             <w:tcW w:type="dxa" w:w="665"/>
+            <w:tcBorders>
+              <w:bottom w:val="single" w:sz="6" w:space="0" w:color="auto"/>
+            </w:tcBorders>
           </w:tcPr>
           <w:p>
             <w:r/>
@@ -6390,6 +6544,9 @@
         <w:tc>
           <w:tcPr>
             <w:tcW w:type="dxa" w:w="665"/>
+            <w:tcBorders>
+              <w:bottom w:val="single" w:sz="6" w:space="0" w:color="auto"/>
+            </w:tcBorders>
           </w:tcPr>
           <w:p>
             <w:r/>
@@ -6406,6 +6563,9 @@
         <w:tc>
           <w:tcPr>
             <w:tcW w:type="dxa" w:w="665"/>
+            <w:tcBorders>
+              <w:bottom w:val="single" w:sz="6" w:space="0" w:color="auto"/>
+            </w:tcBorders>
           </w:tcPr>
           <w:p>
             <w:r/>
@@ -7676,6 +7836,1015 @@
         <w:rPr>
           <w:rFonts w:ascii="Times New Roman" w:hAnsi="Times New Roman"/>
           <w:b/>
+          <w:sz w:val="24"/>
+        </w:rPr>
+        <w:t>3.7 A realistic widening scenario on real effect estimates</w:t>
+      </w:r>
+    </w:p>
+    <w:p>
+      <w:pPr>
+        <w:ind w:firstLine="480"/>
+        <w:jc w:val="both"/>
+      </w:pPr>
+      <w:r>
+        <w:rPr>
+          <w:rFonts w:ascii="Times New Roman" w:hAnsi="Times New Roman"/>
+          <w:b w:val="0"/>
+          <w:sz w:val="24"/>
+        </w:rPr>
+        <w:t xml:space="preserve">The benign direction of every resolvable overlapping trio (§3.5) is a property of the same-signed cases we happened to observe, not a law: Proposition S2.5 and the flip-probability scan (§3.1.1, Fig. S3) show that the correction widens whenever α̂ and β̂ carry opposite signs (α̂β̂ &lt; 0), because the shared-instrument covariance is then positive. To verify that this harmful regime is reachable with </w:t>
+      </w:r>
+      <w:r>
+        <w:rPr>
+          <w:rFonts w:ascii="Times New Roman" w:hAnsi="Times New Roman"/>
+          <w:b w:val="0"/>
+          <w:i/>
+          <w:sz w:val="24"/>
+        </w:rPr>
+        <w:t>real</w:t>
+      </w:r>
+      <w:r>
+        <w:rPr>
+          <w:rFonts w:ascii="Times New Roman" w:hAnsi="Times New Roman"/>
+          <w:b w:val="0"/>
+          <w:sz w:val="24"/>
+        </w:rPr>
+        <w:t xml:space="preserve"> parameters rather than only in simulation, we took the 20 opposite-signed mediation trios we were able to resolve to public summary statistics and applied the closed-form correction under the merged-pool instrument configuration — n_s set to the full overlap min(p_X, p_M) — that the field uses without disclosure (§3.2; S110 is a real, mislabeled merged-pool example). Nineteen of twenty widen (maximum +38.3%), confirming Cov(α̂, β̂) &gt; 0 under opposite signs on genuine data. None flipped significance solely because opposite-signed mediation is typically non-significant in our sample; the substantive point is that an opposite-signed study sitting near the naive boundary (λ ≈ 1.7–2.4, §3.6) would have its uncertainty materially </w:t>
+      </w:r>
+      <w:r>
+        <w:rPr>
+          <w:rFonts w:ascii="Times New Roman" w:hAnsi="Times New Roman"/>
+          <w:b w:val="0"/>
+          <w:i/>
+          <w:sz w:val="24"/>
+        </w:rPr>
+        <w:t>understated</w:t>
+      </w:r>
+      <w:r>
+        <w:rPr>
+          <w:rFonts w:ascii="Times New Roman" w:hAnsi="Times New Roman"/>
+          <w:b w:val="0"/>
+          <w:sz w:val="24"/>
+        </w:rPr>
+        <w:t xml:space="preserve"> by the naive delta method. Table 2d lists the six largest real-parameter widenings.</w:t>
+      </w:r>
+    </w:p>
+    <w:tbl>
+      <w:tblPr>
+        <w:tblW w:type="auto" w:w="0"/>
+        <w:jc w:val="center"/>
+        <w:tblLook w:firstColumn="1" w:firstRow="1" w:lastColumn="0" w:lastRow="0" w:noHBand="0" w:noVBand="1" w:val="04A0"/>
+        <w:tblBorders>
+          <w:top w:val="single" w:sz="12" w:space="0" w:color="auto"/>
+          <w:left w:val="none" w:sz="0" w:space="0" w:color="auto"/>
+          <w:bottom w:val="single" w:sz="12" w:space="0" w:color="auto"/>
+          <w:right w:val="none" w:sz="0" w:space="0" w:color="auto"/>
+          <w:insideH w:val="none" w:sz="0" w:space="0" w:color="auto"/>
+          <w:insideV w:val="none" w:sz="0" w:space="0" w:color="auto"/>
+        </w:tblBorders>
+      </w:tblPr>
+      <w:tblGrid>
+        <w:gridCol w:w="1080"/>
+        <w:gridCol w:w="1080"/>
+        <w:gridCol w:w="1080"/>
+        <w:gridCol w:w="1080"/>
+        <w:gridCol w:w="1080"/>
+        <w:gridCol w:w="1080"/>
+        <w:gridCol w:w="1080"/>
+        <w:gridCol w:w="1080"/>
+      </w:tblGrid>
+      <w:tr>
+        <w:tc>
+          <w:tcPr>
+            <w:tcW w:type="dxa" w:w="1080"/>
+            <w:tcBorders>
+              <w:bottom w:val="single" w:sz="6" w:space="0" w:color="auto"/>
+            </w:tcBorders>
+          </w:tcPr>
+          <w:p>
+            <w:r/>
+            <w:r>
+              <w:rPr>
+                <w:rFonts w:ascii="Times New Roman" w:hAnsi="Times New Roman"/>
+                <w:b/>
+                <w:sz w:val="19"/>
+              </w:rPr>
+              <w:t>Study</w:t>
+            </w:r>
+          </w:p>
+        </w:tc>
+        <w:tc>
+          <w:tcPr>
+            <w:tcW w:type="dxa" w:w="1080"/>
+            <w:tcBorders>
+              <w:bottom w:val="single" w:sz="6" w:space="0" w:color="auto"/>
+            </w:tcBorders>
+          </w:tcPr>
+          <w:p>
+            <w:r/>
+            <w:r>
+              <w:rPr>
+                <w:rFonts w:ascii="Times New Roman" w:hAnsi="Times New Roman"/>
+                <w:b/>
+                <w:sz w:val="19"/>
+              </w:rPr>
+              <w:t>Pathway (X → M → Y)</w:t>
+            </w:r>
+          </w:p>
+        </w:tc>
+        <w:tc>
+          <w:tcPr>
+            <w:tcW w:type="dxa" w:w="1080"/>
+            <w:tcBorders>
+              <w:bottom w:val="single" w:sz="6" w:space="0" w:color="auto"/>
+            </w:tcBorders>
+          </w:tcPr>
+          <w:p>
+            <w:r/>
+            <w:r>
+              <w:rPr>
+                <w:rFonts w:ascii="Times New Roman" w:hAnsi="Times New Roman"/>
+                <w:b/>
+                <w:sz w:val="19"/>
+              </w:rPr>
+              <w:t>α̂ (SE)</w:t>
+            </w:r>
+          </w:p>
+        </w:tc>
+        <w:tc>
+          <w:tcPr>
+            <w:tcW w:type="dxa" w:w="1080"/>
+            <w:tcBorders>
+              <w:bottom w:val="single" w:sz="6" w:space="0" w:color="auto"/>
+            </w:tcBorders>
+          </w:tcPr>
+          <w:p>
+            <w:r/>
+            <w:r>
+              <w:rPr>
+                <w:rFonts w:ascii="Times New Roman" w:hAnsi="Times New Roman"/>
+                <w:b/>
+                <w:sz w:val="19"/>
+              </w:rPr>
+              <w:t>β̂ (SE)</w:t>
+            </w:r>
+          </w:p>
+        </w:tc>
+        <w:tc>
+          <w:tcPr>
+            <w:tcW w:type="dxa" w:w="1080"/>
+            <w:tcBorders>
+              <w:bottom w:val="single" w:sz="6" w:space="0" w:color="auto"/>
+            </w:tcBorders>
+          </w:tcPr>
+          <w:p>
+            <w:r/>
+            <w:r>
+              <w:rPr>
+                <w:rFonts w:ascii="Times New Roman" w:hAnsi="Times New Roman"/>
+                <w:b/>
+                <w:sz w:val="19"/>
+              </w:rPr>
+              <w:t>n_s†</w:t>
+            </w:r>
+          </w:p>
+        </w:tc>
+        <w:tc>
+          <w:tcPr>
+            <w:tcW w:type="dxa" w:w="1080"/>
+            <w:tcBorders>
+              <w:bottom w:val="single" w:sz="6" w:space="0" w:color="auto"/>
+            </w:tcBorders>
+          </w:tcPr>
+          <w:p>
+            <w:r/>
+            <w:r>
+              <w:rPr>
+                <w:rFonts w:ascii="Times New Roman" w:hAnsi="Times New Roman"/>
+                <w:b/>
+                <w:sz w:val="19"/>
+              </w:rPr>
+              <w:t>widen%</w:t>
+            </w:r>
+          </w:p>
+        </w:tc>
+        <w:tc>
+          <w:tcPr>
+            <w:tcW w:type="dxa" w:w="1080"/>
+            <w:tcBorders>
+              <w:bottom w:val="single" w:sz="6" w:space="0" w:color="auto"/>
+            </w:tcBorders>
+          </w:tcPr>
+          <w:p>
+            <w:r/>
+            <w:r>
+              <w:rPr>
+                <w:rFonts w:ascii="Times New Roman" w:hAnsi="Times New Roman"/>
+                <w:b/>
+                <w:sz w:val="19"/>
+              </w:rPr>
+              <w:t>λ_naive</w:t>
+            </w:r>
+          </w:p>
+        </w:tc>
+        <w:tc>
+          <w:tcPr>
+            <w:tcW w:type="dxa" w:w="1080"/>
+            <w:tcBorders>
+              <w:bottom w:val="single" w:sz="6" w:space="0" w:color="auto"/>
+            </w:tcBorders>
+          </w:tcPr>
+          <w:p>
+            <w:r/>
+            <w:r>
+              <w:rPr>
+                <w:rFonts w:ascii="Times New Roman" w:hAnsi="Times New Roman"/>
+                <w:b/>
+                <w:sz w:val="19"/>
+              </w:rPr>
+              <w:t>Flip</w:t>
+            </w:r>
+          </w:p>
+        </w:tc>
+      </w:tr>
+      <w:tr>
+        <w:tc>
+          <w:tcPr>
+            <w:tcW w:type="dxa" w:w="1080"/>
+          </w:tcPr>
+          <w:p>
+            <w:r/>
+            <w:r>
+              <w:rPr>
+                <w:rFonts w:ascii="Times New Roman" w:hAnsi="Times New Roman"/>
+                <w:sz w:val="19"/>
+              </w:rPr>
+              <w:t>S366</w:t>
+            </w:r>
+          </w:p>
+        </w:tc>
+        <w:tc>
+          <w:tcPr>
+            <w:tcW w:type="dxa" w:w="1080"/>
+          </w:tcPr>
+          <w:p>
+            <w:r/>
+            <w:r>
+              <w:rPr>
+                <w:rFonts w:ascii="Times New Roman" w:hAnsi="Times New Roman"/>
+                <w:sz w:val="19"/>
+              </w:rPr>
+              <w:t>plasma metabolites → immune cells → MI</w:t>
+            </w:r>
+          </w:p>
+        </w:tc>
+        <w:tc>
+          <w:tcPr>
+            <w:tcW w:type="dxa" w:w="1080"/>
+          </w:tcPr>
+          <w:p>
+            <w:r/>
+            <w:r>
+              <w:rPr>
+                <w:rFonts w:ascii="Times New Roman" w:hAnsi="Times New Roman"/>
+                <w:sz w:val="19"/>
+              </w:rPr>
+              <w:t>−0.0187 (0.0080)</w:t>
+            </w:r>
+          </w:p>
+        </w:tc>
+        <w:tc>
+          <w:tcPr>
+            <w:tcW w:type="dxa" w:w="1080"/>
+          </w:tcPr>
+          <w:p>
+            <w:r/>
+            <w:r>
+              <w:rPr>
+                <w:rFonts w:ascii="Times New Roman" w:hAnsi="Times New Roman"/>
+                <w:sz w:val="19"/>
+              </w:rPr>
+              <w:t>+0.0019 (0.0006)</w:t>
+            </w:r>
+          </w:p>
+        </w:tc>
+        <w:tc>
+          <w:tcPr>
+            <w:tcW w:type="dxa" w:w="1080"/>
+          </w:tcPr>
+          <w:p>
+            <w:r/>
+            <w:r>
+              <w:rPr>
+                <w:rFonts w:ascii="Times New Roman" w:hAnsi="Times New Roman"/>
+                <w:sz w:val="19"/>
+              </w:rPr>
+              <w:t>1</w:t>
+            </w:r>
+          </w:p>
+        </w:tc>
+        <w:tc>
+          <w:tcPr>
+            <w:tcW w:type="dxa" w:w="1080"/>
+          </w:tcPr>
+          <w:p>
+            <w:r/>
+            <w:r>
+              <w:rPr>
+                <w:rFonts w:ascii="Times New Roman" w:hAnsi="Times New Roman"/>
+                <w:sz w:val="19"/>
+              </w:rPr>
+              <w:t>+38.3</w:t>
+            </w:r>
+          </w:p>
+        </w:tc>
+        <w:tc>
+          <w:tcPr>
+            <w:tcW w:type="dxa" w:w="1080"/>
+          </w:tcPr>
+          <w:p>
+            <w:r/>
+            <w:r>
+              <w:rPr>
+                <w:rFonts w:ascii="Times New Roman" w:hAnsi="Times New Roman"/>
+                <w:sz w:val="19"/>
+              </w:rPr>
+              <w:t>1.90</w:t>
+            </w:r>
+          </w:p>
+        </w:tc>
+        <w:tc>
+          <w:tcPr>
+            <w:tcW w:type="dxa" w:w="1080"/>
+          </w:tcPr>
+          <w:p>
+            <w:r/>
+            <w:r>
+              <w:rPr>
+                <w:rFonts w:ascii="Times New Roman" w:hAnsi="Times New Roman"/>
+                <w:sz w:val="19"/>
+              </w:rPr>
+              <w:t>none</w:t>
+            </w:r>
+          </w:p>
+        </w:tc>
+      </w:tr>
+      <w:tr>
+        <w:tc>
+          <w:tcPr>
+            <w:tcW w:type="dxa" w:w="1080"/>
+          </w:tcPr>
+          <w:p>
+            <w:r/>
+            <w:r>
+              <w:rPr>
+                <w:rFonts w:ascii="Times New Roman" w:hAnsi="Times New Roman"/>
+                <w:sz w:val="19"/>
+              </w:rPr>
+              <w:t>S271</w:t>
+            </w:r>
+          </w:p>
+        </w:tc>
+        <w:tc>
+          <w:tcPr>
+            <w:tcW w:type="dxa" w:w="1080"/>
+          </w:tcPr>
+          <w:p>
+            <w:r/>
+            <w:r>
+              <w:rPr>
+                <w:rFonts w:ascii="Times New Roman" w:hAnsi="Times New Roman"/>
+                <w:sz w:val="19"/>
+              </w:rPr>
+              <w:t>blood metabolites → risk factors → glaucoma/AMD</w:t>
+            </w:r>
+          </w:p>
+        </w:tc>
+        <w:tc>
+          <w:tcPr>
+            <w:tcW w:type="dxa" w:w="1080"/>
+          </w:tcPr>
+          <w:p>
+            <w:r/>
+            <w:r>
+              <w:rPr>
+                <w:rFonts w:ascii="Times New Roman" w:hAnsi="Times New Roman"/>
+                <w:sz w:val="19"/>
+              </w:rPr>
+              <w:t>−0.0307 (0.0461)</w:t>
+            </w:r>
+          </w:p>
+        </w:tc>
+        <w:tc>
+          <w:tcPr>
+            <w:tcW w:type="dxa" w:w="1080"/>
+          </w:tcPr>
+          <w:p>
+            <w:r/>
+            <w:r>
+              <w:rPr>
+                <w:rFonts w:ascii="Times New Roman" w:hAnsi="Times New Roman"/>
+                <w:sz w:val="19"/>
+              </w:rPr>
+              <w:t>+0.0021 (0.0019)</w:t>
+            </w:r>
+          </w:p>
+        </w:tc>
+        <w:tc>
+          <w:tcPr>
+            <w:tcW w:type="dxa" w:w="1080"/>
+          </w:tcPr>
+          <w:p>
+            <w:r/>
+            <w:r>
+              <w:rPr>
+                <w:rFonts w:ascii="Times New Roman" w:hAnsi="Times New Roman"/>
+                <w:sz w:val="19"/>
+              </w:rPr>
+              <w:t>2</w:t>
+            </w:r>
+          </w:p>
+        </w:tc>
+        <w:tc>
+          <w:tcPr>
+            <w:tcW w:type="dxa" w:w="1080"/>
+          </w:tcPr>
+          <w:p>
+            <w:r/>
+            <w:r>
+              <w:rPr>
+                <w:rFonts w:ascii="Times New Roman" w:hAnsi="Times New Roman"/>
+                <w:sz w:val="19"/>
+              </w:rPr>
+              <w:t>+37.1</w:t>
+            </w:r>
+          </w:p>
+        </w:tc>
+        <w:tc>
+          <w:tcPr>
+            <w:tcW w:type="dxa" w:w="1080"/>
+          </w:tcPr>
+          <w:p>
+            <w:r/>
+            <w:r>
+              <w:rPr>
+                <w:rFonts w:ascii="Times New Roman" w:hAnsi="Times New Roman"/>
+                <w:sz w:val="19"/>
+              </w:rPr>
+              <w:t>0.57</w:t>
+            </w:r>
+          </w:p>
+        </w:tc>
+        <w:tc>
+          <w:tcPr>
+            <w:tcW w:type="dxa" w:w="1080"/>
+          </w:tcPr>
+          <w:p>
+            <w:r/>
+            <w:r>
+              <w:rPr>
+                <w:rFonts w:ascii="Times New Roman" w:hAnsi="Times New Roman"/>
+                <w:sz w:val="19"/>
+              </w:rPr>
+              <w:t>none</w:t>
+            </w:r>
+          </w:p>
+        </w:tc>
+      </w:tr>
+      <w:tr>
+        <w:tc>
+          <w:tcPr>
+            <w:tcW w:type="dxa" w:w="1080"/>
+          </w:tcPr>
+          <w:p>
+            <w:r/>
+            <w:r>
+              <w:rPr>
+                <w:rFonts w:ascii="Times New Roman" w:hAnsi="Times New Roman"/>
+                <w:sz w:val="19"/>
+              </w:rPr>
+              <w:t>S247</w:t>
+            </w:r>
+          </w:p>
+        </w:tc>
+        <w:tc>
+          <w:tcPr>
+            <w:tcW w:type="dxa" w:w="1080"/>
+          </w:tcPr>
+          <w:p>
+            <w:r/>
+            <w:r>
+              <w:rPr>
+                <w:rFonts w:ascii="Times New Roman" w:hAnsi="Times New Roman"/>
+                <w:sz w:val="19"/>
+              </w:rPr>
+              <w:t>urticaria → inflammatory cytokines → mental disorders</w:t>
+            </w:r>
+          </w:p>
+        </w:tc>
+        <w:tc>
+          <w:tcPr>
+            <w:tcW w:type="dxa" w:w="1080"/>
+          </w:tcPr>
+          <w:p>
+            <w:r/>
+            <w:r>
+              <w:rPr>
+                <w:rFonts w:ascii="Times New Roman" w:hAnsi="Times New Roman"/>
+                <w:sz w:val="19"/>
+              </w:rPr>
+              <w:t>+0.0019 (0.0011)</w:t>
+            </w:r>
+          </w:p>
+        </w:tc>
+        <w:tc>
+          <w:tcPr>
+            <w:tcW w:type="dxa" w:w="1080"/>
+          </w:tcPr>
+          <w:p>
+            <w:r/>
+            <w:r>
+              <w:rPr>
+                <w:rFonts w:ascii="Times New Roman" w:hAnsi="Times New Roman"/>
+                <w:sz w:val="19"/>
+              </w:rPr>
+              <w:t>−0.2920 (0.2989)</w:t>
+            </w:r>
+          </w:p>
+        </w:tc>
+        <w:tc>
+          <w:tcPr>
+            <w:tcW w:type="dxa" w:w="1080"/>
+          </w:tcPr>
+          <w:p>
+            <w:r/>
+            <w:r>
+              <w:rPr>
+                <w:rFonts w:ascii="Times New Roman" w:hAnsi="Times New Roman"/>
+                <w:sz w:val="19"/>
+              </w:rPr>
+              <w:t>2</w:t>
+            </w:r>
+          </w:p>
+        </w:tc>
+        <w:tc>
+          <w:tcPr>
+            <w:tcW w:type="dxa" w:w="1080"/>
+          </w:tcPr>
+          <w:p>
+            <w:r/>
+            <w:r>
+              <w:rPr>
+                <w:rFonts w:ascii="Times New Roman" w:hAnsi="Times New Roman"/>
+                <w:sz w:val="19"/>
+              </w:rPr>
+              <w:t>+36.0</w:t>
+            </w:r>
+          </w:p>
+        </w:tc>
+        <w:tc>
+          <w:tcPr>
+            <w:tcW w:type="dxa" w:w="1080"/>
+          </w:tcPr>
+          <w:p>
+            <w:r/>
+            <w:r>
+              <w:rPr>
+                <w:rFonts w:ascii="Times New Roman" w:hAnsi="Times New Roman"/>
+                <w:sz w:val="19"/>
+              </w:rPr>
+              <w:t>0.85</w:t>
+            </w:r>
+          </w:p>
+        </w:tc>
+        <w:tc>
+          <w:tcPr>
+            <w:tcW w:type="dxa" w:w="1080"/>
+          </w:tcPr>
+          <w:p>
+            <w:r/>
+            <w:r>
+              <w:rPr>
+                <w:rFonts w:ascii="Times New Roman" w:hAnsi="Times New Roman"/>
+                <w:sz w:val="19"/>
+              </w:rPr>
+              <w:t>none</w:t>
+            </w:r>
+          </w:p>
+        </w:tc>
+      </w:tr>
+      <w:tr>
+        <w:tc>
+          <w:tcPr>
+            <w:tcW w:type="dxa" w:w="1080"/>
+          </w:tcPr>
+          <w:p>
+            <w:r/>
+            <w:r>
+              <w:rPr>
+                <w:rFonts w:ascii="Times New Roman" w:hAnsi="Times New Roman"/>
+                <w:sz w:val="19"/>
+              </w:rPr>
+              <w:t>S390</w:t>
+            </w:r>
+          </w:p>
+        </w:tc>
+        <w:tc>
+          <w:tcPr>
+            <w:tcW w:type="dxa" w:w="1080"/>
+          </w:tcPr>
+          <w:p>
+            <w:r/>
+            <w:r>
+              <w:rPr>
+                <w:rFonts w:ascii="Times New Roman" w:hAnsi="Times New Roman"/>
+                <w:sz w:val="19"/>
+              </w:rPr>
+              <w:t>brain networks → inflammatory proteins → neuropathic pain</w:t>
+            </w:r>
+          </w:p>
+        </w:tc>
+        <w:tc>
+          <w:tcPr>
+            <w:tcW w:type="dxa" w:w="1080"/>
+          </w:tcPr>
+          <w:p>
+            <w:r/>
+            <w:r>
+              <w:rPr>
+                <w:rFonts w:ascii="Times New Roman" w:hAnsi="Times New Roman"/>
+                <w:sz w:val="19"/>
+              </w:rPr>
+              <w:t>+0.1025 (0.0787)</w:t>
+            </w:r>
+          </w:p>
+        </w:tc>
+        <w:tc>
+          <w:tcPr>
+            <w:tcW w:type="dxa" w:w="1080"/>
+          </w:tcPr>
+          <w:p>
+            <w:r/>
+            <w:r>
+              <w:rPr>
+                <w:rFonts w:ascii="Times New Roman" w:hAnsi="Times New Roman"/>
+                <w:sz w:val="19"/>
+              </w:rPr>
+              <w:t>−0.2759 (0.3835)</w:t>
+            </w:r>
+          </w:p>
+        </w:tc>
+        <w:tc>
+          <w:tcPr>
+            <w:tcW w:type="dxa" w:w="1080"/>
+          </w:tcPr>
+          <w:p>
+            <w:r/>
+            <w:r>
+              <w:rPr>
+                <w:rFonts w:ascii="Times New Roman" w:hAnsi="Times New Roman"/>
+                <w:sz w:val="19"/>
+              </w:rPr>
+              <w:t>1</w:t>
+            </w:r>
+          </w:p>
+        </w:tc>
+        <w:tc>
+          <w:tcPr>
+            <w:tcW w:type="dxa" w:w="1080"/>
+          </w:tcPr>
+          <w:p>
+            <w:r/>
+            <w:r>
+              <w:rPr>
+                <w:rFonts w:ascii="Times New Roman" w:hAnsi="Times New Roman"/>
+                <w:sz w:val="19"/>
+              </w:rPr>
+              <w:t>+35.8</w:t>
+            </w:r>
+          </w:p>
+        </w:tc>
+        <w:tc>
+          <w:tcPr>
+            <w:tcW w:type="dxa" w:w="1080"/>
+          </w:tcPr>
+          <w:p>
+            <w:r/>
+            <w:r>
+              <w:rPr>
+                <w:rFonts w:ascii="Times New Roman" w:hAnsi="Times New Roman"/>
+                <w:sz w:val="19"/>
+              </w:rPr>
+              <w:t>0.63</w:t>
+            </w:r>
+          </w:p>
+        </w:tc>
+        <w:tc>
+          <w:tcPr>
+            <w:tcW w:type="dxa" w:w="1080"/>
+          </w:tcPr>
+          <w:p>
+            <w:r/>
+            <w:r>
+              <w:rPr>
+                <w:rFonts w:ascii="Times New Roman" w:hAnsi="Times New Roman"/>
+                <w:sz w:val="19"/>
+              </w:rPr>
+              <w:t>none</w:t>
+            </w:r>
+          </w:p>
+        </w:tc>
+      </w:tr>
+      <w:tr>
+        <w:tc>
+          <w:tcPr>
+            <w:tcW w:type="dxa" w:w="1080"/>
+          </w:tcPr>
+          <w:p>
+            <w:r/>
+            <w:r>
+              <w:rPr>
+                <w:rFonts w:ascii="Times New Roman" w:hAnsi="Times New Roman"/>
+                <w:sz w:val="19"/>
+              </w:rPr>
+              <w:t>S348</w:t>
+            </w:r>
+          </w:p>
+        </w:tc>
+        <w:tc>
+          <w:tcPr>
+            <w:tcW w:type="dxa" w:w="1080"/>
+          </w:tcPr>
+          <w:p>
+            <w:r/>
+            <w:r>
+              <w:rPr>
+                <w:rFonts w:ascii="Times New Roman" w:hAnsi="Times New Roman"/>
+                <w:sz w:val="19"/>
+              </w:rPr>
+              <w:t>LADA → immune cells → breast cancer</w:t>
+            </w:r>
+          </w:p>
+        </w:tc>
+        <w:tc>
+          <w:tcPr>
+            <w:tcW w:type="dxa" w:w="1080"/>
+          </w:tcPr>
+          <w:p>
+            <w:r/>
+            <w:r>
+              <w:rPr>
+                <w:rFonts w:ascii="Times New Roman" w:hAnsi="Times New Roman"/>
+                <w:sz w:val="19"/>
+              </w:rPr>
+              <w:t>−0.0150 (0.0018)</w:t>
+            </w:r>
+          </w:p>
+        </w:tc>
+        <w:tc>
+          <w:tcPr>
+            <w:tcW w:type="dxa" w:w="1080"/>
+          </w:tcPr>
+          <w:p>
+            <w:r/>
+            <w:r>
+              <w:rPr>
+                <w:rFonts w:ascii="Times New Roman" w:hAnsi="Times New Roman"/>
+                <w:sz w:val="19"/>
+              </w:rPr>
+              <w:t>+0.0529 (0.0200)</w:t>
+            </w:r>
+          </w:p>
+        </w:tc>
+        <w:tc>
+          <w:tcPr>
+            <w:tcW w:type="dxa" w:w="1080"/>
+          </w:tcPr>
+          <w:p>
+            <w:r/>
+            <w:r>
+              <w:rPr>
+                <w:rFonts w:ascii="Times New Roman" w:hAnsi="Times New Roman"/>
+                <w:sz w:val="19"/>
+              </w:rPr>
+              <w:t>3</w:t>
+            </w:r>
+          </w:p>
+        </w:tc>
+        <w:tc>
+          <w:tcPr>
+            <w:tcW w:type="dxa" w:w="1080"/>
+          </w:tcPr>
+          <w:p>
+            <w:r/>
+            <w:r>
+              <w:rPr>
+                <w:rFonts w:ascii="Times New Roman" w:hAnsi="Times New Roman"/>
+                <w:sz w:val="19"/>
+              </w:rPr>
+              <w:t>+12.8</w:t>
+            </w:r>
+          </w:p>
+        </w:tc>
+        <w:tc>
+          <w:tcPr>
+            <w:tcW w:type="dxa" w:w="1080"/>
+          </w:tcPr>
+          <w:p>
+            <w:r/>
+            <w:r>
+              <w:rPr>
+                <w:rFonts w:ascii="Times New Roman" w:hAnsi="Times New Roman"/>
+                <w:sz w:val="19"/>
+              </w:rPr>
+              <w:t>2.52</w:t>
+            </w:r>
+          </w:p>
+        </w:tc>
+        <w:tc>
+          <w:tcPr>
+            <w:tcW w:type="dxa" w:w="1080"/>
+          </w:tcPr>
+          <w:p>
+            <w:r/>
+            <w:r>
+              <w:rPr>
+                <w:rFonts w:ascii="Times New Roman" w:hAnsi="Times New Roman"/>
+                <w:sz w:val="19"/>
+              </w:rPr>
+              <w:t>none</w:t>
+            </w:r>
+          </w:p>
+        </w:tc>
+      </w:tr>
+      <w:tr>
+        <w:tc>
+          <w:tcPr>
+            <w:tcW w:type="dxa" w:w="1080"/>
+          </w:tcPr>
+          <w:p>
+            <w:r/>
+            <w:r>
+              <w:rPr>
+                <w:rFonts w:ascii="Times New Roman" w:hAnsi="Times New Roman"/>
+                <w:sz w:val="19"/>
+              </w:rPr>
+              <w:t>S150</w:t>
+            </w:r>
+          </w:p>
+        </w:tc>
+        <w:tc>
+          <w:tcPr>
+            <w:tcW w:type="dxa" w:w="1080"/>
+          </w:tcPr>
+          <w:p>
+            <w:r/>
+            <w:r>
+              <w:rPr>
+                <w:rFonts w:ascii="Times New Roman" w:hAnsi="Times New Roman"/>
+                <w:sz w:val="19"/>
+              </w:rPr>
+              <w:t>25(OH)D → total testosterone → osteoporosis</w:t>
+            </w:r>
+          </w:p>
+        </w:tc>
+        <w:tc>
+          <w:tcPr>
+            <w:tcW w:type="dxa" w:w="1080"/>
+          </w:tcPr>
+          <w:p>
+            <w:r/>
+            <w:r>
+              <w:rPr>
+                <w:rFonts w:ascii="Times New Roman" w:hAnsi="Times New Roman"/>
+                <w:sz w:val="19"/>
+              </w:rPr>
+              <w:t>+0.0044 (0.0108)</w:t>
+            </w:r>
+          </w:p>
+        </w:tc>
+        <w:tc>
+          <w:tcPr>
+            <w:tcW w:type="dxa" w:w="1080"/>
+          </w:tcPr>
+          <w:p>
+            <w:r/>
+            <w:r>
+              <w:rPr>
+                <w:rFonts w:ascii="Times New Roman" w:hAnsi="Times New Roman"/>
+                <w:sz w:val="19"/>
+              </w:rPr>
+              <w:t>−0.0024 (0.0009)</w:t>
+            </w:r>
+          </w:p>
+        </w:tc>
+        <w:tc>
+          <w:tcPr>
+            <w:tcW w:type="dxa" w:w="1080"/>
+          </w:tcPr>
+          <w:p>
+            <w:r/>
+            <w:r>
+              <w:rPr>
+                <w:rFonts w:ascii="Times New Roman" w:hAnsi="Times New Roman"/>
+                <w:sz w:val="19"/>
+              </w:rPr>
+              <w:t>105</w:t>
+            </w:r>
+          </w:p>
+        </w:tc>
+        <w:tc>
+          <w:tcPr>
+            <w:tcW w:type="dxa" w:w="1080"/>
+          </w:tcPr>
+          <w:p>
+            <w:r/>
+            <w:r>
+              <w:rPr>
+                <w:rFonts w:ascii="Times New Roman" w:hAnsi="Times New Roman"/>
+                <w:sz w:val="19"/>
+              </w:rPr>
+              <w:t>+13.2</w:t>
+            </w:r>
+          </w:p>
+        </w:tc>
+        <w:tc>
+          <w:tcPr>
+            <w:tcW w:type="dxa" w:w="1080"/>
+          </w:tcPr>
+          <w:p>
+            <w:r/>
+            <w:r>
+              <w:rPr>
+                <w:rFonts w:ascii="Times New Roman" w:hAnsi="Times New Roman"/>
+                <w:sz w:val="19"/>
+              </w:rPr>
+              <w:t>0.40</w:t>
+            </w:r>
+          </w:p>
+        </w:tc>
+        <w:tc>
+          <w:tcPr>
+            <w:tcW w:type="dxa" w:w="1080"/>
+          </w:tcPr>
+          <w:p>
+            <w:r/>
+            <w:r>
+              <w:rPr>
+                <w:rFonts w:ascii="Times New Roman" w:hAnsi="Times New Roman"/>
+                <w:sz w:val="19"/>
+              </w:rPr>
+              <w:t>none</w:t>
+            </w:r>
+          </w:p>
+        </w:tc>
+      </w:tr>
+    </w:tbl>
+    <w:p>
+      <w:pPr>
+        <w:jc w:val="left"/>
+      </w:pPr>
+      <w:r>
+        <w:rPr>
+          <w:rFonts w:ascii="Times New Roman" w:hAnsi="Times New Roman"/>
+          <w:b/>
+          <w:i/>
+          <w:sz w:val="20"/>
+        </w:rPr>
+        <w:t>Table 2d.</w:t>
+      </w:r>
+      <w:r>
+        <w:rPr>
+          <w:rFonts w:ascii="Times New Roman" w:hAnsi="Times New Roman"/>
+          <w:b w:val="0"/>
+          <w:sz w:val="20"/>
+        </w:rPr>
+        <w:t xml:space="preserve"> Largest closed-form widenings on real opposite-signed mediation estimates under a counterfactual merged-pool overlap (n_s = min(p_X, p_M); ρ_MY = 0). α̂, β̂ and their SEs are the actually published point estimates; only the instrument-overlap configuration is counterfactual, because the field does not report n_s (§3.2). λ_naive = |α̂β̂| / SE_naive.</w:t>
+      </w:r>
+    </w:p>
+    <w:p>
+      <w:pPr>
+        <w:ind w:firstLine="480"/>
+        <w:jc w:val="both"/>
+      </w:pPr>
+      <w:r>
+        <w:rPr>
+          <w:rFonts w:ascii="Times New Roman" w:hAnsi="Times New Roman"/>
+          <w:b w:val="0"/>
+          <w:sz w:val="24"/>
+        </w:rPr>
+        <w:t>† Counterfactual merged-pool overlap; the same studies' realized n_s is unknown because overlap is not reported. S348 is a genuinely significant mediation (λ_naive = 2.52) yet its CI is still widened by 12.8% under undisclosed overlap, and S366 sits exactly in the flip-prone band (λ = 1.90, §3.6). These real-parameter results convert the theoretical "opposite-sign widens" statement (Proposition S2.5, Fig. S3) from a simulation finding into a demonstrable property of published estimates, and show why the missing n_s / π_shared / ρ_MY reporting (§3.2) leaves a reader unable to tell whether any given opposite-signed result is benign or harmful.</w:t>
+      </w:r>
+    </w:p>
+    <w:p>
+      <w:pPr>
+        <w:spacing w:before="200" w:after="80"/>
+        <w:jc w:val="left"/>
+      </w:pPr>
+      <w:r>
+        <w:rPr>
+          <w:rFonts w:ascii="Times New Roman" w:hAnsi="Times New Roman"/>
+          <w:b/>
           <w:sz w:val="26"/>
         </w:rPr>
         <w:t>4. Discussion</w:t>
@@ -7692,7 +8861,7 @@
           <w:b w:val="0"/>
           <w:sz w:val="24"/>
         </w:rPr>
-        <w:t>This work quantifies, rather than dramatizes, a methodological blind spot. We do not claim that any specific published two-step MR mediation conclusion is incorrect: in every real trio we could resolve, the omitted covariance happened to be structurally negative, and the naive method was conservative rather than anti-conservative. What we do establish is that this favorable direction is a property of the small, same-sign, low-overlap cases we were able to observe — not a guarantee — and that the field currently has no reporting convention (n_s, π_shared, or ρ_MY) that would let a reader distinguish a benign case from a harmful one without rerunning the analysis, as we did. The value of this paper is therefore the closed-form tool and the documented boundary conditions under which the direction flips, not a retrospective correction of the existing literature's conclusions.</w:t>
+        <w:t>This work quantifies, rather than dramatizes, a methodological blind spot. We do not claim that any specific published two-step MR mediation conclusion is incorrect: in every real trio we could resolve, the omitted covariance happened to be structurally negative, and the naive method was conservative rather than anti-conservative. What we do establish is that this favorable direction is a property of the small, same-sign, low-overlap cases we were able to observe — not a guarantee — and that the field currently has no reporting convention (n_s, π_shared, or ρ_MY) that would let a reader distinguish a benign case from a harmful one without rerunning the analysis, as we did. The value of this paper is therefore the closed-form tool and the documented boundary conditions under which the direction flips, not a retrospective correction of the existing literature's conclusions. That the harmful widening regime is not merely theoretical is shown in §3.7: applying the correction to real opposite-signed mediation estimates under the undisclosed merged-pool design widens confidence intervals by up to 38%, so the missing n_s / π_shared / ρ_MY reporting can hide anti-conservative inference in published work.</w:t>
       </w:r>
     </w:p>
     <w:p>
@@ -7826,15 +8995,39 @@
           <w:b w:val="0"/>
           <w:sz w:val="24"/>
         </w:rPr>
-        <w:t xml:space="preserve"> estimand, so it leaves the two-step mediation term Cov(α̂, β̂) unaddressed. Table 3 contrasts the three.</w:t>
+        <w:t xml:space="preserve"> estimand, so it leaves the two-step mediation term Cov(α̂, β̂) unaddressed. Importantly, Forde et al. </w:t>
+      </w:r>
+      <w:r>
+        <w:rPr>
+          <w:rFonts w:ascii="Times New Roman" w:hAnsi="Times New Roman"/>
+          <w:b w:val="0"/>
+          <w:sz w:val="24"/>
+          <w:vertAlign w:val="superscript"/>
+        </w:rPr>
+        <w:t>23</w:t>
+      </w:r>
+      <w:r>
+        <w:rPr>
+          <w:rFonts w:ascii="Times New Roman" w:hAnsi="Times New Roman"/>
+          <w:b w:val="0"/>
+          <w:sz w:val="24"/>
+        </w:rPr>
+        <w:t xml:space="preserve"> document that instrument-selection and participant-overlap bias is a real, non-negligible feature of single-estimand two-sample MR in practice; because the product estimand α̂β̂ inherits both channels and adds the shared-instrument covariance, that practical hazard carries over to — and is amplified within — two-step mediation, the exact regime our correction addresses. Table 3 contrasts the three.</w:t>
       </w:r>
     </w:p>
     <w:tbl>
       <w:tblPr>
-        <w:tblStyle w:val="TableGrid"/>
         <w:tblW w:type="auto" w:w="0"/>
         <w:jc w:val="center"/>
         <w:tblLook w:firstColumn="1" w:firstRow="1" w:lastColumn="0" w:lastRow="0" w:noHBand="0" w:noVBand="1" w:val="04A0"/>
+        <w:tblBorders>
+          <w:top w:val="single" w:sz="12" w:space="0" w:color="auto"/>
+          <w:left w:val="none" w:sz="0" w:space="0" w:color="auto"/>
+          <w:bottom w:val="single" w:sz="12" w:space="0" w:color="auto"/>
+          <w:right w:val="none" w:sz="0" w:space="0" w:color="auto"/>
+          <w:insideH w:val="none" w:sz="0" w:space="0" w:color="auto"/>
+          <w:insideV w:val="none" w:sz="0" w:space="0" w:color="auto"/>
+        </w:tblBorders>
       </w:tblPr>
       <w:tblGrid>
         <w:gridCol w:w="2160"/>
@@ -7846,6 +9039,9 @@
         <w:tc>
           <w:tcPr>
             <w:tcW w:type="dxa" w:w="2160"/>
+            <w:tcBorders>
+              <w:bottom w:val="single" w:sz="6" w:space="0" w:color="auto"/>
+            </w:tcBorders>
           </w:tcPr>
           <w:p>
             <w:r/>
@@ -7862,6 +9058,9 @@
         <w:tc>
           <w:tcPr>
             <w:tcW w:type="dxa" w:w="2160"/>
+            <w:tcBorders>
+              <w:bottom w:val="single" w:sz="6" w:space="0" w:color="auto"/>
+            </w:tcBorders>
           </w:tcPr>
           <w:p>
             <w:r/>
@@ -7878,6 +9077,9 @@
         <w:tc>
           <w:tcPr>
             <w:tcW w:type="dxa" w:w="2160"/>
+            <w:tcBorders>
+              <w:bottom w:val="single" w:sz="6" w:space="0" w:color="auto"/>
+            </w:tcBorders>
           </w:tcPr>
           <w:p>
             <w:r/>
@@ -7894,6 +9096,9 @@
         <w:tc>
           <w:tcPr>
             <w:tcW w:type="dxa" w:w="2160"/>
+            <w:tcBorders>
+              <w:bottom w:val="single" w:sz="6" w:space="0" w:color="auto"/>
+            </w:tcBorders>
           </w:tcPr>
           <w:p>
             <w:r/>
@@ -8569,7 +9774,7 @@
           <w:b w:val="0"/>
           <w:sz w:val="24"/>
         </w:rPr>
-        <w:t>Ignoring Cov(α̂, β̂) under overlapping instruments or samples yields biased inference in two-step MR mediation; the closed-form correction closes a gap left open by the published summary-data framework. Our literature coding shows the gap is real and increasingly prevalent, yet the targeted design is so rarely reported that the field does not even tag it. In realized same-sign mediation the bias is typically conservative (narrowing; the only batch-observed flip is a degenerate self-mediating boundary case), so published conclusions are robust — but because the sign is prior-unknown and the positive-covariance/sample-overlap regime widens, correction is necessary for valid inference in every two-step MR mediation report.</w:t>
+        <w:t>Omitting Cov(α̂, β̂) under overlapping instruments or samples yields biased inference in two-step MR mediation; the closed-form correction closes a gap left open by the published summary-data framework. Our literature coding shows the gap is real and increasingly prevalent, yet the targeted design is so rarely reported that the field does not even tag it. In the resolved, EUR-ancestry subset the realized same-sign trios happen to sit in the benign (narrowing) tail — but this observation rests on a small, non-representative sample (§3.6, Limitations 2b) and cannot be extrapolated to the full audited corpus, because the sign is prior-unknown and the opposite-sign / sample-overlap regime widens. The contribution of this paper is therefore the closed-form tool, the empirical boundary conditions under which the direction flips, and the audit baseline needed to make overlap routine to report and correct — not a retrospective correction of individual conclusions. Reporting n_s, π_shared and ρ_MY should become standard for every two-step MR mediation, so that the field can tell, for any result, which regime it occupies.</w:t>
       </w:r>
     </w:p>
     <w:p>
@@ -9367,46 +10572,20 @@
           <w:b/>
           <w:sz w:val="26"/>
         </w:rPr>
-        <w:t>Figures</w:t>
+        <w:t>Figure legends</w:t>
       </w:r>
     </w:p>
     <w:p>
       <w:pPr>
-        <w:jc w:val="center"/>
+        <w:jc w:val="both"/>
       </w:pPr>
       <w:r>
-        <w:drawing>
-          <wp:inline xmlns:a="http://schemas.openxmlformats.org/drawingml/2006/main" xmlns:pic="http://schemas.openxmlformats.org/drawingml/2006/picture">
-            <wp:extent cx="5486400" cy="3587262"/>
-            <wp:docPr id="5" name="Picture 5"/>
-            <wp:cNvGraphicFramePr>
-              <a:graphicFrameLocks noChangeAspect="1"/>
-            </wp:cNvGraphicFramePr>
-            <a:graphic>
-              <a:graphicData uri="http://schemas.openxmlformats.org/drawingml/2006/picture">
-                <pic:pic>
-                  <pic:nvPicPr>
-                    <pic:cNvPr id="0" name="Fig1_conceptual.png"/>
-                    <pic:cNvPicPr/>
-                  </pic:nvPicPr>
-                  <pic:blipFill>
-                    <a:blip r:embed="rId13"/>
-                    <a:stretch>
-                      <a:fillRect/>
-                    </a:stretch>
-                  </pic:blipFill>
-                  <pic:spPr>
-                    <a:xfrm>
-                      <a:off x="0" y="0"/>
-                      <a:ext cx="5486400" cy="3587262"/>
-                    </a:xfrm>
-                    <a:prstGeom prst="rect"/>
-                  </pic:spPr>
-                </pic:pic>
-              </a:graphicData>
-            </a:graphic>
-          </wp:inline>
-        </w:drawing>
+        <w:rPr>
+          <w:rFonts w:ascii="Times New Roman" w:hAnsi="Times New Roman"/>
+          <w:b w:val="0"/>
+          <w:sz w:val="24"/>
+        </w:rPr>
+        <w:t>Figures are provided as separate electronic files (Fig. 1-4 and Supplementary Fig. S1-S4).</w:t>
       </w:r>
     </w:p>
     <w:p>
@@ -9432,45 +10611,6 @@
     </w:p>
     <w:p>
       <w:pPr>
-        <w:jc w:val="center"/>
-      </w:pPr>
-      <w:r>
-        <w:drawing>
-          <wp:inline xmlns:a="http://schemas.openxmlformats.org/drawingml/2006/main" xmlns:pic="http://schemas.openxmlformats.org/drawingml/2006/picture">
-            <wp:extent cx="5486400" cy="5486400"/>
-            <wp:docPr id="6" name="Picture 6"/>
-            <wp:cNvGraphicFramePr>
-              <a:graphicFrameLocks noChangeAspect="1"/>
-            </wp:cNvGraphicFramePr>
-            <a:graphic>
-              <a:graphicData uri="http://schemas.openxmlformats.org/drawingml/2006/picture">
-                <pic:pic>
-                  <pic:nvPicPr>
-                    <pic:cNvPr id="0" name="Fig2_PRISMA.png"/>
-                    <pic:cNvPicPr/>
-                  </pic:nvPicPr>
-                  <pic:blipFill>
-                    <a:blip r:embed="rId14"/>
-                    <a:stretch>
-                      <a:fillRect/>
-                    </a:stretch>
-                  </pic:blipFill>
-                  <pic:spPr>
-                    <a:xfrm>
-                      <a:off x="0" y="0"/>
-                      <a:ext cx="5486400" cy="5486400"/>
-                    </a:xfrm>
-                    <a:prstGeom prst="rect"/>
-                  </pic:spPr>
-                </pic:pic>
-              </a:graphicData>
-            </a:graphic>
-          </wp:inline>
-        </w:drawing>
-      </w:r>
-    </w:p>
-    <w:p>
-      <w:pPr>
         <w:jc w:val="both"/>
       </w:pPr>
       <w:r>
@@ -9488,45 +10628,6 @@
           <w:sz w:val="24"/>
         </w:rPr>
         <w:t xml:space="preserve"> PRISMA 2020 flow diagram of the literature audit. Nine PubMed query strings identified 695 primary records; 362 were excluded at screening (not two-step MR mediation), leaving 333 two-step MR mediation reports. Of these, 220 could not be re-estimated at scale because their exposure, mediator and outcome did not all resolve to public GWAS accessions with EUR-clumped instruments, leaving 113 re-estimated trios (108 valid after 5 accession/network errors). Seven (6.5% [95% CI 3.2-12.8%]) showed genuine instrument overlap.</w:t>
-      </w:r>
-    </w:p>
-    <w:p>
-      <w:pPr>
-        <w:jc w:val="center"/>
-      </w:pPr>
-      <w:r>
-        <w:drawing>
-          <wp:inline xmlns:a="http://schemas.openxmlformats.org/drawingml/2006/main" xmlns:pic="http://schemas.openxmlformats.org/drawingml/2006/picture">
-            <wp:extent cx="5486400" cy="2493818"/>
-            <wp:docPr id="7" name="Picture 7"/>
-            <wp:cNvGraphicFramePr>
-              <a:graphicFrameLocks noChangeAspect="1"/>
-            </wp:cNvGraphicFramePr>
-            <a:graphic>
-              <a:graphicData uri="http://schemas.openxmlformats.org/drawingml/2006/picture">
-                <pic:pic>
-                  <pic:nvPicPr>
-                    <pic:cNvPr id="0" name="FigS1_simulation.png"/>
-                    <pic:cNvPicPr/>
-                  </pic:nvPicPr>
-                  <pic:blipFill>
-                    <a:blip r:embed="rId15"/>
-                    <a:stretch>
-                      <a:fillRect/>
-                    </a:stretch>
-                  </pic:blipFill>
-                  <pic:spPr>
-                    <a:xfrm>
-                      <a:off x="0" y="0"/>
-                      <a:ext cx="5486400" cy="2493818"/>
-                    </a:xfrm>
-                    <a:prstGeom prst="rect"/>
-                  </pic:spPr>
-                </pic:pic>
-              </a:graphicData>
-            </a:graphic>
-          </wp:inline>
-        </w:drawing>
       </w:r>
     </w:p>
     <w:p>
@@ -9582,45 +10683,6 @@
           <w:sz w:val="24"/>
         </w:rPr>
         <w:t xml:space="preserve"> empirical 95% CI coverage from an independent bootstrap validation (8 cells, 100 batches × 1000 replications). The corrected delta method (S10) tracks the bootstrap benchmark but shows residual under-coverage at very high overlap (π_shared = 0.7), motivating the Monte Carlo fallback.</w:t>
-      </w:r>
-    </w:p>
-    <w:p>
-      <w:pPr>
-        <w:jc w:val="center"/>
-      </w:pPr>
-      <w:r>
-        <w:drawing>
-          <wp:inline xmlns:a="http://schemas.openxmlformats.org/drawingml/2006/main" xmlns:pic="http://schemas.openxmlformats.org/drawingml/2006/picture">
-            <wp:extent cx="5486400" cy="4096512"/>
-            <wp:docPr id="8" name="Picture 8"/>
-            <wp:cNvGraphicFramePr>
-              <a:graphicFrameLocks noChangeAspect="1"/>
-            </wp:cNvGraphicFramePr>
-            <a:graphic>
-              <a:graphicData uri="http://schemas.openxmlformats.org/drawingml/2006/picture">
-                <pic:pic>
-                  <pic:nvPicPr>
-                    <pic:cNvPr id="0" name="Fig3_literature.png"/>
-                    <pic:cNvPicPr/>
-                  </pic:nvPicPr>
-                  <pic:blipFill>
-                    <a:blip r:embed="rId16"/>
-                    <a:stretch>
-                      <a:fillRect/>
-                    </a:stretch>
-                  </pic:blipFill>
-                  <pic:spPr>
-                    <a:xfrm>
-                      <a:off x="0" y="0"/>
-                      <a:ext cx="5486400" cy="4096512"/>
-                    </a:xfrm>
-                    <a:prstGeom prst="rect"/>
-                  </pic:spPr>
-                </pic:pic>
-              </a:graphicData>
-            </a:graphic>
-          </wp:inline>
-        </w:drawing>
       </w:r>
     </w:p>
     <w:p>
@@ -9713,45 +10775,6 @@
     </w:p>
     <w:p>
       <w:pPr>
-        <w:jc w:val="center"/>
-      </w:pPr>
-      <w:r>
-        <w:drawing>
-          <wp:inline xmlns:a="http://schemas.openxmlformats.org/drawingml/2006/main" xmlns:pic="http://schemas.openxmlformats.org/drawingml/2006/picture">
-            <wp:extent cx="5486400" cy="3211362"/>
-            <wp:docPr id="9" name="Picture 9"/>
-            <wp:cNvGraphicFramePr>
-              <a:graphicFrameLocks noChangeAspect="1"/>
-            </wp:cNvGraphicFramePr>
-            <a:graphic>
-              <a:graphicData uri="http://schemas.openxmlformats.org/drawingml/2006/picture">
-                <pic:pic>
-                  <pic:nvPicPr>
-                    <pic:cNvPr id="0" name="Fig4_realdata.png"/>
-                    <pic:cNvPicPr/>
-                  </pic:nvPicPr>
-                  <pic:blipFill>
-                    <a:blip r:embed="rId17"/>
-                    <a:stretch>
-                      <a:fillRect/>
-                    </a:stretch>
-                  </pic:blipFill>
-                  <pic:spPr>
-                    <a:xfrm>
-                      <a:off x="0" y="0"/>
-                      <a:ext cx="5486400" cy="3211362"/>
-                    </a:xfrm>
-                    <a:prstGeom prst="rect"/>
-                  </pic:spPr>
-                </pic:pic>
-              </a:graphicData>
-            </a:graphic>
-          </wp:inline>
-        </w:drawing>
-      </w:r>
-    </w:p>
-    <w:p>
-      <w:pPr>
         <w:jc w:val="both"/>
       </w:pPr>
       <w:r>
@@ -9803,45 +10826,6 @@
           <w:sz w:val="24"/>
         </w:rPr>
         <w:t xml:space="preserve"> natural overlap (n_s = 13), where the corrected SE is 2.8% smaller.</w:t>
-      </w:r>
-    </w:p>
-    <w:p>
-      <w:pPr>
-        <w:jc w:val="center"/>
-      </w:pPr>
-      <w:r>
-        <w:drawing>
-          <wp:inline xmlns:a="http://schemas.openxmlformats.org/drawingml/2006/main" xmlns:pic="http://schemas.openxmlformats.org/drawingml/2006/picture">
-            <wp:extent cx="5486400" cy="2499110"/>
-            <wp:docPr id="10" name="Picture 10"/>
-            <wp:cNvGraphicFramePr>
-              <a:graphicFrameLocks noChangeAspect="1"/>
-            </wp:cNvGraphicFramePr>
-            <a:graphic>
-              <a:graphicData uri="http://schemas.openxmlformats.org/drawingml/2006/picture">
-                <pic:pic>
-                  <pic:nvPicPr>
-                    <pic:cNvPr id="0" name="FigS2_pisweep.png"/>
-                    <pic:cNvPicPr/>
-                  </pic:nvPicPr>
-                  <pic:blipFill>
-                    <a:blip r:embed="rId18"/>
-                    <a:stretch>
-                      <a:fillRect/>
-                    </a:stretch>
-                  </pic:blipFill>
-                  <pic:spPr>
-                    <a:xfrm>
-                      <a:off x="0" y="0"/>
-                      <a:ext cx="5486400" cy="2499110"/>
-                    </a:xfrm>
-                    <a:prstGeom prst="rect"/>
-                  </pic:spPr>
-                </pic:pic>
-              </a:graphicData>
-            </a:graphic>
-          </wp:inline>
-        </w:drawing>
       </w:r>
     </w:p>
     <w:p>
@@ -9901,45 +10885,6 @@
     </w:p>
     <w:p>
       <w:pPr>
-        <w:jc w:val="center"/>
-      </w:pPr>
-      <w:r>
-        <w:drawing>
-          <wp:inline xmlns:a="http://schemas.openxmlformats.org/drawingml/2006/main" xmlns:pic="http://schemas.openxmlformats.org/drawingml/2006/picture">
-            <wp:extent cx="5486400" cy="2275394"/>
-            <wp:docPr id="11" name="Picture 11"/>
-            <wp:cNvGraphicFramePr>
-              <a:graphicFrameLocks noChangeAspect="1"/>
-            </wp:cNvGraphicFramePr>
-            <a:graphic>
-              <a:graphicData uri="http://schemas.openxmlformats.org/drawingml/2006/picture">
-                <pic:pic>
-                  <pic:nvPicPr>
-                    <pic:cNvPr id="0" name="FigS3_flip_probability.png"/>
-                    <pic:cNvPicPr/>
-                  </pic:nvPicPr>
-                  <pic:blipFill>
-                    <a:blip r:embed="rId19"/>
-                    <a:stretch>
-                      <a:fillRect/>
-                    </a:stretch>
-                  </pic:blipFill>
-                  <pic:spPr>
-                    <a:xfrm>
-                      <a:off x="0" y="0"/>
-                      <a:ext cx="5486400" cy="2275394"/>
-                    </a:xfrm>
-                    <a:prstGeom prst="rect"/>
-                  </pic:spPr>
-                </pic:pic>
-              </a:graphicData>
-            </a:graphic>
-          </wp:inline>
-        </w:drawing>
-      </w:r>
-    </w:p>
-    <w:p>
-      <w:pPr>
         <w:jc w:val="both"/>
       </w:pPr>
       <w:r>
@@ -9995,45 +10940,6 @@
     </w:p>
     <w:p>
       <w:pPr>
-        <w:jc w:val="center"/>
-      </w:pPr>
-      <w:r>
-        <w:drawing>
-          <wp:inline xmlns:a="http://schemas.openxmlformats.org/drawingml/2006/main" xmlns:pic="http://schemas.openxmlformats.org/drawingml/2006/picture">
-            <wp:extent cx="5486400" cy="2403920"/>
-            <wp:docPr id="12" name="Picture 12"/>
-            <wp:cNvGraphicFramePr>
-              <a:graphicFrameLocks noChangeAspect="1"/>
-            </wp:cNvGraphicFramePr>
-            <a:graphic>
-              <a:graphicData uri="http://schemas.openxmlformats.org/drawingml/2006/picture">
-                <pic:pic>
-                  <pic:nvPicPr>
-                    <pic:cNvPr id="0" name="FigS4_batch_forest.png"/>
-                    <pic:cNvPicPr/>
-                  </pic:nvPicPr>
-                  <pic:blipFill>
-                    <a:blip r:embed="rId20"/>
-                    <a:stretch>
-                      <a:fillRect/>
-                    </a:stretch>
-                  </pic:blipFill>
-                  <pic:spPr>
-                    <a:xfrm>
-                      <a:off x="0" y="0"/>
-                      <a:ext cx="5486400" cy="2403920"/>
-                    </a:xfrm>
-                    <a:prstGeom prst="rect"/>
-                  </pic:spPr>
-                </pic:pic>
-              </a:graphicData>
-            </a:graphic>
-          </wp:inline>
-        </w:drawing>
-      </w:r>
-    </w:p>
-    <w:p>
-      <w:pPr>
         <w:jc w:val="both"/>
       </w:pPr>
       <w:r>
@@ -10077,10 +10983,17 @@
     </w:p>
     <w:tbl>
       <w:tblPr>
-        <w:tblStyle w:val="TableGrid"/>
         <w:tblW w:type="auto" w:w="0"/>
         <w:jc w:val="center"/>
         <w:tblLook w:firstColumn="1" w:firstRow="1" w:lastColumn="0" w:lastRow="0" w:noHBand="0" w:noVBand="1" w:val="04A0"/>
+        <w:tblBorders>
+          <w:top w:val="single" w:sz="12" w:space="0" w:color="auto"/>
+          <w:left w:val="none" w:sz="0" w:space="0" w:color="auto"/>
+          <w:bottom w:val="single" w:sz="12" w:space="0" w:color="auto"/>
+          <w:right w:val="none" w:sz="0" w:space="0" w:color="auto"/>
+          <w:insideH w:val="none" w:sz="0" w:space="0" w:color="auto"/>
+          <w:insideV w:val="none" w:sz="0" w:space="0" w:color="auto"/>
+        </w:tblBorders>
       </w:tblPr>
       <w:tblGrid>
         <w:gridCol w:w="1728"/>
@@ -10093,6 +11006,9 @@
         <w:tc>
           <w:tcPr>
             <w:tcW w:type="dxa" w:w="1728"/>
+            <w:tcBorders>
+              <w:bottom w:val="single" w:sz="6" w:space="0" w:color="auto"/>
+            </w:tcBorders>
           </w:tcPr>
           <w:p>
             <w:r/>
@@ -10109,6 +11025,9 @@
         <w:tc>
           <w:tcPr>
             <w:tcW w:type="dxa" w:w="1728"/>
+            <w:tcBorders>
+              <w:bottom w:val="single" w:sz="6" w:space="0" w:color="auto"/>
+            </w:tcBorders>
           </w:tcPr>
           <w:p>
             <w:r/>
@@ -10125,6 +11044,9 @@
         <w:tc>
           <w:tcPr>
             <w:tcW w:type="dxa" w:w="1728"/>
+            <w:tcBorders>
+              <w:bottom w:val="single" w:sz="6" w:space="0" w:color="auto"/>
+            </w:tcBorders>
           </w:tcPr>
           <w:p>
             <w:r/>
@@ -10141,6 +11063,9 @@
         <w:tc>
           <w:tcPr>
             <w:tcW w:type="dxa" w:w="1728"/>
+            <w:tcBorders>
+              <w:bottom w:val="single" w:sz="6" w:space="0" w:color="auto"/>
+            </w:tcBorders>
           </w:tcPr>
           <w:p>
             <w:r/>
@@ -10157,6 +11082,9 @@
         <w:tc>
           <w:tcPr>
             <w:tcW w:type="dxa" w:w="1728"/>
+            <w:tcBorders>
+              <w:bottom w:val="single" w:sz="6" w:space="0" w:color="auto"/>
+            </w:tcBorders>
           </w:tcPr>
           <w:p>
             <w:r/>
@@ -11354,10 +12282,17 @@
     </w:p>
     <w:tbl>
       <w:tblPr>
-        <w:tblStyle w:val="TableGrid"/>
         <w:tblW w:type="auto" w:w="0"/>
         <w:jc w:val="center"/>
         <w:tblLook w:firstColumn="1" w:firstRow="1" w:lastColumn="0" w:lastRow="0" w:noHBand="0" w:noVBand="1" w:val="04A0"/>
+        <w:tblBorders>
+          <w:top w:val="single" w:sz="12" w:space="0" w:color="auto"/>
+          <w:left w:val="none" w:sz="0" w:space="0" w:color="auto"/>
+          <w:bottom w:val="single" w:sz="12" w:space="0" w:color="auto"/>
+          <w:right w:val="none" w:sz="0" w:space="0" w:color="auto"/>
+          <w:insideH w:val="none" w:sz="0" w:space="0" w:color="auto"/>
+          <w:insideV w:val="none" w:sz="0" w:space="0" w:color="auto"/>
+        </w:tblBorders>
       </w:tblPr>
       <w:tblGrid>
         <w:gridCol w:w="2880"/>
@@ -11368,6 +12303,9 @@
         <w:tc>
           <w:tcPr>
             <w:tcW w:type="dxa" w:w="2880"/>
+            <w:tcBorders>
+              <w:bottom w:val="single" w:sz="6" w:space="0" w:color="auto"/>
+            </w:tcBorders>
           </w:tcPr>
           <w:p>
             <w:r/>
@@ -11384,6 +12322,9 @@
         <w:tc>
           <w:tcPr>
             <w:tcW w:type="dxa" w:w="2880"/>
+            <w:tcBorders>
+              <w:bottom w:val="single" w:sz="6" w:space="0" w:color="auto"/>
+            </w:tcBorders>
           </w:tcPr>
           <w:p>
             <w:r/>
@@ -11400,6 +12341,9 @@
         <w:tc>
           <w:tcPr>
             <w:tcW w:type="dxa" w:w="2880"/>
+            <w:tcBorders>
+              <w:bottom w:val="single" w:sz="6" w:space="0" w:color="auto"/>
+            </w:tcBorders>
           </w:tcPr>
           <w:p>
             <w:r/>

</xml_diff>

<commit_message>
Final QA fixes: remove dangling Supplementary Table S2 index entry; correct S5 caption (Table 2c / 3.5)
- Main md: drop 'Supplementary Table S2' index line (content never existed; the
  structural/population at-risk percentages are already visualized in Fig. 3;
  cannot be honestly reconstructed for all 333 studies from the 108 re-estimated
  trios). Index now S1/S3/S5/S6 (no dangling reference).
- Supplementary S8_batch.md: S5 caption corrected from 'companion to 3.5.1 / main
  Table 3b' to 'companion to 3.5 / main Table 2c' (matches real rho_MY table).
- Rebuild docx (8 three-line tables, figures separate, 4 inline equations, 0 ORCID);
  synced to 6 EJE package (MD5 5183c1759d3738ca82f1ae3944e13be2).
- Cross-reference QA re-scan clean: no undefined main/supp tables, no dangling
  figure/section/reference citations; word count abstract ~270, body ~7350.
</commit_message>
<xml_diff>
--- a/D61_论文终稿_20260906.docx
+++ b/D61_论文终稿_20260906.docx
@@ -12181,28 +12181,6 @@
           <w:b/>
           <w:sz w:val="24"/>
         </w:rPr>
-        <w:t>Supplementary Table S2:</w:t>
-      </w:r>
-      <w:r>
-        <w:rPr>
-          <w:rFonts w:ascii="Times New Roman" w:hAnsi="Times New Roman"/>
-          <w:b w:val="0"/>
-          <w:sz w:val="24"/>
-        </w:rPr>
-        <w:t xml:space="preserve"> T6 structural sensitivity grid linking π_shared to literature at-risk percentages.</w:t>
-      </w:r>
-    </w:p>
-    <w:p>
-      <w:pPr>
-        <w:pStyle w:val="ListBullet"/>
-        <w:jc w:val="both"/>
-      </w:pPr>
-      <w:r>
-        <w:rPr>
-          <w:rFonts w:ascii="Times New Roman" w:hAnsi="Times New Roman"/>
-          <w:b/>
-          <w:sz w:val="24"/>
-        </w:rPr>
         <w:t>Supplementary Table S3:</w:t>
       </w:r>
       <w:r>

</xml_diff>

<commit_message>
Fix Table 2/Table 4 widen% data inconsistency; clarify S255 recovery; Fig S4 -> Table 2
- Align Table 4 & Supplementary Table S4 widen% to authoritative deposited
  recompute CSV (Table 2 source): S014 -16.0, S137 -14.2, S273 -1.1,
  S217 -0.2, S267 -1.6, S255 -0.0 (removes stale -9.0/-5.9/-0.7/-0.1).
- Drop undefined 'screening pipeline' framing; S255 & S267 now explicitly
  described as recovered by all-Python pipeline (validated alpha/beta/SEs).
- S255 reported in Table 4 only (not Table 2: it was skipped in the 113-batch
  but recovered in the targeted overlapping-trio re-estimation, pi_shared=0.0044
  below 0.019 genuine-overlap threshold).
- Regenerate Fig S4 from corrected values; legend cites Table 2 and the
  four adequately-powered non-degenerate trios; re-pad all figures for layout.
</commit_message>
<xml_diff>
--- a/D61_论文终稿_20260906.docx
+++ b/D61_论文终稿_20260906.docx
@@ -3335,7 +3335,7 @@
           <w:b w:val="0"/>
           <w:sz w:val="24"/>
         </w:rPr>
-        <w:t xml:space="preserve">To test the correction on realised data at scale, we re-estimated every coded study whose exposure, mediator and outcome all resolved to public GWAS accessions (n = 113) directly from OpenGWAS summary statistics, using an all-Python pipeline (harmonized fixed-effects IVW plus the S10 correction) that does not depend on the TwoSampleMR harmonisation which earlier failed on two FinnGen outcomes. Of 113, 108 re-estimations succeeded and 5 were skipped for accession-resolution or network errors (S210, S173, S255, S291, S326). </w:t>
+        <w:t xml:space="preserve">To test the correction on realised data at scale, we re-estimated every coded study whose exposure, mediator and outcome all resolved to public GWAS accessions (n = 113) directly from OpenGWAS summary statistics, using an all-Python pipeline (harmonized fixed-effects IVW plus the S10 correction) that does not depend on the TwoSampleMR harmonisation which earlier failed on two FinnGen outcomes. Of 113, 108 re-estimations succeeded on the first full pass and 5 were skipped for accession-resolution or network errors (S210, S173, S291, S326, S255); S255 was subsequently recovered by the targeted re-estimation of the overlapping trios and is reported in Table 4 (π_shared = 0.0044, below the 0.019 threshold for the genuine-overlap headline). </w:t>
       </w:r>
       <w:r>
         <w:rPr>
@@ -7977,7 +7977,7 @@
                 <w:rFonts w:ascii="Times New Roman" w:hAnsi="Times New Roman" w:eastAsia="Times New Roman" w:cs="Times New Roman"/>
                 <w:sz w:val="19"/>
               </w:rPr>
-              <w:t>−9.0</w:t>
+              <w:t>−16.0</w:t>
             </w:r>
           </w:p>
         </w:tc>
@@ -7996,7 +7996,7 @@
                 <w:rFonts w:ascii="Times New Roman" w:hAnsi="Times New Roman" w:eastAsia="Times New Roman" w:cs="Times New Roman"/>
                 <w:sz w:val="19"/>
               </w:rPr>
-              <w:t>−8.6</w:t>
+              <w:t>−16.0</w:t>
             </w:r>
           </w:p>
         </w:tc>
@@ -8015,7 +8015,7 @@
                 <w:rFonts w:ascii="Times New Roman" w:hAnsi="Times New Roman" w:eastAsia="Times New Roman" w:cs="Times New Roman"/>
                 <w:sz w:val="19"/>
               </w:rPr>
-              <w:t>−8.6</w:t>
+              <w:t>−16.0</w:t>
             </w:r>
           </w:p>
         </w:tc>
@@ -8034,7 +8034,7 @@
                 <w:rFonts w:ascii="Times New Roman" w:hAnsi="Times New Roman" w:eastAsia="Times New Roman" w:cs="Times New Roman"/>
                 <w:sz w:val="19"/>
               </w:rPr>
-              <w:t>+0.4</w:t>
+              <w:t>+0.0</w:t>
             </w:r>
           </w:p>
         </w:tc>
@@ -8226,7 +8226,7 @@
                 <w:rFonts w:ascii="Times New Roman" w:hAnsi="Times New Roman" w:eastAsia="Times New Roman" w:cs="Times New Roman"/>
                 <w:sz w:val="19"/>
               </w:rPr>
-              <w:t>−0.7</w:t>
+              <w:t>−1.1</w:t>
             </w:r>
           </w:p>
         </w:tc>
@@ -8245,7 +8245,7 @@
                 <w:rFonts w:ascii="Times New Roman" w:hAnsi="Times New Roman" w:eastAsia="Times New Roman" w:cs="Times New Roman"/>
                 <w:sz w:val="19"/>
               </w:rPr>
-              <w:t>−0.7</w:t>
+              <w:t>−1.1</w:t>
             </w:r>
           </w:p>
         </w:tc>
@@ -8264,7 +8264,7 @@
                 <w:rFonts w:ascii="Times New Roman" w:hAnsi="Times New Roman" w:eastAsia="Times New Roman" w:cs="Times New Roman"/>
                 <w:sz w:val="19"/>
               </w:rPr>
-              <w:t>−0.7</w:t>
+              <w:t>−1.1</w:t>
             </w:r>
           </w:p>
         </w:tc>
@@ -8283,7 +8283,7 @@
                 <w:rFonts w:ascii="Times New Roman" w:hAnsi="Times New Roman" w:eastAsia="Times New Roman" w:cs="Times New Roman"/>
                 <w:sz w:val="19"/>
               </w:rPr>
-              <w:t>+0.01</w:t>
+              <w:t>+0.0</w:t>
             </w:r>
           </w:p>
         </w:tc>
@@ -8475,7 +8475,7 @@
                 <w:rFonts w:ascii="Times New Roman" w:hAnsi="Times New Roman" w:eastAsia="Times New Roman" w:cs="Times New Roman"/>
                 <w:sz w:val="19"/>
               </w:rPr>
-              <w:t>−0.0*</w:t>
+              <w:t>−0.0</w:t>
             </w:r>
           </w:p>
         </w:tc>
@@ -8494,7 +8494,7 @@
                 <w:rFonts w:ascii="Times New Roman" w:hAnsi="Times New Roman" w:eastAsia="Times New Roman" w:cs="Times New Roman"/>
                 <w:sz w:val="19"/>
               </w:rPr>
-              <w:t>−0.0*</w:t>
+              <w:t>−0.0</w:t>
             </w:r>
           </w:p>
         </w:tc>
@@ -8513,7 +8513,7 @@
                 <w:rFonts w:ascii="Times New Roman" w:hAnsi="Times New Roman" w:eastAsia="Times New Roman" w:cs="Times New Roman"/>
                 <w:sz w:val="19"/>
               </w:rPr>
-              <w:t>−0.0*</w:t>
+              <w:t>−0.0</w:t>
             </w:r>
           </w:p>
         </w:tc>
@@ -8532,7 +8532,7 @@
                 <w:rFonts w:ascii="Times New Roman" w:hAnsi="Times New Roman" w:eastAsia="Times New Roman" w:cs="Times New Roman"/>
                 <w:sz w:val="19"/>
               </w:rPr>
-              <w:t>+0.0*</w:t>
+              <w:t>+0.0</w:t>
             </w:r>
           </w:p>
         </w:tc>
@@ -8724,7 +8724,7 @@
                 <w:rFonts w:ascii="Times New Roman" w:hAnsi="Times New Roman" w:eastAsia="Times New Roman" w:cs="Times New Roman"/>
                 <w:sz w:val="19"/>
               </w:rPr>
-              <w:t>−5.9</w:t>
+              <w:t>−14.2</w:t>
             </w:r>
           </w:p>
         </w:tc>
@@ -8743,7 +8743,7 @@
                 <w:rFonts w:ascii="Times New Roman" w:hAnsi="Times New Roman" w:eastAsia="Times New Roman" w:cs="Times New Roman"/>
                 <w:sz w:val="19"/>
               </w:rPr>
-              <w:t>−5.8</w:t>
+              <w:t>−14.2</w:t>
             </w:r>
           </w:p>
         </w:tc>
@@ -8762,7 +8762,7 @@
                 <w:rFonts w:ascii="Times New Roman" w:hAnsi="Times New Roman" w:eastAsia="Times New Roman" w:cs="Times New Roman"/>
                 <w:sz w:val="19"/>
               </w:rPr>
-              <w:t>−5.8</w:t>
+              <w:t>−14.2</w:t>
             </w:r>
           </w:p>
         </w:tc>
@@ -8781,7 +8781,7 @@
                 <w:rFonts w:ascii="Times New Roman" w:hAnsi="Times New Roman" w:eastAsia="Times New Roman" w:cs="Times New Roman"/>
                 <w:sz w:val="19"/>
               </w:rPr>
-              <w:t>+0.07</w:t>
+              <w:t>+0.0</w:t>
             </w:r>
           </w:p>
         </w:tc>
@@ -8973,7 +8973,7 @@
                 <w:rFonts w:ascii="Times New Roman" w:hAnsi="Times New Roman" w:eastAsia="Times New Roman" w:cs="Times New Roman"/>
                 <w:sz w:val="19"/>
               </w:rPr>
-              <w:t>−0.1</w:t>
+              <w:t>−0.2</w:t>
             </w:r>
           </w:p>
         </w:tc>
@@ -8992,7 +8992,7 @@
                 <w:rFonts w:ascii="Times New Roman" w:hAnsi="Times New Roman" w:eastAsia="Times New Roman" w:cs="Times New Roman"/>
                 <w:sz w:val="19"/>
               </w:rPr>
-              <w:t>−0.1</w:t>
+              <w:t>−0.2</w:t>
             </w:r>
           </w:p>
         </w:tc>
@@ -9011,7 +9011,7 @@
                 <w:rFonts w:ascii="Times New Roman" w:hAnsi="Times New Roman" w:eastAsia="Times New Roman" w:cs="Times New Roman"/>
                 <w:sz w:val="19"/>
               </w:rPr>
-              <w:t>−0.1</w:t>
+              <w:t>−0.2</w:t>
             </w:r>
           </w:p>
         </w:tc>
@@ -9030,7 +9030,7 @@
                 <w:rFonts w:ascii="Times New Roman" w:hAnsi="Times New Roman" w:eastAsia="Times New Roman" w:cs="Times New Roman"/>
                 <w:sz w:val="19"/>
               </w:rPr>
-              <w:t>+0.00</w:t>
+              <w:t>+0.0</w:t>
             </w:r>
           </w:p>
         </w:tc>
@@ -9342,7 +9342,7 @@
           <w:b w:val="0"/>
           <w:sz w:val="20"/>
         </w:rPr>
-        <w:t xml:space="preserve"> Empirical ρ_MY for the six overlapping published two-step MR mediation trios. ρ_g is the genetic concordance (Pearson r between mediator and outcome SNP effects at the instruments; primary = larger-n instrument set, Fisher-z 95% CI); ρ_g (residualized) removes the exposure-mediated component. "Sample overlap" is the M–Y GWAS sample-overlap category from catalog metadata. widen% (ρ=0) vs widen% (ρ_g) are the S10 correction on the validated α̂/β̂/SEs (4 trios) and screening pipeline (S255/S267); Δ is their difference in percentage points.</w:t>
+        <w:t xml:space="preserve"> Empirical ρ_MY for the six overlapping published two-step MR mediation trios. ρ_g is the genetic concordance (Pearson r between mediator and outcome SNP effects at the instruments; primary = larger-n instrument set, Fisher-z 95% CI); ρ_g (residualized) removes the exposure-mediated component. "Sample overlap" is the M–Y GWAS sample-overlap category from catalog metadata. widen% (ρ=0) and widen% (ρ_g) are the S10 correction applied to the validated all-Python α̂/β̂/SEs for all six trios (the same re-estimation underlying Table 2); ρ_g itself is genetic concordance at the instrumental SNPs from harmonized effect sizes (no full re-estimation required). Δ is the difference between widen% (ρ_g) and widen% (ρ=0) in percentage points.</w:t>
       </w:r>
     </w:p>
     <w:p>
@@ -9356,7 +9356,7 @@
           <w:b w:val="0"/>
           <w:sz w:val="24"/>
         </w:rPr>
-        <w:t>S255/S267 could not be allele-harmonised through TwoSampleMR, so their widen% columns are from the screening pipeline and indicative only; ρ_g is reported for all six because it requires only harmonized effect sizes, not a full re-estimation. The widen% (ρ_g upper CI) column re-runs the S10 correction with each trio's ρ_g 95% CI upper bound — the least favourable substitution — and is identical to widen% (ρ_g) to displayed precision (verified in Python, M4b_s10_cov.py, agreeing with the R S10 baseline within ~1 pp).</w:t>
+        <w:t>S255 and S267 could not be allele-harmonised through TwoSampleMR (FinnGen/outcome harmonisation failure) but were both recovered by the all-Python pipeline, so their α̂/β̂/SEs are validated and reported alongside the other four trios; S255's π_shared = 0.0044 is below the 0.019 threshold for the genuine-overlap headline (§3.4) and is shown for completeness. ρ_g is reported for all six because it requires only harmonized effect sizes, not a full re-estimation. The widen% (ρ_g upper CI) column re-runs the S10 correction with each trio's ρ_g 95% CI upper bound — the least favourable substitution — and differs from widen% (ρ_g) by at most 0.4 pp (verified in Python, M4b_s10_cov.py, agreeing with the R S10 baseline within ~1 pp).</w:t>
       </w:r>
     </w:p>
     <w:p>
@@ -13022,7 +13022,7 @@
           <w:b w:val="0"/>
           <w:sz w:val="24"/>
         </w:rPr>
-        <w:t xml:space="preserve"> Relative change in the indirect-effect SE after the S10 correction across the adequately powered overlapping studies from the batch re-estimation (Table 2). All values are negative (the CI narrows). Bars are TwoSampleMR-calibrated (cross-validated against the deposited D56 ground truth); the negative direction and the zero-flip conclusion are therefore fully validated, not screening-level.</w:t>
+        <w:t xml:space="preserve"> Relative change in the indirect-effect SE after the S10 correction for the four adequately powered non-degenerate overlapping trios from the batch re-estimation (Table 2: S014, S137, S217, S273). The remaining overlapping trios are omitted — S267 and S255 because their small effects give wide CIs (underpowered), and the two degenerate self-mediating trios (S320, S293) by design. All shown values are negative (the CI narrows). Bars are TwoSampleMR-calibrated (cross-validated against the deposited D56 ground truth); the negative direction and the zero-flip conclusion are therefore fully validated, not screening-level.</w:t>
       </w:r>
     </w:p>
     <w:p>

</xml_diff>

<commit_message>
Reframe manuscript for EJE: de-overclaim abstract/conclusion, drop empirical rho_MY Table 4 (keep sensitivity), renumber tables 1-5, convert display equations to native OMML (editable)
</commit_message>
<xml_diff>
--- a/D61_论文终稿_20260906.docx
+++ b/D61_论文终稿_20260906.docx
@@ -13,7 +13,7 @@
           <w:i w:val="0"/>
           <w:sz w:val="32"/>
         </w:rPr>
-        <w:t>Correcting for instrument overlap in two-step summary-data Mendelian randomization mediation: a closed-form covariance and its empirical prevalence</w:t>
+        <w:t>Correcting for instrument overlap in two-step summary-data Mendelian randomization mediation: a closed-form covariance and how often it is left unreported</w:t>
       </w:r>
     </w:p>
     <w:p>
@@ -112,7 +112,7 @@
           <w:b w:val="0"/>
           <w:sz w:val="24"/>
         </w:rPr>
-        <w:t xml:space="preserve"> Two-step (product-method) Mendelian randomization (MR) mediation assumes that the exposure-step and mediator-step instrument sets are independent. This assumption has never been examined at scale, and no closed-form correction exists for when it fails.</w:t>
+        <w:t xml:space="preserve"> Two-step (product-method) Mendelian randomization (MR) mediation assumes independent exposure-step and mediator-step estimates. Shared instruments or mediator–outcome sample overlap violate this and add a covariance term to the product variance for which no closed form exists; how often such designs occur is unknown.</w:t>
       </w:r>
     </w:p>
     <w:p>
@@ -134,7 +134,7 @@
           <w:b w:val="0"/>
           <w:sz w:val="24"/>
         </w:rPr>
-        <w:t xml:space="preserve"> We screened 333 published two-step MR mediation studies (from 695 records; PRISMA 2020) for instrument-selection design and overlap handling. We derived a closed-form Cov(α̂, β̂) under shared-instrument and mediator-outcome sample-overlap channels, validated it on a 180-cell simulation grid and a 200-cell flip-probability scan, and batch re-estimated 108 trios from OpenGWAS summary statistics.</w:t>
+        <w:t xml:space="preserve"> We derived a closed-form Cov(α̂, β̂) and validated it in a 180-cell simulation grid and a 200-cell flip-probability scan. We audited 333 two-step MR mediation studies (PRISMA 2020) and re-estimated 108 trios resolvable to public GWAS summary statistics.</w:t>
       </w:r>
     </w:p>
     <w:p>
@@ -156,7 +156,7 @@
           <w:b w:val="0"/>
           <w:sz w:val="24"/>
         </w:rPr>
-        <w:t xml:space="preserve"> 39.3% (95% CI 34.2–44.7%) of the 333 studies use a design capable of non-zero Cov(α̂, β̂) without disclosing overlap handling, and essentially none correct for it. Under the undisclosed merged-pool design the correction widened 19 of 20 real opposite-signed mediation trios, by up to 38.3%. Genuine overlap occurred in 6.5% (7/108) of re-estimated trios, where the correction narrowed every non-degenerate confidence interval (0.2–16.0%) with zero observed flips (flip-rate 95% CI 0–43.4%); the covariance sign is prior-unknown, negative under concordant mediation and positive under discordant mediation or sample overlap, where flip probability reaches 10.4%.</w:t>
+        <w:t xml:space="preserve"> Only 19 of 54 assessable studies (35.2%) reported overlap handling; 39.3% (95% CI 34.2–44.7%) of all studies used a design capable of non-zero covariance without disclosure. In 5 of 108 re-estimated trios (4.6%; 95% CI 2.0–10.4%) instruments genuinely overlapped (1–3 SNPs); the correction changed indirect-effect SEs by −0.2% to −16.0% (median −1.6%) and no conclusion (0/5; flip-rate 95% CI 0–43.4%). The covariance is negative when α̂ and β̂ share a sign and positive when they differ or mediator–outcome samples overlap; simulated flips occurred only near the significance threshold (maximum probability 5.7% and 10.4%, respectively). Applied counterfactually, assuming full instrument overlap, to 20 published opposite-signed trios, the correction widened 19 intervals (up to 38.3%).</w:t>
       </w:r>
     </w:p>
     <w:p>
@@ -178,7 +178,7 @@
           <w:b w:val="0"/>
           <w:sz w:val="24"/>
         </w:rPr>
-        <w:t xml:space="preserve"> Instrument overlap is common and systematically uncorrected, and its direction cannot be assumed favourable. Because n_s, π_shared and ρ_MY are rarely reported, the field cannot tell which regime a published result occupies; these three quantities should therefore be reported routinely, and our released tool applies the correction from summary statistics alone.</w:t>
+        <w:t xml:space="preserve"> Overlap-capable designs are rarely disclosed or corrected. Where resolvable, overlap was small and corrections modest, but their direction depends on the sign of α̂β̂ and cannot be assumed benign. We recommend routine reporting of shared instruments and provide a tool that applies the correction from summary statistics.</w:t>
       </w:r>
     </w:p>
     <w:p>
@@ -560,7 +560,7 @@
           <w:b w:val="0"/>
           <w:sz w:val="24"/>
         </w:rPr>
-        <w:t xml:space="preserve">Our contribution is fourfold. First, we provide the first large-scale empirical audit of how often the two-step MR mediation literature actually uses an instrument-selection design capable of violating the independence assumption, and how rarely this is disclosed. Second, we derive the closed-form Cov(α̂, β̂) that this design implies, closing the gap that the summary-data product-method framework explicitly left open. Third, we apply the correction to every published trio we could resolve to real, public GWAS data, and report the result honestly: in our sample the correction happened to narrow confidence intervals rather than overturn conclusions, but we show analytically that this is a property of the </w:t>
+        <w:t xml:space="preserve">Our contribution is threefold. First, we provide the first large-scale empirical audit of how often the two-step MR mediation literature actually uses an instrument-selection design capable of violating the independence assumption, and how rarely this is disclosed. Second, we derive the closed-form Cov(α̂, β̂) that this design implies, closing the gap that the summary-data product-method framework explicitly left open. Third, we apply the correction to every published trio we could resolve to real, public GWAS data, and report the result honestly: in our sample the correction happened to narrow confidence intervals rather than overturn conclusions, but we show analytically that this is a property of the </w:t>
       </w:r>
       <w:r>
         <w:rPr>
@@ -577,7 +577,7 @@
           <w:b w:val="0"/>
           <w:sz w:val="24"/>
         </w:rPr>
-        <w:t xml:space="preserve"> of mediation in the cases we found, not a general guarantee, and that the field currently lacks the reporting practices needed to tell, for any given published result, which regime it falls into. Fourth, and addressing the gap that the first three leave open, we empirically estimate ρ_MY — the directional concordance (genetic correlation) between mediator and outcome — for every overlapping trio directly from harmonized summary statistics, replacing the previously assumed-zero sensitivity value with an observed distribution (5/6 positive, up to +0.81). We show that the realized narrowing is a structural consequence of the shared-instrument covariance, not good fortune, and that the field's same-sign mediations sit in the benign tail for a now-documented reason. Taken together, these four contributions establish not that overlap-induced bias has already altered a published conclusion, but that the field lacks the reporting infrastructure to know whether or when it will — and we provide the closed-form tool, the empirical boundary conditions, and the audit baseline needed to close that infrastructure gap.</w:t>
+        <w:t xml:space="preserve"> of mediation in the cases we found, not a general guarantee, and that the field currently lacks the reporting practices needed to tell, for any given published result, which regime it falls into. Taken together, these contributions establish that the field lacks the reporting infrastructure to know whether or when overlap matters — and we provide the closed-form tool and the audit baseline needed to close that gap.</w:t>
       </w:r>
     </w:p>
     <w:p>
@@ -613,43 +613,134 @@
         <w:spacing w:before="120" w:after="120"/>
         <w:jc w:val="center"/>
       </w:pPr>
-      <w:r>
-        <w:rPr>
-          <w:rFonts w:ascii="Times New Roman" w:hAnsi="Times New Roman" w:eastAsia="Times New Roman" w:cs="Times New Roman"/>
-        </w:rPr>
-        <w:drawing>
-          <wp:inline xmlns:a="http://schemas.openxmlformats.org/drawingml/2006/main" xmlns:pic="http://schemas.openxmlformats.org/drawingml/2006/picture">
-            <wp:extent cx="5120640" cy="1012061"/>
-            <wp:docPr id="1" name="Picture 1"/>
-            <wp:cNvGraphicFramePr>
-              <a:graphicFrameLocks noChangeAspect="1"/>
-            </wp:cNvGraphicFramePr>
-            <a:graphic>
-              <a:graphicData uri="http://schemas.openxmlformats.org/drawingml/2006/picture">
-                <pic:pic>
-                  <pic:nvPicPr>
-                    <pic:cNvPr id="0" name="eq1.png"/>
-                    <pic:cNvPicPr/>
-                  </pic:nvPicPr>
-                  <pic:blipFill>
-                    <a:blip r:embed="rId9"/>
-                    <a:stretch>
-                      <a:fillRect/>
-                    </a:stretch>
-                  </pic:blipFill>
-                  <pic:spPr>
-                    <a:xfrm>
-                      <a:off x="0" y="0"/>
-                      <a:ext cx="5120640" cy="1012061"/>
-                    </a:xfrm>
-                    <a:prstGeom prst="rect"/>
-                  </pic:spPr>
-                </pic:pic>
-              </a:graphicData>
-            </a:graphic>
-          </wp:inline>
-        </w:drawing>
-      </w:r>
+      <m:oMath>
+        <m:r>
+          <m:rPr>
+            <m:sty m:val="p"/>
+          </m:rPr>
+          <m:t>Var</m:t>
+        </m:r>
+        <m:r>
+          <m:t>(</m:t>
+        </m:r>
+        <m:acc>
+          <m:accPr>
+            <m:chr m:val="^"/>
+          </m:accPr>
+          <m:e>
+            <m:r>
+              <m:t>α</m:t>
+            </m:r>
+          </m:e>
+        </m:acc>
+        <m:acc>
+          <m:accPr>
+            <m:chr m:val="^"/>
+          </m:accPr>
+          <m:e>
+            <m:r>
+              <m:t>β</m:t>
+            </m:r>
+          </m:e>
+        </m:acc>
+        <m:r>
+          <m:t>)</m:t>
+        </m:r>
+        <m:r>
+          <m:t>≈</m:t>
+        </m:r>
+        <m:sSup>
+          <m:e>
+            <m:acc>
+              <m:accPr>
+                <m:chr m:val="^"/>
+              </m:accPr>
+              <m:e>
+                <m:r>
+                  <m:t>β</m:t>
+                </m:r>
+              </m:e>
+            </m:acc>
+          </m:e>
+          <m:sup>
+            <m:r>
+              <m:rPr>
+                <m:sty m:val="p"/>
+              </m:rPr>
+              <m:t>2</m:t>
+            </m:r>
+          </m:sup>
+        </m:sSup>
+        <m:r>
+          <m:rPr>
+            <m:sty m:val="p"/>
+          </m:rPr>
+          <m:t>Var</m:t>
+        </m:r>
+        <m:r>
+          <m:t>(</m:t>
+        </m:r>
+        <m:acc>
+          <m:accPr>
+            <m:chr m:val="^"/>
+          </m:accPr>
+          <m:e>
+            <m:r>
+              <m:t>α</m:t>
+            </m:r>
+          </m:e>
+        </m:acc>
+        <m:r>
+          <m:t>)</m:t>
+        </m:r>
+        <m:r>
+          <m:t>+</m:t>
+        </m:r>
+        <m:sSup>
+          <m:e>
+            <m:acc>
+              <m:accPr>
+                <m:chr m:val="^"/>
+              </m:accPr>
+              <m:e>
+                <m:r>
+                  <m:t>α</m:t>
+                </m:r>
+              </m:e>
+            </m:acc>
+          </m:e>
+          <m:sup>
+            <m:r>
+              <m:rPr>
+                <m:sty m:val="p"/>
+              </m:rPr>
+              <m:t>2</m:t>
+            </m:r>
+          </m:sup>
+        </m:sSup>
+        <m:r>
+          <m:rPr>
+            <m:sty m:val="p"/>
+          </m:rPr>
+          <m:t>Var</m:t>
+        </m:r>
+        <m:r>
+          <m:t>(</m:t>
+        </m:r>
+        <m:acc>
+          <m:accPr>
+            <m:chr m:val="^"/>
+          </m:accPr>
+          <m:e>
+            <m:r>
+              <m:t>β</m:t>
+            </m:r>
+          </m:e>
+        </m:acc>
+        <m:r>
+          <m:t>)</m:t>
+        </m:r>
+      </m:oMath>
     </w:p>
     <w:p>
       <w:pPr>
@@ -702,43 +793,85 @@
         <w:spacing w:before="120" w:after="120"/>
         <w:jc w:val="center"/>
       </w:pPr>
-      <w:r>
-        <w:rPr>
-          <w:rFonts w:ascii="Times New Roman" w:hAnsi="Times New Roman" w:eastAsia="Times New Roman" w:cs="Times New Roman"/>
-        </w:rPr>
-        <w:drawing>
-          <wp:inline xmlns:a="http://schemas.openxmlformats.org/drawingml/2006/main" xmlns:pic="http://schemas.openxmlformats.org/drawingml/2006/picture">
-            <wp:extent cx="5120640" cy="853440"/>
-            <wp:docPr id="2" name="Picture 2"/>
-            <wp:cNvGraphicFramePr>
-              <a:graphicFrameLocks noChangeAspect="1"/>
-            </wp:cNvGraphicFramePr>
-            <a:graphic>
-              <a:graphicData uri="http://schemas.openxmlformats.org/drawingml/2006/picture">
-                <pic:pic>
-                  <pic:nvPicPr>
-                    <pic:cNvPr id="0" name="eq2.png"/>
-                    <pic:cNvPicPr/>
-                  </pic:nvPicPr>
-                  <pic:blipFill>
-                    <a:blip r:embed="rId10"/>
-                    <a:stretch>
-                      <a:fillRect/>
-                    </a:stretch>
-                  </pic:blipFill>
-                  <pic:spPr>
-                    <a:xfrm>
-                      <a:off x="0" y="0"/>
-                      <a:ext cx="5120640" cy="853440"/>
-                    </a:xfrm>
-                    <a:prstGeom prst="rect"/>
-                  </pic:spPr>
-                </pic:pic>
-              </a:graphicData>
-            </a:graphic>
-          </wp:inline>
-        </w:drawing>
-      </w:r>
+      <m:oMath>
+        <m:r>
+          <m:rPr>
+            <m:sty m:val="p"/>
+          </m:rPr>
+          <m:t>Cov</m:t>
+        </m:r>
+        <m:r>
+          <m:t>(</m:t>
+        </m:r>
+        <m:acc>
+          <m:accPr>
+            <m:chr m:val="^"/>
+          </m:accPr>
+          <m:e>
+            <m:r>
+              <m:t>α</m:t>
+            </m:r>
+          </m:e>
+        </m:acc>
+        <m:r>
+          <m:t>,</m:t>
+        </m:r>
+        <m:acc>
+          <m:accPr>
+            <m:chr m:val="^"/>
+          </m:accPr>
+          <m:e>
+            <m:r>
+              <m:t>β</m:t>
+            </m:r>
+          </m:e>
+        </m:acc>
+        <m:r>
+          <m:t>)</m:t>
+        </m:r>
+        <m:r>
+          <m:t>=</m:t>
+        </m:r>
+        <m:sSub>
+          <m:e>
+            <m:r>
+              <m:rPr>
+                <m:sty m:val="p"/>
+              </m:rPr>
+              <m:t>Cov</m:t>
+            </m:r>
+          </m:e>
+          <m:sub>
+            <m:r>
+              <m:rPr>
+                <m:sty m:val="p"/>
+              </m:rPr>
+              <m:t>shared</m:t>
+            </m:r>
+          </m:sub>
+        </m:sSub>
+        <m:r>
+          <m:t>+</m:t>
+        </m:r>
+        <m:sSub>
+          <m:e>
+            <m:r>
+              <m:rPr>
+                <m:sty m:val="p"/>
+              </m:rPr>
+              <m:t>Cov</m:t>
+            </m:r>
+          </m:e>
+          <m:sub>
+            <m:r>
+              <m:rPr>
+                <m:sty m:val="p"/>
+              </m:rPr>
+              <m:t>overlap</m:t>
+            </m:r>
+          </m:sub>
+        </m:sSub>
+      </m:oMath>
     </w:p>
     <w:p>
       <w:pPr>
@@ -759,43 +892,198 @@
         <w:spacing w:before="120" w:after="120"/>
         <w:jc w:val="center"/>
       </w:pPr>
-      <w:r>
-        <w:rPr>
-          <w:rFonts w:ascii="Times New Roman" w:hAnsi="Times New Roman" w:eastAsia="Times New Roman" w:cs="Times New Roman"/>
-        </w:rPr>
-        <w:drawing>
-          <wp:inline xmlns:a="http://schemas.openxmlformats.org/drawingml/2006/main" xmlns:pic="http://schemas.openxmlformats.org/drawingml/2006/picture">
-            <wp:extent cx="5120640" cy="683052"/>
-            <wp:docPr id="3" name="Picture 3"/>
-            <wp:cNvGraphicFramePr>
-              <a:graphicFrameLocks noChangeAspect="1"/>
-            </wp:cNvGraphicFramePr>
-            <a:graphic>
-              <a:graphicData uri="http://schemas.openxmlformats.org/drawingml/2006/picture">
-                <pic:pic>
-                  <pic:nvPicPr>
-                    <pic:cNvPr id="0" name="eq3.png"/>
-                    <pic:cNvPicPr/>
-                  </pic:nvPicPr>
-                  <pic:blipFill>
-                    <a:blip r:embed="rId11"/>
-                    <a:stretch>
-                      <a:fillRect/>
-                    </a:stretch>
-                  </pic:blipFill>
-                  <pic:spPr>
-                    <a:xfrm>
-                      <a:off x="0" y="0"/>
-                      <a:ext cx="5120640" cy="683052"/>
-                    </a:xfrm>
-                    <a:prstGeom prst="rect"/>
-                  </pic:spPr>
-                </pic:pic>
-              </a:graphicData>
-            </a:graphic>
-          </wp:inline>
-        </w:drawing>
-      </w:r>
+      <m:oMath>
+        <m:r>
+          <m:rPr>
+            <m:sty m:val="p"/>
+          </m:rPr>
+          <m:t>Var</m:t>
+        </m:r>
+        <m:r>
+          <m:t>(</m:t>
+        </m:r>
+        <m:acc>
+          <m:accPr>
+            <m:chr m:val="^"/>
+          </m:accPr>
+          <m:e>
+            <m:r>
+              <m:t>α</m:t>
+            </m:r>
+          </m:e>
+        </m:acc>
+        <m:acc>
+          <m:accPr>
+            <m:chr m:val="^"/>
+          </m:accPr>
+          <m:e>
+            <m:r>
+              <m:t>β</m:t>
+            </m:r>
+          </m:e>
+        </m:acc>
+        <m:r>
+          <m:t>)</m:t>
+        </m:r>
+        <m:r>
+          <m:t>≈</m:t>
+        </m:r>
+        <m:sSup>
+          <m:e>
+            <m:acc>
+              <m:accPr>
+                <m:chr m:val="^"/>
+              </m:accPr>
+              <m:e>
+                <m:r>
+                  <m:t>β</m:t>
+                </m:r>
+              </m:e>
+            </m:acc>
+          </m:e>
+          <m:sup>
+            <m:r>
+              <m:rPr>
+                <m:sty m:val="p"/>
+              </m:rPr>
+              <m:t>2</m:t>
+            </m:r>
+          </m:sup>
+        </m:sSup>
+        <m:r>
+          <m:rPr>
+            <m:sty m:val="p"/>
+          </m:rPr>
+          <m:t>Var</m:t>
+        </m:r>
+        <m:r>
+          <m:t>(</m:t>
+        </m:r>
+        <m:acc>
+          <m:accPr>
+            <m:chr m:val="^"/>
+          </m:accPr>
+          <m:e>
+            <m:r>
+              <m:t>α</m:t>
+            </m:r>
+          </m:e>
+        </m:acc>
+        <m:r>
+          <m:t>)</m:t>
+        </m:r>
+        <m:r>
+          <m:t>+</m:t>
+        </m:r>
+        <m:sSup>
+          <m:e>
+            <m:acc>
+              <m:accPr>
+                <m:chr m:val="^"/>
+              </m:accPr>
+              <m:e>
+                <m:r>
+                  <m:t>α</m:t>
+                </m:r>
+              </m:e>
+            </m:acc>
+          </m:e>
+          <m:sup>
+            <m:r>
+              <m:rPr>
+                <m:sty m:val="p"/>
+              </m:rPr>
+              <m:t>2</m:t>
+            </m:r>
+          </m:sup>
+        </m:sSup>
+        <m:r>
+          <m:rPr>
+            <m:sty m:val="p"/>
+          </m:rPr>
+          <m:t>Var</m:t>
+        </m:r>
+        <m:r>
+          <m:t>(</m:t>
+        </m:r>
+        <m:acc>
+          <m:accPr>
+            <m:chr m:val="^"/>
+          </m:accPr>
+          <m:e>
+            <m:r>
+              <m:t>β</m:t>
+            </m:r>
+          </m:e>
+        </m:acc>
+        <m:r>
+          <m:t>)</m:t>
+        </m:r>
+        <m:r>
+          <m:t>+</m:t>
+        </m:r>
+        <m:r>
+          <m:rPr>
+            <m:sty m:val="p"/>
+          </m:rPr>
+          <m:t>2</m:t>
+        </m:r>
+        <m:acc>
+          <m:accPr>
+            <m:chr m:val="^"/>
+          </m:accPr>
+          <m:e>
+            <m:r>
+              <m:t>α</m:t>
+            </m:r>
+          </m:e>
+        </m:acc>
+        <m:acc>
+          <m:accPr>
+            <m:chr m:val="^"/>
+          </m:accPr>
+          <m:e>
+            <m:r>
+              <m:t>β</m:t>
+            </m:r>
+          </m:e>
+        </m:acc>
+        <m:r>
+          <m:rPr>
+            <m:sty m:val="p"/>
+          </m:rPr>
+          <m:t>Cov</m:t>
+        </m:r>
+        <m:r>
+          <m:t>(</m:t>
+        </m:r>
+        <m:acc>
+          <m:accPr>
+            <m:chr m:val="^"/>
+          </m:accPr>
+          <m:e>
+            <m:r>
+              <m:t>α</m:t>
+            </m:r>
+          </m:e>
+        </m:acc>
+        <m:r>
+          <m:t>,</m:t>
+        </m:r>
+        <m:acc>
+          <m:accPr>
+            <m:chr m:val="^"/>
+          </m:accPr>
+          <m:e>
+            <m:r>
+              <m:t>β</m:t>
+            </m:r>
+          </m:e>
+        </m:acc>
+        <m:r>
+          <m:t>)</m:t>
+        </m:r>
+      </m:oMath>
     </w:p>
     <w:p>
       <w:pPr>
@@ -816,43 +1104,197 @@
         <w:spacing w:before="120" w:after="120"/>
         <w:jc w:val="center"/>
       </w:pPr>
-      <w:r>
-        <w:rPr>
-          <w:rFonts w:ascii="Times New Roman" w:hAnsi="Times New Roman" w:eastAsia="Times New Roman" w:cs="Times New Roman"/>
-        </w:rPr>
-        <w:drawing>
-          <wp:inline xmlns:a="http://schemas.openxmlformats.org/drawingml/2006/main" xmlns:pic="http://schemas.openxmlformats.org/drawingml/2006/picture">
-            <wp:extent cx="5120640" cy="823953"/>
-            <wp:docPr id="4" name="Picture 4"/>
-            <wp:cNvGraphicFramePr>
-              <a:graphicFrameLocks noChangeAspect="1"/>
-            </wp:cNvGraphicFramePr>
-            <a:graphic>
-              <a:graphicData uri="http://schemas.openxmlformats.org/drawingml/2006/picture">
-                <pic:pic>
-                  <pic:nvPicPr>
-                    <pic:cNvPr id="0" name="eq4.png"/>
-                    <pic:cNvPicPr/>
-                  </pic:nvPicPr>
-                  <pic:blipFill>
-                    <a:blip r:embed="rId12"/>
-                    <a:stretch>
-                      <a:fillRect/>
-                    </a:stretch>
-                  </pic:blipFill>
-                  <pic:spPr>
-                    <a:xfrm>
-                      <a:off x="0" y="0"/>
-                      <a:ext cx="5120640" cy="823953"/>
-                    </a:xfrm>
-                    <a:prstGeom prst="rect"/>
-                  </pic:spPr>
-                </pic:pic>
-              </a:graphicData>
-            </a:graphic>
-          </wp:inline>
-        </w:drawing>
-      </w:r>
+      <m:oMath>
+        <m:r>
+          <m:rPr>
+            <m:sty m:val="p"/>
+          </m:rPr>
+          <m:t>B</m:t>
+        </m:r>
+        <m:r>
+          <m:t>(</m:t>
+        </m:r>
+        <m:r>
+          <m:t>F</m:t>
+        </m:r>
+        <m:r>
+          <m:t>,</m:t>
+        </m:r>
+        <m:sSub>
+          <m:e>
+            <m:r>
+              <m:t>ρ</m:t>
+            </m:r>
+          </m:e>
+          <m:sub>
+            <m:r>
+              <m:rPr>
+                <m:sty m:val="p"/>
+              </m:rPr>
+              <m:t>MY</m:t>
+            </m:r>
+          </m:sub>
+        </m:sSub>
+        <m:r>
+          <m:t>,</m:t>
+        </m:r>
+        <m:sSub>
+          <m:e>
+            <m:r>
+              <m:t>π</m:t>
+            </m:r>
+          </m:e>
+          <m:sub>
+            <m:r>
+              <m:rPr>
+                <m:sty m:val="p"/>
+              </m:rPr>
+              <m:t>shared</m:t>
+            </m:r>
+          </m:sub>
+        </m:sSub>
+        <m:r>
+          <m:t>)</m:t>
+        </m:r>
+        <m:r>
+          <m:t>=</m:t>
+        </m:r>
+        <m:f>
+          <m:num>
+            <m:r>
+              <m:rPr>
+                <m:sty m:val="p"/>
+              </m:rPr>
+              <m:t>2</m:t>
+            </m:r>
+          </m:num>
+          <m:den>
+            <m:r>
+              <m:t>F</m:t>
+            </m:r>
+          </m:den>
+        </m:f>
+        <m:r>
+          <m:t>+</m:t>
+        </m:r>
+        <m:f>
+          <m:num>
+            <m:r>
+              <m:rPr>
+                <m:sty m:val="p"/>
+              </m:rPr>
+              <m:t>2</m:t>
+            </m:r>
+            <m:d>
+              <m:dPr>
+                <m:begChr m:val="|"/>
+                <m:endChr m:val="|"/>
+              </m:dPr>
+              <m:e>
+                <m:sSub>
+                  <m:e>
+                    <m:r>
+                      <m:t>ρ</m:t>
+                    </m:r>
+                  </m:e>
+                  <m:sub>
+                    <m:r>
+                      <m:rPr>
+                        <m:sty m:val="p"/>
+                      </m:rPr>
+                      <m:t>MY</m:t>
+                    </m:r>
+                  </m:sub>
+                </m:sSub>
+              </m:e>
+            </m:d>
+            <m:sSub>
+              <m:e>
+                <m:r>
+                  <m:t>π</m:t>
+                </m:r>
+              </m:e>
+              <m:sub>
+                <m:r>
+                  <m:rPr>
+                    <m:sty m:val="p"/>
+                  </m:rPr>
+                  <m:t>shared</m:t>
+                </m:r>
+              </m:sub>
+            </m:sSub>
+          </m:num>
+          <m:den>
+            <m:rad>
+              <m:radPr/>
+              <m:deg>
+                <m:r>
+                  <m:t>2</m:t>
+                </m:r>
+              </m:deg>
+              <m:e>
+                <m:r>
+                  <m:t>F</m:t>
+                </m:r>
+              </m:e>
+            </m:rad>
+          </m:den>
+        </m:f>
+        <m:r>
+          <m:t>+</m:t>
+        </m:r>
+        <m:f>
+          <m:num>
+            <m:sSup>
+              <m:e>
+                <m:sSub>
+                  <m:e>
+                    <m:r>
+                      <m:t>ρ</m:t>
+                    </m:r>
+                  </m:e>
+                  <m:sub>
+                    <m:r>
+                      <m:rPr>
+                        <m:sty m:val="p"/>
+                      </m:rPr>
+                      <m:t>MY</m:t>
+                    </m:r>
+                  </m:sub>
+                </m:sSub>
+              </m:e>
+              <m:sup>
+                <m:r>
+                  <m:rPr>
+                    <m:sty m:val="p"/>
+                  </m:rPr>
+                  <m:t>2</m:t>
+                </m:r>
+              </m:sup>
+            </m:sSup>
+            <m:sSub>
+              <m:e>
+                <m:r>
+                  <m:t>π</m:t>
+                </m:r>
+              </m:e>
+              <m:sub>
+                <m:r>
+                  <m:rPr>
+                    <m:sty m:val="p"/>
+                  </m:rPr>
+                  <m:t>shared</m:t>
+                </m:r>
+              </m:sub>
+            </m:sSub>
+          </m:num>
+          <m:den>
+            <m:r>
+              <m:t>F</m:t>
+            </m:r>
+          </m:den>
+        </m:f>
+      </m:oMath>
     </w:p>
     <w:p>
       <w:pPr>
@@ -1033,7 +1475,7 @@
           <w:b w:val="0"/>
           <w:sz w:val="24"/>
         </w:rPr>
-        <w:t>. The pipeline was validated by reproducing the deposited BMI → waist → CHD ground truth to four decimals before any new candidate was analyzed. ρ_MY was estimated empirically as genetic concordance (Pearson r between mediator and outcome SNP effects) at the instrumental SNPs from harmonized effect sizes already pulled by the pipeline. Because it is computed only on the small set of overlapping or selected instruments (n_s = 1–3 in the overlapping trios), this local ρ_MY is a directional concordance measure at the relevant SNPs, not a genome-wide LD Score regression genetic correlation (r_g); its sampling variance is consequently large when n_s is small, and we report Fisher-z 95% CIs to make that instability explicit (§3.5).</w:t>
+        <w:t>. The pipeline was validated by reproducing the deposited BMI → waist → CHD ground truth to four decimals before any new candidate was analyzed. We treat the mediator–outcome sample-overlap parameter ρ_MY as a sensitivity parameter varied from 0 to 1 across the validation grids (§3.1) rather than estimating it empirically: a local correlation of mediator and outcome SNP effects at the n_s = 1–3 overlapping instruments does not identify the genome-wide error correlation the model assumes and has unstable (or, at n_s = 1, undefined) sampling variance; the correction's direction and the nominal-coverage result are unchanged across the full ρ_MY ∈ [0,1] range (§3.4).</w:t>
       </w:r>
     </w:p>
     <w:p>
@@ -1197,7 +1639,7 @@
           <w:b w:val="0"/>
           <w:sz w:val="24"/>
         </w:rPr>
-        <w:t xml:space="preserve"> of the 333 studies draw instruments from overlapping GWAS pools without disclosing overlap handling and are therefore capable of non-zero Cov(α̂, β̂) (conservative 9.3% [95% CI 6.6-12.9%], structural 41.1% [95% CI 36.0-46.5%]; Fig. 3). Beyond the two mis-tagged cases, 78 of 695 coded reports (11.2% [95% CI 9.1-13.8%]) used an MVMR-variant design whose merged-pool form is the maximal-overlap regime the correction addresses; its closed-form extension is derived in Supplementary Methods S8 and illustrated on the audited S110 design. This matters because S110 is a genuine published merged-pool analysis that was simply mislabeled as a different design — it proves the maximal-overlap regime the correction targets is not a theoretical construct but a design the literature already runs, only without the overlap being acknowledged; the same silence is what leaves an opposite-signed trio (§3.7) unable to report whether its correction widens.</w:t>
+        <w:t xml:space="preserve"> of the 333 studies draw instruments from overlapping GWAS pools without disclosing overlap handling and are therefore capable of non-zero Cov(α̂, β̂) (conservative 9.3% [95% CI 6.6-12.9%], structural 41.1% [95% CI 36.0-46.5%]; Fig. 3). The 39.3% "capable" count is design-based: design_type is ascertainable for all 333 records, so the 279 studies whose overlap-handling disclosure could not be assessed still enter this numerator whenever their design indicates an overlap-capable instrument strategy, whereas the 19/54 disclosure rate is computed only among the 54 studies where disclosure status was ascertainable. Beyond the two mis-tagged cases, 78 of 695 coded reports (11.2% [95% CI 9.1-13.8%]) used an MVMR-variant design whose merged-pool form is the maximal-overlap regime the correction addresses; its closed-form extension is derived in Supplementary Methods S8 and illustrated on the audited S110 design. This matters because S110 is a genuine published merged-pool analysis that was simply mislabeled as a different design — it proves the maximal-overlap regime the correction targets is not a theoretical construct but a design the literature already runs, only without the overlap being acknowledged; the same silence is what leaves an opposite-signed trio (§3.7) unable to report whether its correction widens.</w:t>
       </w:r>
     </w:p>
     <w:p>
@@ -1219,7 +1661,7 @@
           <w:b w:val="0"/>
           <w:sz w:val="24"/>
         </w:rPr>
-        <w:t xml:space="preserve"> A second blinded coding pass by co-author C. Yan (C.Y.)—independent of the original coder (J.W., excluded) and blind to the sealed answer key—on a stratified 50-study sample gave 100.0% observed agreement on design_type (PABAK 1.00); raw Cohen's κ is undefined as a statistical artifact (the key contains zero "exclude" instances, so expected agreement → 1). On IV_selection_strategy agreement was 74.3% (κ = 0.44, 95% CI 0.17–0.69; PABAK 0.49; n = 35 valid pairs, 15 blank-excluded); on reports_overlap_risk only n = 8 entries were populated and agreement was 87.5% (κ = 0.78, 95% CI 0.43–1.0; PABAK 0.75, unstable). The macro-averaged κ across the two non-artifact fields was 0.61. A prior within-team blind re-code gave consistent magnitudes (design_type 94.0%/PABAK 0.88; IV κ = 0.50; reports κ = 0.50), corroborating these estimates. Full details in Supplementary Methods S7.</w:t>
+        <w:t xml:space="preserve"> Because the literature screening and coding were performed by a single author (Yan Chen, YC), classification reproducibility was assessed by a within-team blinded re-coding of a stratified 50-study sample by the same author (YC), blind to the sealed answer key; this is a within-team consistency check rather than an independent inter-coder reliability estimate. The re-code gave 100.0% observed agreement on design_type (PABAK 1.00); raw Cohen's κ is undefined as a statistical artifact (the key contains zero "exclude" instances, so expected agreement → 1). On IV_selection_strategy agreement was 74.3% (κ = 0.44, 95% CI 0.17–0.69; PABAK 0.49; n = 35 valid pairs, 15 blank-excluded); on reports_overlap_risk only n = 8 entries were populated and agreement was 87.5% (κ = 0.78, 95% CI 0.43–1.0; PABAK 0.75, unstable). The macro-averaged κ across the two non-artifact fields was 0.61. A prior within-team blind re-code gave consistent magnitudes (design_type 94.0%/PABAK 0.88; IV κ = 0.50; reports κ = 0.50), corroborating these estimates. Full details in Supplementary Methods S7.</w:t>
       </w:r>
     </w:p>
     <w:p>
@@ -3307,7 +3749,7 @@
           <w:b w:val="0"/>
           <w:sz w:val="20"/>
         </w:rPr>
-        <w:t xml:space="preserve"> BMI → waist → CHD real-data application. "natural" uses the empirical IV intersection (n_s = 13); "shared-IV" reuses the 78 BMI instruments in both steps (n_s = 78). widen_% is the percentage change in the indirect-effect SE after S10 correction (negative = narrower).</w:t>
+        <w:t xml:space="preserve"> BMI → waist → CHD real-data application. "natural" uses the empirical IV intersection (n_s = 13); "shared-IV" reuses the 78 BMI instruments in both steps (n_s = 78). widen_% is the percentage change in the indirect-effect SE after the closed-form correction (negative = narrower).</w:t>
       </w:r>
     </w:p>
     <w:p>
@@ -3335,56 +3777,7 @@
           <w:b w:val="0"/>
           <w:sz w:val="24"/>
         </w:rPr>
-        <w:t xml:space="preserve">To test the correction on realised data at scale, we re-estimated every coded study whose exposure, mediator and outcome all resolved to public GWAS accessions (n = 113) directly from OpenGWAS summary statistics, using an all-Python pipeline (harmonized fixed-effects IVW plus the S10 correction) that does not depend on the TwoSampleMR harmonisation which earlier failed on two FinnGen outcomes. Of 113, 108 re-estimations succeeded on the first full pass and 5 were skipped for accession-resolution or network errors (S210, S173, S291, S326, S255); S255 was subsequently recovered by the targeted re-estimation of the overlapping trios and is reported in Table 4 (π_shared = 0.0044, below the 0.019 threshold for the genuine-overlap headline). </w:t>
-      </w:r>
-      <w:r>
-        <w:rPr>
-          <w:rFonts w:ascii="Times New Roman" w:hAnsi="Times New Roman" w:eastAsia="Times New Roman" w:cs="Times New Roman"/>
-          <w:b/>
-          <w:sz w:val="24"/>
-        </w:rPr>
-        <w:t>Seven (6.5% [95% CI 3.2–12.8%]) of the 108 showed genuine instrument overlap (n_s = 1–3, π_shared = 0.019–1.0).</w:t>
-      </w:r>
-      <w:r>
-        <w:rPr>
-          <w:rFonts w:ascii="Times New Roman" w:hAnsi="Times New Roman" w:eastAsia="Times New Roman" w:cs="Times New Roman"/>
-          <w:b w:val="0"/>
-          <w:sz w:val="24"/>
-        </w:rPr>
-        <w:t xml:space="preserve"> Every overlapping trio was same-sign, so the correction narrowed every CI (−0.2% to −16.0% among the non-degenerate trios, −32.8% including the degenerate S293). Two of the seven (S320, S293) are methodologically degenerate: their exposure and mediator resolve to the </w:t>
-      </w:r>
-      <w:r>
-        <w:rPr>
-          <w:rFonts w:ascii="Times New Roman" w:hAnsi="Times New Roman" w:eastAsia="Times New Roman" w:cs="Times New Roman"/>
-          <w:b w:val="0"/>
-          <w:i/>
-          <w:sz w:val="24"/>
-        </w:rPr>
-        <w:t>same</w:t>
-      </w:r>
-      <w:r>
-        <w:rPr>
-          <w:rFonts w:ascii="Times New Roman" w:hAnsi="Times New Roman" w:eastAsia="Times New Roman" w:cs="Times New Roman"/>
-          <w:b w:val="0"/>
-          <w:sz w:val="24"/>
-        </w:rPr>
-        <w:t xml:space="preserve"> GWAS accession, giving α̂ = 1.0 exactly and π_shared = 1.0 — a self-mediating (non-mediation) design rather than a substantive pathway. Among the remaining </w:t>
-      </w:r>
-      <w:r>
-        <w:rPr>
-          <w:rFonts w:ascii="Times New Roman" w:hAnsi="Times New Roman" w:eastAsia="Times New Roman" w:cs="Times New Roman"/>
-          <w:b/>
-          <w:sz w:val="24"/>
-        </w:rPr>
-        <w:t>five non-degenerate overlapping trios, zero changed significance (0/5 flips)</w:t>
-      </w:r>
-      <w:r>
-        <w:rPr>
-          <w:rFonts w:ascii="Times New Roman" w:hAnsi="Times New Roman" w:eastAsia="Times New Roman" w:cs="Times New Roman"/>
-          <w:b w:val="0"/>
-          <w:sz w:val="24"/>
-        </w:rPr>
-        <w:t xml:space="preserve"> and all corrections narrowed the CI. The single flip in the entire batch, S320, is a flip-gain (naive non-significant, corrected significant) that arises entirely from its degenerate π_shared = 1.0 structure; we report it as a boundary illustration, not a mediation finding. The all-Python pipeline also recovered trio S267, which TwoSampleMR could not allele-harmonise (FinnGen outcome), re-estimating it as overlapping (n_s = 3, −1.6%, no flip) — evidence the pipeline is wider-coverage than the gold-standard wrapper. Table 2 reports the per-trio re-estimation, and Supplementary Table S3 tabulates the complete Phase-B batch. Supplementary Fig. S4 shows the SE-change forest across the overlapping trios.</w:t>
+        <w:t>To test the correction on realised data at scale, we re-estimated every coded study whose exposure, mediator and outcome all resolved to public GWAS accessions (n = 113) directly from OpenGWAS summary statistics, using an all-Python pipeline (harmonized fixed-effects IVW plus the the closed-form correction) that does not depend on the TwoSampleMR harmonisation which earlier failed on two FinnGen outcomes. Of 113, 108 re-estimations succeeded on the first full pass and 4 were skipped for accession-resolution or network errors (S210, S173, S291, S326); S255 was subsequently recovered by the targeted re-estimation of the overlapping trios but its overlap is sub-threshold (π_shared = 0.0044 &lt; 0.019), so it is reported as a recovered case and excluded from the genuine-overlap headline. Five (4.6% [95% CI 2.0–10.4%]) of the 108 re-estimated trios showed genuine, non-degenerate instrument overlap (n_s = 1–3); the correction narrowed every one of these confidence intervals by −0.2% to −16.0% with zero significance flips (0/5). Two further trios (S320, S293) are methodologically degenerate self-mediating designs — their exposure and mediator resolve to the same GWAS accession, giving α̂ = 1.0 exactly and π_shared = 1.0 — which are mapping artefacts rather than substantive pathways; counting them, seven (6.5% [95% CI 3.2–12.8%]) trios show any instrument overlap. Among the five non-degenerate overlapping trios, all corrections narrowed the CI and none altered significance. The single flip in the entire batch, S320, is a flip-gain (naive non-significant, corrected significant) that arises entirely from its degenerate π_shared = 1.0 structure; we report it as a boundary illustration, not a mediation finding. The all-Python pipeline also recovered trio S267, which TwoSampleMR could not allele-harmonise (FinnGen outcome), re-estimating it as overlapping (n_s = 3, −1.6%, no flip) — evidence the pipeline is wider-coverage than the gold-standard wrapper. Table 2 reports the per-trio re-estimation, and Supplementary Table S3 tabulates the complete batch. Supplementary Fig. S4 shows the SE-change forest across the overlapping trios.</w:t>
       </w:r>
     </w:p>
     <w:tbl>
@@ -5794,7 +6187,7 @@
           <w:b w:val="0"/>
           <w:sz w:val="20"/>
         </w:rPr>
-        <w:t xml:space="preserve"> All-Python batch re-estimation of the seven published two-step MR mediation trios (of 108 re-estimated) with genuine instrument overlap, resolved directly from OpenGWAS summary statistics. π_shared and n_s are exact (extracted clumped instrument sets); α̂, β̂ and their SEs are re-estimated with harmonized fixed-effects IVW; widen_% is the S10 correction at ρ_MY = 0; negative = narrower. Significance two-sided at α = 0.05. S320 and S293 are degenerate self-mediating designs (exposure ≡ mediator accession, α̂ = 1.0, π_shared = 1.0), flagged and not counted as substantive mediation evidence; S320's flip-gain is a boundary illustration of the §3.1.1 prediction, not a finding.</w:t>
+        <w:t xml:space="preserve"> All-Python batch re-estimation of the seven published two-step MR mediation trios (of 108 re-estimated) with genuine instrument overlap, resolved directly from OpenGWAS summary statistics. π_shared and n_s are exact (extracted clumped instrument sets); α̂, β̂ and their SEs are re-estimated with harmonized fixed-effects IVW; widen_% is the the closed-form correction at ρ_MY = 0; negative = narrower. Significance two-sided at α = 0.05. S320 and S293 are degenerate self-mediating designs (exposure ≡ mediator accession, α̂ = 1.0, π_shared = 1.0), flagged and not counted as substantive mediation evidence; S320's flip-gain is a boundary illustration of the §3.1.1 prediction, not a finding.</w:t>
       </w:r>
     </w:p>
     <w:p>
@@ -5817,7 +6210,7 @@
           <w:b w:val="0"/>
           <w:sz w:val="24"/>
         </w:rPr>
-        <w:t xml:space="preserve"> S320 (ukb-d-1468_2 → ukb-d-1468_2 → ieu-b-69) and S293 (ebi-a-GCST90103751 → ebi-a-GCST90103751 → ebi-a-GCST90038634) are degenerate: exposure and mediator resolve to the identical GWAS accession, so α̂ = 1.0 exactly and π_shared = 1.0; they represent self-mediating (non-mediation) designs and are flagged, not counted as substantive mediation evidence. S320's flip-gain is reported as a boundary illustration of the §3.1.1 prediction (same-sign, π_shared = 1.0 → flip-gain), not as a finding. S267 was not estimable through TwoSampleMR (FinnGen harmonisation failure) but succeeded here. Five trios (S210, S173, S255, S291, S326) were skipped for accession-resolution or network errors.</w:t>
+        <w:t xml:space="preserve"> S320 (ukb-d-1468_2 → ukb-d-1468_2 → ieu-b-69) and S293 (ebi-a-GCST90103751 → ebi-a-GCST90103751 → ebi-a-GCST90038634) are degenerate: exposure and mediator resolve to the identical GWAS accession, so α̂ = 1.0 exactly and π_shared = 1.0; they represent self-mediating (non-mediation) designs and are flagged, not counted as substantive mediation evidence. S320's flip-gain is reported as a boundary illustration of the §3.1.1 prediction (same-sign, π_shared = 1.0 → flip-gain), not as a finding. S267 was not estimable through TwoSampleMR (FinnGen harmonisation failure) but succeeded here. Four trios (S210, S173, S291, S326) were skipped for accession-resolution or network errors; S255 was recovered by the targeted re-estimation and is reported as a sub-threshold overlap case (π_shared = 0.0044 &lt; 0.019).</w:t>
       </w:r>
     </w:p>
     <w:p>
@@ -5845,7 +6238,7 @@
           <w:b w:val="0"/>
           <w:sz w:val="24"/>
         </w:rPr>
-        <w:t>Because the Introduction advertises Egger regression and weighted-median estimation as pleiotropy-robust MR tools, we verified that horizontal pleiotropy does not distort the re-estimated α̂ or β̂ on which the covariance correction rests. For each of the five non-degenerate overlapping trios we ran, on both steps (X→M and M→Y), an MR-Egger intercept test (Bowden et al., 2017) and a weighted-median (WM) cross-check, using the clumped instruments already extracted for the re-estimation and harmonized effect sizes from OpenGWAS (script M4c, deposited). The covariance correction is a variance adjustment conditional on the point estimates; if pleiotropy reversed the sign of α̂ or β̂, the direction of Cov(α̂, β̂) — and therefore whether the correction narrows or widens — could change, so this is the relevant robustness check for the point estimates the correction conditions on (Table 3).</w:t>
+        <w:t>Because the Introduction advertises Egger regression and weighted-median estimation as pleiotropy-robust MR tools, we verified that horizontal pleiotropy does not distort the re-estimated α̂ or β̂ on which the covariance correction rests. For each of the five non-degenerate overlapping trios we ran, on both steps (X→M and M→Y), an MR-Egger intercept test (Bowden et al., 2017) and a weighted-median (WM) cross-check, using the clumped instruments already extracted for the re-estimation and harmonized effect sizes from OpenGWAS (the pleiotropy-sensitivity script, deposited). The covariance correction is a variance adjustment conditional on the point estimates; if pleiotropy reversed the sign of α̂ or β̂, the direction of Cov(α̂, β̂) — and therefore whether the correction narrows or widens — could change, so this is the relevant robustness check for the point estimates the correction conditions on (Table 3).</w:t>
       </w:r>
     </w:p>
     <w:tbl>
@@ -6164,7 +6557,7 @@
                 <w:rFonts w:ascii="Times New Roman" w:hAnsi="Times New Roman" w:eastAsia="Times New Roman" w:cs="Times New Roman"/>
                 <w:sz w:val="19"/>
               </w:rPr>
-              <w:t>yes</w:t>
+              <w:t>no</w:t>
             </w:r>
           </w:p>
         </w:tc>
@@ -6569,7 +6962,7 @@
                 <w:rFonts w:ascii="Times New Roman" w:hAnsi="Times New Roman" w:eastAsia="Times New Roman" w:cs="Times New Roman"/>
                 <w:sz w:val="19"/>
               </w:rPr>
-              <w:t>yes</w:t>
+              <w:t>no</w:t>
             </w:r>
           </w:p>
         </w:tc>
@@ -6974,7 +7367,7 @@
                 <w:rFonts w:ascii="Times New Roman" w:hAnsi="Times New Roman" w:eastAsia="Times New Roman" w:cs="Times New Roman"/>
                 <w:sz w:val="19"/>
               </w:rPr>
-              <w:t>yes</w:t>
+              <w:t>no</w:t>
             </w:r>
           </w:p>
         </w:tc>
@@ -7404,7 +7797,7 @@
           <w:b w:val="0"/>
           <w:sz w:val="20"/>
         </w:rPr>
-        <w:t xml:space="preserve"> Horizontal-pleiotropy sensitivity for the five non-degenerate overlapping trios. Egger intercept β₀ tests directional pleiotropy (|β₀| is the practically relevant magnitude; p is reported but is inflated by large n when β₀ ≈ 0). WM = weighted-median slope. "Sign agrees" compares the WM slope with the IVW point estimate of the same step.</w:t>
+        <w:t xml:space="preserve"> Horizontal-pleiotropy sensitivity for the five non-degenerate overlapping trios. Egger intercept β₀ tests directional pleiotropy (|β₀| is the practically relevant magnitude; p is reported but is inflated by large n when β₀ ≈ 0). WM = weighted-median slope, estimated on the same clumped instruments used for the re-estimation. "Sign agrees" compares the sign of the WM slope with the sign of the IVW α̂/β̂ for the same step reported in Table 2; three of ten steps disagree (S014 X→M, S137 M→Y, S273 X→M).</w:t>
       </w:r>
     </w:p>
     <w:p>
@@ -7418,7 +7811,7 @@
           <w:b w:val="0"/>
           <w:sz w:val="24"/>
         </w:rPr>
-        <w:t xml:space="preserve">Across all ten step-level tests the weighted-median slope agrees in sign with the IVW estimate, so no horizontal pleiotropy reverses the direction of α̂ or β̂. Three tests carry p &lt; 0.05, but in two of them (S014 M→Y, S273 X→M) the Egger intercept is effectively zero (|β₀| ≤ 1.3×10⁻⁴), so the significant p reflects the large instrument count rather than meaningful directional pleiotropy. The remaining signal, S217 M→Y (β₀ = −0.017, n_IV = 10), has too few instruments for a stable Egger test; here the WM slope (0.33) is larger than but same-signed as the IVW estimate (0.20), so even allowing for possible pleiotropy the β̂ direction is unchanged. We therefore conclude that horizontal pleiotropy does not overturn the sign of either product component in any resolvable trio, and the observed CI-narrowing of the covariance correction is robust to it. (The correction itself does not remove pleiotropy bias in the point estimate; it corrects the </w:t>
+        <w:t xml:space="preserve">Across the ten step-level tests the weighted-median (WM) slope — estimated on the same clumped instruments used for the re-estimation — agreed in sign with the IVW α̂/β̂ (Table 2) for seven steps but disagreed for three: S014 X→M (WM −0.0021 vs IVW +0.0038), S137 M→Y (WM −0.0143 vs IVW +0.0018) and S273 X→M (WM −0.0258 vs IVW +0.0072). Because the WM and IVW are computed on the same instrument set, these are genuine estimator-level disagreements rather than a scale or instrument-mismatch artefact, indicating that the direction of a product component is not perfectly stable across methods in three of the five trios. In each discordant step the Egger intercept is effectively zero (|β₀| ≤ 1.3×10⁻⁴, with p reflecting only large n), so the sign disagreement is not driven by strong directional pleiotropy; it more plausibly reflects weak-instrument or heterogeneity sensitivity of the ratio estimate at the clumped-tophit resolution. Two further steps yield biologically implausible magnitudes on the clumped set (S217 X→M ≈ 40–61, S273 M→Y ≈ 1.3–3.1), signalling unstable estimation that limits how much weight this sensitivity check can carry. This matters for the correction, because the direction of Cov(α̂, β̂) — and therefore whether the correction narrows or widens the indirect-effect interval — is conditional on sign(α̂β̂); where that sign is method-dependent, the correction's direction should be reported alongside a pleiotropy-robust estimate rather than assumed from IVW alone. In the present sample the correction was small for every resolvable trio (≤16% SE change) and the sign ambiguity did not alter any conclusion, but we flag it as a reporting requirement, not a resolved non-issue. (The correction itself does not remove pleiotropy bias in the point estimate; it corrects the </w:t>
       </w:r>
       <w:r>
         <w:rPr>
@@ -7449,7 +7842,7 @@
           <w:b/>
           <w:sz w:val="24"/>
         </w:rPr>
-        <w:t>3.5 Empirical ρ_MY in the overlapping trios</w:t>
+        <w:t>3.5 Sensitivity to the mediator–outcome sample-overlap parameter ρ_MY</w:t>
       </w:r>
     </w:p>
     <w:p>
@@ -7463,1900 +7856,7 @@
           <w:b w:val="0"/>
           <w:sz w:val="24"/>
         </w:rPr>
-        <w:t xml:space="preserve">Treating ρ_MY as 0 leaves the central warning theoretical; we therefore estimated it empirically for the overlapping trios as genetic concordance at the instrumental SNPs (six resolved through the TwoSampleMR-compatible ρ_MY scan in Table 4; the all-Python batch in §3.4 recovers five of these non-degenerate trios plus two additional degenerate self-mediating trios, S320/S293, excluded from the ρ_MY scan because exposure ≡ mediator). In </w:t>
-      </w:r>
-      <w:r>
-        <w:rPr>
-          <w:rFonts w:ascii="Times New Roman" w:hAnsi="Times New Roman" w:eastAsia="Times New Roman" w:cs="Times New Roman"/>
-          <w:b/>
-          <w:sz w:val="24"/>
-        </w:rPr>
-        <w:t>five of six</w:t>
-      </w:r>
-      <w:r>
-        <w:rPr>
-          <w:rFonts w:ascii="Times New Roman" w:hAnsi="Times New Roman" w:eastAsia="Times New Roman" w:cs="Times New Roman"/>
-          <w:b w:val="0"/>
-          <w:sz w:val="24"/>
-        </w:rPr>
-        <w:t xml:space="preserve"> trios the mediator and outcome are genetically concordant in the same direction (ρ_g up to +0.81; the single negative case, S267, a UKB–FinnGen pair whose 95% CI includes zero), and four of six draw both mediator and outcome from UK Biobank-derived GWAS (substantial sample overlap). </w:t>
-      </w:r>
-      <w:r>
-        <w:rPr>
-          <w:rFonts w:ascii="Times New Roman" w:hAnsi="Times New Roman" w:eastAsia="Times New Roman" w:cs="Times New Roman"/>
-          <w:b/>
-          <w:sz w:val="24"/>
-        </w:rPr>
-        <w:t>Despite uniformly positive (or high-overlap) ρ_MY, re-entering the empirical values narrowed every corrected CI by at most 0.4 percentage points with zero flips</w:t>
-      </w:r>
-      <w:r>
-        <w:rPr>
-          <w:rFonts w:ascii="Times New Roman" w:hAnsi="Times New Roman" w:eastAsia="Times New Roman" w:cs="Times New Roman"/>
-          <w:b w:val="0"/>
-          <w:sz w:val="24"/>
-        </w:rPr>
-        <w:t xml:space="preserve"> (Table 4); a worst-case substitution of each trio's ρ_g 95% CI upper bound leaves the conclusion unchanged. The reason is structural (Proposition S2.5): a shared SNP's larger effect on M shrinks its M → Y ratio, making Cov(α̂, β̂) provably negative whenever α̂ and β̂ share a sign — which dominates the positive ρ_MY contribution for the small shared counts realized (n_s = 1–3). The correction therefore narrows by mechanism, not luck, converting the theoretical "ρ_MY &gt; 0 widens" statement into an observed fact. We note the caveat that the local ρ_MY estimated on n_s = 1–3 instruments carries wide sampling uncertainty (e.g., S217, n_s = 1, has ρ_g 95% CI [0.37, 0.95]); the empirical ρ_MY distribution should therefore be read as indicative, not precise. Crucially, this instability does not weaken the narrowing conclusion, because the sign of the omitted covariance in the realized trios is dominated by sign(α̂β̂) through Proposition S2.5 (an instrument-overlap effect) rather than by the exact value of ρ_MY, so the worst-case upper-CI substitution in Table 4 leaves every conclusion unchanged. Supplementary Table S4 tabulates the empirical ρ_MY values with their Fisher-z confidence intervals.</w:t>
-      </w:r>
-    </w:p>
-    <w:tbl>
-      <w:tblPr>
-        <w:tblW w:type="auto" w:w="0"/>
-        <w:jc w:val="center"/>
-        <w:tblLook w:firstColumn="1" w:firstRow="1" w:lastColumn="0" w:lastRow="0" w:noHBand="0" w:noVBand="1" w:val="04A0"/>
-        <w:tblBorders>
-          <w:top w:val="single" w:sz="12" w:space="0" w:color="auto"/>
-          <w:left w:val="none" w:sz="0" w:space="0" w:color="auto"/>
-          <w:bottom w:val="single" w:sz="12" w:space="0" w:color="auto"/>
-          <w:right w:val="none" w:sz="0" w:space="0" w:color="auto"/>
-          <w:insideH w:val="none" w:sz="0" w:space="0" w:color="auto"/>
-          <w:insideV w:val="none" w:sz="0" w:space="0" w:color="auto"/>
-        </w:tblBorders>
-      </w:tblPr>
-      <w:tblGrid>
-        <w:gridCol w:w="665"/>
-        <w:gridCol w:w="665"/>
-        <w:gridCol w:w="665"/>
-        <w:gridCol w:w="665"/>
-        <w:gridCol w:w="665"/>
-        <w:gridCol w:w="665"/>
-        <w:gridCol w:w="665"/>
-        <w:gridCol w:w="665"/>
-        <w:gridCol w:w="665"/>
-        <w:gridCol w:w="665"/>
-        <w:gridCol w:w="665"/>
-        <w:gridCol w:w="665"/>
-        <w:gridCol w:w="665"/>
-      </w:tblGrid>
-      <w:tr>
-        <w:tc>
-          <w:tcPr>
-            <w:tcW w:type="dxa" w:w="665"/>
-            <w:tcBorders>
-              <w:bottom w:val="single" w:sz="6" w:space="0" w:color="auto"/>
-            </w:tcBorders>
-          </w:tcPr>
-          <w:p>
-            <w:r>
-              <w:rPr>
-                <w:rFonts w:ascii="Times New Roman" w:hAnsi="Times New Roman" w:eastAsia="Times New Roman" w:cs="Times New Roman"/>
-              </w:rPr>
-            </w:r>
-            <w:r>
-              <w:rPr>
-                <w:rFonts w:ascii="Times New Roman" w:hAnsi="Times New Roman" w:eastAsia="Times New Roman" w:cs="Times New Roman"/>
-                <w:b/>
-                <w:sz w:val="19"/>
-              </w:rPr>
-              <w:t>Study</w:t>
-            </w:r>
-          </w:p>
-        </w:tc>
-        <w:tc>
-          <w:tcPr>
-            <w:tcW w:type="dxa" w:w="665"/>
-            <w:tcBorders>
-              <w:bottom w:val="single" w:sz="6" w:space="0" w:color="auto"/>
-            </w:tcBorders>
-          </w:tcPr>
-          <w:p>
-            <w:r>
-              <w:rPr>
-                <w:rFonts w:ascii="Times New Roman" w:hAnsi="Times New Roman" w:eastAsia="Times New Roman" w:cs="Times New Roman"/>
-              </w:rPr>
-            </w:r>
-            <w:r>
-              <w:rPr>
-                <w:rFonts w:ascii="Times New Roman" w:hAnsi="Times New Roman" w:eastAsia="Times New Roman" w:cs="Times New Roman"/>
-                <w:b/>
-                <w:sz w:val="19"/>
-              </w:rPr>
-              <w:t>Pathway (X → M → Y)</w:t>
-            </w:r>
-          </w:p>
-        </w:tc>
-        <w:tc>
-          <w:tcPr>
-            <w:tcW w:type="dxa" w:w="665"/>
-            <w:tcBorders>
-              <w:bottom w:val="single" w:sz="6" w:space="0" w:color="auto"/>
-            </w:tcBorders>
-          </w:tcPr>
-          <w:p>
-            <w:r>
-              <w:rPr>
-                <w:rFonts w:ascii="Times New Roman" w:hAnsi="Times New Roman" w:eastAsia="Times New Roman" w:cs="Times New Roman"/>
-              </w:rPr>
-            </w:r>
-            <w:r>
-              <w:rPr>
-                <w:rFonts w:ascii="Times New Roman" w:hAnsi="Times New Roman" w:eastAsia="Times New Roman" w:cs="Times New Roman"/>
-                <w:b/>
-                <w:sz w:val="19"/>
-              </w:rPr>
-              <w:t>n_s</w:t>
-            </w:r>
-          </w:p>
-        </w:tc>
-        <w:tc>
-          <w:tcPr>
-            <w:tcW w:type="dxa" w:w="665"/>
-            <w:tcBorders>
-              <w:bottom w:val="single" w:sz="6" w:space="0" w:color="auto"/>
-            </w:tcBorders>
-          </w:tcPr>
-          <w:p>
-            <w:r>
-              <w:rPr>
-                <w:rFonts w:ascii="Times New Roman" w:hAnsi="Times New Roman" w:eastAsia="Times New Roman" w:cs="Times New Roman"/>
-              </w:rPr>
-            </w:r>
-            <w:r>
-              <w:rPr>
-                <w:rFonts w:ascii="Times New Roman" w:hAnsi="Times New Roman" w:eastAsia="Times New Roman" w:cs="Times New Roman"/>
-                <w:b/>
-                <w:sz w:val="19"/>
-              </w:rPr>
-              <w:t>ρ_g (primary)</w:t>
-            </w:r>
-          </w:p>
-        </w:tc>
-        <w:tc>
-          <w:tcPr>
-            <w:tcW w:type="dxa" w:w="665"/>
-            <w:tcBorders>
-              <w:bottom w:val="single" w:sz="6" w:space="0" w:color="auto"/>
-            </w:tcBorders>
-          </w:tcPr>
-          <w:p>
-            <w:r>
-              <w:rPr>
-                <w:rFonts w:ascii="Times New Roman" w:hAnsi="Times New Roman" w:eastAsia="Times New Roman" w:cs="Times New Roman"/>
-              </w:rPr>
-            </w:r>
-            <w:r>
-              <w:rPr>
-                <w:rFonts w:ascii="Times New Roman" w:hAnsi="Times New Roman" w:eastAsia="Times New Roman" w:cs="Times New Roman"/>
-                <w:b/>
-                <w:sz w:val="19"/>
-              </w:rPr>
-              <w:t>95% CI</w:t>
-            </w:r>
-          </w:p>
-        </w:tc>
-        <w:tc>
-          <w:tcPr>
-            <w:tcW w:type="dxa" w:w="665"/>
-            <w:tcBorders>
-              <w:bottom w:val="single" w:sz="6" w:space="0" w:color="auto"/>
-            </w:tcBorders>
-          </w:tcPr>
-          <w:p>
-            <w:r>
-              <w:rPr>
-                <w:rFonts w:ascii="Times New Roman" w:hAnsi="Times New Roman" w:eastAsia="Times New Roman" w:cs="Times New Roman"/>
-              </w:rPr>
-            </w:r>
-            <w:r>
-              <w:rPr>
-                <w:rFonts w:ascii="Times New Roman" w:hAnsi="Times New Roman" w:eastAsia="Times New Roman" w:cs="Times New Roman"/>
-                <w:b/>
-                <w:sz w:val="19"/>
-              </w:rPr>
-              <w:t>ρ_g (residualized)</w:t>
-            </w:r>
-          </w:p>
-        </w:tc>
-        <w:tc>
-          <w:tcPr>
-            <w:tcW w:type="dxa" w:w="665"/>
-            <w:tcBorders>
-              <w:bottom w:val="single" w:sz="6" w:space="0" w:color="auto"/>
-            </w:tcBorders>
-          </w:tcPr>
-          <w:p>
-            <w:r>
-              <w:rPr>
-                <w:rFonts w:ascii="Times New Roman" w:hAnsi="Times New Roman" w:eastAsia="Times New Roman" w:cs="Times New Roman"/>
-              </w:rPr>
-            </w:r>
-            <w:r>
-              <w:rPr>
-                <w:rFonts w:ascii="Times New Roman" w:hAnsi="Times New Roman" w:eastAsia="Times New Roman" w:cs="Times New Roman"/>
-                <w:b/>
-                <w:sz w:val="19"/>
-              </w:rPr>
-              <w:t>sample overlap</w:t>
-            </w:r>
-          </w:p>
-        </w:tc>
-        <w:tc>
-          <w:tcPr>
-            <w:tcW w:type="dxa" w:w="665"/>
-            <w:tcBorders>
-              <w:bottom w:val="single" w:sz="6" w:space="0" w:color="auto"/>
-            </w:tcBorders>
-          </w:tcPr>
-          <w:p>
-            <w:r>
-              <w:rPr>
-                <w:rFonts w:ascii="Times New Roman" w:hAnsi="Times New Roman" w:eastAsia="Times New Roman" w:cs="Times New Roman"/>
-              </w:rPr>
-            </w:r>
-            <w:r>
-              <w:rPr>
-                <w:rFonts w:ascii="Times New Roman" w:hAnsi="Times New Roman" w:eastAsia="Times New Roman" w:cs="Times New Roman"/>
-                <w:b/>
-                <w:sz w:val="19"/>
-              </w:rPr>
-              <w:t>widen% (ρ=0)</w:t>
-            </w:r>
-          </w:p>
-        </w:tc>
-        <w:tc>
-          <w:tcPr>
-            <w:tcW w:type="dxa" w:w="665"/>
-            <w:tcBorders>
-              <w:bottom w:val="single" w:sz="6" w:space="0" w:color="auto"/>
-            </w:tcBorders>
-          </w:tcPr>
-          <w:p>
-            <w:r>
-              <w:rPr>
-                <w:rFonts w:ascii="Times New Roman" w:hAnsi="Times New Roman" w:eastAsia="Times New Roman" w:cs="Times New Roman"/>
-              </w:rPr>
-            </w:r>
-            <w:r>
-              <w:rPr>
-                <w:rFonts w:ascii="Times New Roman" w:hAnsi="Times New Roman" w:eastAsia="Times New Roman" w:cs="Times New Roman"/>
-                <w:b/>
-                <w:sz w:val="19"/>
-              </w:rPr>
-              <w:t>widen% (ρ_g)</w:t>
-            </w:r>
-          </w:p>
-        </w:tc>
-        <w:tc>
-          <w:tcPr>
-            <w:tcW w:type="dxa" w:w="665"/>
-            <w:tcBorders>
-              <w:bottom w:val="single" w:sz="6" w:space="0" w:color="auto"/>
-            </w:tcBorders>
-          </w:tcPr>
-          <w:p>
-            <w:r>
-              <w:rPr>
-                <w:rFonts w:ascii="Times New Roman" w:hAnsi="Times New Roman" w:eastAsia="Times New Roman" w:cs="Times New Roman"/>
-              </w:rPr>
-            </w:r>
-            <w:r>
-              <w:rPr>
-                <w:rFonts w:ascii="Times New Roman" w:hAnsi="Times New Roman" w:eastAsia="Times New Roman" w:cs="Times New Roman"/>
-                <w:b/>
-                <w:sz w:val="19"/>
-              </w:rPr>
-              <w:t>widen% (ρ_g upper CI)</w:t>
-            </w:r>
-          </w:p>
-        </w:tc>
-        <w:tc>
-          <w:tcPr>
-            <w:tcW w:type="dxa" w:w="665"/>
-            <w:tcBorders>
-              <w:bottom w:val="single" w:sz="6" w:space="0" w:color="auto"/>
-            </w:tcBorders>
-          </w:tcPr>
-          <w:p>
-            <w:r>
-              <w:rPr>
-                <w:rFonts w:ascii="Times New Roman" w:hAnsi="Times New Roman" w:eastAsia="Times New Roman" w:cs="Times New Roman"/>
-              </w:rPr>
-            </w:r>
-            <w:r>
-              <w:rPr>
-                <w:rFonts w:ascii="Times New Roman" w:hAnsi="Times New Roman" w:eastAsia="Times New Roman" w:cs="Times New Roman"/>
-                <w:b/>
-                <w:sz w:val="19"/>
-              </w:rPr>
-              <w:t>Δ (pp)</w:t>
-            </w:r>
-          </w:p>
-        </w:tc>
-        <w:tc>
-          <w:tcPr>
-            <w:tcW w:type="dxa" w:w="665"/>
-            <w:tcBorders>
-              <w:bottom w:val="single" w:sz="6" w:space="0" w:color="auto"/>
-            </w:tcBorders>
-          </w:tcPr>
-          <w:p>
-            <w:r>
-              <w:rPr>
-                <w:rFonts w:ascii="Times New Roman" w:hAnsi="Times New Roman" w:eastAsia="Times New Roman" w:cs="Times New Roman"/>
-              </w:rPr>
-            </w:r>
-            <w:r>
-              <w:rPr>
-                <w:rFonts w:ascii="Times New Roman" w:hAnsi="Times New Roman" w:eastAsia="Times New Roman" w:cs="Times New Roman"/>
-                <w:b/>
-                <w:sz w:val="19"/>
-              </w:rPr>
-              <w:t>Flip (point)</w:t>
-            </w:r>
-          </w:p>
-        </w:tc>
-        <w:tc>
-          <w:tcPr>
-            <w:tcW w:type="dxa" w:w="665"/>
-            <w:tcBorders>
-              <w:bottom w:val="single" w:sz="6" w:space="0" w:color="auto"/>
-            </w:tcBorders>
-          </w:tcPr>
-          <w:p>
-            <w:r>
-              <w:rPr>
-                <w:rFonts w:ascii="Times New Roman" w:hAnsi="Times New Roman" w:eastAsia="Times New Roman" w:cs="Times New Roman"/>
-              </w:rPr>
-            </w:r>
-            <w:r>
-              <w:rPr>
-                <w:rFonts w:ascii="Times New Roman" w:hAnsi="Times New Roman" w:eastAsia="Times New Roman" w:cs="Times New Roman"/>
-                <w:b/>
-                <w:sz w:val="19"/>
-              </w:rPr>
-              <w:t>Flip (worst case)</w:t>
-            </w:r>
-          </w:p>
-        </w:tc>
-      </w:tr>
-      <w:tr>
-        <w:tc>
-          <w:tcPr>
-            <w:tcW w:type="dxa" w:w="665"/>
-          </w:tcPr>
-          <w:p>
-            <w:r>
-              <w:rPr>
-                <w:rFonts w:ascii="Times New Roman" w:hAnsi="Times New Roman" w:eastAsia="Times New Roman" w:cs="Times New Roman"/>
-              </w:rPr>
-            </w:r>
-            <w:r>
-              <w:rPr>
-                <w:rFonts w:ascii="Times New Roman" w:hAnsi="Times New Roman" w:eastAsia="Times New Roman" w:cs="Times New Roman"/>
-                <w:sz w:val="19"/>
-              </w:rPr>
-              <w:t>S014</w:t>
-            </w:r>
-          </w:p>
-        </w:tc>
-        <w:tc>
-          <w:tcPr>
-            <w:tcW w:type="dxa" w:w="665"/>
-          </w:tcPr>
-          <w:p>
-            <w:r>
-              <w:rPr>
-                <w:rFonts w:ascii="Times New Roman" w:hAnsi="Times New Roman" w:eastAsia="Times New Roman" w:cs="Times New Roman"/>
-              </w:rPr>
-            </w:r>
-            <w:r>
-              <w:rPr>
-                <w:rFonts w:ascii="Times New Roman" w:hAnsi="Times New Roman" w:eastAsia="Times New Roman" w:cs="Times New Roman"/>
-                <w:sz w:val="19"/>
-              </w:rPr>
-              <w:t>T1DM → hypertension → atherosclerosis (PAS/CAS)</w:t>
-            </w:r>
-          </w:p>
-        </w:tc>
-        <w:tc>
-          <w:tcPr>
-            <w:tcW w:type="dxa" w:w="665"/>
-          </w:tcPr>
-          <w:p>
-            <w:r>
-              <w:rPr>
-                <w:rFonts w:ascii="Times New Roman" w:hAnsi="Times New Roman" w:eastAsia="Times New Roman" w:cs="Times New Roman"/>
-              </w:rPr>
-            </w:r>
-            <w:r>
-              <w:rPr>
-                <w:rFonts w:ascii="Times New Roman" w:hAnsi="Times New Roman" w:eastAsia="Times New Roman" w:cs="Times New Roman"/>
-                <w:sz w:val="19"/>
-              </w:rPr>
-              <w:t>1</w:t>
-            </w:r>
-          </w:p>
-        </w:tc>
-        <w:tc>
-          <w:tcPr>
-            <w:tcW w:type="dxa" w:w="665"/>
-          </w:tcPr>
-          <w:p>
-            <w:r>
-              <w:rPr>
-                <w:rFonts w:ascii="Times New Roman" w:hAnsi="Times New Roman" w:eastAsia="Times New Roman" w:cs="Times New Roman"/>
-              </w:rPr>
-            </w:r>
-            <w:r>
-              <w:rPr>
-                <w:rFonts w:ascii="Times New Roman" w:hAnsi="Times New Roman" w:eastAsia="Times New Roman" w:cs="Times New Roman"/>
-                <w:sz w:val="19"/>
-              </w:rPr>
-              <w:t>+0.597</w:t>
-            </w:r>
-          </w:p>
-        </w:tc>
-        <w:tc>
-          <w:tcPr>
-            <w:tcW w:type="dxa" w:w="665"/>
-          </w:tcPr>
-          <w:p>
-            <w:r>
-              <w:rPr>
-                <w:rFonts w:ascii="Times New Roman" w:hAnsi="Times New Roman" w:eastAsia="Times New Roman" w:cs="Times New Roman"/>
-              </w:rPr>
-            </w:r>
-            <w:r>
-              <w:rPr>
-                <w:rFonts w:ascii="Times New Roman" w:hAnsi="Times New Roman" w:eastAsia="Times New Roman" w:cs="Times New Roman"/>
-                <w:sz w:val="19"/>
-              </w:rPr>
-              <w:t>[0.50, 0.68]</w:t>
-            </w:r>
-          </w:p>
-        </w:tc>
-        <w:tc>
-          <w:tcPr>
-            <w:tcW w:type="dxa" w:w="665"/>
-          </w:tcPr>
-          <w:p>
-            <w:r>
-              <w:rPr>
-                <w:rFonts w:ascii="Times New Roman" w:hAnsi="Times New Roman" w:eastAsia="Times New Roman" w:cs="Times New Roman"/>
-              </w:rPr>
-            </w:r>
-            <w:r>
-              <w:rPr>
-                <w:rFonts w:ascii="Times New Roman" w:hAnsi="Times New Roman" w:eastAsia="Times New Roman" w:cs="Times New Roman"/>
-                <w:sz w:val="19"/>
-              </w:rPr>
-              <w:t>+0.591</w:t>
-            </w:r>
-          </w:p>
-        </w:tc>
-        <w:tc>
-          <w:tcPr>
-            <w:tcW w:type="dxa" w:w="665"/>
-          </w:tcPr>
-          <w:p>
-            <w:r>
-              <w:rPr>
-                <w:rFonts w:ascii="Times New Roman" w:hAnsi="Times New Roman" w:eastAsia="Times New Roman" w:cs="Times New Roman"/>
-              </w:rPr>
-            </w:r>
-            <w:r>
-              <w:rPr>
-                <w:rFonts w:ascii="Times New Roman" w:hAnsi="Times New Roman" w:eastAsia="Times New Roman" w:cs="Times New Roman"/>
-                <w:sz w:val="19"/>
-              </w:rPr>
-              <w:t>high (UKB–UKB)</w:t>
-            </w:r>
-          </w:p>
-        </w:tc>
-        <w:tc>
-          <w:tcPr>
-            <w:tcW w:type="dxa" w:w="665"/>
-          </w:tcPr>
-          <w:p>
-            <w:r>
-              <w:rPr>
-                <w:rFonts w:ascii="Times New Roman" w:hAnsi="Times New Roman" w:eastAsia="Times New Roman" w:cs="Times New Roman"/>
-              </w:rPr>
-            </w:r>
-            <w:r>
-              <w:rPr>
-                <w:rFonts w:ascii="Times New Roman" w:hAnsi="Times New Roman" w:eastAsia="Times New Roman" w:cs="Times New Roman"/>
-                <w:sz w:val="19"/>
-              </w:rPr>
-              <w:t>−16.0</w:t>
-            </w:r>
-          </w:p>
-        </w:tc>
-        <w:tc>
-          <w:tcPr>
-            <w:tcW w:type="dxa" w:w="665"/>
-          </w:tcPr>
-          <w:p>
-            <w:r>
-              <w:rPr>
-                <w:rFonts w:ascii="Times New Roman" w:hAnsi="Times New Roman" w:eastAsia="Times New Roman" w:cs="Times New Roman"/>
-              </w:rPr>
-            </w:r>
-            <w:r>
-              <w:rPr>
-                <w:rFonts w:ascii="Times New Roman" w:hAnsi="Times New Roman" w:eastAsia="Times New Roman" w:cs="Times New Roman"/>
-                <w:sz w:val="19"/>
-              </w:rPr>
-              <w:t>−16.0</w:t>
-            </w:r>
-          </w:p>
-        </w:tc>
-        <w:tc>
-          <w:tcPr>
-            <w:tcW w:type="dxa" w:w="665"/>
-          </w:tcPr>
-          <w:p>
-            <w:r>
-              <w:rPr>
-                <w:rFonts w:ascii="Times New Roman" w:hAnsi="Times New Roman" w:eastAsia="Times New Roman" w:cs="Times New Roman"/>
-              </w:rPr>
-            </w:r>
-            <w:r>
-              <w:rPr>
-                <w:rFonts w:ascii="Times New Roman" w:hAnsi="Times New Roman" w:eastAsia="Times New Roman" w:cs="Times New Roman"/>
-                <w:sz w:val="19"/>
-              </w:rPr>
-              <w:t>−16.0</w:t>
-            </w:r>
-          </w:p>
-        </w:tc>
-        <w:tc>
-          <w:tcPr>
-            <w:tcW w:type="dxa" w:w="665"/>
-          </w:tcPr>
-          <w:p>
-            <w:r>
-              <w:rPr>
-                <w:rFonts w:ascii="Times New Roman" w:hAnsi="Times New Roman" w:eastAsia="Times New Roman" w:cs="Times New Roman"/>
-              </w:rPr>
-            </w:r>
-            <w:r>
-              <w:rPr>
-                <w:rFonts w:ascii="Times New Roman" w:hAnsi="Times New Roman" w:eastAsia="Times New Roman" w:cs="Times New Roman"/>
-                <w:sz w:val="19"/>
-              </w:rPr>
-              <w:t>+0.0</w:t>
-            </w:r>
-          </w:p>
-        </w:tc>
-        <w:tc>
-          <w:tcPr>
-            <w:tcW w:type="dxa" w:w="665"/>
-          </w:tcPr>
-          <w:p>
-            <w:r>
-              <w:rPr>
-                <w:rFonts w:ascii="Times New Roman" w:hAnsi="Times New Roman" w:eastAsia="Times New Roman" w:cs="Times New Roman"/>
-              </w:rPr>
-            </w:r>
-            <w:r>
-              <w:rPr>
-                <w:rFonts w:ascii="Times New Roman" w:hAnsi="Times New Roman" w:eastAsia="Times New Roman" w:cs="Times New Roman"/>
-                <w:sz w:val="19"/>
-              </w:rPr>
-              <w:t>none</w:t>
-            </w:r>
-          </w:p>
-        </w:tc>
-        <w:tc>
-          <w:tcPr>
-            <w:tcW w:type="dxa" w:w="665"/>
-          </w:tcPr>
-          <w:p>
-            <w:r>
-              <w:rPr>
-                <w:rFonts w:ascii="Times New Roman" w:hAnsi="Times New Roman" w:eastAsia="Times New Roman" w:cs="Times New Roman"/>
-              </w:rPr>
-            </w:r>
-            <w:r>
-              <w:rPr>
-                <w:rFonts w:ascii="Times New Roman" w:hAnsi="Times New Roman" w:eastAsia="Times New Roman" w:cs="Times New Roman"/>
-                <w:sz w:val="19"/>
-              </w:rPr>
-              <w:t>none</w:t>
-            </w:r>
-          </w:p>
-        </w:tc>
-      </w:tr>
-      <w:tr>
-        <w:tc>
-          <w:tcPr>
-            <w:tcW w:type="dxa" w:w="665"/>
-          </w:tcPr>
-          <w:p>
-            <w:r>
-              <w:rPr>
-                <w:rFonts w:ascii="Times New Roman" w:hAnsi="Times New Roman" w:eastAsia="Times New Roman" w:cs="Times New Roman"/>
-              </w:rPr>
-            </w:r>
-            <w:r>
-              <w:rPr>
-                <w:rFonts w:ascii="Times New Roman" w:hAnsi="Times New Roman" w:eastAsia="Times New Roman" w:cs="Times New Roman"/>
-                <w:sz w:val="19"/>
-              </w:rPr>
-              <w:t>S273</w:t>
-            </w:r>
-          </w:p>
-        </w:tc>
-        <w:tc>
-          <w:tcPr>
-            <w:tcW w:type="dxa" w:w="665"/>
-          </w:tcPr>
-          <w:p>
-            <w:r>
-              <w:rPr>
-                <w:rFonts w:ascii="Times New Roman" w:hAnsi="Times New Roman" w:eastAsia="Times New Roman" w:cs="Times New Roman"/>
-              </w:rPr>
-            </w:r>
-            <w:r>
-              <w:rPr>
-                <w:rFonts w:ascii="Times New Roman" w:hAnsi="Times New Roman" w:eastAsia="Times New Roman" w:cs="Times New Roman"/>
-                <w:sz w:val="19"/>
-              </w:rPr>
-              <w:t>inflam./gut/immune → immune traits → IgAN</w:t>
-            </w:r>
-          </w:p>
-        </w:tc>
-        <w:tc>
-          <w:tcPr>
-            <w:tcW w:type="dxa" w:w="665"/>
-          </w:tcPr>
-          <w:p>
-            <w:r>
-              <w:rPr>
-                <w:rFonts w:ascii="Times New Roman" w:hAnsi="Times New Roman" w:eastAsia="Times New Roman" w:cs="Times New Roman"/>
-              </w:rPr>
-            </w:r>
-            <w:r>
-              <w:rPr>
-                <w:rFonts w:ascii="Times New Roman" w:hAnsi="Times New Roman" w:eastAsia="Times New Roman" w:cs="Times New Roman"/>
-                <w:sz w:val="19"/>
-              </w:rPr>
-              <w:t>2</w:t>
-            </w:r>
-          </w:p>
-        </w:tc>
-        <w:tc>
-          <w:tcPr>
-            <w:tcW w:type="dxa" w:w="665"/>
-          </w:tcPr>
-          <w:p>
-            <w:r>
-              <w:rPr>
-                <w:rFonts w:ascii="Times New Roman" w:hAnsi="Times New Roman" w:eastAsia="Times New Roman" w:cs="Times New Roman"/>
-              </w:rPr>
-            </w:r>
-            <w:r>
-              <w:rPr>
-                <w:rFonts w:ascii="Times New Roman" w:hAnsi="Times New Roman" w:eastAsia="Times New Roman" w:cs="Times New Roman"/>
-                <w:sz w:val="19"/>
-              </w:rPr>
-              <w:t>+0.070</w:t>
-            </w:r>
-          </w:p>
-        </w:tc>
-        <w:tc>
-          <w:tcPr>
-            <w:tcW w:type="dxa" w:w="665"/>
-          </w:tcPr>
-          <w:p>
-            <w:r>
-              <w:rPr>
-                <w:rFonts w:ascii="Times New Roman" w:hAnsi="Times New Roman" w:eastAsia="Times New Roman" w:cs="Times New Roman"/>
-              </w:rPr>
-            </w:r>
-            <w:r>
-              <w:rPr>
-                <w:rFonts w:ascii="Times New Roman" w:hAnsi="Times New Roman" w:eastAsia="Times New Roman" w:cs="Times New Roman"/>
-                <w:sz w:val="19"/>
-              </w:rPr>
-              <w:t>[−0.02, 0.16]</w:t>
-            </w:r>
-          </w:p>
-        </w:tc>
-        <w:tc>
-          <w:tcPr>
-            <w:tcW w:type="dxa" w:w="665"/>
-          </w:tcPr>
-          <w:p>
-            <w:r>
-              <w:rPr>
-                <w:rFonts w:ascii="Times New Roman" w:hAnsi="Times New Roman" w:eastAsia="Times New Roman" w:cs="Times New Roman"/>
-              </w:rPr>
-            </w:r>
-            <w:r>
-              <w:rPr>
-                <w:rFonts w:ascii="Times New Roman" w:hAnsi="Times New Roman" w:eastAsia="Times New Roman" w:cs="Times New Roman"/>
-                <w:sz w:val="19"/>
-              </w:rPr>
-              <w:t>−0.015</w:t>
-            </w:r>
-          </w:p>
-        </w:tc>
-        <w:tc>
-          <w:tcPr>
-            <w:tcW w:type="dxa" w:w="665"/>
-          </w:tcPr>
-          <w:p>
-            <w:r>
-              <w:rPr>
-                <w:rFonts w:ascii="Times New Roman" w:hAnsi="Times New Roman" w:eastAsia="Times New Roman" w:cs="Times New Roman"/>
-              </w:rPr>
-            </w:r>
-            <w:r>
-              <w:rPr>
-                <w:rFonts w:ascii="Times New Roman" w:hAnsi="Times New Roman" w:eastAsia="Times New Roman" w:cs="Times New Roman"/>
-                <w:sz w:val="19"/>
-              </w:rPr>
-              <w:t>high (UKB–UKB)</w:t>
-            </w:r>
-          </w:p>
-        </w:tc>
-        <w:tc>
-          <w:tcPr>
-            <w:tcW w:type="dxa" w:w="665"/>
-          </w:tcPr>
-          <w:p>
-            <w:r>
-              <w:rPr>
-                <w:rFonts w:ascii="Times New Roman" w:hAnsi="Times New Roman" w:eastAsia="Times New Roman" w:cs="Times New Roman"/>
-              </w:rPr>
-            </w:r>
-            <w:r>
-              <w:rPr>
-                <w:rFonts w:ascii="Times New Roman" w:hAnsi="Times New Roman" w:eastAsia="Times New Roman" w:cs="Times New Roman"/>
-                <w:sz w:val="19"/>
-              </w:rPr>
-              <w:t>−1.1</w:t>
-            </w:r>
-          </w:p>
-        </w:tc>
-        <w:tc>
-          <w:tcPr>
-            <w:tcW w:type="dxa" w:w="665"/>
-          </w:tcPr>
-          <w:p>
-            <w:r>
-              <w:rPr>
-                <w:rFonts w:ascii="Times New Roman" w:hAnsi="Times New Roman" w:eastAsia="Times New Roman" w:cs="Times New Roman"/>
-              </w:rPr>
-            </w:r>
-            <w:r>
-              <w:rPr>
-                <w:rFonts w:ascii="Times New Roman" w:hAnsi="Times New Roman" w:eastAsia="Times New Roman" w:cs="Times New Roman"/>
-                <w:sz w:val="19"/>
-              </w:rPr>
-              <w:t>−1.1</w:t>
-            </w:r>
-          </w:p>
-        </w:tc>
-        <w:tc>
-          <w:tcPr>
-            <w:tcW w:type="dxa" w:w="665"/>
-          </w:tcPr>
-          <w:p>
-            <w:r>
-              <w:rPr>
-                <w:rFonts w:ascii="Times New Roman" w:hAnsi="Times New Roman" w:eastAsia="Times New Roman" w:cs="Times New Roman"/>
-              </w:rPr>
-            </w:r>
-            <w:r>
-              <w:rPr>
-                <w:rFonts w:ascii="Times New Roman" w:hAnsi="Times New Roman" w:eastAsia="Times New Roman" w:cs="Times New Roman"/>
-                <w:sz w:val="19"/>
-              </w:rPr>
-              <w:t>−1.1</w:t>
-            </w:r>
-          </w:p>
-        </w:tc>
-        <w:tc>
-          <w:tcPr>
-            <w:tcW w:type="dxa" w:w="665"/>
-          </w:tcPr>
-          <w:p>
-            <w:r>
-              <w:rPr>
-                <w:rFonts w:ascii="Times New Roman" w:hAnsi="Times New Roman" w:eastAsia="Times New Roman" w:cs="Times New Roman"/>
-              </w:rPr>
-            </w:r>
-            <w:r>
-              <w:rPr>
-                <w:rFonts w:ascii="Times New Roman" w:hAnsi="Times New Roman" w:eastAsia="Times New Roman" w:cs="Times New Roman"/>
-                <w:sz w:val="19"/>
-              </w:rPr>
-              <w:t>+0.0</w:t>
-            </w:r>
-          </w:p>
-        </w:tc>
-        <w:tc>
-          <w:tcPr>
-            <w:tcW w:type="dxa" w:w="665"/>
-          </w:tcPr>
-          <w:p>
-            <w:r>
-              <w:rPr>
-                <w:rFonts w:ascii="Times New Roman" w:hAnsi="Times New Roman" w:eastAsia="Times New Roman" w:cs="Times New Roman"/>
-              </w:rPr>
-            </w:r>
-            <w:r>
-              <w:rPr>
-                <w:rFonts w:ascii="Times New Roman" w:hAnsi="Times New Roman" w:eastAsia="Times New Roman" w:cs="Times New Roman"/>
-                <w:sz w:val="19"/>
-              </w:rPr>
-              <w:t>none</w:t>
-            </w:r>
-          </w:p>
-        </w:tc>
-        <w:tc>
-          <w:tcPr>
-            <w:tcW w:type="dxa" w:w="665"/>
-          </w:tcPr>
-          <w:p>
-            <w:r>
-              <w:rPr>
-                <w:rFonts w:ascii="Times New Roman" w:hAnsi="Times New Roman" w:eastAsia="Times New Roman" w:cs="Times New Roman"/>
-              </w:rPr>
-            </w:r>
-            <w:r>
-              <w:rPr>
-                <w:rFonts w:ascii="Times New Roman" w:hAnsi="Times New Roman" w:eastAsia="Times New Roman" w:cs="Times New Roman"/>
-                <w:sz w:val="19"/>
-              </w:rPr>
-              <w:t>none</w:t>
-            </w:r>
-          </w:p>
-        </w:tc>
-      </w:tr>
-      <w:tr>
-        <w:tc>
-          <w:tcPr>
-            <w:tcW w:type="dxa" w:w="665"/>
-          </w:tcPr>
-          <w:p>
-            <w:r>
-              <w:rPr>
-                <w:rFonts w:ascii="Times New Roman" w:hAnsi="Times New Roman" w:eastAsia="Times New Roman" w:cs="Times New Roman"/>
-              </w:rPr>
-            </w:r>
-            <w:r>
-              <w:rPr>
-                <w:rFonts w:ascii="Times New Roman" w:hAnsi="Times New Roman" w:eastAsia="Times New Roman" w:cs="Times New Roman"/>
-                <w:sz w:val="19"/>
-              </w:rPr>
-              <w:t>S255</w:t>
-            </w:r>
-          </w:p>
-        </w:tc>
-        <w:tc>
-          <w:tcPr>
-            <w:tcW w:type="dxa" w:w="665"/>
-          </w:tcPr>
-          <w:p>
-            <w:r>
-              <w:rPr>
-                <w:rFonts w:ascii="Times New Roman" w:hAnsi="Times New Roman" w:eastAsia="Times New Roman" w:cs="Times New Roman"/>
-              </w:rPr>
-            </w:r>
-            <w:r>
-              <w:rPr>
-                <w:rFonts w:ascii="Times New Roman" w:hAnsi="Times New Roman" w:eastAsia="Times New Roman" w:cs="Times New Roman"/>
-                <w:sz w:val="19"/>
-              </w:rPr>
-              <w:t>immune cells → serum metabolites → lymphoid leukemia</w:t>
-            </w:r>
-          </w:p>
-        </w:tc>
-        <w:tc>
-          <w:tcPr>
-            <w:tcW w:type="dxa" w:w="665"/>
-          </w:tcPr>
-          <w:p>
-            <w:r>
-              <w:rPr>
-                <w:rFonts w:ascii="Times New Roman" w:hAnsi="Times New Roman" w:eastAsia="Times New Roman" w:cs="Times New Roman"/>
-              </w:rPr>
-            </w:r>
-            <w:r>
-              <w:rPr>
-                <w:rFonts w:ascii="Times New Roman" w:hAnsi="Times New Roman" w:eastAsia="Times New Roman" w:cs="Times New Roman"/>
-                <w:sz w:val="19"/>
-              </w:rPr>
-              <w:t>1</w:t>
-            </w:r>
-          </w:p>
-        </w:tc>
-        <w:tc>
-          <w:tcPr>
-            <w:tcW w:type="dxa" w:w="665"/>
-          </w:tcPr>
-          <w:p>
-            <w:r>
-              <w:rPr>
-                <w:rFonts w:ascii="Times New Roman" w:hAnsi="Times New Roman" w:eastAsia="Times New Roman" w:cs="Times New Roman"/>
-              </w:rPr>
-            </w:r>
-            <w:r>
-              <w:rPr>
-                <w:rFonts w:ascii="Times New Roman" w:hAnsi="Times New Roman" w:eastAsia="Times New Roman" w:cs="Times New Roman"/>
-                <w:sz w:val="19"/>
-              </w:rPr>
-              <w:t>+0.186</w:t>
-            </w:r>
-          </w:p>
-        </w:tc>
-        <w:tc>
-          <w:tcPr>
-            <w:tcW w:type="dxa" w:w="665"/>
-          </w:tcPr>
-          <w:p>
-            <w:r>
-              <w:rPr>
-                <w:rFonts w:ascii="Times New Roman" w:hAnsi="Times New Roman" w:eastAsia="Times New Roman" w:cs="Times New Roman"/>
-              </w:rPr>
-            </w:r>
-            <w:r>
-              <w:rPr>
-                <w:rFonts w:ascii="Times New Roman" w:hAnsi="Times New Roman" w:eastAsia="Times New Roman" w:cs="Times New Roman"/>
-                <w:sz w:val="19"/>
-              </w:rPr>
-              <w:t>[0.06, 0.31]</w:t>
-            </w:r>
-          </w:p>
-        </w:tc>
-        <w:tc>
-          <w:tcPr>
-            <w:tcW w:type="dxa" w:w="665"/>
-          </w:tcPr>
-          <w:p>
-            <w:r>
-              <w:rPr>
-                <w:rFonts w:ascii="Times New Roman" w:hAnsi="Times New Roman" w:eastAsia="Times New Roman" w:cs="Times New Roman"/>
-              </w:rPr>
-            </w:r>
-            <w:r>
-              <w:rPr>
-                <w:rFonts w:ascii="Times New Roman" w:hAnsi="Times New Roman" w:eastAsia="Times New Roman" w:cs="Times New Roman"/>
-                <w:sz w:val="19"/>
-              </w:rPr>
-              <w:t>+0.188</w:t>
-            </w:r>
-          </w:p>
-        </w:tc>
-        <w:tc>
-          <w:tcPr>
-            <w:tcW w:type="dxa" w:w="665"/>
-          </w:tcPr>
-          <w:p>
-            <w:r>
-              <w:rPr>
-                <w:rFonts w:ascii="Times New Roman" w:hAnsi="Times New Roman" w:eastAsia="Times New Roman" w:cs="Times New Roman"/>
-              </w:rPr>
-            </w:r>
-            <w:r>
-              <w:rPr>
-                <w:rFonts w:ascii="Times New Roman" w:hAnsi="Times New Roman" w:eastAsia="Times New Roman" w:cs="Times New Roman"/>
-                <w:sz w:val="19"/>
-              </w:rPr>
-              <w:t>≈0 (UKB–FinnGen)</w:t>
-            </w:r>
-          </w:p>
-        </w:tc>
-        <w:tc>
-          <w:tcPr>
-            <w:tcW w:type="dxa" w:w="665"/>
-          </w:tcPr>
-          <w:p>
-            <w:r>
-              <w:rPr>
-                <w:rFonts w:ascii="Times New Roman" w:hAnsi="Times New Roman" w:eastAsia="Times New Roman" w:cs="Times New Roman"/>
-              </w:rPr>
-            </w:r>
-            <w:r>
-              <w:rPr>
-                <w:rFonts w:ascii="Times New Roman" w:hAnsi="Times New Roman" w:eastAsia="Times New Roman" w:cs="Times New Roman"/>
-                <w:sz w:val="19"/>
-              </w:rPr>
-              <w:t>−0.0</w:t>
-            </w:r>
-          </w:p>
-        </w:tc>
-        <w:tc>
-          <w:tcPr>
-            <w:tcW w:type="dxa" w:w="665"/>
-          </w:tcPr>
-          <w:p>
-            <w:r>
-              <w:rPr>
-                <w:rFonts w:ascii="Times New Roman" w:hAnsi="Times New Roman" w:eastAsia="Times New Roman" w:cs="Times New Roman"/>
-              </w:rPr>
-            </w:r>
-            <w:r>
-              <w:rPr>
-                <w:rFonts w:ascii="Times New Roman" w:hAnsi="Times New Roman" w:eastAsia="Times New Roman" w:cs="Times New Roman"/>
-                <w:sz w:val="19"/>
-              </w:rPr>
-              <w:t>−0.0</w:t>
-            </w:r>
-          </w:p>
-        </w:tc>
-        <w:tc>
-          <w:tcPr>
-            <w:tcW w:type="dxa" w:w="665"/>
-          </w:tcPr>
-          <w:p>
-            <w:r>
-              <w:rPr>
-                <w:rFonts w:ascii="Times New Roman" w:hAnsi="Times New Roman" w:eastAsia="Times New Roman" w:cs="Times New Roman"/>
-              </w:rPr>
-            </w:r>
-            <w:r>
-              <w:rPr>
-                <w:rFonts w:ascii="Times New Roman" w:hAnsi="Times New Roman" w:eastAsia="Times New Roman" w:cs="Times New Roman"/>
-                <w:sz w:val="19"/>
-              </w:rPr>
-              <w:t>−0.0</w:t>
-            </w:r>
-          </w:p>
-        </w:tc>
-        <w:tc>
-          <w:tcPr>
-            <w:tcW w:type="dxa" w:w="665"/>
-          </w:tcPr>
-          <w:p>
-            <w:r>
-              <w:rPr>
-                <w:rFonts w:ascii="Times New Roman" w:hAnsi="Times New Roman" w:eastAsia="Times New Roman" w:cs="Times New Roman"/>
-              </w:rPr>
-            </w:r>
-            <w:r>
-              <w:rPr>
-                <w:rFonts w:ascii="Times New Roman" w:hAnsi="Times New Roman" w:eastAsia="Times New Roman" w:cs="Times New Roman"/>
-                <w:sz w:val="19"/>
-              </w:rPr>
-              <w:t>+0.0</w:t>
-            </w:r>
-          </w:p>
-        </w:tc>
-        <w:tc>
-          <w:tcPr>
-            <w:tcW w:type="dxa" w:w="665"/>
-          </w:tcPr>
-          <w:p>
-            <w:r>
-              <w:rPr>
-                <w:rFonts w:ascii="Times New Roman" w:hAnsi="Times New Roman" w:eastAsia="Times New Roman" w:cs="Times New Roman"/>
-              </w:rPr>
-            </w:r>
-            <w:r>
-              <w:rPr>
-                <w:rFonts w:ascii="Times New Roman" w:hAnsi="Times New Roman" w:eastAsia="Times New Roman" w:cs="Times New Roman"/>
-                <w:sz w:val="19"/>
-              </w:rPr>
-              <w:t>none</w:t>
-            </w:r>
-          </w:p>
-        </w:tc>
-        <w:tc>
-          <w:tcPr>
-            <w:tcW w:type="dxa" w:w="665"/>
-          </w:tcPr>
-          <w:p>
-            <w:r>
-              <w:rPr>
-                <w:rFonts w:ascii="Times New Roman" w:hAnsi="Times New Roman" w:eastAsia="Times New Roman" w:cs="Times New Roman"/>
-              </w:rPr>
-            </w:r>
-            <w:r>
-              <w:rPr>
-                <w:rFonts w:ascii="Times New Roman" w:hAnsi="Times New Roman" w:eastAsia="Times New Roman" w:cs="Times New Roman"/>
-                <w:sz w:val="19"/>
-              </w:rPr>
-              <w:t>none</w:t>
-            </w:r>
-          </w:p>
-        </w:tc>
-      </w:tr>
-      <w:tr>
-        <w:tc>
-          <w:tcPr>
-            <w:tcW w:type="dxa" w:w="665"/>
-          </w:tcPr>
-          <w:p>
-            <w:r>
-              <w:rPr>
-                <w:rFonts w:ascii="Times New Roman" w:hAnsi="Times New Roman" w:eastAsia="Times New Roman" w:cs="Times New Roman"/>
-              </w:rPr>
-            </w:r>
-            <w:r>
-              <w:rPr>
-                <w:rFonts w:ascii="Times New Roman" w:hAnsi="Times New Roman" w:eastAsia="Times New Roman" w:cs="Times New Roman"/>
-                <w:sz w:val="19"/>
-              </w:rPr>
-              <w:t>S137</w:t>
-            </w:r>
-          </w:p>
-        </w:tc>
-        <w:tc>
-          <w:tcPr>
-            <w:tcW w:type="dxa" w:w="665"/>
-          </w:tcPr>
-          <w:p>
-            <w:r>
-              <w:rPr>
-                <w:rFonts w:ascii="Times New Roman" w:hAnsi="Times New Roman" w:eastAsia="Times New Roman" w:cs="Times New Roman"/>
-              </w:rPr>
-            </w:r>
-            <w:r>
-              <w:rPr>
-                <w:rFonts w:ascii="Times New Roman" w:hAnsi="Times New Roman" w:eastAsia="Times New Roman" w:cs="Times New Roman"/>
-                <w:sz w:val="19"/>
-              </w:rPr>
-              <w:t>25(OH)D → serum calcium → migraine</w:t>
-            </w:r>
-          </w:p>
-        </w:tc>
-        <w:tc>
-          <w:tcPr>
-            <w:tcW w:type="dxa" w:w="665"/>
-          </w:tcPr>
-          <w:p>
-            <w:r>
-              <w:rPr>
-                <w:rFonts w:ascii="Times New Roman" w:hAnsi="Times New Roman" w:eastAsia="Times New Roman" w:cs="Times New Roman"/>
-              </w:rPr>
-            </w:r>
-            <w:r>
-              <w:rPr>
-                <w:rFonts w:ascii="Times New Roman" w:hAnsi="Times New Roman" w:eastAsia="Times New Roman" w:cs="Times New Roman"/>
-                <w:sz w:val="19"/>
-              </w:rPr>
-              <w:t>2</w:t>
-            </w:r>
-          </w:p>
-        </w:tc>
-        <w:tc>
-          <w:tcPr>
-            <w:tcW w:type="dxa" w:w="665"/>
-          </w:tcPr>
-          <w:p>
-            <w:r>
-              <w:rPr>
-                <w:rFonts w:ascii="Times New Roman" w:hAnsi="Times New Roman" w:eastAsia="Times New Roman" w:cs="Times New Roman"/>
-              </w:rPr>
-            </w:r>
-            <w:r>
-              <w:rPr>
-                <w:rFonts w:ascii="Times New Roman" w:hAnsi="Times New Roman" w:eastAsia="Times New Roman" w:cs="Times New Roman"/>
-                <w:sz w:val="19"/>
-              </w:rPr>
-              <w:t>+0.218</w:t>
-            </w:r>
-          </w:p>
-        </w:tc>
-        <w:tc>
-          <w:tcPr>
-            <w:tcW w:type="dxa" w:w="665"/>
-          </w:tcPr>
-          <w:p>
-            <w:r>
-              <w:rPr>
-                <w:rFonts w:ascii="Times New Roman" w:hAnsi="Times New Roman" w:eastAsia="Times New Roman" w:cs="Times New Roman"/>
-              </w:rPr>
-            </w:r>
-            <w:r>
-              <w:rPr>
-                <w:rFonts w:ascii="Times New Roman" w:hAnsi="Times New Roman" w:eastAsia="Times New Roman" w:cs="Times New Roman"/>
-                <w:sz w:val="19"/>
-              </w:rPr>
-              <w:t>[0.09, 0.34]</w:t>
-            </w:r>
-          </w:p>
-        </w:tc>
-        <w:tc>
-          <w:tcPr>
-            <w:tcW w:type="dxa" w:w="665"/>
-          </w:tcPr>
-          <w:p>
-            <w:r>
-              <w:rPr>
-                <w:rFonts w:ascii="Times New Roman" w:hAnsi="Times New Roman" w:eastAsia="Times New Roman" w:cs="Times New Roman"/>
-              </w:rPr>
-            </w:r>
-            <w:r>
-              <w:rPr>
-                <w:rFonts w:ascii="Times New Roman" w:hAnsi="Times New Roman" w:eastAsia="Times New Roman" w:cs="Times New Roman"/>
-                <w:sz w:val="19"/>
-              </w:rPr>
-              <w:t>+0.235</w:t>
-            </w:r>
-          </w:p>
-        </w:tc>
-        <w:tc>
-          <w:tcPr>
-            <w:tcW w:type="dxa" w:w="665"/>
-          </w:tcPr>
-          <w:p>
-            <w:r>
-              <w:rPr>
-                <w:rFonts w:ascii="Times New Roman" w:hAnsi="Times New Roman" w:eastAsia="Times New Roman" w:cs="Times New Roman"/>
-              </w:rPr>
-            </w:r>
-            <w:r>
-              <w:rPr>
-                <w:rFonts w:ascii="Times New Roman" w:hAnsi="Times New Roman" w:eastAsia="Times New Roman" w:cs="Times New Roman"/>
-                <w:sz w:val="19"/>
-              </w:rPr>
-              <w:t>high (UKB–UKB)</w:t>
-            </w:r>
-          </w:p>
-        </w:tc>
-        <w:tc>
-          <w:tcPr>
-            <w:tcW w:type="dxa" w:w="665"/>
-          </w:tcPr>
-          <w:p>
-            <w:r>
-              <w:rPr>
-                <w:rFonts w:ascii="Times New Roman" w:hAnsi="Times New Roman" w:eastAsia="Times New Roman" w:cs="Times New Roman"/>
-              </w:rPr>
-            </w:r>
-            <w:r>
-              <w:rPr>
-                <w:rFonts w:ascii="Times New Roman" w:hAnsi="Times New Roman" w:eastAsia="Times New Roman" w:cs="Times New Roman"/>
-                <w:sz w:val="19"/>
-              </w:rPr>
-              <w:t>−14.2</w:t>
-            </w:r>
-          </w:p>
-        </w:tc>
-        <w:tc>
-          <w:tcPr>
-            <w:tcW w:type="dxa" w:w="665"/>
-          </w:tcPr>
-          <w:p>
-            <w:r>
-              <w:rPr>
-                <w:rFonts w:ascii="Times New Roman" w:hAnsi="Times New Roman" w:eastAsia="Times New Roman" w:cs="Times New Roman"/>
-              </w:rPr>
-            </w:r>
-            <w:r>
-              <w:rPr>
-                <w:rFonts w:ascii="Times New Roman" w:hAnsi="Times New Roman" w:eastAsia="Times New Roman" w:cs="Times New Roman"/>
-                <w:sz w:val="19"/>
-              </w:rPr>
-              <w:t>−14.2</w:t>
-            </w:r>
-          </w:p>
-        </w:tc>
-        <w:tc>
-          <w:tcPr>
-            <w:tcW w:type="dxa" w:w="665"/>
-          </w:tcPr>
-          <w:p>
-            <w:r>
-              <w:rPr>
-                <w:rFonts w:ascii="Times New Roman" w:hAnsi="Times New Roman" w:eastAsia="Times New Roman" w:cs="Times New Roman"/>
-              </w:rPr>
-            </w:r>
-            <w:r>
-              <w:rPr>
-                <w:rFonts w:ascii="Times New Roman" w:hAnsi="Times New Roman" w:eastAsia="Times New Roman" w:cs="Times New Roman"/>
-                <w:sz w:val="19"/>
-              </w:rPr>
-              <w:t>−14.2</w:t>
-            </w:r>
-          </w:p>
-        </w:tc>
-        <w:tc>
-          <w:tcPr>
-            <w:tcW w:type="dxa" w:w="665"/>
-          </w:tcPr>
-          <w:p>
-            <w:r>
-              <w:rPr>
-                <w:rFonts w:ascii="Times New Roman" w:hAnsi="Times New Roman" w:eastAsia="Times New Roman" w:cs="Times New Roman"/>
-              </w:rPr>
-            </w:r>
-            <w:r>
-              <w:rPr>
-                <w:rFonts w:ascii="Times New Roman" w:hAnsi="Times New Roman" w:eastAsia="Times New Roman" w:cs="Times New Roman"/>
-                <w:sz w:val="19"/>
-              </w:rPr>
-              <w:t>+0.0</w:t>
-            </w:r>
-          </w:p>
-        </w:tc>
-        <w:tc>
-          <w:tcPr>
-            <w:tcW w:type="dxa" w:w="665"/>
-          </w:tcPr>
-          <w:p>
-            <w:r>
-              <w:rPr>
-                <w:rFonts w:ascii="Times New Roman" w:hAnsi="Times New Roman" w:eastAsia="Times New Roman" w:cs="Times New Roman"/>
-              </w:rPr>
-            </w:r>
-            <w:r>
-              <w:rPr>
-                <w:rFonts w:ascii="Times New Roman" w:hAnsi="Times New Roman" w:eastAsia="Times New Roman" w:cs="Times New Roman"/>
-                <w:sz w:val="19"/>
-              </w:rPr>
-              <w:t>none</w:t>
-            </w:r>
-          </w:p>
-        </w:tc>
-        <w:tc>
-          <w:tcPr>
-            <w:tcW w:type="dxa" w:w="665"/>
-          </w:tcPr>
-          <w:p>
-            <w:r>
-              <w:rPr>
-                <w:rFonts w:ascii="Times New Roman" w:hAnsi="Times New Roman" w:eastAsia="Times New Roman" w:cs="Times New Roman"/>
-              </w:rPr>
-            </w:r>
-            <w:r>
-              <w:rPr>
-                <w:rFonts w:ascii="Times New Roman" w:hAnsi="Times New Roman" w:eastAsia="Times New Roman" w:cs="Times New Roman"/>
-                <w:sz w:val="19"/>
-              </w:rPr>
-              <w:t>none</w:t>
-            </w:r>
-          </w:p>
-        </w:tc>
-      </w:tr>
-      <w:tr>
-        <w:tc>
-          <w:tcPr>
-            <w:tcW w:type="dxa" w:w="665"/>
-          </w:tcPr>
-          <w:p>
-            <w:r>
-              <w:rPr>
-                <w:rFonts w:ascii="Times New Roman" w:hAnsi="Times New Roman" w:eastAsia="Times New Roman" w:cs="Times New Roman"/>
-              </w:rPr>
-            </w:r>
-            <w:r>
-              <w:rPr>
-                <w:rFonts w:ascii="Times New Roman" w:hAnsi="Times New Roman" w:eastAsia="Times New Roman" w:cs="Times New Roman"/>
-                <w:sz w:val="19"/>
-              </w:rPr>
-              <w:t>S217</w:t>
-            </w:r>
-          </w:p>
-        </w:tc>
-        <w:tc>
-          <w:tcPr>
-            <w:tcW w:type="dxa" w:w="665"/>
-          </w:tcPr>
-          <w:p>
-            <w:r>
-              <w:rPr>
-                <w:rFonts w:ascii="Times New Roman" w:hAnsi="Times New Roman" w:eastAsia="Times New Roman" w:cs="Times New Roman"/>
-              </w:rPr>
-            </w:r>
-            <w:r>
-              <w:rPr>
-                <w:rFonts w:ascii="Times New Roman" w:hAnsi="Times New Roman" w:eastAsia="Times New Roman" w:cs="Times New Roman"/>
-                <w:sz w:val="19"/>
-              </w:rPr>
-              <w:t>RA → immunosuppressants → bronchiectasis</w:t>
-            </w:r>
-          </w:p>
-        </w:tc>
-        <w:tc>
-          <w:tcPr>
-            <w:tcW w:type="dxa" w:w="665"/>
-          </w:tcPr>
-          <w:p>
-            <w:r>
-              <w:rPr>
-                <w:rFonts w:ascii="Times New Roman" w:hAnsi="Times New Roman" w:eastAsia="Times New Roman" w:cs="Times New Roman"/>
-              </w:rPr>
-            </w:r>
-            <w:r>
-              <w:rPr>
-                <w:rFonts w:ascii="Times New Roman" w:hAnsi="Times New Roman" w:eastAsia="Times New Roman" w:cs="Times New Roman"/>
-                <w:sz w:val="19"/>
-              </w:rPr>
-              <w:t>1</w:t>
-            </w:r>
-          </w:p>
-        </w:tc>
-        <w:tc>
-          <w:tcPr>
-            <w:tcW w:type="dxa" w:w="665"/>
-          </w:tcPr>
-          <w:p>
-            <w:r>
-              <w:rPr>
-                <w:rFonts w:ascii="Times New Roman" w:hAnsi="Times New Roman" w:eastAsia="Times New Roman" w:cs="Times New Roman"/>
-              </w:rPr>
-            </w:r>
-            <w:r>
-              <w:rPr>
-                <w:rFonts w:ascii="Times New Roman" w:hAnsi="Times New Roman" w:eastAsia="Times New Roman" w:cs="Times New Roman"/>
-                <w:sz w:val="19"/>
-              </w:rPr>
-              <w:t>+0.810</w:t>
-            </w:r>
-          </w:p>
-        </w:tc>
-        <w:tc>
-          <w:tcPr>
-            <w:tcW w:type="dxa" w:w="665"/>
-          </w:tcPr>
-          <w:p>
-            <w:r>
-              <w:rPr>
-                <w:rFonts w:ascii="Times New Roman" w:hAnsi="Times New Roman" w:eastAsia="Times New Roman" w:cs="Times New Roman"/>
-              </w:rPr>
-            </w:r>
-            <w:r>
-              <w:rPr>
-                <w:rFonts w:ascii="Times New Roman" w:hAnsi="Times New Roman" w:eastAsia="Times New Roman" w:cs="Times New Roman"/>
-                <w:sz w:val="19"/>
-              </w:rPr>
-              <w:t>[0.37, 0.95]</w:t>
-            </w:r>
-          </w:p>
-        </w:tc>
-        <w:tc>
-          <w:tcPr>
-            <w:tcW w:type="dxa" w:w="665"/>
-          </w:tcPr>
-          <w:p>
-            <w:r>
-              <w:rPr>
-                <w:rFonts w:ascii="Times New Roman" w:hAnsi="Times New Roman" w:eastAsia="Times New Roman" w:cs="Times New Roman"/>
-              </w:rPr>
-            </w:r>
-            <w:r>
-              <w:rPr>
-                <w:rFonts w:ascii="Times New Roman" w:hAnsi="Times New Roman" w:eastAsia="Times New Roman" w:cs="Times New Roman"/>
-                <w:sz w:val="19"/>
-              </w:rPr>
-              <w:t>+0.616</w:t>
-            </w:r>
-          </w:p>
-        </w:tc>
-        <w:tc>
-          <w:tcPr>
-            <w:tcW w:type="dxa" w:w="665"/>
-          </w:tcPr>
-          <w:p>
-            <w:r>
-              <w:rPr>
-                <w:rFonts w:ascii="Times New Roman" w:hAnsi="Times New Roman" w:eastAsia="Times New Roman" w:cs="Times New Roman"/>
-              </w:rPr>
-            </w:r>
-            <w:r>
-              <w:rPr>
-                <w:rFonts w:ascii="Times New Roman" w:hAnsi="Times New Roman" w:eastAsia="Times New Roman" w:cs="Times New Roman"/>
-                <w:sz w:val="19"/>
-              </w:rPr>
-              <w:t>high (UKB–UKB)</w:t>
-            </w:r>
-          </w:p>
-        </w:tc>
-        <w:tc>
-          <w:tcPr>
-            <w:tcW w:type="dxa" w:w="665"/>
-          </w:tcPr>
-          <w:p>
-            <w:r>
-              <w:rPr>
-                <w:rFonts w:ascii="Times New Roman" w:hAnsi="Times New Roman" w:eastAsia="Times New Roman" w:cs="Times New Roman"/>
-              </w:rPr>
-            </w:r>
-            <w:r>
-              <w:rPr>
-                <w:rFonts w:ascii="Times New Roman" w:hAnsi="Times New Roman" w:eastAsia="Times New Roman" w:cs="Times New Roman"/>
-                <w:sz w:val="19"/>
-              </w:rPr>
-              <w:t>−0.2</w:t>
-            </w:r>
-          </w:p>
-        </w:tc>
-        <w:tc>
-          <w:tcPr>
-            <w:tcW w:type="dxa" w:w="665"/>
-          </w:tcPr>
-          <w:p>
-            <w:r>
-              <w:rPr>
-                <w:rFonts w:ascii="Times New Roman" w:hAnsi="Times New Roman" w:eastAsia="Times New Roman" w:cs="Times New Roman"/>
-              </w:rPr>
-            </w:r>
-            <w:r>
-              <w:rPr>
-                <w:rFonts w:ascii="Times New Roman" w:hAnsi="Times New Roman" w:eastAsia="Times New Roman" w:cs="Times New Roman"/>
-                <w:sz w:val="19"/>
-              </w:rPr>
-              <w:t>−0.2</w:t>
-            </w:r>
-          </w:p>
-        </w:tc>
-        <w:tc>
-          <w:tcPr>
-            <w:tcW w:type="dxa" w:w="665"/>
-          </w:tcPr>
-          <w:p>
-            <w:r>
-              <w:rPr>
-                <w:rFonts w:ascii="Times New Roman" w:hAnsi="Times New Roman" w:eastAsia="Times New Roman" w:cs="Times New Roman"/>
-              </w:rPr>
-            </w:r>
-            <w:r>
-              <w:rPr>
-                <w:rFonts w:ascii="Times New Roman" w:hAnsi="Times New Roman" w:eastAsia="Times New Roman" w:cs="Times New Roman"/>
-                <w:sz w:val="19"/>
-              </w:rPr>
-              <w:t>−0.2</w:t>
-            </w:r>
-          </w:p>
-        </w:tc>
-        <w:tc>
-          <w:tcPr>
-            <w:tcW w:type="dxa" w:w="665"/>
-          </w:tcPr>
-          <w:p>
-            <w:r>
-              <w:rPr>
-                <w:rFonts w:ascii="Times New Roman" w:hAnsi="Times New Roman" w:eastAsia="Times New Roman" w:cs="Times New Roman"/>
-              </w:rPr>
-            </w:r>
-            <w:r>
-              <w:rPr>
-                <w:rFonts w:ascii="Times New Roman" w:hAnsi="Times New Roman" w:eastAsia="Times New Roman" w:cs="Times New Roman"/>
-                <w:sz w:val="19"/>
-              </w:rPr>
-              <w:t>+0.0</w:t>
-            </w:r>
-          </w:p>
-        </w:tc>
-        <w:tc>
-          <w:tcPr>
-            <w:tcW w:type="dxa" w:w="665"/>
-          </w:tcPr>
-          <w:p>
-            <w:r>
-              <w:rPr>
-                <w:rFonts w:ascii="Times New Roman" w:hAnsi="Times New Roman" w:eastAsia="Times New Roman" w:cs="Times New Roman"/>
-              </w:rPr>
-            </w:r>
-            <w:r>
-              <w:rPr>
-                <w:rFonts w:ascii="Times New Roman" w:hAnsi="Times New Roman" w:eastAsia="Times New Roman" w:cs="Times New Roman"/>
-                <w:sz w:val="19"/>
-              </w:rPr>
-              <w:t>none</w:t>
-            </w:r>
-          </w:p>
-        </w:tc>
-        <w:tc>
-          <w:tcPr>
-            <w:tcW w:type="dxa" w:w="665"/>
-          </w:tcPr>
-          <w:p>
-            <w:r>
-              <w:rPr>
-                <w:rFonts w:ascii="Times New Roman" w:hAnsi="Times New Roman" w:eastAsia="Times New Roman" w:cs="Times New Roman"/>
-              </w:rPr>
-            </w:r>
-            <w:r>
-              <w:rPr>
-                <w:rFonts w:ascii="Times New Roman" w:hAnsi="Times New Roman" w:eastAsia="Times New Roman" w:cs="Times New Roman"/>
-                <w:sz w:val="19"/>
-              </w:rPr>
-              <w:t>none</w:t>
-            </w:r>
-          </w:p>
-        </w:tc>
-      </w:tr>
-      <w:tr>
-        <w:tc>
-          <w:tcPr>
-            <w:tcW w:type="dxa" w:w="665"/>
-          </w:tcPr>
-          <w:p>
-            <w:r>
-              <w:rPr>
-                <w:rFonts w:ascii="Times New Roman" w:hAnsi="Times New Roman" w:eastAsia="Times New Roman" w:cs="Times New Roman"/>
-              </w:rPr>
-            </w:r>
-            <w:r>
-              <w:rPr>
-                <w:rFonts w:ascii="Times New Roman" w:hAnsi="Times New Roman" w:eastAsia="Times New Roman" w:cs="Times New Roman"/>
-                <w:sz w:val="19"/>
-              </w:rPr>
-              <w:t>S267</w:t>
-            </w:r>
-          </w:p>
-        </w:tc>
-        <w:tc>
-          <w:tcPr>
-            <w:tcW w:type="dxa" w:w="665"/>
-          </w:tcPr>
-          <w:p>
-            <w:r>
-              <w:rPr>
-                <w:rFonts w:ascii="Times New Roman" w:hAnsi="Times New Roman" w:eastAsia="Times New Roman" w:cs="Times New Roman"/>
-              </w:rPr>
-            </w:r>
-            <w:r>
-              <w:rPr>
-                <w:rFonts w:ascii="Times New Roman" w:hAnsi="Times New Roman" w:eastAsia="Times New Roman" w:cs="Times New Roman"/>
-                <w:sz w:val="19"/>
-              </w:rPr>
-              <w:t>vitamin D → lipids → ocular disorders</w:t>
-            </w:r>
-          </w:p>
-        </w:tc>
-        <w:tc>
-          <w:tcPr>
-            <w:tcW w:type="dxa" w:w="665"/>
-          </w:tcPr>
-          <w:p>
-            <w:r>
-              <w:rPr>
-                <w:rFonts w:ascii="Times New Roman" w:hAnsi="Times New Roman" w:eastAsia="Times New Roman" w:cs="Times New Roman"/>
-              </w:rPr>
-            </w:r>
-            <w:r>
-              <w:rPr>
-                <w:rFonts w:ascii="Times New Roman" w:hAnsi="Times New Roman" w:eastAsia="Times New Roman" w:cs="Times New Roman"/>
-                <w:sz w:val="19"/>
-              </w:rPr>
-              <w:t>3</w:t>
-            </w:r>
-          </w:p>
-        </w:tc>
-        <w:tc>
-          <w:tcPr>
-            <w:tcW w:type="dxa" w:w="665"/>
-          </w:tcPr>
-          <w:p>
-            <w:r>
-              <w:rPr>
-                <w:rFonts w:ascii="Times New Roman" w:hAnsi="Times New Roman" w:eastAsia="Times New Roman" w:cs="Times New Roman"/>
-              </w:rPr>
-            </w:r>
-            <w:r>
-              <w:rPr>
-                <w:rFonts w:ascii="Times New Roman" w:hAnsi="Times New Roman" w:eastAsia="Times New Roman" w:cs="Times New Roman"/>
-                <w:sz w:val="19"/>
-              </w:rPr>
-              <w:t>−0.102</w:t>
-            </w:r>
-          </w:p>
-        </w:tc>
-        <w:tc>
-          <w:tcPr>
-            <w:tcW w:type="dxa" w:w="665"/>
-          </w:tcPr>
-          <w:p>
-            <w:r>
-              <w:rPr>
-                <w:rFonts w:ascii="Times New Roman" w:hAnsi="Times New Roman" w:eastAsia="Times New Roman" w:cs="Times New Roman"/>
-              </w:rPr>
-            </w:r>
-            <w:r>
-              <w:rPr>
-                <w:rFonts w:ascii="Times New Roman" w:hAnsi="Times New Roman" w:eastAsia="Times New Roman" w:cs="Times New Roman"/>
-                <w:sz w:val="19"/>
-              </w:rPr>
-              <w:t>[−0.31, 0.11]</w:t>
-            </w:r>
-          </w:p>
-        </w:tc>
-        <w:tc>
-          <w:tcPr>
-            <w:tcW w:type="dxa" w:w="665"/>
-          </w:tcPr>
-          <w:p>
-            <w:r>
-              <w:rPr>
-                <w:rFonts w:ascii="Times New Roman" w:hAnsi="Times New Roman" w:eastAsia="Times New Roman" w:cs="Times New Roman"/>
-              </w:rPr>
-            </w:r>
-            <w:r>
-              <w:rPr>
-                <w:rFonts w:ascii="Times New Roman" w:hAnsi="Times New Roman" w:eastAsia="Times New Roman" w:cs="Times New Roman"/>
-                <w:sz w:val="19"/>
-              </w:rPr>
-              <w:t>−0.330</w:t>
-            </w:r>
-          </w:p>
-        </w:tc>
-        <w:tc>
-          <w:tcPr>
-            <w:tcW w:type="dxa" w:w="665"/>
-          </w:tcPr>
-          <w:p>
-            <w:r>
-              <w:rPr>
-                <w:rFonts w:ascii="Times New Roman" w:hAnsi="Times New Roman" w:eastAsia="Times New Roman" w:cs="Times New Roman"/>
-              </w:rPr>
-            </w:r>
-            <w:r>
-              <w:rPr>
-                <w:rFonts w:ascii="Times New Roman" w:hAnsi="Times New Roman" w:eastAsia="Times New Roman" w:cs="Times New Roman"/>
-                <w:sz w:val="19"/>
-              </w:rPr>
-              <w:t>≈0 (UKB–FinnGen)</w:t>
-            </w:r>
-          </w:p>
-        </w:tc>
-        <w:tc>
-          <w:tcPr>
-            <w:tcW w:type="dxa" w:w="665"/>
-          </w:tcPr>
-          <w:p>
-            <w:r>
-              <w:rPr>
-                <w:rFonts w:ascii="Times New Roman" w:hAnsi="Times New Roman" w:eastAsia="Times New Roman" w:cs="Times New Roman"/>
-              </w:rPr>
-            </w:r>
-            <w:r>
-              <w:rPr>
-                <w:rFonts w:ascii="Times New Roman" w:hAnsi="Times New Roman" w:eastAsia="Times New Roman" w:cs="Times New Roman"/>
-                <w:sz w:val="19"/>
-              </w:rPr>
-              <w:t>−1.6</w:t>
-            </w:r>
-          </w:p>
-        </w:tc>
-        <w:tc>
-          <w:tcPr>
-            <w:tcW w:type="dxa" w:w="665"/>
-          </w:tcPr>
-          <w:p>
-            <w:r>
-              <w:rPr>
-                <w:rFonts w:ascii="Times New Roman" w:hAnsi="Times New Roman" w:eastAsia="Times New Roman" w:cs="Times New Roman"/>
-              </w:rPr>
-            </w:r>
-            <w:r>
-              <w:rPr>
-                <w:rFonts w:ascii="Times New Roman" w:hAnsi="Times New Roman" w:eastAsia="Times New Roman" w:cs="Times New Roman"/>
-                <w:sz w:val="19"/>
-              </w:rPr>
-              <w:t>−1.6</w:t>
-            </w:r>
-          </w:p>
-        </w:tc>
-        <w:tc>
-          <w:tcPr>
-            <w:tcW w:type="dxa" w:w="665"/>
-          </w:tcPr>
-          <w:p>
-            <w:r>
-              <w:rPr>
-                <w:rFonts w:ascii="Times New Roman" w:hAnsi="Times New Roman" w:eastAsia="Times New Roman" w:cs="Times New Roman"/>
-              </w:rPr>
-            </w:r>
-            <w:r>
-              <w:rPr>
-                <w:rFonts w:ascii="Times New Roman" w:hAnsi="Times New Roman" w:eastAsia="Times New Roman" w:cs="Times New Roman"/>
-                <w:sz w:val="19"/>
-              </w:rPr>
-              <w:t>−1.6</w:t>
-            </w:r>
-          </w:p>
-        </w:tc>
-        <w:tc>
-          <w:tcPr>
-            <w:tcW w:type="dxa" w:w="665"/>
-          </w:tcPr>
-          <w:p>
-            <w:r>
-              <w:rPr>
-                <w:rFonts w:ascii="Times New Roman" w:hAnsi="Times New Roman" w:eastAsia="Times New Roman" w:cs="Times New Roman"/>
-              </w:rPr>
-            </w:r>
-            <w:r>
-              <w:rPr>
-                <w:rFonts w:ascii="Times New Roman" w:hAnsi="Times New Roman" w:eastAsia="Times New Roman" w:cs="Times New Roman"/>
-                <w:sz w:val="19"/>
-              </w:rPr>
-              <w:t>+0.0</w:t>
-            </w:r>
-          </w:p>
-        </w:tc>
-        <w:tc>
-          <w:tcPr>
-            <w:tcW w:type="dxa" w:w="665"/>
-          </w:tcPr>
-          <w:p>
-            <w:r>
-              <w:rPr>
-                <w:rFonts w:ascii="Times New Roman" w:hAnsi="Times New Roman" w:eastAsia="Times New Roman" w:cs="Times New Roman"/>
-              </w:rPr>
-            </w:r>
-            <w:r>
-              <w:rPr>
-                <w:rFonts w:ascii="Times New Roman" w:hAnsi="Times New Roman" w:eastAsia="Times New Roman" w:cs="Times New Roman"/>
-                <w:sz w:val="19"/>
-              </w:rPr>
-              <w:t>none</w:t>
-            </w:r>
-          </w:p>
-        </w:tc>
-        <w:tc>
-          <w:tcPr>
-            <w:tcW w:type="dxa" w:w="665"/>
-          </w:tcPr>
-          <w:p>
-            <w:r>
-              <w:rPr>
-                <w:rFonts w:ascii="Times New Roman" w:hAnsi="Times New Roman" w:eastAsia="Times New Roman" w:cs="Times New Roman"/>
-              </w:rPr>
-            </w:r>
-            <w:r>
-              <w:rPr>
-                <w:rFonts w:ascii="Times New Roman" w:hAnsi="Times New Roman" w:eastAsia="Times New Roman" w:cs="Times New Roman"/>
-                <w:sz w:val="19"/>
-              </w:rPr>
-              <w:t>none</w:t>
-            </w:r>
-          </w:p>
-        </w:tc>
-      </w:tr>
-    </w:tbl>
-    <w:p>
-      <w:pPr>
-        <w:jc w:val="both"/>
-      </w:pPr>
-      <w:r>
-        <w:rPr>
-          <w:rFonts w:ascii="Times New Roman" w:hAnsi="Times New Roman" w:eastAsia="Times New Roman" w:cs="Times New Roman"/>
-          <w:b/>
-          <w:i/>
-          <w:sz w:val="20"/>
-        </w:rPr>
-        <w:t>Table 4.</w:t>
-      </w:r>
-      <w:r>
-        <w:rPr>
-          <w:rFonts w:ascii="Times New Roman" w:hAnsi="Times New Roman" w:eastAsia="Times New Roman" w:cs="Times New Roman"/>
-          <w:b w:val="0"/>
-          <w:sz w:val="20"/>
-        </w:rPr>
-        <w:t xml:space="preserve"> Empirical ρ_MY for the six overlapping published two-step MR mediation trios. ρ_g is the genetic concordance (Pearson r between mediator and outcome SNP effects at the instruments; primary = larger-n instrument set, Fisher-z 95% CI); ρ_g (residualized) removes the exposure-mediated component. "Sample overlap" is the M–Y GWAS sample-overlap category from catalog metadata. widen% (ρ=0) and widen% (ρ_g) are the S10 correction applied to the validated all-Python α̂/β̂/SEs for all six trios (the same re-estimation underlying Table 2); ρ_g itself is genetic concordance at the instrumental SNPs from harmonized effect sizes (no full re-estimation required). Δ is the difference between widen% (ρ_g) and widen% (ρ=0) in percentage points.</w:t>
-      </w:r>
-    </w:p>
-    <w:p>
-      <w:pPr>
-        <w:ind w:firstLine="480"/>
-        <w:jc w:val="both"/>
-      </w:pPr>
-      <w:r>
-        <w:rPr>
-          <w:rFonts w:ascii="Times New Roman" w:hAnsi="Times New Roman" w:eastAsia="Times New Roman" w:cs="Times New Roman"/>
-          <w:b w:val="0"/>
-          <w:sz w:val="24"/>
-        </w:rPr>
-        <w:t>S255 and S267 could not be allele-harmonised through TwoSampleMR (FinnGen/outcome harmonisation failure) but were both recovered by the all-Python pipeline, so their α̂/β̂/SEs are validated and reported alongside the other four trios; S255's π_shared = 0.0044 is below the 0.019 threshold for the genuine-overlap headline (§3.4) and is shown for completeness. ρ_g is reported for all six because it requires only harmonized effect sizes, not a full re-estimation. The widen% (ρ_g upper CI) column re-runs the S10 correction with each trio's ρ_g 95% CI upper bound — the least favourable substitution — and differs from widen% (ρ_g) by at most 0.4 pp (verified in Python, M4b_s10_cov.py, agreeing with the R S10 baseline within ~1 pp).</w:t>
+        <w:t>The second overlap channel — mediator–outcome sample overlap — enters the covariance as the error correlation ρ_MY. Estimating it empirically from the n_s = 1–3 overlapping instruments would conflate a local SNP-effect correlation with the genome-wide error correlation the model assumes, and is undefined at n_s = 1 (S217, S255); we therefore do not report an empirical ρ_MY. Instead we vary ρ_MY across its full [0,1] range in the validation grids (§3.1) and find that the correction's direction (negative under concordant, positive under discordant mediation) and the restored nominal coverage are unchanged across that range. The sign of the omitted covariance in realised data is consequently dominated by sign(α̂β̂) through Proposition S2.5, so the reporting gap that matters most is the shared-instrument count n_s.</w:t>
       </w:r>
     </w:p>
     <w:p>
@@ -9384,7 +7884,7 @@
           <w:b w:val="0"/>
           <w:sz w:val="24"/>
         </w:rPr>
-        <w:t>The headline re-estimation findings — 6.5% genuine overlap (7/108) and zero significance flips among the five non-degenerate overlapping trios — are point estimates from small samples and should be read with their sampling uncertainty made explicit. Using the Wilson score method, the 95% CI for the overlap prevalence is 3.2–12.8%, and the 95% CI for the underlying flip rate implied by 0/5 observed flips is 0.0–43.4%. The zero-flip result is therefore consistent both with flips being genuinely rare in this design space and with flips occurring in as many as two in five comparable cases without our five trios happening to reveal one; the data cannot distinguish between these possibilities. We report this explicitly because the flip-probability scan (§3.1.1) independently predicts that flips are concentrated near the naive significance boundary (λ ≈ 1.7–2.4) and rise with π_shared — conditions that describe a minority, but not a negligible fraction, of the design space — so the small-sample null result should not be interpreted as evidence that the boundary conditions we characterize analytically are rare in practice, only that they did not happen to be realized in the five cases we could resolve to public data.</w:t>
+        <w:t>The headline re-estimation findings — 4.6% (5/108) genuine non-degenerate overlap (7/108 including two degenerate self-mediating designs) and zero significance flips among the five non-degenerate overlapping trios — are point estimates from small samples and should be read with their sampling uncertainty made explicit. Using the Wilson score method, the 95% CI for the overlap prevalence is 3.2–12.8%, and the 95% CI for the underlying flip rate implied by 0/5 observed flips is 0.0–43.4%. The zero-flip result is therefore consistent both with flips being genuinely rare in this design space and with flips occurring in as many as two in five comparable cases without our five trios happening to reveal one; the data cannot distinguish between these possibilities. We report this explicitly because the flip-probability scan (§3.1.1) independently predicts that flips are concentrated near the naive significance boundary (λ ≈ 1.7–2.4) and rise with π_shared — conditions that describe a minority, but not a negligible fraction, of the design space — so the small-sample null result should not be interpreted as evidence that the boundary conditions we characterize analytically are rare in practice, only that they did not happen to be realized in the five cases we could resolve to public data.</w:t>
       </w:r>
     </w:p>
     <w:p>
@@ -9412,7 +7912,7 @@
           <w:b w:val="0"/>
           <w:sz w:val="24"/>
         </w:rPr>
-        <w:t xml:space="preserve">The benign direction of every resolvable overlapping trio (§3.5) is a property of the same-signed cases we happened to observe, not a law: Proposition S2.5 and the flip-probability scan (§3.1.1, Fig. S3) show that the correction widens whenever α̂ and β̂ carry opposite signs (α̂β̂ &lt; 0), because the shared-instrument covariance is then positive. To verify that this harmful regime is reachable with </w:t>
+        <w:t xml:space="preserve">The benign direction of every resolvable overlapping trio (§3.4) is a property of the same-signed cases we happened to observe, not a law: Proposition S2.5 and the flip-probability scan (§3.1.1, Fig. S3) show that the correction widens whenever α̂ and β̂ carry opposite signs (α̂β̂ &lt; 0), because the shared-instrument covariance is then positive. To verify that this harmful regime is reachable with </w:t>
       </w:r>
       <w:r>
         <w:rPr>
@@ -9429,7 +7929,24 @@
           <w:b w:val="0"/>
           <w:sz w:val="24"/>
         </w:rPr>
-        <w:t xml:space="preserve"> parameters rather than only in simulation, we took the 20 opposite-signed mediation trios we were able to resolve to public summary statistics and applied the closed-form correction under the merged-pool instrument configuration — n_s set to the full overlap min(p_X, p_M) — that the field uses without disclosure (§3.2; S110 is a real, mislabeled merged-pool example). Nineteen of twenty widen (maximum +38.3%), confirming Cov(α̂, β̂) &gt; 0 under opposite signs on genuine data. None flipped significance solely because opposite-signed mediation is typically non-significant in our sample; the substantive point is that an opposite-signed study sitting near the naive boundary (λ ≈ 1.7–2.4, §3.6) would have its uncertainty materially </w:t>
+        <w:t xml:space="preserve"> parameters rather than only in simulation, we took the 20 opposite-signed mediation trios we were able to resolve to public summary statistics and applied the closed-form correction under a </w:t>
+      </w:r>
+      <w:r>
+        <w:rPr>
+          <w:rFonts w:ascii="Times New Roman" w:hAnsi="Times New Roman" w:eastAsia="Times New Roman" w:cs="Times New Roman"/>
+          <w:b w:val="0"/>
+          <w:i/>
+          <w:sz w:val="24"/>
+        </w:rPr>
+        <w:t>counterfactual</w:t>
+      </w:r>
+      <w:r>
+        <w:rPr>
+          <w:rFonts w:ascii="Times New Roman" w:hAnsi="Times New Roman" w:eastAsia="Times New Roman" w:cs="Times New Roman"/>
+          <w:b w:val="0"/>
+          <w:sz w:val="24"/>
+        </w:rPr>
+        <w:t xml:space="preserve"> merged-pool instrument configuration — n_s set to the full overlap min(p_X, p_M) — that the field uses without disclosure (§3.2; S110 is a real, mislabeled merged-pool example). Nineteen of twenty widen (maximum +38.3%), confirming Cov(α̂, β̂) &gt; 0 under opposite signs on genuine data. None flipped significance solely because opposite-signed mediation is typically non-significant in our sample; the substantive point is that an opposite-signed study sitting near the naive boundary (λ ≈ 1.7–2.4, §3.6) would have its uncertainty materially </w:t>
       </w:r>
       <w:r>
         <w:rPr>
@@ -9446,7 +7963,7 @@
           <w:b w:val="0"/>
           <w:sz w:val="24"/>
         </w:rPr>
-        <w:t xml:space="preserve"> by the naive delta method. Table 5 lists the six largest real-parameter widenings.</w:t>
+        <w:t xml:space="preserve"> by the naive delta method. Table 4 lists the six largest real-parameter widenings.</w:t>
       </w:r>
     </w:p>
     <w:tbl>
@@ -10595,7 +9112,7 @@
           <w:i/>
           <w:sz w:val="20"/>
         </w:rPr>
-        <w:t>Table 5.</w:t>
+        <w:t>Table 4.</w:t>
       </w:r>
       <w:r>
         <w:rPr>
@@ -10617,7 +9134,7 @@
           <w:b w:val="0"/>
           <w:sz w:val="24"/>
         </w:rPr>
-        <w:t>† Counterfactual merged-pool overlap; the same studies' realized n_s is unknown because overlap is not reported. S348 is a genuinely significant mediation (λ_naive = 2.52) yet its CI is still widened by 12.8% under undisclosed overlap, and S366 sits exactly in the flip-prone band (λ = 1.90, §3.6). These real-parameter results convert the theoretical "opposite-sign widens" statement (Proposition S2.5, Fig. S3) from a simulation finding into a demonstrable property of published estimates, and show why the missing n_s / π_shared / ρ_MY reporting (§3.2) leaves a reader unable to tell whether any given opposite-signed result is benign or harmful.</w:t>
+        <w:t>† Counterfactual merged-pool overlap; the same studies' realized n_s is unknown because overlap is not reported. S348 is a genuinely significant mediation (λ_naive = 2.52) yet its CI is still widened by 12.8% under the counterfactual undisclosed-overlap configuration, and S366 sits exactly in the flip-prone band (λ = 1.90, §3.6). These real-parameter results illustrate the theoretical "opposite-sign widens" statement (Proposition S2.5, Fig. S3) on actual published point estimates under a counterfactual overlap configuration, and show why the missing n_s / π_shared reporting (§3.2) leaves a reader unable to tell whether any given opposite-signed result is benign or harmful.</w:t>
       </w:r>
     </w:p>
     <w:p>
@@ -10645,7 +9162,7 @@
           <w:b w:val="0"/>
           <w:sz w:val="24"/>
         </w:rPr>
-        <w:t>This work quantifies, rather than dramatizes, a methodological blind spot. We do not claim that any specific published two-step MR mediation conclusion is incorrect: in every real trio we could resolve, the omitted covariance happened to be structurally negative, and the naive method was conservative rather than anti-conservative. What we do establish is that this favorable direction is a property of the small, same-sign, low-overlap cases we were able to observe — not a guarantee — and that the field currently has no reporting convention (n_s, π_shared, or ρ_MY) that would let a reader distinguish a benign case from a harmful one without rerunning the analysis, as we did. The value of this paper is therefore the closed-form tool and the documented boundary conditions under which the direction flips, not a retrospective correction of the existing literature's conclusions. That the harmful widening regime is not merely theoretical is shown in §3.7: applying the correction to real opposite-signed mediation estimates under the undisclosed merged-pool design widens confidence intervals by up to 38%, so the missing n_s / π_shared / ρ_MY reporting can hide anti-conservative inference in published work.</w:t>
+        <w:t>This work quantifies, rather than dramatizes, a methodological blind spot. We do not claim that any specific published two-step MR mediation conclusion is incorrect: in every real trio we could resolve, the omitted covariance happened to be structurally negative, and the naive method was conservative rather than anti-conservative. What we do establish is that this favorable direction is a property of the small, same-sign, low-overlap cases we were able to observe — not a guarantee — and that the field currently has no reporting convention (n_s, π_shared, or ρ_MY) that would let a reader distinguish a benign case from a harmful one without rerunning the analysis, as we did. The value of this paper is therefore the closed-form tool and the documented boundary conditions under which the direction flips, not a retrospective correction of the existing literature's conclusions. That the harmful widening regime is not merely theoretical is shown in §3.7: applying the correction counterfactually to real opposite-signed mediation estimates under the undisclosed merged-pool design widens confidence intervals by up to 38%; because the direction cannot be known without the reported n_s / π_shared, routine reporting — not retrospective correction — is what the field needs.</w:t>
       </w:r>
     </w:p>
     <w:p>
@@ -10675,7 +9192,7 @@
           <w:b w:val="0"/>
           <w:sz w:val="24"/>
         </w:rPr>
-        <w:t>, and only ~35% of assessable studies disclose overlap handling. Yet the §3.4 batch re-estimation finds genuine instrument overlap in 6.5% (7/108) of re-estimated trios, and among the five non-degenerate overlapping trios the correction narrowed every CI (0.2–16.0%) with zero flips; the only flip in the batch (S320) is a degenerate self-mediating design (exposure ≡ mediator accession) reported as a boundary illustration, not a mediation finding. The field therefore routinely analyzes overlapping instruments without reporting or correcting them. Consistent with a targeted PubMed novelty check (no 2024–2026 publication derives this covariance), our work closes a gap the published product-method framework left open.</w:t>
+        <w:t>, and only ~35% of assessable studies disclose overlap handling. Yet the §3.4 batch re-estimation finds genuine instrument overlap in 4.6% (5/108) of re-estimated trios (7/108, 6.5%, counting two degenerate self-mediating designs that are mapping artefacts), and among the five non-degenerate overlapping trios the correction narrowed every CI (0.2–16.0%) with zero flips; the only flip in the batch (S320) is a degenerate self-mediating design (exposure ≡ mediator accession) reported as a boundary illustration, not a mediation finding. The field therefore routinely analyzes overlapping instruments without reporting or correcting them. Consistent with a targeted PubMed novelty check (no 2024–2026 publication derives this covariance), our work closes a gap the published product-method framework left open.</w:t>
       </w:r>
     </w:p>
     <w:p>
@@ -10689,7 +9206,7 @@
           <w:b w:val="0"/>
           <w:sz w:val="24"/>
         </w:rPr>
-        <w:t>The central real-data finding is that the sign of the omitted covariance is not predictable from published statistics alone. In realized same-sign mediation the corrected CIs are narrower (the BMI → waist → CHD example by 2.8%, shared-IV by 15.5%), but the literature narrative usually assumes the opposite. Our batch re-estimation confirms this is structural, not fortune: the dominant shared-instrument covariance is provably negative when α̂ and β̂ share a sign (Proposition S2.5), so the naive SE is conservative in this regime. Because that sign cannot be anticipated at the design stage, and the opposite-sign regime widens rather than narrows (§3.1.1), analysts should correct as a matter of routine. §3.5 shows that even where ρ_MY is empirically positive the correction still narrows, because the structurally negative term dominates for n_s = 1–3.</w:t>
+        <w:t>The central real-data finding is that the sign of the omitted covariance is not predictable from published statistics alone. In realized same-sign mediation the corrected CIs are narrower (the BMI → waist → CHD example by 2.8%, shared-IV by 15.5%), but the literature narrative usually assumes the opposite. Our batch re-estimation confirms this is structural, not fortune: the dominant shared-instrument covariance is provably negative when α̂ and β̂ share a sign (Proposition S2.5), so the naive SE is conservative in this regime. Because that sign cannot be anticipated at the design stage, and the opposite-sign regime widens rather than narrows (§3.1.1), analysts should correct as a matter of routine.</w:t>
       </w:r>
     </w:p>
     <w:p>
@@ -10796,906 +9313,7 @@
           <w:b w:val="0"/>
           <w:sz w:val="24"/>
         </w:rPr>
-        <w:t xml:space="preserve"> estimand, so it leaves the two-step mediation term Cov(α̂, β̂) unaddressed. Critically, that single-estimand work documents instrument-selection and participant-overlap bias as a real, non-negligible feature of two-sample MR in practice; because the product estimand α̂β̂ inherits both channels and adds the shared-instrument covariance, that practical hazard carries over to — and is amplified within — two-step mediation, the exact regime our correction addresses. Table 6 contrasts the three.</w:t>
-      </w:r>
-    </w:p>
-    <w:tbl>
-      <w:tblPr>
-        <w:tblW w:type="auto" w:w="0"/>
-        <w:jc w:val="center"/>
-        <w:tblLook w:firstColumn="1" w:firstRow="1" w:lastColumn="0" w:lastRow="0" w:noHBand="0" w:noVBand="1" w:val="04A0"/>
-        <w:tblBorders>
-          <w:top w:val="single" w:sz="12" w:space="0" w:color="auto"/>
-          <w:left w:val="none" w:sz="0" w:space="0" w:color="auto"/>
-          <w:bottom w:val="single" w:sz="12" w:space="0" w:color="auto"/>
-          <w:right w:val="none" w:sz="0" w:space="0" w:color="auto"/>
-          <w:insideH w:val="none" w:sz="0" w:space="0" w:color="auto"/>
-          <w:insideV w:val="none" w:sz="0" w:space="0" w:color="auto"/>
-        </w:tblBorders>
-      </w:tblPr>
-      <w:tblGrid>
-        <w:gridCol w:w="2160"/>
-        <w:gridCol w:w="2160"/>
-        <w:gridCol w:w="2160"/>
-        <w:gridCol w:w="2160"/>
-      </w:tblGrid>
-      <w:tr>
-        <w:tc>
-          <w:tcPr>
-            <w:tcW w:type="dxa" w:w="2160"/>
-            <w:tcBorders>
-              <w:bottom w:val="single" w:sz="6" w:space="0" w:color="auto"/>
-            </w:tcBorders>
-          </w:tcPr>
-          <w:p>
-            <w:r>
-              <w:rPr>
-                <w:rFonts w:ascii="Times New Roman" w:hAnsi="Times New Roman" w:eastAsia="Times New Roman" w:cs="Times New Roman"/>
-              </w:rPr>
-            </w:r>
-            <w:r>
-              <w:rPr>
-                <w:rFonts w:ascii="Times New Roman" w:hAnsi="Times New Roman" w:eastAsia="Times New Roman" w:cs="Times New Roman"/>
-                <w:b/>
-                <w:sz w:val="19"/>
-              </w:rPr>
-              <w:t>Feature</w:t>
-            </w:r>
-          </w:p>
-        </w:tc>
-        <w:tc>
-          <w:tcPr>
-            <w:tcW w:type="dxa" w:w="2160"/>
-            <w:tcBorders>
-              <w:bottom w:val="single" w:sz="6" w:space="0" w:color="auto"/>
-            </w:tcBorders>
-          </w:tcPr>
-          <w:p>
-            <w:r>
-              <w:rPr>
-                <w:rFonts w:ascii="Times New Roman" w:hAnsi="Times New Roman" w:eastAsia="Times New Roman" w:cs="Times New Roman"/>
-              </w:rPr>
-            </w:r>
-            <w:r>
-              <w:rPr>
-                <w:rFonts w:ascii="Times New Roman" w:hAnsi="Times New Roman" w:eastAsia="Times New Roman" w:cs="Times New Roman"/>
-                <w:b/>
-                <w:sz w:val="19"/>
-              </w:rPr>
-              <w:t>This work</w:t>
-            </w:r>
-          </w:p>
-        </w:tc>
-        <w:tc>
-          <w:tcPr>
-            <w:tcW w:type="dxa" w:w="2160"/>
-            <w:tcBorders>
-              <w:bottom w:val="single" w:sz="6" w:space="0" w:color="auto"/>
-            </w:tcBorders>
-          </w:tcPr>
-          <w:p>
-            <w:r>
-              <w:rPr>
-                <w:rFonts w:ascii="Times New Roman" w:hAnsi="Times New Roman" w:eastAsia="Times New Roman" w:cs="Times New Roman"/>
-              </w:rPr>
-            </w:r>
-            <w:r>
-              <w:rPr>
-                <w:rFonts w:ascii="Times New Roman" w:hAnsi="Times New Roman" w:eastAsia="Times New Roman" w:cs="Times New Roman"/>
-                <w:b/>
-                <w:sz w:val="19"/>
-              </w:rPr>
-              <w:t>Forde et al. 2026 (MR-SimSS)</w:t>
-            </w:r>
-          </w:p>
-        </w:tc>
-        <w:tc>
-          <w:tcPr>
-            <w:tcW w:type="dxa" w:w="2160"/>
-            <w:tcBorders>
-              <w:bottom w:val="single" w:sz="6" w:space="0" w:color="auto"/>
-            </w:tcBorders>
-          </w:tcPr>
-          <w:p>
-            <w:r>
-              <w:rPr>
-                <w:rFonts w:ascii="Times New Roman" w:hAnsi="Times New Roman" w:eastAsia="Times New Roman" w:cs="Times New Roman"/>
-              </w:rPr>
-            </w:r>
-            <w:r>
-              <w:rPr>
-                <w:rFonts w:ascii="Times New Roman" w:hAnsi="Times New Roman" w:eastAsia="Times New Roman" w:cs="Times New Roman"/>
-                <w:b/>
-                <w:sz w:val="19"/>
-              </w:rPr>
-              <w:t>Chen et al. 2025 (correspondence)</w:t>
-            </w:r>
-          </w:p>
-        </w:tc>
-      </w:tr>
-      <w:tr>
-        <w:tc>
-          <w:tcPr>
-            <w:tcW w:type="dxa" w:w="2160"/>
-          </w:tcPr>
-          <w:p>
-            <w:r>
-              <w:rPr>
-                <w:rFonts w:ascii="Times New Roman" w:hAnsi="Times New Roman" w:eastAsia="Times New Roman" w:cs="Times New Roman"/>
-              </w:rPr>
-            </w:r>
-            <w:r>
-              <w:rPr>
-                <w:rFonts w:ascii="Times New Roman" w:hAnsi="Times New Roman" w:eastAsia="Times New Roman" w:cs="Times New Roman"/>
-                <w:sz w:val="19"/>
-              </w:rPr>
-              <w:t>Target estimand</w:t>
-            </w:r>
-          </w:p>
-        </w:tc>
-        <w:tc>
-          <w:tcPr>
-            <w:tcW w:type="dxa" w:w="2160"/>
-          </w:tcPr>
-          <w:p>
-            <w:r>
-              <w:rPr>
-                <w:rFonts w:ascii="Times New Roman" w:hAnsi="Times New Roman" w:eastAsia="Times New Roman" w:cs="Times New Roman"/>
-              </w:rPr>
-            </w:r>
-            <w:r>
-              <w:rPr>
-                <w:rFonts w:ascii="Times New Roman" w:hAnsi="Times New Roman" w:eastAsia="Times New Roman" w:cs="Times New Roman"/>
-                <w:sz w:val="19"/>
-              </w:rPr>
-              <w:t>indirect effect α̂β̂ in two-step MR mediation (product of two IVW estimates)</w:t>
-            </w:r>
-          </w:p>
-        </w:tc>
-        <w:tc>
-          <w:tcPr>
-            <w:tcW w:type="dxa" w:w="2160"/>
-          </w:tcPr>
-          <w:p>
-            <w:r>
-              <w:rPr>
-                <w:rFonts w:ascii="Times New Roman" w:hAnsi="Times New Roman" w:eastAsia="Times New Roman" w:cs="Times New Roman"/>
-              </w:rPr>
-            </w:r>
-            <w:r>
-              <w:rPr>
-                <w:rFonts w:ascii="Times New Roman" w:hAnsi="Times New Roman" w:eastAsia="Times New Roman" w:cs="Times New Roman"/>
-                <w:sz w:val="19"/>
-              </w:rPr>
-              <w:t>single causal effect in two-sample MR (exposure → outcome)</w:t>
-            </w:r>
-          </w:p>
-        </w:tc>
-        <w:tc>
-          <w:tcPr>
-            <w:tcW w:type="dxa" w:w="2160"/>
-          </w:tcPr>
-          <w:p>
-            <w:r>
-              <w:rPr>
-                <w:rFonts w:ascii="Times New Roman" w:hAnsi="Times New Roman" w:eastAsia="Times New Roman" w:cs="Times New Roman"/>
-              </w:rPr>
-            </w:r>
-            <w:r>
-              <w:rPr>
-                <w:rFonts w:ascii="Times New Roman" w:hAnsi="Times New Roman" w:eastAsia="Times New Roman" w:cs="Times New Roman"/>
-                <w:sz w:val="19"/>
-              </w:rPr>
-              <w:t>not a method; flags overlap in a protein → MI MR</w:t>
-            </w:r>
-          </w:p>
-        </w:tc>
-      </w:tr>
-      <w:tr>
-        <w:tc>
-          <w:tcPr>
-            <w:tcW w:type="dxa" w:w="2160"/>
-          </w:tcPr>
-          <w:p>
-            <w:r>
-              <w:rPr>
-                <w:rFonts w:ascii="Times New Roman" w:hAnsi="Times New Roman" w:eastAsia="Times New Roman" w:cs="Times New Roman"/>
-              </w:rPr>
-            </w:r>
-            <w:r>
-              <w:rPr>
-                <w:rFonts w:ascii="Times New Roman" w:hAnsi="Times New Roman" w:eastAsia="Times New Roman" w:cs="Times New Roman"/>
-                <w:sz w:val="19"/>
-              </w:rPr>
-              <w:t>Overlap / bias source addressed</w:t>
-            </w:r>
-          </w:p>
-        </w:tc>
-        <w:tc>
-          <w:tcPr>
-            <w:tcW w:type="dxa" w:w="2160"/>
-          </w:tcPr>
-          <w:p>
-            <w:r>
-              <w:rPr>
-                <w:rFonts w:ascii="Times New Roman" w:hAnsi="Times New Roman" w:eastAsia="Times New Roman" w:cs="Times New Roman"/>
-              </w:rPr>
-            </w:r>
-            <w:r>
-              <w:rPr>
-                <w:rFonts w:ascii="Times New Roman" w:hAnsi="Times New Roman" w:eastAsia="Times New Roman" w:cs="Times New Roman"/>
-                <w:sz w:val="19"/>
-              </w:rPr>
-              <w:t>shared instruments across the two steps (n_s) and M–Y sample overlap (ρ_MY); the covariance of a product estimand</w:t>
-            </w:r>
-          </w:p>
-        </w:tc>
-        <w:tc>
-          <w:tcPr>
-            <w:tcW w:type="dxa" w:w="2160"/>
-          </w:tcPr>
-          <w:p>
-            <w:r>
-              <w:rPr>
-                <w:rFonts w:ascii="Times New Roman" w:hAnsi="Times New Roman" w:eastAsia="Times New Roman" w:cs="Times New Roman"/>
-              </w:rPr>
-            </w:r>
-            <w:r>
-              <w:rPr>
-                <w:rFonts w:ascii="Times New Roman" w:hAnsi="Times New Roman" w:eastAsia="Times New Roman" w:cs="Times New Roman"/>
-                <w:sz w:val="19"/>
-              </w:rPr>
-              <w:t>instrument selection (Winner's Curse), weak-instrument bias, exposure–outcome sample overlap; bias of a single estimand</w:t>
-            </w:r>
-          </w:p>
-        </w:tc>
-        <w:tc>
-          <w:tcPr>
-            <w:tcW w:type="dxa" w:w="2160"/>
-          </w:tcPr>
-          <w:p>
-            <w:r>
-              <w:rPr>
-                <w:rFonts w:ascii="Times New Roman" w:hAnsi="Times New Roman" w:eastAsia="Times New Roman" w:cs="Times New Roman"/>
-              </w:rPr>
-            </w:r>
-            <w:r>
-              <w:rPr>
-                <w:rFonts w:ascii="Times New Roman" w:hAnsi="Times New Roman" w:eastAsia="Times New Roman" w:cs="Times New Roman"/>
-                <w:sz w:val="19"/>
-              </w:rPr>
-              <w:t>exposure–outcome sample overlap; meta-analysis weighting imbalance (no correction proposed)</w:t>
-            </w:r>
-          </w:p>
-        </w:tc>
-      </w:tr>
-      <w:tr>
-        <w:tc>
-          <w:tcPr>
-            <w:tcW w:type="dxa" w:w="2160"/>
-          </w:tcPr>
-          <w:p>
-            <w:r>
-              <w:rPr>
-                <w:rFonts w:ascii="Times New Roman" w:hAnsi="Times New Roman" w:eastAsia="Times New Roman" w:cs="Times New Roman"/>
-              </w:rPr>
-            </w:r>
-            <w:r>
-              <w:rPr>
-                <w:rFonts w:ascii="Times New Roman" w:hAnsi="Times New Roman" w:eastAsia="Times New Roman" w:cs="Times New Roman"/>
-                <w:sz w:val="19"/>
-              </w:rPr>
-              <w:t>Individual-level data required</w:t>
-            </w:r>
-          </w:p>
-        </w:tc>
-        <w:tc>
-          <w:tcPr>
-            <w:tcW w:type="dxa" w:w="2160"/>
-          </w:tcPr>
-          <w:p>
-            <w:r>
-              <w:rPr>
-                <w:rFonts w:ascii="Times New Roman" w:hAnsi="Times New Roman" w:eastAsia="Times New Roman" w:cs="Times New Roman"/>
-              </w:rPr>
-            </w:r>
-            <w:r>
-              <w:rPr>
-                <w:rFonts w:ascii="Times New Roman" w:hAnsi="Times New Roman" w:eastAsia="Times New Roman" w:cs="Times New Roman"/>
-                <w:sz w:val="19"/>
-              </w:rPr>
-              <w:t>no (summary statistics only)</w:t>
-            </w:r>
-          </w:p>
-        </w:tc>
-        <w:tc>
-          <w:tcPr>
-            <w:tcW w:type="dxa" w:w="2160"/>
-          </w:tcPr>
-          <w:p>
-            <w:r>
-              <w:rPr>
-                <w:rFonts w:ascii="Times New Roman" w:hAnsi="Times New Roman" w:eastAsia="Times New Roman" w:cs="Times New Roman"/>
-              </w:rPr>
-            </w:r>
-            <w:r>
-              <w:rPr>
-                <w:rFonts w:ascii="Times New Roman" w:hAnsi="Times New Roman" w:eastAsia="Times New Roman" w:cs="Times New Roman"/>
-                <w:sz w:val="19"/>
-              </w:rPr>
-              <w:t>no (simulated independent summary statistics)</w:t>
-            </w:r>
-          </w:p>
-        </w:tc>
-        <w:tc>
-          <w:tcPr>
-            <w:tcW w:type="dxa" w:w="2160"/>
-          </w:tcPr>
-          <w:p>
-            <w:r>
-              <w:rPr>
-                <w:rFonts w:ascii="Times New Roman" w:hAnsi="Times New Roman" w:eastAsia="Times New Roman" w:cs="Times New Roman"/>
-              </w:rPr>
-            </w:r>
-            <w:r>
-              <w:rPr>
-                <w:rFonts w:ascii="Times New Roman" w:hAnsi="Times New Roman" w:eastAsia="Times New Roman" w:cs="Times New Roman"/>
-                <w:sz w:val="19"/>
-              </w:rPr>
-              <w:t>no</w:t>
-            </w:r>
-          </w:p>
-        </w:tc>
-      </w:tr>
-      <w:tr>
-        <w:tc>
-          <w:tcPr>
-            <w:tcW w:type="dxa" w:w="2160"/>
-          </w:tcPr>
-          <w:p>
-            <w:r>
-              <w:rPr>
-                <w:rFonts w:ascii="Times New Roman" w:hAnsi="Times New Roman" w:eastAsia="Times New Roman" w:cs="Times New Roman"/>
-              </w:rPr>
-            </w:r>
-            <w:r>
-              <w:rPr>
-                <w:rFonts w:ascii="Times New Roman" w:hAnsi="Times New Roman" w:eastAsia="Times New Roman" w:cs="Times New Roman"/>
-                <w:sz w:val="19"/>
-              </w:rPr>
-              <w:t>Closed-form covariance for the product estimand</w:t>
-            </w:r>
-          </w:p>
-        </w:tc>
-        <w:tc>
-          <w:tcPr>
-            <w:tcW w:type="dxa" w:w="2160"/>
-          </w:tcPr>
-          <w:p>
-            <w:r>
-              <w:rPr>
-                <w:rFonts w:ascii="Times New Roman" w:hAnsi="Times New Roman" w:eastAsia="Times New Roman" w:cs="Times New Roman"/>
-              </w:rPr>
-            </w:r>
-            <w:r>
-              <w:rPr>
-                <w:rFonts w:ascii="Times New Roman" w:hAnsi="Times New Roman" w:eastAsia="Times New Roman" w:cs="Times New Roman"/>
-                <w:sz w:val="19"/>
-              </w:rPr>
-              <w:t>yes — Cov(α̂, β̂) derived analytically, with a conservative bound</w:t>
-            </w:r>
-          </w:p>
-        </w:tc>
-        <w:tc>
-          <w:tcPr>
-            <w:tcW w:type="dxa" w:w="2160"/>
-          </w:tcPr>
-          <w:p>
-            <w:r>
-              <w:rPr>
-                <w:rFonts w:ascii="Times New Roman" w:hAnsi="Times New Roman" w:eastAsia="Times New Roman" w:cs="Times New Roman"/>
-              </w:rPr>
-            </w:r>
-            <w:r>
-              <w:rPr>
-                <w:rFonts w:ascii="Times New Roman" w:hAnsi="Times New Roman" w:eastAsia="Times New Roman" w:cs="Times New Roman"/>
-                <w:sz w:val="19"/>
-              </w:rPr>
-              <w:t>no — single-estimand bias corrected by simulation</w:t>
-            </w:r>
-          </w:p>
-        </w:tc>
-        <w:tc>
-          <w:tcPr>
-            <w:tcW w:type="dxa" w:w="2160"/>
-          </w:tcPr>
-          <w:p>
-            <w:r>
-              <w:rPr>
-                <w:rFonts w:ascii="Times New Roman" w:hAnsi="Times New Roman" w:eastAsia="Times New Roman" w:cs="Times New Roman"/>
-              </w:rPr>
-            </w:r>
-            <w:r>
-              <w:rPr>
-                <w:rFonts w:ascii="Times New Roman" w:hAnsi="Times New Roman" w:eastAsia="Times New Roman" w:cs="Times New Roman"/>
-                <w:sz w:val="19"/>
-              </w:rPr>
-              <w:t>no — recommends LDSC / dataset replacement</w:t>
-            </w:r>
-          </w:p>
-        </w:tc>
-      </w:tr>
-      <w:tr>
-        <w:tc>
-          <w:tcPr>
-            <w:tcW w:type="dxa" w:w="2160"/>
-          </w:tcPr>
-          <w:p>
-            <w:r>
-              <w:rPr>
-                <w:rFonts w:ascii="Times New Roman" w:hAnsi="Times New Roman" w:eastAsia="Times New Roman" w:cs="Times New Roman"/>
-              </w:rPr>
-            </w:r>
-            <w:r>
-              <w:rPr>
-                <w:rFonts w:ascii="Times New Roman" w:hAnsi="Times New Roman" w:eastAsia="Times New Roman" w:cs="Times New Roman"/>
-                <w:sz w:val="19"/>
-              </w:rPr>
-              <w:t>Mediation-relevant</w:t>
-            </w:r>
-          </w:p>
-        </w:tc>
-        <w:tc>
-          <w:tcPr>
-            <w:tcW w:type="dxa" w:w="2160"/>
-          </w:tcPr>
-          <w:p>
-            <w:r>
-              <w:rPr>
-                <w:rFonts w:ascii="Times New Roman" w:hAnsi="Times New Roman" w:eastAsia="Times New Roman" w:cs="Times New Roman"/>
-              </w:rPr>
-            </w:r>
-            <w:r>
-              <w:rPr>
-                <w:rFonts w:ascii="Times New Roman" w:hAnsi="Times New Roman" w:eastAsia="Times New Roman" w:cs="Times New Roman"/>
-                <w:sz w:val="19"/>
-              </w:rPr>
-              <w:t>yes (two-step product-method)</w:t>
-            </w:r>
-          </w:p>
-        </w:tc>
-        <w:tc>
-          <w:tcPr>
-            <w:tcW w:type="dxa" w:w="2160"/>
-          </w:tcPr>
-          <w:p>
-            <w:r>
-              <w:rPr>
-                <w:rFonts w:ascii="Times New Roman" w:hAnsi="Times New Roman" w:eastAsia="Times New Roman" w:cs="Times New Roman"/>
-              </w:rPr>
-            </w:r>
-            <w:r>
-              <w:rPr>
-                <w:rFonts w:ascii="Times New Roman" w:hAnsi="Times New Roman" w:eastAsia="Times New Roman" w:cs="Times New Roman"/>
-                <w:sz w:val="19"/>
-              </w:rPr>
-              <w:t>no (single-pathway two-sample MR)</w:t>
-            </w:r>
-          </w:p>
-        </w:tc>
-        <w:tc>
-          <w:tcPr>
-            <w:tcW w:type="dxa" w:w="2160"/>
-          </w:tcPr>
-          <w:p>
-            <w:r>
-              <w:rPr>
-                <w:rFonts w:ascii="Times New Roman" w:hAnsi="Times New Roman" w:eastAsia="Times New Roman" w:cs="Times New Roman"/>
-              </w:rPr>
-            </w:r>
-            <w:r>
-              <w:rPr>
-                <w:rFonts w:ascii="Times New Roman" w:hAnsi="Times New Roman" w:eastAsia="Times New Roman" w:cs="Times New Roman"/>
-                <w:sz w:val="19"/>
-              </w:rPr>
-              <w:t>no (single-pathway critique)</w:t>
-            </w:r>
-          </w:p>
-        </w:tc>
-      </w:tr>
-      <w:tr>
-        <w:tc>
-          <w:tcPr>
-            <w:tcW w:type="dxa" w:w="2160"/>
-          </w:tcPr>
-          <w:p>
-            <w:r>
-              <w:rPr>
-                <w:rFonts w:ascii="Times New Roman" w:hAnsi="Times New Roman" w:eastAsia="Times New Roman" w:cs="Times New Roman"/>
-              </w:rPr>
-            </w:r>
-            <w:r>
-              <w:rPr>
-                <w:rFonts w:ascii="Times New Roman" w:hAnsi="Times New Roman" w:eastAsia="Times New Roman" w:cs="Times New Roman"/>
-                <w:sz w:val="19"/>
-              </w:rPr>
-              <w:t>Reproducible tool</w:t>
-            </w:r>
-          </w:p>
-        </w:tc>
-        <w:tc>
-          <w:tcPr>
-            <w:tcW w:type="dxa" w:w="2160"/>
-          </w:tcPr>
-          <w:p>
-            <w:r>
-              <w:rPr>
-                <w:rFonts w:ascii="Times New Roman" w:hAnsi="Times New Roman" w:eastAsia="Times New Roman" w:cs="Times New Roman"/>
-              </w:rPr>
-            </w:r>
-            <w:r>
-              <w:rPr>
-                <w:rFonts w:ascii="Times New Roman" w:hAnsi="Times New Roman" w:eastAsia="Times New Roman" w:cs="Times New Roman"/>
-                <w:sz w:val="19"/>
-              </w:rPr>
-              <w:t>estimate_cov_prod_mr() (R) + wrappers</w:t>
-            </w:r>
-          </w:p>
-        </w:tc>
-        <w:tc>
-          <w:tcPr>
-            <w:tcW w:type="dxa" w:w="2160"/>
-          </w:tcPr>
-          <w:p>
-            <w:r>
-              <w:rPr>
-                <w:rFonts w:ascii="Times New Roman" w:hAnsi="Times New Roman" w:eastAsia="Times New Roman" w:cs="Times New Roman"/>
-              </w:rPr>
-            </w:r>
-            <w:r>
-              <w:rPr>
-                <w:rFonts w:ascii="Times New Roman" w:hAnsi="Times New Roman" w:eastAsia="Times New Roman" w:cs="Times New Roman"/>
-                <w:sz w:val="19"/>
-              </w:rPr>
-              <w:t>mr.simss (R package)</w:t>
-            </w:r>
-          </w:p>
-        </w:tc>
-        <w:tc>
-          <w:tcPr>
-            <w:tcW w:type="dxa" w:w="2160"/>
-          </w:tcPr>
-          <w:p>
-            <w:r>
-              <w:rPr>
-                <w:rFonts w:ascii="Times New Roman" w:hAnsi="Times New Roman" w:eastAsia="Times New Roman" w:cs="Times New Roman"/>
-              </w:rPr>
-            </w:r>
-            <w:r>
-              <w:rPr>
-                <w:rFonts w:ascii="Times New Roman" w:hAnsi="Times New Roman" w:eastAsia="Times New Roman" w:cs="Times New Roman"/>
-                <w:sz w:val="19"/>
-              </w:rPr>
-              <w:t>none</w:t>
-            </w:r>
-          </w:p>
-        </w:tc>
-      </w:tr>
-    </w:tbl>
-    <w:p>
-      <w:pPr>
-        <w:jc w:val="both"/>
-      </w:pPr>
-      <w:r>
-        <w:rPr>
-          <w:rFonts w:ascii="Times New Roman" w:hAnsi="Times New Roman" w:eastAsia="Times New Roman" w:cs="Times New Roman"/>
-          <w:b/>
-          <w:i/>
-          <w:sz w:val="20"/>
-        </w:rPr>
-        <w:t>Table 6.</w:t>
-      </w:r>
-      <w:r>
-        <w:rPr>
-          <w:rFonts w:ascii="Times New Roman" w:hAnsi="Times New Roman" w:eastAsia="Times New Roman" w:cs="Times New Roman"/>
-          <w:b w:val="0"/>
-          <w:sz w:val="20"/>
-        </w:rPr>
-        <w:t xml:space="preserve"> Overlap-bias methods relevant to two-step MR mediation. "Product estimand" = the indirect effect α̂β̂ as the product of two IVW estimates.</w:t>
-      </w:r>
-    </w:p>
-    <w:p>
-      <w:pPr>
-        <w:ind w:firstLine="480"/>
-        <w:jc w:val="both"/>
-      </w:pPr>
-      <w:r>
-        <w:rPr>
-          <w:rFonts w:ascii="Times New Roman" w:hAnsi="Times New Roman" w:eastAsia="Times New Roman" w:cs="Times New Roman"/>
-          <w:b/>
-          <w:sz w:val="24"/>
-        </w:rPr>
-        <w:t>Representative applications of two-step MR mediation.</w:t>
-      </w:r>
-      <w:r>
-        <w:rPr>
-          <w:rFonts w:ascii="Times New Roman" w:hAnsi="Times New Roman" w:eastAsia="Times New Roman" w:cs="Times New Roman"/>
-          <w:b w:val="0"/>
-          <w:sz w:val="24"/>
-        </w:rPr>
-        <w:t xml:space="preserve"> The method has proliferated rapidly across clinical domains, and a representative set illustrates its reach. METEOR was introduced for the detection of shared and specific exposures underlying multiple outcomes </w:t>
-      </w:r>
-      <w:r>
-        <w:rPr>
-          <w:rFonts w:ascii="Times New Roman" w:hAnsi="Times New Roman" w:eastAsia="Times New Roman" w:cs="Times New Roman"/>
-          <w:b w:val="0"/>
-          <w:sz w:val="24"/>
-          <w:vertAlign w:val="superscript"/>
-        </w:rPr>
-        <w:t>24</w:t>
-      </w:r>
-      <w:r>
-        <w:rPr>
-          <w:rFonts w:ascii="Times New Roman" w:hAnsi="Times New Roman" w:eastAsia="Times New Roman" w:cs="Times New Roman"/>
-          <w:b w:val="0"/>
-          <w:sz w:val="24"/>
-        </w:rPr>
-        <w:t xml:space="preserve">. Cross-ancestry pleiotropic analysis of imaging-derived phenotypes has been used to stratify depression risk </w:t>
-      </w:r>
-      <w:r>
-        <w:rPr>
-          <w:rFonts w:ascii="Times New Roman" w:hAnsi="Times New Roman" w:eastAsia="Times New Roman" w:cs="Times New Roman"/>
-          <w:b w:val="0"/>
-          <w:sz w:val="24"/>
-          <w:vertAlign w:val="superscript"/>
-        </w:rPr>
-        <w:t>25</w:t>
-      </w:r>
-      <w:r>
-        <w:rPr>
-          <w:rFonts w:ascii="Times New Roman" w:hAnsi="Times New Roman" w:eastAsia="Times New Roman" w:cs="Times New Roman"/>
-          <w:b w:val="0"/>
-          <w:sz w:val="24"/>
-        </w:rPr>
-        <w:t xml:space="preserve">. Metabolic improvement has been examined as the mediator linking GLP-1 receptor agonists to myocardial infarction </w:t>
-      </w:r>
-      <w:r>
-        <w:rPr>
-          <w:rFonts w:ascii="Times New Roman" w:hAnsi="Times New Roman" w:eastAsia="Times New Roman" w:cs="Times New Roman"/>
-          <w:b w:val="0"/>
-          <w:sz w:val="24"/>
-          <w:vertAlign w:val="superscript"/>
-        </w:rPr>
-        <w:t>26</w:t>
-      </w:r>
-      <w:r>
-        <w:rPr>
-          <w:rFonts w:ascii="Times New Roman" w:hAnsi="Times New Roman" w:eastAsia="Times New Roman" w:cs="Times New Roman"/>
-          <w:b w:val="0"/>
-          <w:sz w:val="24"/>
-        </w:rPr>
-        <w:t xml:space="preserve">. Blood metabolites and immune-cell mediators have been related to graft-versus-host disease and relapse </w:t>
-      </w:r>
-      <w:r>
-        <w:rPr>
-          <w:rFonts w:ascii="Times New Roman" w:hAnsi="Times New Roman" w:eastAsia="Times New Roman" w:cs="Times New Roman"/>
-          <w:b w:val="0"/>
-          <w:sz w:val="24"/>
-          <w:vertAlign w:val="superscript"/>
-        </w:rPr>
-        <w:t>27</w:t>
-      </w:r>
-      <w:r>
-        <w:rPr>
-          <w:rFonts w:ascii="Times New Roman" w:hAnsi="Times New Roman" w:eastAsia="Times New Roman" w:cs="Times New Roman"/>
-          <w:b w:val="0"/>
-          <w:sz w:val="24"/>
-        </w:rPr>
-        <w:t xml:space="preserve">. Circulating mediators have been proposed to link cardiometabolic disease to heart failure with preserved ejection fraction </w:t>
-      </w:r>
-      <w:r>
-        <w:rPr>
-          <w:rFonts w:ascii="Times New Roman" w:hAnsi="Times New Roman" w:eastAsia="Times New Roman" w:cs="Times New Roman"/>
-          <w:b w:val="0"/>
-          <w:sz w:val="24"/>
-          <w:vertAlign w:val="superscript"/>
-        </w:rPr>
-        <w:t>28</w:t>
-      </w:r>
-      <w:r>
-        <w:rPr>
-          <w:rFonts w:ascii="Times New Roman" w:hAnsi="Times New Roman" w:eastAsia="Times New Roman" w:cs="Times New Roman"/>
-          <w:b w:val="0"/>
-          <w:sz w:val="24"/>
-        </w:rPr>
-        <w:t xml:space="preserve">. Body-fat distribution has been studied as a mediator of the diabetogenic action of lipid-modifying drugs </w:t>
-      </w:r>
-      <w:r>
-        <w:rPr>
-          <w:rFonts w:ascii="Times New Roman" w:hAnsi="Times New Roman" w:eastAsia="Times New Roman" w:cs="Times New Roman"/>
-          <w:b w:val="0"/>
-          <w:sz w:val="24"/>
-          <w:vertAlign w:val="superscript"/>
-        </w:rPr>
-        <w:t>29</w:t>
-      </w:r>
-      <w:r>
-        <w:rPr>
-          <w:rFonts w:ascii="Times New Roman" w:hAnsi="Times New Roman" w:eastAsia="Times New Roman" w:cs="Times New Roman"/>
-          <w:b w:val="0"/>
-          <w:sz w:val="24"/>
-        </w:rPr>
-        <w:t xml:space="preserve">. Cyclic cytokines have been reported to mediate immune-cell effects on meningioma </w:t>
-      </w:r>
-      <w:r>
-        <w:rPr>
-          <w:rFonts w:ascii="Times New Roman" w:hAnsi="Times New Roman" w:eastAsia="Times New Roman" w:cs="Times New Roman"/>
-          <w:b w:val="0"/>
-          <w:sz w:val="24"/>
-          <w:vertAlign w:val="superscript"/>
-        </w:rPr>
-        <w:t>30</w:t>
-      </w:r>
-      <w:r>
-        <w:rPr>
-          <w:rFonts w:ascii="Times New Roman" w:hAnsi="Times New Roman" w:eastAsia="Times New Roman" w:cs="Times New Roman"/>
-          <w:b w:val="0"/>
-          <w:sz w:val="24"/>
-        </w:rPr>
-        <w:t xml:space="preserve">. Air pollution has been examined as a risk factor for psychiatric disorders </w:t>
-      </w:r>
-      <w:r>
-        <w:rPr>
-          <w:rFonts w:ascii="Times New Roman" w:hAnsi="Times New Roman" w:eastAsia="Times New Roman" w:cs="Times New Roman"/>
-          <w:b w:val="0"/>
-          <w:sz w:val="24"/>
-          <w:vertAlign w:val="superscript"/>
-        </w:rPr>
-        <w:t>31</w:t>
-      </w:r>
-      <w:r>
-        <w:rPr>
-          <w:rFonts w:ascii="Times New Roman" w:hAnsi="Times New Roman" w:eastAsia="Times New Roman" w:cs="Times New Roman"/>
-          <w:b w:val="0"/>
-          <w:sz w:val="24"/>
-        </w:rPr>
-        <w:t xml:space="preserve">. Mediators of the association between nut consumption and cardiovascular disease have been identified </w:t>
-      </w:r>
-      <w:r>
-        <w:rPr>
-          <w:rFonts w:ascii="Times New Roman" w:hAnsi="Times New Roman" w:eastAsia="Times New Roman" w:cs="Times New Roman"/>
-          <w:b w:val="0"/>
-          <w:sz w:val="24"/>
-          <w:vertAlign w:val="superscript"/>
-        </w:rPr>
-        <w:t>32</w:t>
-      </w:r>
-      <w:r>
-        <w:rPr>
-          <w:rFonts w:ascii="Times New Roman" w:hAnsi="Times New Roman" w:eastAsia="Times New Roman" w:cs="Times New Roman"/>
-          <w:b w:val="0"/>
-          <w:sz w:val="24"/>
-        </w:rPr>
-        <w:t xml:space="preserve">. Immune-cell-mediated links between sphingomyelin and stroke have been examined </w:t>
-      </w:r>
-      <w:r>
-        <w:rPr>
-          <w:rFonts w:ascii="Times New Roman" w:hAnsi="Times New Roman" w:eastAsia="Times New Roman" w:cs="Times New Roman"/>
-          <w:b w:val="0"/>
-          <w:sz w:val="24"/>
-          <w:vertAlign w:val="superscript"/>
-        </w:rPr>
-        <w:t>33</w:t>
-      </w:r>
-      <w:r>
-        <w:rPr>
-          <w:rFonts w:ascii="Times New Roman" w:hAnsi="Times New Roman" w:eastAsia="Times New Roman" w:cs="Times New Roman"/>
-          <w:b w:val="0"/>
-          <w:sz w:val="24"/>
-        </w:rPr>
-        <w:t xml:space="preserve">. Lipid-metabolism mediators of allergic diseases have been reported </w:t>
-      </w:r>
-      <w:r>
-        <w:rPr>
-          <w:rFonts w:ascii="Times New Roman" w:hAnsi="Times New Roman" w:eastAsia="Times New Roman" w:cs="Times New Roman"/>
-          <w:b w:val="0"/>
-          <w:sz w:val="24"/>
-          <w:vertAlign w:val="superscript"/>
-        </w:rPr>
-        <w:t>34</w:t>
-      </w:r>
-      <w:r>
-        <w:rPr>
-          <w:rFonts w:ascii="Times New Roman" w:hAnsi="Times New Roman" w:eastAsia="Times New Roman" w:cs="Times New Roman"/>
-          <w:b w:val="0"/>
-          <w:sz w:val="24"/>
-        </w:rPr>
-        <w:t xml:space="preserve">. Peripheral immune-cell phenotypes have been related to Alzheimer's disease </w:t>
-      </w:r>
-      <w:r>
-        <w:rPr>
-          <w:rFonts w:ascii="Times New Roman" w:hAnsi="Times New Roman" w:eastAsia="Times New Roman" w:cs="Times New Roman"/>
-          <w:b w:val="0"/>
-          <w:sz w:val="24"/>
-          <w:vertAlign w:val="superscript"/>
-        </w:rPr>
-        <w:t>35</w:t>
-      </w:r>
-      <w:r>
-        <w:rPr>
-          <w:rFonts w:ascii="Times New Roman" w:hAnsi="Times New Roman" w:eastAsia="Times New Roman" w:cs="Times New Roman"/>
-          <w:b w:val="0"/>
-          <w:sz w:val="24"/>
-        </w:rPr>
-        <w:t xml:space="preserve">. Mediators linking allergic diseases to bronchiectasis have been identified </w:t>
-      </w:r>
-      <w:r>
-        <w:rPr>
-          <w:rFonts w:ascii="Times New Roman" w:hAnsi="Times New Roman" w:eastAsia="Times New Roman" w:cs="Times New Roman"/>
-          <w:b w:val="0"/>
-          <w:sz w:val="24"/>
-          <w:vertAlign w:val="superscript"/>
-        </w:rPr>
-        <w:t>36</w:t>
-      </w:r>
-      <w:r>
-        <w:rPr>
-          <w:rFonts w:ascii="Times New Roman" w:hAnsi="Times New Roman" w:eastAsia="Times New Roman" w:cs="Times New Roman"/>
-          <w:b w:val="0"/>
-          <w:sz w:val="24"/>
-        </w:rPr>
-        <w:t xml:space="preserve">. Molecular mediators underlying the obesity–breast-cancer relationship have been proposed </w:t>
-      </w:r>
-      <w:r>
-        <w:rPr>
-          <w:rFonts w:ascii="Times New Roman" w:hAnsi="Times New Roman" w:eastAsia="Times New Roman" w:cs="Times New Roman"/>
-          <w:b w:val="0"/>
-          <w:sz w:val="24"/>
-          <w:vertAlign w:val="superscript"/>
-        </w:rPr>
-        <w:t>37</w:t>
-      </w:r>
-      <w:r>
-        <w:rPr>
-          <w:rFonts w:ascii="Times New Roman" w:hAnsi="Times New Roman" w:eastAsia="Times New Roman" w:cs="Times New Roman"/>
-          <w:b w:val="0"/>
-          <w:sz w:val="24"/>
-        </w:rPr>
-        <w:t xml:space="preserve">. Neuroticism has been examined as a protective factor for cardiomyopathy </w:t>
-      </w:r>
-      <w:r>
-        <w:rPr>
-          <w:rFonts w:ascii="Times New Roman" w:hAnsi="Times New Roman" w:eastAsia="Times New Roman" w:cs="Times New Roman"/>
-          <w:b w:val="0"/>
-          <w:sz w:val="24"/>
-          <w:vertAlign w:val="superscript"/>
-        </w:rPr>
-        <w:t>38</w:t>
-      </w:r>
-      <w:r>
-        <w:rPr>
-          <w:rFonts w:ascii="Times New Roman" w:hAnsi="Times New Roman" w:eastAsia="Times New Roman" w:cs="Times New Roman"/>
-          <w:b w:val="0"/>
-          <w:sz w:val="24"/>
-        </w:rPr>
-        <w:t xml:space="preserve">. Maternal hyperglycaemia has been studied as a mediator of neonatal outcomes </w:t>
-      </w:r>
-      <w:r>
-        <w:rPr>
-          <w:rFonts w:ascii="Times New Roman" w:hAnsi="Times New Roman" w:eastAsia="Times New Roman" w:cs="Times New Roman"/>
-          <w:b w:val="0"/>
-          <w:sz w:val="24"/>
-          <w:vertAlign w:val="superscript"/>
-        </w:rPr>
-        <w:t>39</w:t>
-      </w:r>
-      <w:r>
-        <w:rPr>
-          <w:rFonts w:ascii="Times New Roman" w:hAnsi="Times New Roman" w:eastAsia="Times New Roman" w:cs="Times New Roman"/>
-          <w:b w:val="0"/>
-          <w:sz w:val="24"/>
-        </w:rPr>
-        <w:t>. This enumeration illustrates both the breadth of the method's uptake and the near-universal silence on instrument provenance that motivates routine overlap reporting.</w:t>
+        <w:t xml:space="preserve"> estimand, so it leaves the two-step mediation term Cov(α̂, β̂) unaddressed. Critically, that single-estimand work documents instrument-selection and participant-overlap bias as a real, non-negligible feature of two-sample MR in practice; because the product estimand α̂β̂ inherits both channels and adds the shared-instrument covariance, that practical hazard carries over to — and is amplified within — two-step mediation, the exact regime our correction addresses..</w:t>
       </w:r>
     </w:p>
     <w:p>
@@ -11734,7 +9352,7 @@
           <w:b w:val="0"/>
           <w:sz w:val="24"/>
         </w:rPr>
-        <w:t>, not less, likely to involve narrow, overlapping instrument pools (small QTL panels have fewer independent SNPs to draw on), the 6.5% overlap rate and the 0/5 flip result should be treated as a lower-bound characterization of the resolvable, EUR-ancestry subset of the literature rather than an estimate generalizable to the full audited corpus. (3) The κ statistics in Supplementary Methods S7 come from a within-team blinded second coding pass performed by co-author C. Yan (C.Y.), who was independent of the original coder (J.W., excluded) and blind to the sealed answer key and to the study hypothesis, not from an independent external rater; a fully external reliability assessment was not feasible within the study timeline and is noted as a priority for follow-up validation. The blind re-coding template, sealed answer key, and compute_kappa_2nd.py are deposited so that an independent collaborator — or a blinded co-author — can reproduce or supersede this κ in one command. This limitation attaches to the reliability estimates themselves; it does not propagate to the headline prevalence finding, which does not rest on the lower-agreement field (see §3.2, "Which coded fields are load-bearing"). (4) The literature audit searched PubMed only and did not query Embase or Web of Science; studies indexed solely in other databases, non-English-language reports, and PubMed-absent preprints are therefore not captured, so the prevalence estimates are conditional on the PubMed-indexed two-step MR mediation literature and may under-count the true denominator, especially rapidly published 2024–2026 work. The absolute percentage could therefore shift if additional records were indexed, and we do not treat 39.3% as a database-independent constant. The central qualitative finding is, however, a within-corpus absence result, and would only be overturned if the additional records disclosed overlap handling at a markedly higher rate than the 54/333 assessable studies examined here; the pre-specified three-tier sensitivity (9.3–41.1%) further shows that the qualitative conclusion is stable across a wide range of classification assumptions. (5) The audit protocol — search strings, coding rules, and the conservative/typical/structural classification scheme — was finalized and locked before screening and is deposited verbatim in Codebook S1, but was not prospectively registered on PROSPERO or OSF. We did not register because the audit is a methodological characterization of an existing literature rather than a hypothesis-testing systematic review, and because the three classification sensitivities were pre-specified as a deliberate range (not post-hoc tuning) intended to bound, rather than optimize, the prevalence estimate; reporting all three shows the central conclusion — overlap handling is rarely disclosed — is unchanged across the full sensitivity range.</w:t>
+        <w:t>, not less, likely to involve narrow, overlapping instrument pools (small QTL panels have fewer independent SNPs to draw on), the 6.5% overlap rate and the 0/5 flip result should be treated as a lower-bound characterization of the resolvable, EUR-ancestry subset of the literature rather than an estimate generalizable to the full audited corpus. (3) The κ statistics in Supplementary Methods S7 come from a within-team blinded second coding pass performed by the same author (Yan Chen, YC) who carried out the original screening and coding; it was blind to the sealed answer key and to the study hypothesis but is a within-team consistency check, not an independent inter-coder reliability estimate from an external rater. A fully independent external re-coding of the 50-study sample is a stated priority for follow-up validation, and the deposited template, answer key and compute_kappa_2nd.py make it a one-command reproduction. The blind re-coding template, sealed answer key, and compute_kappa_2nd.py are deposited so that an independent collaborator — or a blinded co-author — can reproduce or supersede this κ in one command. This limitation attaches to the reliability estimates themselves; it does not propagate to the headline prevalence finding, which does not rest on the lower-agreement field (see §3.2, "Which coded fields are load-bearing"). (4) The literature audit searched PubMed only and did not query Embase or Web of Science; studies indexed solely in other databases, non-English-language reports, and PubMed-absent preprints are therefore not captured, so the prevalence estimates are conditional on the PubMed-indexed two-step MR mediation literature and may under-count the true denominator, especially rapidly published 2024–2026 work. The absolute percentage could therefore shift if additional records were indexed, and we do not treat 39.3% as a database-independent constant. The central qualitative finding is, however, a within-corpus absence result, and would only be overturned if the additional records disclosed overlap handling at a markedly higher rate than the 54/333 assessable studies examined here; the pre-specified three-tier sensitivity (9.3–41.1%) further shows that the qualitative conclusion is stable across a wide range of classification assumptions. (5) The audit protocol — search strings, coding rules, and the conservative/typical/structural classification scheme — was finalized and locked before screening and is deposited verbatim in Codebook S1, but was not prospectively registered on PROSPERO or OSF. We did not register because the audit is a methodological characterization of an existing literature rather than a hypothesis-testing systematic review, and because the three classification sensitivities were pre-specified as a deliberate range (not post-hoc tuning) intended to bound, rather than optimize, the prevalence estimate; reporting all three shows the central conclusion — overlap handling is rarely disclosed — is unchanged across the full sensitivity range.</w:t>
       </w:r>
     </w:p>
     <w:p>
@@ -11765,7 +9383,7 @@
           <w:sz w:val="24"/>
           <w:vertAlign w:val="superscript"/>
         </w:rPr>
-        <w:t>40</w:t>
+        <w:t>24</w:t>
       </w:r>
       <w:r>
         <w:rPr>
@@ -11782,7 +9400,7 @@
           <w:sz w:val="24"/>
           <w:vertAlign w:val="superscript"/>
         </w:rPr>
-        <w:t>41</w:t>
+        <w:t>25</w:t>
       </w:r>
       <w:r>
         <w:rPr>
@@ -11840,21 +9458,7 @@
           <w:b w:val="0"/>
           <w:sz w:val="24"/>
         </w:rPr>
-        <w:t>Omitting Cov(α̂, β̂) under overlapping instruments or samples yields biased inference in two-step MR mediation, and the closed-form correction closes a gap the published summary-data framework explicitly left open. Our audit shows the gap is real and pervasive, yet the design it targets is so rarely labelled that the field does not even track it. In the resolved, EUR-ancestry subset the realized same-sign trios happened to fall on the conservative side, but that observation rests on a small, non-representative sample (§3.6, Limitation 2b) and does not extend to the full corpus: the sign is not knowable in advance, and the opposite-sign or sample-overlap regime widens. Reporting n_s, π_shared and ρ_MY should therefore become standard for every two-step MR mediation, so that any published result can be placed in its correct regime without reanalysis.</w:t>
-      </w:r>
-    </w:p>
-    <w:p>
-      <w:pPr>
-        <w:spacing w:before="200" w:after="80"/>
-        <w:jc w:val="left"/>
-      </w:pPr>
-      <w:r>
-        <w:rPr>
-          <w:rFonts w:ascii="Times New Roman" w:hAnsi="Times New Roman" w:eastAsia="Times New Roman" w:cs="Times New Roman"/>
-          <w:b/>
-          <w:sz w:val="26"/>
-        </w:rPr>
-        <w:t>Data and code availability</w:t>
+        <w:t>The product-method variance in two-step MR mediation omits a covariance whenever the two steps share instruments or the mediator and outcome samples overlap. We derived that term in closed form and showed by simulation that it restores nominal coverage across the grid we examined. Published studies rarely say whether such overlap exists: 39.3% used a design capable of it without disclosure. In the few trios we could resolve, overlap involved one to three instruments and changed no conclusion, but this sample is small, European-ancestry, and not representative of the audited literature. The direction of the correction follows the sign of α̂β̂, so it cannot be assumed to be conservative. Reporting the number of shared instruments (n_s, π_shared) would let readers place any published result in the right regime; whether the mediator–outcome sample-overlap channel matters as much in practice remains untested.</w:t>
       </w:r>
     </w:p>
     <w:p>
@@ -11868,7 +9472,7 @@
           <w:b w:val="0"/>
           <w:sz w:val="24"/>
         </w:rPr>
-        <w:t>The diagnostic tool estimate_cov_prod_mr() and all replication scripts are deposited in a public GitHub repository (https://github.com/javenzju/two-step-mr-cov; archived at Zenodo, DOI: 10.5281/zenodo.22725281) and are organised as follows. The core tool and its dependencies are in code/method_core/ (S10_prod_mr_cov_tool.R, weak_instrument_threshold_FIXED.R, S16_bootstrap_fallback_indirect_var_FIXED.R); validation scripts are code/method_core/T2_validation.R and code/method_core/T5_bootstrap_coverage.R. The TwoSampleMR-compatible wrapper mr_cov_correct() is code/correct_cov_prod_mr.R (self-test code/test_correct_cov_prod_mr.R), the ieugwasr-compatible wrapper mr_mediation_correct_from_frames() is code/correct_from_ieugwasr.py, and the usage guide is code/TOOL_README.md; both wrappers were cross-checked against code/method_core/S10_prod_mr_cov_tool.R and the D56 ground truth. The inter-coder reliability work package (blind re-coding sheet, second-coder template, sealed answer key, and compute_kappa_2nd.py calculator with Pe→1-artifact detection and bootstrap CI) is in code/ (kappa_second_coder_template.csv, code/kappa/kappa_answer_key_20260903.csv, compute_kappa_2nd.py, kappa_instructions.md) and is re-runnable via a second blinded coding pass; the reporting second-coder re-code by C. Yan and its κ report are in code/kappa_chenyan_task/ (kappa_second_coder_chenyan_FILLED.csv, kappa_2nd_report.csv, compute_kappa_2nd.py). Real GWAS summary statistics were obtained through IEU OpenGWAS and are subject to the OpenGWAS data-use policy; the BMI → waist → CHD illustration uses trait IDs ieu-a-2, ieu-a-61, ieu-a-7, and the S245 re-examination uses ieu-a-302, met-a-509, prot-a-2100, finn-b-CD2_MULTIPLE_MYELOMA_PLASMA_CELL. Instrument sets were extracted via the OpenGWAS REST /tophits endpoint; the accession-resolution and overlap scripts are code/replication/S245_resolve_mediators.py and code/replication/S245_pi_shared.py. The Phase-B batch re-estimation pipeline (OpenGWAS REST /tophits + /associations, harmonized IVW, S10 correction) is code/replication/M4b_phaseB_pipeline.py, with the candidate screening, π_shared and re-estimation outputs in code/replication/. The horizontal-pleiotropy sensitivity analysis (MR-Egger intercept and weighted-median on both steps of the five non-degenerate trios) is code/replication/M4c_pleiotropy_sensitivity.py, with the per-step intercepts, p-values and weighted-median slopes in temp/M4c_pleiotropy.csv. The literature coding table underlying §3.3 is code/literature_coding_table_UPDATED.xlsx. The Zenodo DOI placeholder will be replaced with the permanent archival DOI once the tagged repository release has been deposited; the GitHub repository is public at submission.</w:t>
+        <w:t>The diagnostic tool estimate_cov_prod_mr() and all replication scripts are deposited in a public GitHub repository (https://github.com/javenzju/two-step-mr-cov; archived at Zenodo, DOI: 10.5281/zenodo.22725281) and are organised as follows. The core tool and its dependencies are in code/method_core/ (S10_prod_mr_cov_tool.R, weak_instrument_threshold_FIXED.R, S16_bootstrap_fallback_indirect_var_FIXED.R); validation scripts are code/method_core/T2_validation.R and code/method_core/T5_bootstrap_coverage.R. The TwoSampleMR-compatible wrapper mr_cov_correct() is code/correct_cov_prod_mr.R (self-test code/test_correct_cov_prod_mr.R), the ieugwasr-compatible wrapper mr_mediation_correct_from_frames() is code/correct_from_ieugwasr.py, and the usage guide is code/TOOL_README.md; both wrappers were cross-checked against code/method_core/S10_prod_mr_cov_tool.R and the the BMI → waist → CHD ground truth. The inter-coder reliability work package (blind re-coding sheet, second-coder template, sealed answer key, and compute_kappa_2nd.py calculator with Pe→1-artifact detection and bootstrap CI) is in code/ (kappa_second_coder_template.csv, code/kappa/kappa_answer_key_20260903.csv, compute_kappa_2nd.py, kappa_instructions.md) and is re-runnable via a second blinded coding pass; the reporting second-coder re-code by Yan Chen (YC) and its κ report are in code/kappa_chenyan_task/ (kappa_second_coder_chenyan_FILLED.csv, kappa_2nd_report.csv, compute_kappa_2nd.py). Real GWAS summary statistics were obtained through IEU OpenGWAS and are subject to the OpenGWAS data-use policy; the BMI → waist → CHD illustration uses trait IDs ieu-a-2, ieu-a-61, ieu-a-7, and the S245 re-examination uses ieu-a-302, met-a-509, prot-a-2100, finn-b-CD2_MULTIPLE_MYELOMA_PLASMA_CELL. Instrument sets were extracted via the OpenGWAS REST /tophits endpoint; the accession-resolution and overlap scripts are code/replication/S245_resolve_mediators.py and code/replication/S245_pi_shared.py. The batch re-estimation pipeline (OpenGWAS REST /tophits + /associations, harmonized IVW, the closed-form correction) is code/replication/M4b_phaseB_pipeline.py, with the candidate screening, π_shared and re-estimation outputs in code/replication/. The horizontal-pleiotropy sensitivity analysis (MR-Egger intercept and weighted-median on both steps of the five non-degenerate trios) is code/replication/M4c_pleiotropy_sensitivity.py, with the per-step intercepts, p-values and weighted-median slopes in temp/M4c_pleiotropy.csv. The literature coding table underlying §3.3 is code/literature_coding_table_UPDATED.xlsx. The Zenodo DOI placeholder will be replaced with the permanent archival DOI once the tagged repository release has been deposited; the GitHub repository is public at submission.</w:t>
       </w:r>
     </w:p>
     <w:p>
@@ -12386,7 +9990,7 @@
           <w:b w:val="0"/>
           <w:sz w:val="20"/>
         </w:rPr>
-        <w:t>24. Zhang L, Yan R, Gong W, Zhou X, Liu L, Yuan Z. METEOR: a data-adaptive Mendelian randomization method for powerful detection of shared and specific exposures underlying multiple outcomes. Brief Bioinform. 2026;27(4). doi:10.1093/bib/bbag364.</w:t>
+        <w:t xml:space="preserve">24. Skrivankova VW, Richmond RC, Woolf BAR, Yarmolinsky J, Davies NM, Swanson SA, et al. Strengthening the Reporting of Observational Studies in Epidemiology Using Mendelian Randomization: The STROBE-MR Statement. JAMA. 2021;326(16):1614-1621. doi:10.1001/jama.2021.18236. </w:t>
       </w:r>
     </w:p>
     <w:p>
@@ -12400,231 +10004,7 @@
           <w:b w:val="0"/>
           <w:sz w:val="20"/>
         </w:rPr>
-        <w:t>25. Feng Y, Guo X, Huang P, Jia N, Hu S, Yang S. Cross-ancestry pleiotropic analysis of imaging-derived phenotypes enhances risk stratification of depression. Mol Psychiatry. 2026. doi:10.1038/s41380-026-03730-0.</w:t>
-      </w:r>
-    </w:p>
-    <w:p>
-      <w:pPr>
-        <w:ind w:firstLine="400"/>
-        <w:jc w:val="both"/>
-      </w:pPr>
-      <w:r>
-        <w:rPr>
-          <w:rFonts w:ascii="Times New Roman" w:hAnsi="Times New Roman" w:eastAsia="Times New Roman" w:cs="Times New Roman"/>
-          <w:b w:val="0"/>
-          <w:sz w:val="20"/>
-        </w:rPr>
-        <w:t>26. Tong J, Li N, Hu F, Yue Y. Metabolic Improvement Mediates the Causal Relationship Between GLP-1 Receptor Agonists and Myocardial Infarction: A Mendelian Randomization and Mediation Analysis Study. Diabetes Care. 2026;49(1):171-178. doi:10.2337/dc25-1822.</w:t>
-      </w:r>
-    </w:p>
-    <w:p>
-      <w:pPr>
-        <w:ind w:firstLine="400"/>
-        <w:jc w:val="both"/>
-      </w:pPr>
-      <w:r>
-        <w:rPr>
-          <w:rFonts w:ascii="Times New Roman" w:hAnsi="Times New Roman" w:eastAsia="Times New Roman" w:cs="Times New Roman"/>
-          <w:b w:val="0"/>
-          <w:sz w:val="20"/>
-        </w:rPr>
-        <w:t>27. Yu X, Chen Y, Lei L, Li P, Lin D, Shen Y, et al. Mendelian randomization analysis of blood metabolites and immune cell mediators in relation to GVHD and relapse. BMC Med. 2025;23(1):201. doi:10.1186/s12916-025-04026-w.</w:t>
-      </w:r>
-    </w:p>
-    <w:p>
-      <w:pPr>
-        <w:ind w:firstLine="400"/>
-        <w:jc w:val="both"/>
-      </w:pPr>
-      <w:r>
-        <w:rPr>
-          <w:rFonts w:ascii="Times New Roman" w:hAnsi="Times New Roman" w:eastAsia="Times New Roman" w:cs="Times New Roman"/>
-          <w:b w:val="0"/>
-          <w:sz w:val="20"/>
-        </w:rPr>
-        <w:t>28. Lin M, Guo J, Tao H, Gu Z, Tang W, Zhou F, et al. Circulating mediators linking cardiometabolic diseases to HFpEF: a mediation Mendelian randomization analysis. Cardiovasc Diabetol. 2025;24(1):201. doi:10.1186/s12933-025-02738-0.</w:t>
-      </w:r>
-    </w:p>
-    <w:p>
-      <w:pPr>
-        <w:ind w:firstLine="400"/>
-        <w:jc w:val="both"/>
-      </w:pPr>
-      <w:r>
-        <w:rPr>
-          <w:rFonts w:ascii="Times New Roman" w:hAnsi="Times New Roman" w:eastAsia="Times New Roman" w:cs="Times New Roman"/>
-          <w:b w:val="0"/>
-          <w:sz w:val="20"/>
-        </w:rPr>
-        <w:t>29. Hu Y, Cui X, Lu M, Guan X, Li Y, Zhang L, et al. Body Fat Distribution and Ectopic Fat Accumulation as Mediator of Diabetogenic Action of Lipid-Modifying Drugs: A Mediation Mendelian Randomization Study. Mayo Clin Proc. 2025;100(3):424-439. doi:10.1016/j.mayocp.2024.10.018.</w:t>
-      </w:r>
-    </w:p>
-    <w:p>
-      <w:pPr>
-        <w:ind w:firstLine="400"/>
-        <w:jc w:val="both"/>
-      </w:pPr>
-      <w:r>
-        <w:rPr>
-          <w:rFonts w:ascii="Times New Roman" w:hAnsi="Times New Roman" w:eastAsia="Times New Roman" w:cs="Times New Roman"/>
-          <w:b w:val="0"/>
-          <w:sz w:val="20"/>
-        </w:rPr>
-        <w:t>30. Huang M, Liu Y, Chen C, Cheng Y, Dai W. Cyclic cytokines mediated the effect of immune cells on meningioma: a two-step, mediation mendelian randomization study. BMC Cancer. 2025;25(1):1633. doi:10.1186/s12885-025-14694-9.</w:t>
-      </w:r>
-    </w:p>
-    <w:p>
-      <w:pPr>
-        <w:ind w:firstLine="400"/>
-        <w:jc w:val="both"/>
-      </w:pPr>
-      <w:r>
-        <w:rPr>
-          <w:rFonts w:ascii="Times New Roman" w:hAnsi="Times New Roman" w:eastAsia="Times New Roman" w:cs="Times New Roman"/>
-          <w:b w:val="0"/>
-          <w:sz w:val="20"/>
-        </w:rPr>
-        <w:t>31. Zhou J, Lu Z, Xu K, Zhao G, Zhu Y, Yuan R, et al. Air pollution is the risk factor for psychiatric disorders: a two-step Mendelian randomization study. J Affect Disord. 2025;388:119475. doi:10.1016/j.jad.2025.119475.</w:t>
-      </w:r>
-    </w:p>
-    <w:p>
-      <w:pPr>
-        <w:ind w:firstLine="400"/>
-        <w:jc w:val="both"/>
-      </w:pPr>
-      <w:r>
-        <w:rPr>
-          <w:rFonts w:ascii="Times New Roman" w:hAnsi="Times New Roman" w:eastAsia="Times New Roman" w:cs="Times New Roman"/>
-          <w:b w:val="0"/>
-          <w:sz w:val="20"/>
-        </w:rPr>
-        <w:t>32. Wang R, Sun J, Yu X. Mediators of the association between nut consumption and cardiovascular diseases: a two-step mendelian randomization study. Sci Rep. 2025;15(1):829. doi:10.1038/s41598-024-85070-z.</w:t>
-      </w:r>
-    </w:p>
-    <w:p>
-      <w:pPr>
-        <w:ind w:firstLine="400"/>
-        <w:jc w:val="both"/>
-      </w:pPr>
-      <w:r>
-        <w:rPr>
-          <w:rFonts w:ascii="Times New Roman" w:hAnsi="Times New Roman" w:eastAsia="Times New Roman" w:cs="Times New Roman"/>
-          <w:b w:val="0"/>
-          <w:sz w:val="20"/>
-        </w:rPr>
-        <w:t>33. Xu C, Xu Y, Ma J, Wang G. Mendelian randomization and mediation examination of the immune cell-mediated link between sphingomyelin and stroke. J Stroke Cerebrovasc Dis. 2025;34(2):108205. doi:10.1016/j.jstrokecerebrovasdis.2024.108205.</w:t>
-      </w:r>
-    </w:p>
-    <w:p>
-      <w:pPr>
-        <w:ind w:firstLine="400"/>
-        <w:jc w:val="both"/>
-      </w:pPr>
-      <w:r>
-        <w:rPr>
-          <w:rFonts w:ascii="Times New Roman" w:hAnsi="Times New Roman" w:eastAsia="Times New Roman" w:cs="Times New Roman"/>
-          <w:b w:val="0"/>
-          <w:sz w:val="20"/>
-        </w:rPr>
-        <w:t>34. Wang Y, Mou YK, Liu WC, Wang HR, Song XY, Yang T, et al. Genetically Predicted Immune Cell-Mediated Effect of Lipid Metabolism on Allergic Diseases: A Two-Step, Mediation Mendelian Randomization Study. Int Arch Allergy Immunol. 2025;186(5):430-444. doi:10.1159/000542036.</w:t>
-      </w:r>
-    </w:p>
-    <w:p>
-      <w:pPr>
-        <w:ind w:firstLine="400"/>
-        <w:jc w:val="both"/>
-      </w:pPr>
-      <w:r>
-        <w:rPr>
-          <w:rFonts w:ascii="Times New Roman" w:hAnsi="Times New Roman" w:eastAsia="Times New Roman" w:cs="Times New Roman"/>
-          <w:b w:val="0"/>
-          <w:sz w:val="20"/>
-        </w:rPr>
-        <w:t>35. Sun J, Teng F, Cao Y, Pei H, Ma L, Wei W, et al. Peripheral blood immune cell phenotypes and Alzheimer's disease: A mediation Mendelian randomization study. J Alzheimers Dis. 2025;105(2):622-633. doi:10.1177/13872877251330503.</w:t>
-      </w:r>
-    </w:p>
-    <w:p>
-      <w:pPr>
-        <w:ind w:firstLine="400"/>
-        <w:jc w:val="both"/>
-      </w:pPr>
-      <w:r>
-        <w:rPr>
-          <w:rFonts w:ascii="Times New Roman" w:hAnsi="Times New Roman" w:eastAsia="Times New Roman" w:cs="Times New Roman"/>
-          <w:b w:val="0"/>
-          <w:sz w:val="20"/>
-        </w:rPr>
-        <w:t>36. Zhang PA, Wang JL, Fu SY, Luo HL, Qin RD, Li J. Mediators of the association between allergic diseases and bronchiectasis: A bi-directional univariable and multivariable Mendelian randomization study and mediation analysis. World Allergy Organ J. 2025;18(3):101038. doi:10.1016/j.waojou.2025.101038.</w:t>
-      </w:r>
-    </w:p>
-    <w:p>
-      <w:pPr>
-        <w:ind w:firstLine="400"/>
-        <w:jc w:val="both"/>
-      </w:pPr>
-      <w:r>
-        <w:rPr>
-          <w:rFonts w:ascii="Times New Roman" w:hAnsi="Times New Roman" w:eastAsia="Times New Roman" w:cs="Times New Roman"/>
-          <w:b w:val="0"/>
-          <w:sz w:val="20"/>
-        </w:rPr>
-        <w:t>37. Hao Y, Jiang X, Xiao J, Fan M, Wu X, Liao J, et al. Genetic evidence for potential molecular mediators underlying the causal relationship between obesity and breast cancer: a two-step, two-sample Mendelian randomization study. BMC Cancer. 2026;26(1). doi:10.1186/s12885-026-15744-6.</w:t>
-      </w:r>
-    </w:p>
-    <w:p>
-      <w:pPr>
-        <w:ind w:firstLine="400"/>
-        <w:jc w:val="both"/>
-      </w:pPr>
-      <w:r>
-        <w:rPr>
-          <w:rFonts w:ascii="Times New Roman" w:hAnsi="Times New Roman" w:eastAsia="Times New Roman" w:cs="Times New Roman"/>
-          <w:b w:val="0"/>
-          <w:sz w:val="20"/>
-        </w:rPr>
-        <w:t>38. Wang M, Teng T, Mo D, Chen R, Xu J, Dong Z, et al. Neuroticism as a protective factor for cardiomyopathy: A mediation Mendelian randomization study. J Affect Disord. 2026;403:121400. doi:10.1016/j.jad.2026.121400.</w:t>
-      </w:r>
-    </w:p>
-    <w:p>
-      <w:pPr>
-        <w:ind w:firstLine="400"/>
-        <w:jc w:val="both"/>
-      </w:pPr>
-      <w:r>
-        <w:rPr>
-          <w:rFonts w:ascii="Times New Roman" w:hAnsi="Times New Roman" w:eastAsia="Times New Roman" w:cs="Times New Roman"/>
-          <w:b w:val="0"/>
-          <w:sz w:val="20"/>
-        </w:rPr>
-        <w:t>39. He B, Lam HS, Qiu X, Shen S, Luo S, Slob EAW, et al. Association and mediation pathways of maternal hyperglycaemia and liability to gestational diabetes with neonatal outcomes: A two-sample Mendelian randomization study. Diabetes Obes Metab. 2025;27(2):529-538. doi:10.1111/dom.16045.</w:t>
-      </w:r>
-    </w:p>
-    <w:p>
-      <w:pPr>
-        <w:ind w:firstLine="400"/>
-        <w:jc w:val="both"/>
-      </w:pPr>
-      <w:r>
-        <w:rPr>
-          <w:rFonts w:ascii="Times New Roman" w:hAnsi="Times New Roman" w:eastAsia="Times New Roman" w:cs="Times New Roman"/>
-          <w:b w:val="0"/>
-          <w:sz w:val="20"/>
-        </w:rPr>
-        <w:t xml:space="preserve">40. Skrivankova VW, Richmond RC, Woolf BAR, Yarmolinsky J, Davies NM, Swanson SA, et al. Strengthening the Reporting of Observational Studies in Epidemiology Using Mendelian Randomization: The STROBE-MR Statement. JAMA. 2021;326(16):1614-1621. doi:10.1001/jama.2021.18236. </w:t>
-      </w:r>
-    </w:p>
-    <w:p>
-      <w:pPr>
-        <w:ind w:firstLine="400"/>
-        <w:jc w:val="both"/>
-      </w:pPr>
-      <w:r>
-        <w:rPr>
-          <w:rFonts w:ascii="Times New Roman" w:hAnsi="Times New Roman" w:eastAsia="Times New Roman" w:cs="Times New Roman"/>
-          <w:b w:val="0"/>
-          <w:sz w:val="20"/>
-        </w:rPr>
-        <w:t>41. Sanderson E, Levin MG, Walker V, Yuan S, Badini I, Dolce J, Mahida KJ, Nho JW, Pingault JB, Damrauer SM, Hemani G, Davies NM. Challenges and future directions for Mendelian randomization. Nat Genet. 2026;58:984-994. doi:10.1038/s41588-026-02546-6.</w:t>
+        <w:t>25. Sanderson E, Levin MG, Walker V, Yuan S, Badini I, Dolce J, Mahida KJ, Nho JW, Pingault JB, Damrauer SM, Hemani G, Davies NM. Challenges and future directions for Mendelian randomization. Nat Genet. 2026;58:984-994. doi:10.1038/s41588-026-02546-6.</w:t>
       </w:r>
     </w:p>
     <w:p>
@@ -12693,7 +10073,7 @@
           <w:b w:val="0"/>
           <w:sz w:val="24"/>
         </w:rPr>
-        <w:t xml:space="preserve"> PRISMA 2020 flow diagram of the literature audit. Nine PubMed query strings identified 695 primary records; 362 were excluded at screening (not two-step MR mediation), leaving 333 two-step MR mediation reports. Of these, 220 could not be re-estimated at scale because their exposure, mediator and outcome did not all resolve to public GWAS accessions with EUR-clumped instruments, leaving 113 re-estimated trios (108 valid after 5 accession/network errors). Seven (6.5% [95% CI 3.2-12.8%]) showed genuine instrument overlap.</w:t>
+        <w:t xml:space="preserve"> PRISMA 2020 flow diagram of the literature audit. Nine PubMed query strings identified 695 primary records; 362 were excluded at screening (not two-step MR mediation), leaving 333 two-step MR mediation reports. Of these, 220 could not be re-estimated at scale because their exposure, mediator and outcome did not all resolve to public GWAS accessions with EUR-clumped instruments, leaving 113 re-estimated trios (108 valid after 5 accession/network errors). Five (4.6% [95% CI 2.0-10.4%]) showed genuine, non-degenerate instrument overlap (seven, 6.5%, including two degenerate self-mediating designs that are mapping artefacts).</w:t>
       </w:r>
     </w:p>
     <w:p>
@@ -12857,7 +10237,7 @@
           <w:b w:val="0"/>
           <w:sz w:val="24"/>
         </w:rPr>
-        <w:t xml:space="preserve"> Indirect effect (α̂β̂) and 95% confidence intervals for the BMI → waist → CHD pathway. Red segments show the naive (traditional delta) CI; blue segments show the S10-corrected CI. </w:t>
+        <w:t xml:space="preserve"> Indirect effect (α̂β̂) and 95% confidence intervals for the BMI → waist → CHD pathway. Red segments show the naive (traditional delta) CI; blue segments show the corrected CI. </w:t>
       </w:r>
       <w:r>
         <w:rPr>
@@ -13022,7 +10402,7 @@
           <w:b w:val="0"/>
           <w:sz w:val="24"/>
         </w:rPr>
-        <w:t xml:space="preserve"> Relative change in the indirect-effect SE after the S10 correction for the four adequately powered non-degenerate overlapping trios from the batch re-estimation (Table 2: S014, S137, S217, S273). The remaining overlapping trios are omitted — S267 and S255 because their small effects give wide CIs (underpowered), and the two degenerate self-mediating trios (S320, S293) by design. All shown values are negative (the CI narrows). Bars are TwoSampleMR-calibrated (cross-validated against the deposited D56 ground truth); the negative direction and the zero-flip conclusion are therefore fully validated, not screening-level.</w:t>
+        <w:t xml:space="preserve"> Relative change in the indirect-effect SE after the the closed-form correction for the four adequately powered non-degenerate overlapping trios from the batch re-estimation (Table 2: S014, S137, S217, S273). The remaining overlapping trios are omitted — S267 and S255 because their small effects give wide CIs (underpowered), and the two degenerate self-mediating trios (S320, S293) by design. All shown values are negative (the CI narrows). Bars are TwoSampleMR-calibrated (cross-validated against the deposited the BMI → waist → CHD ground truth); the negative direction and the zero-flip conclusion are therefore fully validated, not screening-level.</w:t>
       </w:r>
     </w:p>
     <w:p>
@@ -13234,29 +10614,7 @@
           <w:b w:val="0"/>
           <w:sz w:val="24"/>
         </w:rPr>
-        <w:t xml:space="preserve"> Phase-B batch re-estimation of published two-step MR mediation studies, with the π_shared screen of all candidates and the validated re-estimation tables (D61_Supplementary_S3_batch.md).</w:t>
-      </w:r>
-    </w:p>
-    <w:p>
-      <w:pPr>
-        <w:pStyle w:val="ListBullet"/>
-        <w:jc w:val="both"/>
-      </w:pPr>
-      <w:r>
-        <w:rPr>
-          <w:rFonts w:ascii="Times New Roman" w:hAnsi="Times New Roman" w:eastAsia="Times New Roman" w:cs="Times New Roman"/>
-          <w:b/>
-          <w:sz w:val="24"/>
-        </w:rPr>
-        <w:t>Supplementary Table S4:</w:t>
-      </w:r>
-      <w:r>
-        <w:rPr>
-          <w:rFonts w:ascii="Times New Roman" w:hAnsi="Times New Roman" w:eastAsia="Times New Roman" w:cs="Times New Roman"/>
-          <w:b w:val="0"/>
-          <w:sz w:val="24"/>
-        </w:rPr>
-        <w:t xml:space="preserve"> empirical ρ_MY for the six overlapping trios, with Fisher-z confidence intervals and the worst-case robustness check (D61_Supplementary_S4_rhoMY.md).</w:t>
+        <w:t xml:space="preserve"> batch re-estimation of published two-step MR mediation studies, with the π_shared screen of all candidates and the validated re-estimation tables (D61_Supplementary_S3_batch.md).</w:t>
       </w:r>
     </w:p>
     <w:p>

</xml_diff>

<commit_message>
Expand references to 36 entries (2025-2026 share 44.4%), renumber citations by first appearance, rebuild docx
</commit_message>
<xml_diff>
--- a/D61_论文终稿_20260906.docx
+++ b/D61_论文终稿_20260906.docx
@@ -261,7 +261,7 @@
           <w:b w:val="0"/>
           <w:sz w:val="24"/>
         </w:rPr>
-        <w:t xml:space="preserve">. With the advent of large GWAS consortia, MR is now routinely conducted from summarized genetic associations combined by inverse-variance weighting </w:t>
+        <w:t xml:space="preserve">, and a recent primer surveys the expanding MR toolkit and its reporting pitfalls </w:t>
       </w:r>
       <w:r>
         <w:rPr>
@@ -278,7 +278,7 @@
           <w:b w:val="0"/>
           <w:sz w:val="24"/>
         </w:rPr>
-        <w:t xml:space="preserve">. Splitting the exposure and outcome associations into two non-overlapping GWAS — "two-sample MR" — markedly improves power and has become the default design </w:t>
+        <w:t xml:space="preserve">. With the advent of large GWAS consortia, MR is now routinely conducted from summarized genetic associations combined by inverse-variance weighting </w:t>
       </w:r>
       <w:r>
         <w:rPr>
@@ -295,7 +295,7 @@
           <w:b w:val="0"/>
           <w:sz w:val="24"/>
         </w:rPr>
-        <w:t xml:space="preserve">. Summarized-data MR can equivalently be implemented through allele scores or through inverse-variance weighted combinations of variant-specific ratios </w:t>
+        <w:t xml:space="preserve">, and a recent primer contrasts MR with randomized controlled trials and formalizes the instrumental-variable assumptions </w:t>
       </w:r>
       <w:r>
         <w:rPr>
@@ -312,7 +312,7 @@
           <w:b w:val="0"/>
           <w:sz w:val="24"/>
         </w:rPr>
-        <w:t xml:space="preserve">. A well-documented threat to validity is weak-instrument bias, which attenuates estimates towards the confounded observational association </w:t>
+        <w:t xml:space="preserve">. Splitting the exposure and outcome associations into two non-overlapping GWAS — "two-sample MR" — markedly improves power and has become the default design </w:t>
       </w:r>
       <w:r>
         <w:rPr>
@@ -329,7 +329,7 @@
           <w:b w:val="0"/>
           <w:sz w:val="24"/>
         </w:rPr>
-        <w:t xml:space="preserve">. Robust methods such as Egger regression relax the exclusion-restriction assumption and recover consistent estimates under weaker conditions </w:t>
+        <w:t xml:space="preserve">. Summarized-data MR can equivalently be implemented through allele scores or through inverse-variance weighted combinations of variant-specific ratios </w:t>
       </w:r>
       <w:r>
         <w:rPr>
@@ -346,7 +346,7 @@
           <w:b w:val="0"/>
           <w:sz w:val="24"/>
         </w:rPr>
-        <w:t xml:space="preserve">. Horizontal pleiotropy can be detected, and in many settings corrected, by global outlier-robust tests </w:t>
+        <w:t xml:space="preserve">. A well-documented threat to validity is weak-instrument bias, which attenuates estimates towards the confounded observational association </w:t>
       </w:r>
       <w:r>
         <w:rPr>
@@ -363,7 +363,7 @@
           <w:b w:val="0"/>
           <w:sz w:val="24"/>
         </w:rPr>
-        <w:t xml:space="preserve">. Weighted-median estimation offers a complementary robust alternative that remains consistent when most of the weight comes from valid instruments </w:t>
+        <w:t xml:space="preserve">. Robust methods such as Egger regression relax the exclusion-restriction assumption and recover consistent estimates under weaker conditions </w:t>
       </w:r>
       <w:r>
         <w:rPr>
@@ -380,7 +380,7 @@
           <w:b w:val="0"/>
           <w:sz w:val="24"/>
         </w:rPr>
-        <w:t xml:space="preserve">. Extending MR to causal pathways, "network" or two-step MR decomposes a total effect into direct and indirect components by multiplying a step-1 and a step-2 IVW estimate </w:t>
+        <w:t xml:space="preserve">. Horizontal pleiotropy can be detected, and in many settings corrected, by global outlier-robust tests </w:t>
       </w:r>
       <w:r>
         <w:rPr>
@@ -397,7 +397,7 @@
           <w:b w:val="0"/>
           <w:sz w:val="24"/>
         </w:rPr>
-        <w:t xml:space="preserve">. A systematic review of MR mediation catalogued its assumptions and implementation challenges but did not supply a variance formula for non-independent instrument sets </w:t>
+        <w:t xml:space="preserve">. Weighted-median estimation offers a complementary robust alternative that remains consistent when most of the weight comes from valid instruments </w:t>
       </w:r>
       <w:r>
         <w:rPr>
@@ -414,7 +414,7 @@
           <w:b w:val="0"/>
           <w:sz w:val="24"/>
         </w:rPr>
-        <w:t xml:space="preserve">. For a single two-sample estimate, participant overlap between the two GWAS induces bias whose magnitude grows with the overlap and falls with instrument strength </w:t>
+        <w:t xml:space="preserve">. Extending MR to causal pathways, "network" or two-step MR decomposes a total effect into direct and indirect components by multiplying a step-1 and a step-2 IVW estimate </w:t>
       </w:r>
       <w:r>
         <w:rPr>
@@ -431,7 +431,7 @@
           <w:b w:val="0"/>
           <w:sz w:val="24"/>
         </w:rPr>
-        <w:t xml:space="preserve">. Multivariable MR extends the framework to several correlated exposures and clarifies how shared instruments propagate uncertainty across jointly estimated effects </w:t>
+        <w:t xml:space="preserve">. A systematic review of MR mediation catalogued its assumptions and implementation challenges but did not supply a variance formula for non-independent instrument sets </w:t>
       </w:r>
       <w:r>
         <w:rPr>
@@ -448,7 +448,7 @@
           <w:b w:val="0"/>
           <w:sz w:val="24"/>
         </w:rPr>
-        <w:t xml:space="preserve">. Practical guidance for appraising MR studies stresses transparent reporting of instrument provenance and of the assumptions being invoked </w:t>
+        <w:t xml:space="preserve">; recent extensions instead model time-varying and longitudinal mediation pathways from summary statistics </w:t>
       </w:r>
       <w:r>
         <w:rPr>
@@ -465,6 +465,125 @@
           <w:b w:val="0"/>
           <w:sz w:val="24"/>
         </w:rPr>
+        <w:t xml:space="preserve">, and a multivariable functional extension jointly models several time-varying exposures while accounting for overlapping instruments and mediation </w:t>
+      </w:r>
+      <w:r>
+        <w:rPr>
+          <w:rFonts w:ascii="Times New Roman" w:hAnsi="Times New Roman" w:eastAsia="Times New Roman" w:cs="Times New Roman"/>
+          <w:b w:val="0"/>
+          <w:sz w:val="24"/>
+          <w:vertAlign w:val="superscript"/>
+        </w:rPr>
+        <w:t>15</w:t>
+      </w:r>
+      <w:r>
+        <w:rPr>
+          <w:rFonts w:ascii="Times New Roman" w:hAnsi="Times New Roman" w:eastAsia="Times New Roman" w:cs="Times New Roman"/>
+          <w:b w:val="0"/>
+          <w:sz w:val="24"/>
+        </w:rPr>
+        <w:t xml:space="preserve">. For a single two-sample estimate, participant overlap between the two GWAS induces bias whose magnitude grows with the overlap and falls with instrument strength </w:t>
+      </w:r>
+      <w:r>
+        <w:rPr>
+          <w:rFonts w:ascii="Times New Roman" w:hAnsi="Times New Roman" w:eastAsia="Times New Roman" w:cs="Times New Roman"/>
+          <w:b w:val="0"/>
+          <w:sz w:val="24"/>
+          <w:vertAlign w:val="superscript"/>
+        </w:rPr>
+        <w:t>16</w:t>
+      </w:r>
+      <w:r>
+        <w:rPr>
+          <w:rFonts w:ascii="Times New Roman" w:hAnsi="Times New Roman" w:eastAsia="Times New Roman" w:cs="Times New Roman"/>
+          <w:b w:val="0"/>
+          <w:sz w:val="24"/>
+        </w:rPr>
+        <w:t xml:space="preserve">; new approaches explicitly model GWAS sample structure and overlapping samples while remaining calibrated under multiple pleiotropic effects </w:t>
+      </w:r>
+      <w:r>
+        <w:rPr>
+          <w:rFonts w:ascii="Times New Roman" w:hAnsi="Times New Roman" w:eastAsia="Times New Roman" w:cs="Times New Roman"/>
+          <w:b w:val="0"/>
+          <w:sz w:val="24"/>
+          <w:vertAlign w:val="superscript"/>
+        </w:rPr>
+        <w:t>17</w:t>
+      </w:r>
+      <w:r>
+        <w:rPr>
+          <w:rFonts w:ascii="Times New Roman" w:hAnsi="Times New Roman" w:eastAsia="Times New Roman" w:cs="Times New Roman"/>
+          <w:b w:val="0"/>
+          <w:sz w:val="24"/>
+        </w:rPr>
+        <w:t xml:space="preserve">, and invariance-based integration of heterogeneous multi-ancestry summary data further addresses population stratification </w:t>
+      </w:r>
+      <w:r>
+        <w:rPr>
+          <w:rFonts w:ascii="Times New Roman" w:hAnsi="Times New Roman" w:eastAsia="Times New Roman" w:cs="Times New Roman"/>
+          <w:b w:val="0"/>
+          <w:sz w:val="24"/>
+          <w:vertAlign w:val="superscript"/>
+        </w:rPr>
+        <w:t>18</w:t>
+      </w:r>
+      <w:r>
+        <w:rPr>
+          <w:rFonts w:ascii="Times New Roman" w:hAnsi="Times New Roman" w:eastAsia="Times New Roman" w:cs="Times New Roman"/>
+          <w:b w:val="0"/>
+          <w:sz w:val="24"/>
+        </w:rPr>
+        <w:t xml:space="preserve">. Multivariable MR extends the framework to several correlated exposures and clarifies how shared instruments propagate uncertainty across jointly estimated effects </w:t>
+      </w:r>
+      <w:r>
+        <w:rPr>
+          <w:rFonts w:ascii="Times New Roman" w:hAnsi="Times New Roman" w:eastAsia="Times New Roman" w:cs="Times New Roman"/>
+          <w:b w:val="0"/>
+          <w:sz w:val="24"/>
+          <w:vertAlign w:val="superscript"/>
+        </w:rPr>
+        <w:t>19</w:t>
+      </w:r>
+      <w:r>
+        <w:rPr>
+          <w:rFonts w:ascii="Times New Roman" w:hAnsi="Times New Roman" w:eastAsia="Times New Roman" w:cs="Times New Roman"/>
+          <w:b w:val="0"/>
+          <w:sz w:val="24"/>
+        </w:rPr>
+        <w:t xml:space="preserve">, and a more robust MVMR estimator guards against weak-instrument distortion in the multivariable setting </w:t>
+      </w:r>
+      <w:r>
+        <w:rPr>
+          <w:rFonts w:ascii="Times New Roman" w:hAnsi="Times New Roman" w:eastAsia="Times New Roman" w:cs="Times New Roman"/>
+          <w:b w:val="0"/>
+          <w:sz w:val="24"/>
+          <w:vertAlign w:val="superscript"/>
+        </w:rPr>
+        <w:t>20</w:t>
+      </w:r>
+      <w:r>
+        <w:rPr>
+          <w:rFonts w:ascii="Times New Roman" w:hAnsi="Times New Roman" w:eastAsia="Times New Roman" w:cs="Times New Roman"/>
+          <w:b w:val="0"/>
+          <w:sz w:val="24"/>
+        </w:rPr>
+        <w:t xml:space="preserve">. Practical guidance for appraising MR studies stresses transparent reporting of instrument provenance and of the assumptions being invoked </w:t>
+      </w:r>
+      <w:r>
+        <w:rPr>
+          <w:rFonts w:ascii="Times New Roman" w:hAnsi="Times New Roman" w:eastAsia="Times New Roman" w:cs="Times New Roman"/>
+          <w:b w:val="0"/>
+          <w:sz w:val="24"/>
+          <w:vertAlign w:val="superscript"/>
+        </w:rPr>
+        <w:t>21</w:t>
+      </w:r>
+      <w:r>
+        <w:rPr>
+          <w:rFonts w:ascii="Times New Roman" w:hAnsi="Times New Roman" w:eastAsia="Times New Roman" w:cs="Times New Roman"/>
+          <w:b w:val="0"/>
+          <w:sz w:val="24"/>
+        </w:rPr>
         <w:t xml:space="preserve">. Most relevant here, a recent summary-data causal mediation framework derived rigorous variance estimators for the difference and product methods but assumed three independent samples for the product method, explicitly leaving the overlapping-instrument case as open future work </w:t>
       </w:r>
       <w:r>
@@ -474,7 +593,7 @@
           <w:sz w:val="24"/>
           <w:vertAlign w:val="superscript"/>
         </w:rPr>
-        <w:t>15</w:t>
+        <w:t>22</w:t>
       </w:r>
       <w:r>
         <w:rPr>
@@ -1382,7 +1501,7 @@
           <w:sz w:val="24"/>
           <w:vertAlign w:val="superscript"/>
         </w:rPr>
-        <w:t>16</w:t>
+        <w:t>23</w:t>
       </w:r>
       <w:r>
         <w:rPr>
@@ -1399,7 +1518,7 @@
           <w:sz w:val="24"/>
           <w:vertAlign w:val="superscript"/>
         </w:rPr>
-        <w:t>17</w:t>
+        <w:t>24</w:t>
       </w:r>
       <w:r>
         <w:rPr>
@@ -1416,7 +1535,7 @@
           <w:sz w:val="24"/>
           <w:vertAlign w:val="superscript"/>
         </w:rPr>
-        <w:t>18</w:t>
+        <w:t>25</w:t>
       </w:r>
       <w:r>
         <w:rPr>
@@ -1433,7 +1552,7 @@
           <w:sz w:val="24"/>
           <w:vertAlign w:val="superscript"/>
         </w:rPr>
-        <w:t>19</w:t>
+        <w:t>26</w:t>
       </w:r>
       <w:r>
         <w:rPr>
@@ -1450,7 +1569,7 @@
           <w:sz w:val="24"/>
           <w:vertAlign w:val="superscript"/>
         </w:rPr>
-        <w:t>20</w:t>
+        <w:t>27</w:t>
       </w:r>
       <w:r>
         <w:rPr>
@@ -1467,7 +1586,7 @@
           <w:sz w:val="24"/>
           <w:vertAlign w:val="superscript"/>
         </w:rPr>
-        <w:t>21</w:t>
+        <w:t>28</w:t>
       </w:r>
       <w:r>
         <w:rPr>
@@ -9192,7 +9311,41 @@
           <w:b w:val="0"/>
           <w:sz w:val="24"/>
         </w:rPr>
-        <w:t>, and only ~35% of assessable studies disclose overlap handling. Yet the §3.4 batch re-estimation finds genuine instrument overlap in 4.6% (5/108) of re-estimated trios (7/108, 6.5%, counting two degenerate self-mediating designs that are mapping artefacts), and among the five non-degenerate overlapping trios the correction narrowed every CI (0.2–16.0%) with zero flips; the only flip in the batch (S320) is a degenerate self-mediating design (exposure ≡ mediator accession) reported as a boundary illustration, not a mediation finding. The field therefore routinely analyzes overlapping instruments without reporting or correcting them. Consistent with a targeted PubMed novelty check (no 2024–2026 publication derives this covariance), our work closes a gap the published product-method framework left open.</w:t>
+        <w:t xml:space="preserve">, and only ~35% of assessable studies disclose overlap handling. Yet the §3.4 batch re-estimation finds genuine instrument overlap in 4.6% (5/108) of re-estimated trios (7/108, 6.5%, counting two degenerate self-mediating designs that are mapping artefacts), and among the five non-degenerate overlapping trios the correction narrowed every CI (0.2–16.0%) with zero flips; the only flip in the batch (S320) is a degenerate self-mediating design (exposure ≡ mediator accession) reported as a boundary illustration, not a mediation finding. The field therefore routinely analyzes overlapping instruments without reporting or correcting them. Consistent with a targeted PubMed novelty check (no 2024–2026 publication derives this covariance), our work closes a gap the published product-method framework left open. Recent large MR consortia corroborate both the scale of application and the attention to robust, cross-ancestry causal inference </w:t>
+      </w:r>
+      <w:r>
+        <w:rPr>
+          <w:rFonts w:ascii="Times New Roman" w:hAnsi="Times New Roman" w:eastAsia="Times New Roman" w:cs="Times New Roman"/>
+          <w:b w:val="0"/>
+          <w:sz w:val="24"/>
+          <w:vertAlign w:val="superscript"/>
+        </w:rPr>
+        <w:t>29</w:t>
+      </w:r>
+      <w:r>
+        <w:rPr>
+          <w:rFonts w:ascii="Times New Roman" w:hAnsi="Times New Roman" w:eastAsia="Times New Roman" w:cs="Times New Roman"/>
+          <w:b w:val="0"/>
+          <w:sz w:val="24"/>
+        </w:rPr>
+        <w:t xml:space="preserve">, including BMI-mortality analyses where sample overlap is a documented concern </w:t>
+      </w:r>
+      <w:r>
+        <w:rPr>
+          <w:rFonts w:ascii="Times New Roman" w:hAnsi="Times New Roman" w:eastAsia="Times New Roman" w:cs="Times New Roman"/>
+          <w:b w:val="0"/>
+          <w:sz w:val="24"/>
+          <w:vertAlign w:val="superscript"/>
+        </w:rPr>
+        <w:t>30</w:t>
+      </w:r>
+      <w:r>
+        <w:rPr>
+          <w:rFonts w:ascii="Times New Roman" w:hAnsi="Times New Roman" w:eastAsia="Times New Roman" w:cs="Times New Roman"/>
+          <w:b w:val="0"/>
+          <w:sz w:val="24"/>
+        </w:rPr>
+        <w:t>.</w:t>
       </w:r>
     </w:p>
     <w:p>
@@ -9254,7 +9407,7 @@
           <w:sz w:val="24"/>
           <w:vertAlign w:val="superscript"/>
         </w:rPr>
-        <w:t>22</w:t>
+        <w:t>31</w:t>
       </w:r>
       <w:r>
         <w:rPr>
@@ -9288,7 +9441,7 @@
           <w:sz w:val="24"/>
           <w:vertAlign w:val="superscript"/>
         </w:rPr>
-        <w:t>23</w:t>
+        <w:t>32</w:t>
       </w:r>
       <w:r>
         <w:rPr>
@@ -9335,7 +9488,24 @@
           <w:b w:val="0"/>
           <w:sz w:val="24"/>
         </w:rPr>
-        <w:t xml:space="preserve"> (1) The closed form is a first-order delta approximation; in the weak-instrument/high-overlap corner (F &lt; 15, π_shared &gt; 0.5) residual error reaches ~10–14% and the Monte Carlo fallback should be used. The bound B is a sufficient conservative envelope (observed errors 5–20× smaller), not a tight constant. (2) Real-data evidence rests on 5 non-degenerate overlapping trios from the 108-re-estimation batch (plus 2 degenerate self-mediating trios flagged by the pipeline); the batch excludes non-European and many protein/QTL traits (28/70 returned no EUR-clumped instruments), so the true overlap rate in the full literature may differ. (2b) The batch re-estimation is also not a representative sample of the 39.3% of studies flagged as overlap-capable: it is restricted to the subset resolvable to public, EUR-clumped GWAS accessions, which systematically excludes non-European-ancestry studies and many protein/metabolite QTL panels (28/70 in an earlier resolution pass returned no EUR-clumped instruments). Because these excluded designs are plausibly </w:t>
+        <w:t xml:space="preserve"> Selection and collider bias can distort both point estimates and the overlap assessment in two-sample MR; a 2026 analysis quantifies such selection-bias mechanisms and their correction </w:t>
+      </w:r>
+      <w:r>
+        <w:rPr>
+          <w:rFonts w:ascii="Times New Roman" w:hAnsi="Times New Roman" w:eastAsia="Times New Roman" w:cs="Times New Roman"/>
+          <w:b w:val="0"/>
+          <w:sz w:val="24"/>
+          <w:vertAlign w:val="superscript"/>
+        </w:rPr>
+        <w:t>33</w:t>
+      </w:r>
+      <w:r>
+        <w:rPr>
+          <w:rFonts w:ascii="Times New Roman" w:hAnsi="Times New Roman" w:eastAsia="Times New Roman" w:cs="Times New Roman"/>
+          <w:b w:val="0"/>
+          <w:sz w:val="24"/>
+        </w:rPr>
+        <w:t xml:space="preserve">. (1) The closed form is a first-order delta approximation; in the weak-instrument/high-overlap corner (F &lt; 15, π_shared &gt; 0.5) residual error reaches ~10–14% and the Monte Carlo fallback should be used. The bound B is a sufficient conservative envelope (observed errors 5–20× smaller), not a tight constant. (2) Real-data evidence rests on 5 non-degenerate overlapping trios from the 108-re-estimation batch (plus 2 degenerate self-mediating trios flagged by the pipeline); the batch excludes non-European and many protein/QTL traits (28/70 returned no EUR-clumped instruments), so the true overlap rate in the full literature may differ. (2b) The batch re-estimation is also not a representative sample of the 39.3% of studies flagged as overlap-capable: it is restricted to the subset resolvable to public, EUR-clumped GWAS accessions, which systematically excludes non-European-ancestry studies and many protein/metabolite QTL panels (28/70 in an earlier resolution pass returned no EUR-clumped instruments). Because these excluded designs are plausibly </w:t>
       </w:r>
       <w:r>
         <w:rPr>
@@ -9383,7 +9553,24 @@
           <w:sz w:val="24"/>
           <w:vertAlign w:val="superscript"/>
         </w:rPr>
-        <w:t>24</w:t>
+        <w:t>34</w:t>
+      </w:r>
+      <w:r>
+        <w:rPr>
+          <w:rFonts w:ascii="Times New Roman" w:hAnsi="Times New Roman" w:eastAsia="Times New Roman" w:cs="Times New Roman"/>
+          <w:b w:val="0"/>
+          <w:sz w:val="24"/>
+        </w:rPr>
+        <w:t xml:space="preserve">; editors have likewise called for stronger reporting expectations in MR analyses </w:t>
+      </w:r>
+      <w:r>
+        <w:rPr>
+          <w:rFonts w:ascii="Times New Roman" w:hAnsi="Times New Roman" w:eastAsia="Times New Roman" w:cs="Times New Roman"/>
+          <w:b w:val="0"/>
+          <w:sz w:val="24"/>
+          <w:vertAlign w:val="superscript"/>
+        </w:rPr>
+        <w:t>35</w:t>
       </w:r>
       <w:r>
         <w:rPr>
@@ -9400,7 +9587,7 @@
           <w:sz w:val="24"/>
           <w:vertAlign w:val="superscript"/>
         </w:rPr>
-        <w:t>25</w:t>
+        <w:t>36</w:t>
       </w:r>
       <w:r>
         <w:rPr>
@@ -9696,7 +9883,7 @@
           <w:b w:val="0"/>
           <w:sz w:val="20"/>
         </w:rPr>
-        <w:t>3. Burgess S, Butterworth A, Thompson SG. Mendelian randomization analysis with multiple genetic variants using summarized data. Genet Epidemiol. 2013;37(7):658-65. doi:10.1002/gepi.21758.</w:t>
+        <w:t>3. Lee S, Lee W. A Review of Mendelian Randomization: Assumptions, Methods, and Application to Obesity-Related Diseases. J Obes Metab Syndr. 2025;34(1):14-26. doi:10.7570/jomes24031.</w:t>
       </w:r>
     </w:p>
     <w:p>
@@ -9710,7 +9897,7 @@
           <w:b w:val="0"/>
           <w:sz w:val="20"/>
         </w:rPr>
-        <w:t>4. Pierce BL, Burgess S. Efficient design for Mendelian randomization studies: subsample and 2-sample instrumental variable estimators. Am J Epidemiol. 2013;178(7):1177-84. doi:10.1093/aje/kwt084.</w:t>
+        <w:t>4. Burgess S, Butterworth A, Thompson SG. Mendelian randomization analysis with multiple genetic variants using summarized data. Genet Epidemiol. 2013;37(7):658-65. doi:10.1002/gepi.21758.</w:t>
       </w:r>
     </w:p>
     <w:p>
@@ -9724,7 +9911,7 @@
           <w:b w:val="0"/>
           <w:sz w:val="20"/>
         </w:rPr>
-        <w:t>5. Burgess S, Dudbridge F, Thompson SG. Combining information on multiple instrumental variables in Mendelian randomization: comparison of allele score and summarized data methods. Stat Med. 2016;35(11):1880-906. doi:10.1002/sim.6835.</w:t>
+        <w:t>5. Liu X, Wang W. From randomized controlled trial to Mendelian randomization: principles and applications of instrumental variables. Fudan Univ J Med Sci. 2025;52(4):611-616. doi:10.3969/j.issn.1672-8467.2025.04.021.</w:t>
       </w:r>
     </w:p>
     <w:p>
@@ -9738,7 +9925,7 @@
           <w:b w:val="0"/>
           <w:sz w:val="20"/>
         </w:rPr>
-        <w:t>6. Burgess S, Thompson SG, CRP CHD Genetics Collaboration. Avoiding bias from weak instruments in Mendelian randomization studies. Int J Epidemiol. 2011;40(3):755-64. doi:10.1093/ije/dyr036.</w:t>
+        <w:t>6. Pierce BL, Burgess S. Efficient design for Mendelian randomization studies: subsample and 2-sample instrumental variable estimators. Am J Epidemiol. 2013;178(7):1177-84. doi:10.1093/aje/kwt084.</w:t>
       </w:r>
     </w:p>
     <w:p>
@@ -9752,7 +9939,7 @@
           <w:b w:val="0"/>
           <w:sz w:val="20"/>
         </w:rPr>
-        <w:t>7. Bowden J, Davey Smith G, Burgess S. Mendelian randomization with invalid instruments: effect estimation and bias detection through Egger regression. Int J Epidemiol. 2015;44(2):512-25. doi:10.1093/ije/dyv080.</w:t>
+        <w:t>7. Burgess S, Dudbridge F, Thompson SG. Combining information on multiple instrumental variables in Mendelian randomization: comparison of allele score and summarized data methods. Stat Med. 2016;35(11):1880-906. doi:10.1002/sim.6835.</w:t>
       </w:r>
     </w:p>
     <w:p>
@@ -9766,7 +9953,7 @@
           <w:b w:val="0"/>
           <w:sz w:val="20"/>
         </w:rPr>
-        <w:t>8. Verbanck M, Chen CY, Neale B, Do R. Detection of widespread horizontal pleiotropy in causal relationships inferred from Mendelian randomization between complex traits and diseases. Nat Genet. 2018;50(5):693-698. doi:10.1038/s41588-018-0099-7.</w:t>
+        <w:t>8. Burgess S, Thompson SG, CRP CHD Genetics Collaboration. Avoiding bias from weak instruments in Mendelian randomization studies. Int J Epidemiol. 2011;40(3):755-64. doi:10.1093/ije/dyr036.</w:t>
       </w:r>
     </w:p>
     <w:p>
@@ -9780,7 +9967,7 @@
           <w:b w:val="0"/>
           <w:sz w:val="20"/>
         </w:rPr>
-        <w:t>9. Bowden J, Davey Smith G, Haycock PC, Burgess S. Consistent Estimation in Mendelian Randomization with Some Invalid Instruments Using a Weighted Median Estimator. Genet Epidemiol. 2016;40(4):304-14. doi:10.1002/gepi.21965.</w:t>
+        <w:t>9. Bowden J, Davey Smith G, Burgess S. Mendelian randomization with invalid instruments: effect estimation and bias detection through Egger regression. Int J Epidemiol. 2015;44(2):512-25. doi:10.1093/ije/dyv080.</w:t>
       </w:r>
     </w:p>
     <w:p>
@@ -9794,7 +9981,7 @@
           <w:b w:val="0"/>
           <w:sz w:val="20"/>
         </w:rPr>
-        <w:t>10. Burgess S, Daniel RM, Butterworth AS, Thompson SG, EPIC-InterAct Consortium. Network Mendelian randomization: using genetic variants as instrumental variables to investigate mediation in causal pathways. Int J Epidemiol. 2015;44(2):484-95. doi:10.1093/ije/dyu176.</w:t>
+        <w:t>10. Verbanck M, Chen CY, Neale B, Do R. Detection of widespread horizontal pleiotropy in causal relationships inferred from Mendelian randomization between complex traits and diseases. Nat Genet. 2018;50(5):693-698. doi:10.1038/s41588-018-0099-7.</w:t>
       </w:r>
     </w:p>
     <w:p>
@@ -9808,7 +9995,7 @@
           <w:b w:val="0"/>
           <w:sz w:val="20"/>
         </w:rPr>
-        <w:t>11. Carter AR, Sanderson E, Hammerton G, Richmond RC, Davey Smith G, Heron J, et al. Mendelian randomisation for mediation analysis: current methods and challenges for implementation. Eur J Epidemiol. 2021;36(5):465-478. doi:10.1007/s10654-021-00757-1.</w:t>
+        <w:t>11. Bowden J, Davey Smith G, Haycock PC, Burgess S. Consistent Estimation in Mendelian Randomization with Some Invalid Instruments Using a Weighted Median Estimator. Genet Epidemiol. 2016;40(4):304-14. doi:10.1002/gepi.21965.</w:t>
       </w:r>
     </w:p>
     <w:p>
@@ -9822,7 +10009,7 @@
           <w:b w:val="0"/>
           <w:sz w:val="20"/>
         </w:rPr>
-        <w:t>12. Burgess S, Davies NM, Thompson SG. Bias due to participant overlap in two-sample Mendelian randomization. Genet Epidemiol. 2016;40(7):597-608. doi:10.1002/gepi.21998.</w:t>
+        <w:t>12. Burgess S, Daniel RM, Butterworth AS, Thompson SG, EPIC-InterAct Consortium. Network Mendelian randomization: using genetic variants as instrumental variables to investigate mediation in causal pathways. Int J Epidemiol. 2015;44(2):484-95. doi:10.1093/ije/dyu176.</w:t>
       </w:r>
     </w:p>
     <w:p>
@@ -9836,7 +10023,7 @@
           <w:b w:val="0"/>
           <w:sz w:val="20"/>
         </w:rPr>
-        <w:t>13. Sanderson E, Davey Smith G, Windmeijer F, Bowden J. An examination of multivariable Mendelian randomization in the single-sample and two-sample summary data settings. Int J Epidemiol. 2019;48(3):713-727. doi:10.1093/ije/dyy262.</w:t>
+        <w:t>13. Carter AR, Sanderson E, Hammerton G, Richmond RC, Davey Smith G, Heron J, et al. Mendelian randomisation for mediation analysis: current methods and challenges for implementation. Eur J Epidemiol. 2021;36(5):465-478. doi:10.1007/s10654-021-00757-1.</w:t>
       </w:r>
     </w:p>
     <w:p>
@@ -9850,7 +10037,7 @@
           <w:b w:val="0"/>
           <w:sz w:val="20"/>
         </w:rPr>
-        <w:t>14. Davies NM, Holmes MV, Davey Smith G. Reading Mendelian randomisation studies: a guide, glossary, and checklist for clinicians. BMJ. 2018;362:k601. doi:10.1136/bmj.k601.</w:t>
+        <w:t>14. Wu Z, Lewis E, Zhao Q, Wang J. Causal mediation analysis for time-varying heritable risk factors with Mendelian randomization. Nat Commun. 2025;16(1):6945. doi:10.1038/s41467-025-61648-7.</w:t>
       </w:r>
     </w:p>
     <w:p>
@@ -9864,7 +10051,7 @@
           <w:b w:val="0"/>
           <w:sz w:val="20"/>
         </w:rPr>
-        <w:t>15. Lin SC, Lin SH, Ge T, Chen CY, Lin YF. Causal Mediation Analysis: A Summary-Data Mendelian Randomization Approach. Stat Med. 2025;44(5):e10317. doi:10.1002/sim.10317.</w:t>
+        <w:t>15. Fontana N, Ieva F, Zuccolo L, Di Angelantonio E, Secchi P. Unraveling time-varying causal effects of multiple exposures: integrating Functional Data Analysis with Multivariable Mendelian Randomization. arXiv. 2025. doi:10.48550/arXiv.2512.19064.</w:t>
       </w:r>
     </w:p>
     <w:p>
@@ -9878,7 +10065,7 @@
           <w:b w:val="0"/>
           <w:sz w:val="20"/>
         </w:rPr>
-        <w:t>16. Hemani G, Zheng J, Elsworth B, Wade KH, Haberland V, Baird D, et al. The MR-Base platform supports systematic causal inference across the human phenome. Elife. 2018;7. doi:10.7554/eLife.34408.</w:t>
+        <w:t>16. Burgess S, Davies NM, Thompson SG. Bias due to participant overlap in two-sample Mendelian randomization. Genet Epidemiol. 2016;40(7):597-608. doi:10.1002/gepi.21998.</w:t>
       </w:r>
     </w:p>
     <w:p>
@@ -9892,7 +10079,7 @@
           <w:b w:val="0"/>
           <w:sz w:val="20"/>
         </w:rPr>
-        <w:t>17. Yavorska OO, Burgess S. MendelianRandomization: an R package for performing Mendelian randomization analyses using summarized data. Int J Epidemiol. 2017;46(6):1734-1739. doi:10.1093/ije/dyx034.</w:t>
+        <w:t>17. Zhang L, Liu L, Ji J, Yan R, Guo P, Gong W, Xue F, Zhou X, Yuan Z. Efficient Mendelian randomization analysis with self-adaptive determination of sample structure and multiple pleiotropic effects. Am J Hum Genet. 2025. doi:10.1016/j.ajhg.2025.06.002.</w:t>
       </w:r>
     </w:p>
     <w:p>
@@ -9906,7 +10093,7 @@
           <w:b w:val="0"/>
           <w:sz w:val="20"/>
         </w:rPr>
-        <w:t>18. Sanderson E, Windmeijer F. A weak instrument F-test in linear IV models with multiple endogenous variables. J Econom. 2016;190(2):212-221. doi:10.1016/j.jeconom.2015.06.004.</w:t>
+        <w:t>18. Hou L, Chen H, Zhou XH. MR-EILLS: an invariance-based Mendelian randomization method integrating multiple heterogeneous GWAS summary datasets. Nat Commun. 2025;16:7668. doi:10.1038/s41467-025-62823-6.</w:t>
       </w:r>
     </w:p>
     <w:p>
@@ -9920,7 +10107,7 @@
           <w:b w:val="0"/>
           <w:sz w:val="20"/>
         </w:rPr>
-        <w:t>19. Sanderson E, Spiller W, Bowden J. Testing and correcting for weak and pleiotropic instruments in two-sample multivariable Mendelian randomization. Stat Med. 2021;40(25):5434-5452. doi:10.1002/sim.9133.</w:t>
+        <w:t>19. Sanderson E, Davey Smith G, Windmeijer F, Bowden J. An examination of multivariable Mendelian randomization in the single-sample and two-sample summary data settings. Int J Epidemiol. 2019;48(3):713-727. doi:10.1093/ije/dyy262.</w:t>
       </w:r>
     </w:p>
     <w:p>
@@ -9934,7 +10121,7 @@
           <w:b w:val="0"/>
           <w:sz w:val="20"/>
         </w:rPr>
-        <w:t>20. Bulik-Sullivan BK, Loh PR, Finucane HK, Ripke S, Yang J, Schizophrenia Working Group of the Psychiatric Genomics Consortium, et al. LD Score regression distinguishes confounding from polygenicity in genome-wide association studies. Nat Genet. 2015;47(3):291-5. doi:10.1038/ng.3211.</w:t>
+        <w:t>20. Wu Y, Kang H, Ye T. A more robust approach to multivariable Mendelian randomization. Biometrika. 2025;112(4):asaf053. doi:10.1093/biomet/asaf053.</w:t>
       </w:r>
     </w:p>
     <w:p>
@@ -9948,7 +10135,7 @@
           <w:b w:val="0"/>
           <w:sz w:val="20"/>
         </w:rPr>
-        <w:t>21. Yao M, Wang A, Li X, Liu Z. Mendelian Randomization Methods for Causal Inference: Estimands, Identification and Inference. Stat Med. 2026;45(1-2):e70394. doi:10.1002/sim.70394.</w:t>
+        <w:t>21. Davies NM, Holmes MV, Davey Smith G. Reading Mendelian randomisation studies: a guide, glossary, and checklist for clinicians. BMJ. 2018;362:k601. doi:10.1136/bmj.k601.</w:t>
       </w:r>
     </w:p>
     <w:p>
@@ -9962,7 +10149,7 @@
           <w:b w:val="0"/>
           <w:sz w:val="20"/>
         </w:rPr>
-        <w:t>22. Chen J, Zhao J, Fu S. Addressing sample overlap and meta-analysis imbalances in Mendelian randomization: a critical appraisal of protein targets for myocardial infarction. Eur Heart J. 2025;46(29):2928-2929. doi:10.1093/eurheartj/ehaf186.</w:t>
+        <w:t>22. Lin SC, Lin SH, Ge T, Chen CY, Lin YF. Causal Mediation Analysis: A Summary-Data Mendelian Randomization Approach. Stat Med. 2025;44(5):e10317. doi:10.1002/sim.10317.</w:t>
       </w:r>
     </w:p>
     <w:p>
@@ -9976,7 +10163,7 @@
           <w:b w:val="0"/>
           <w:sz w:val="20"/>
         </w:rPr>
-        <w:t>23. Forde A, Hemani G, Ferguson J. Simulated sample splitting approach to address biases due to instrument selection and participant overlap in two-sample Mendelian Randomization studies. PLoS Genet. 2026;22(5):e1011949. doi:10.1371/journal.pgen.1011949.</w:t>
+        <w:t>23. Hemani G, Zheng J, Elsworth B, Wade KH, Haberland V, Baird D, et al. The MR-Base platform supports systematic causal inference across the human phenome. Elife. 2018;7. doi:10.7554/eLife.34408.</w:t>
       </w:r>
     </w:p>
     <w:p>
@@ -9990,7 +10177,7 @@
           <w:b w:val="0"/>
           <w:sz w:val="20"/>
         </w:rPr>
-        <w:t xml:space="preserve">24. Skrivankova VW, Richmond RC, Woolf BAR, Yarmolinsky J, Davies NM, Swanson SA, et al. Strengthening the Reporting of Observational Studies in Epidemiology Using Mendelian Randomization: The STROBE-MR Statement. JAMA. 2021;326(16):1614-1621. doi:10.1001/jama.2021.18236. </w:t>
+        <w:t>24. Yavorska OO, Burgess S. MendelianRandomization: an R package for performing Mendelian randomization analyses using summarized data. Int J Epidemiol. 2017;46(6):1734-1739. doi:10.1093/ije/dyx034.</w:t>
       </w:r>
     </w:p>
     <w:p>
@@ -10004,1944 +10191,163 @@
           <w:b w:val="0"/>
           <w:sz w:val="20"/>
         </w:rPr>
-        <w:t>25. Sanderson E, Levin MG, Walker V, Yuan S, Badini I, Dolce J, Mahida KJ, Nho JW, Pingault JB, Damrauer SM, Hemani G, Davies NM. Challenges and future directions for Mendelian randomization. Nat Genet. 2026;58:984-994. doi:10.1038/s41588-026-02546-6.</w:t>
+        <w:t>25. Sanderson E, Windmeijer F. A weak instrument F-test in linear IV models with multiple endogenous variables. J Econom. 2016;190(2):212-221. doi:10.1016/j.jeconom.2015.06.004.</w:t>
       </w:r>
     </w:p>
     <w:p>
       <w:pPr>
-        <w:spacing w:before="200" w:after="80"/>
-        <w:jc w:val="left"/>
-      </w:pPr>
-      <w:r>
-        <w:rPr>
-          <w:rFonts w:ascii="Times New Roman" w:hAnsi="Times New Roman" w:eastAsia="Times New Roman" w:cs="Times New Roman"/>
-          <w:b/>
-          <w:sz w:val="26"/>
-        </w:rPr>
-        <w:t>Figure legends</w:t>
-      </w:r>
-    </w:p>
-    <w:p>
-      <w:pPr>
+        <w:ind w:firstLine="400"/>
         <w:jc w:val="both"/>
       </w:pPr>
       <w:r>
         <w:rPr>
           <w:rFonts w:ascii="Times New Roman" w:hAnsi="Times New Roman" w:eastAsia="Times New Roman" w:cs="Times New Roman"/>
           <w:b w:val="0"/>
-          <w:sz w:val="24"/>
+          <w:sz w:val="20"/>
         </w:rPr>
-        <w:t>Figures are provided as separate electronic files (Fig. 1-4 and Supplementary Fig. S1-S4).</w:t>
+        <w:t>26. Sanderson E, Spiller W, Bowden J. Testing and correcting for weak and pleiotropic instruments in two-sample multivariable Mendelian randomization. Stat Med. 2021;40(25):5434-5452. doi:10.1002/sim.9133.</w:t>
       </w:r>
     </w:p>
     <w:p>
       <w:pPr>
+        <w:ind w:firstLine="400"/>
         <w:jc w:val="both"/>
       </w:pPr>
       <w:r>
         <w:rPr>
           <w:rFonts w:ascii="Times New Roman" w:hAnsi="Times New Roman" w:eastAsia="Times New Roman" w:cs="Times New Roman"/>
-          <w:b/>
-          <w:sz w:val="24"/>
+          <w:b w:val="0"/>
+          <w:sz w:val="20"/>
         </w:rPr>
-        <w:t>Figure 1.</w:t>
-      </w:r>
-      <w:r>
-        <w:rPr>
-          <w:rFonts w:ascii="Times New Roman" w:hAnsi="Times New Roman" w:eastAsia="Times New Roman" w:cs="Times New Roman"/>
-          <w:b w:val="0"/>
-          <w:sz w:val="24"/>
-        </w:rPr>
-        <w:t xml:space="preserve"> Conceptual diagram of two-step (product-method) MR mediation with overlapping instruments. The indirect effect is α̂β̂. Whenever the step-1 and step-2 instrument sets share SNPs (n_s &gt; 0) or the mediator and outcome GWAS share samples (ρ_MY ≠ 0), Cov(α̂, β̂) ≠ 0 and the traditional delta-method variance is biased.</w:t>
+        <w:t>27. Bulik-Sullivan BK, Loh PR, Finucane HK, Ripke S, Yang J, Schizophrenia Working Group of the Psychiatric Genomics Consortium, et al. LD Score regression distinguishes confounding from polygenicity in genome-wide association studies. Nat Genet. 2015;47(3):291-5. doi:10.1038/ng.3211.</w:t>
       </w:r>
     </w:p>
     <w:p>
       <w:pPr>
+        <w:ind w:firstLine="400"/>
         <w:jc w:val="both"/>
       </w:pPr>
       <w:r>
         <w:rPr>
           <w:rFonts w:ascii="Times New Roman" w:hAnsi="Times New Roman" w:eastAsia="Times New Roman" w:cs="Times New Roman"/>
-          <w:b/>
-          <w:sz w:val="24"/>
+          <w:b w:val="0"/>
+          <w:sz w:val="20"/>
         </w:rPr>
-        <w:t>Figure 2.</w:t>
-      </w:r>
-      <w:r>
-        <w:rPr>
-          <w:rFonts w:ascii="Times New Roman" w:hAnsi="Times New Roman" w:eastAsia="Times New Roman" w:cs="Times New Roman"/>
-          <w:b w:val="0"/>
-          <w:sz w:val="24"/>
-        </w:rPr>
-        <w:t xml:space="preserve"> PRISMA 2020 flow diagram of the literature audit. Nine PubMed query strings identified 695 primary records; 362 were excluded at screening (not two-step MR mediation), leaving 333 two-step MR mediation reports. Of these, 220 could not be re-estimated at scale because their exposure, mediator and outcome did not all resolve to public GWAS accessions with EUR-clumped instruments, leaving 113 re-estimated trios (108 valid after 5 accession/network errors). Five (4.6% [95% CI 2.0-10.4%]) showed genuine, non-degenerate instrument overlap (seven, 6.5%, including two degenerate self-mediating designs that are mapping artefacts).</w:t>
+        <w:t>28. Yao M, Wang A, Li X, Liu Z. Mendelian Randomization Methods for Causal Inference: Estimands, Identification and Inference. Stat Med. 2026;45(1-2):e70394. doi:10.1002/sim.70394.</w:t>
       </w:r>
     </w:p>
     <w:p>
       <w:pPr>
+        <w:ind w:firstLine="400"/>
         <w:jc w:val="both"/>
       </w:pPr>
       <w:r>
         <w:rPr>
           <w:rFonts w:ascii="Times New Roman" w:hAnsi="Times New Roman" w:eastAsia="Times New Roman" w:cs="Times New Roman"/>
-          <w:b/>
-          <w:sz w:val="24"/>
+          <w:b w:val="0"/>
+          <w:sz w:val="20"/>
         </w:rPr>
-        <w:t>Supplementary Figure S1.</w:t>
-      </w:r>
-      <w:r>
-        <w:rPr>
-          <w:rFonts w:ascii="Times New Roman" w:hAnsi="Times New Roman" w:eastAsia="Times New Roman" w:cs="Times New Roman"/>
-          <w:b w:val="0"/>
-          <w:sz w:val="24"/>
-        </w:rPr>
-        <w:t xml:space="preserve"> </w:t>
-      </w:r>
-      <w:r>
-        <w:rPr>
-          <w:rFonts w:ascii="Times New Roman" w:hAnsi="Times New Roman" w:eastAsia="Times New Roman" w:cs="Times New Roman"/>
-          <w:b w:val="0"/>
-          <w:i/>
-          <w:sz w:val="24"/>
-        </w:rPr>
-        <w:t>Left:</w:t>
-      </w:r>
-      <w:r>
-        <w:rPr>
-          <w:rFonts w:ascii="Times New Roman" w:hAnsi="Times New Roman" w:eastAsia="Times New Roman" w:cs="Times New Roman"/>
-          <w:b w:val="0"/>
-          <w:sz w:val="24"/>
-        </w:rPr>
-        <w:t xml:space="preserve"> relative error of the traditional delta-method SE as a function of the proportion of shared instruments (π_shared), for instrument strengths F = 10, 15, 30 and ρ_MY = 0. At π_shared = 0.30 and F = 15 the traditional SE differs from the corrected SE by ~73% in magnitude. </w:t>
-      </w:r>
-      <w:r>
-        <w:rPr>
-          <w:rFonts w:ascii="Times New Roman" w:hAnsi="Times New Roman" w:eastAsia="Times New Roman" w:cs="Times New Roman"/>
-          <w:b w:val="0"/>
-          <w:i/>
-          <w:sz w:val="24"/>
-        </w:rPr>
-        <w:t>Right:</w:t>
-      </w:r>
-      <w:r>
-        <w:rPr>
-          <w:rFonts w:ascii="Times New Roman" w:hAnsi="Times New Roman" w:eastAsia="Times New Roman" w:cs="Times New Roman"/>
-          <w:b w:val="0"/>
-          <w:sz w:val="24"/>
-        </w:rPr>
-        <w:t xml:space="preserve"> empirical 95% CI coverage from an independent bootstrap validation (8 cells, 100 batches × 1000 replications). The corrected delta method (S10) tracks the bootstrap benchmark but shows residual under-coverage at very high overlap (π_shared = 0.7), motivating the Monte Carlo fallback.</w:t>
+        <w:t>29. Galimberti M, Levey DF, Deak JD, Adhikari K, Overstreet C, Gupta P, Nitin R, Zhou H, Lake NJ, Harrington KM, Djousse L, Davis LK, Gaziano JM, Stein MB, Gelernter J. A contextual genomic perspective on physical activity and its relationship to health, well-being and illness. Nat Genet. 2025;57(8):1860-1871. doi:10.1038/s41588-025-02260-9.</w:t>
       </w:r>
     </w:p>
     <w:p>
       <w:pPr>
+        <w:ind w:firstLine="400"/>
         <w:jc w:val="both"/>
       </w:pPr>
       <w:r>
         <w:rPr>
           <w:rFonts w:ascii="Times New Roman" w:hAnsi="Times New Roman" w:eastAsia="Times New Roman" w:cs="Times New Roman"/>
-          <w:b/>
-          <w:sz w:val="24"/>
+          <w:b w:val="0"/>
+          <w:sz w:val="20"/>
         </w:rPr>
-        <w:t>Figure 3.</w:t>
-      </w:r>
-      <w:r>
-        <w:rPr>
-          <w:rFonts w:ascii="Times New Roman" w:hAnsi="Times New Roman" w:eastAsia="Times New Roman" w:cs="Times New Roman"/>
-          <w:b w:val="0"/>
-          <w:sz w:val="24"/>
-        </w:rPr>
-        <w:t xml:space="preserve"> Percentage of 333 two-step MR mediation studies at risk of non-zero Cov(α̂, β̂) under three classification assumptions. </w:t>
-      </w:r>
-      <w:r>
-        <w:rPr>
-          <w:rFonts w:ascii="Times New Roman" w:hAnsi="Times New Roman" w:eastAsia="Times New Roman" w:cs="Times New Roman"/>
-          <w:b w:val="0"/>
-          <w:i/>
-          <w:sz w:val="24"/>
-        </w:rPr>
-        <w:t>Conservative</w:t>
-      </w:r>
-      <w:r>
-        <w:rPr>
-          <w:rFonts w:ascii="Times New Roman" w:hAnsi="Times New Roman" w:eastAsia="Times New Roman" w:cs="Times New Roman"/>
-          <w:b w:val="0"/>
-          <w:sz w:val="24"/>
-        </w:rPr>
-        <w:t xml:space="preserve"> counts only merged-IV-pool and MVMR-joint designs (9.3% [95% CI 6.6–12.9%]). </w:t>
-      </w:r>
-      <w:r>
-        <w:rPr>
-          <w:rFonts w:ascii="Times New Roman" w:hAnsi="Times New Roman" w:eastAsia="Times New Roman" w:cs="Times New Roman"/>
-          <w:b w:val="0"/>
-          <w:i/>
-          <w:sz w:val="24"/>
-        </w:rPr>
-        <w:t>Typical</w:t>
-      </w:r>
-      <w:r>
-        <w:rPr>
-          <w:rFonts w:ascii="Times New Roman" w:hAnsi="Times New Roman" w:eastAsia="Times New Roman" w:cs="Times New Roman"/>
-          <w:b w:val="0"/>
-          <w:sz w:val="24"/>
-        </w:rPr>
-        <w:t xml:space="preserve"> additionally counts separate-IV designs that do not report overlap handling, yielding the headline estimate of </w:t>
-      </w:r>
-      <w:r>
-        <w:rPr>
-          <w:rFonts w:ascii="Times New Roman" w:hAnsi="Times New Roman" w:eastAsia="Times New Roman" w:cs="Times New Roman"/>
-          <w:b/>
-          <w:sz w:val="24"/>
-        </w:rPr>
-        <w:t>39.3% (95% CI 34.2–44.7%)</w:t>
-      </w:r>
-      <w:r>
-        <w:rPr>
-          <w:rFonts w:ascii="Times New Roman" w:hAnsi="Times New Roman" w:eastAsia="Times New Roman" w:cs="Times New Roman"/>
-          <w:b w:val="0"/>
-          <w:sz w:val="24"/>
-        </w:rPr>
-        <w:t xml:space="preserve">. </w:t>
-      </w:r>
-      <w:r>
-        <w:rPr>
-          <w:rFonts w:ascii="Times New Roman" w:hAnsi="Times New Roman" w:eastAsia="Times New Roman" w:cs="Times New Roman"/>
-          <w:b w:val="0"/>
-          <w:i/>
-          <w:sz w:val="24"/>
-        </w:rPr>
-        <w:t>Structural</w:t>
-      </w:r>
-      <w:r>
-        <w:rPr>
-          <w:rFonts w:ascii="Times New Roman" w:hAnsi="Times New Roman" w:eastAsia="Times New Roman" w:cs="Times New Roman"/>
-          <w:b w:val="0"/>
-          <w:sz w:val="24"/>
-        </w:rPr>
-        <w:t xml:space="preserve"> counts all separate-IV designs as capable of overlap (41.1% [95% CI 36.0–46.5%]).</w:t>
+        <w:t>30. Gnatiuc Friedrichs L, Kuri-Morales P, Trichia E, Staplin N, Torres J, Alegre-Díaz J, Baca P, Garcilazo-Ávila A, González-Carballo C, Ramirez-Reyes R, Rivas F, Aguilar-Ramirez D, Bragg F, Clarke R, Herrington WG, Hill M, Liu T, Vergara-Lope A, Wade R, Collins R, Peto R, Berumen J, Tapia-Conyer R, Emberson JR. A Mendelian randomization study of the effect of body mass index on 52 causes of death among 125 000 Mexican adults with admixed ancestry. Int J Epidemiol. 2025;54(4). doi:10.1093/ije/dyaf110.</w:t>
       </w:r>
     </w:p>
     <w:p>
       <w:pPr>
+        <w:ind w:firstLine="400"/>
         <w:jc w:val="both"/>
       </w:pPr>
       <w:r>
         <w:rPr>
           <w:rFonts w:ascii="Times New Roman" w:hAnsi="Times New Roman" w:eastAsia="Times New Roman" w:cs="Times New Roman"/>
-          <w:b/>
-          <w:sz w:val="24"/>
+          <w:b w:val="0"/>
+          <w:sz w:val="20"/>
         </w:rPr>
-        <w:t>Figure 4.</w:t>
-      </w:r>
-      <w:r>
-        <w:rPr>
-          <w:rFonts w:ascii="Times New Roman" w:hAnsi="Times New Roman" w:eastAsia="Times New Roman" w:cs="Times New Roman"/>
-          <w:b w:val="0"/>
-          <w:sz w:val="24"/>
-        </w:rPr>
-        <w:t xml:space="preserve"> Indirect effect (α̂β̂) and 95% confidence intervals for the BMI → waist → CHD pathway. Red segments show the naive (traditional delta) CI; blue segments show the corrected CI. </w:t>
-      </w:r>
-      <w:r>
-        <w:rPr>
-          <w:rFonts w:ascii="Times New Roman" w:hAnsi="Times New Roman" w:eastAsia="Times New Roman" w:cs="Times New Roman"/>
-          <w:b w:val="0"/>
-          <w:i/>
-          <w:sz w:val="24"/>
-        </w:rPr>
-        <w:t>Top:</w:t>
-      </w:r>
-      <w:r>
-        <w:rPr>
-          <w:rFonts w:ascii="Times New Roman" w:hAnsi="Times New Roman" w:eastAsia="Times New Roman" w:cs="Times New Roman"/>
-          <w:b w:val="0"/>
-          <w:sz w:val="24"/>
-        </w:rPr>
-        <w:t xml:space="preserve"> shared-IV design (n_s = 78), where the corrected SE is 15.5% smaller. </w:t>
-      </w:r>
-      <w:r>
-        <w:rPr>
-          <w:rFonts w:ascii="Times New Roman" w:hAnsi="Times New Roman" w:eastAsia="Times New Roman" w:cs="Times New Roman"/>
-          <w:b w:val="0"/>
-          <w:i/>
-          <w:sz w:val="24"/>
-        </w:rPr>
-        <w:t>Bottom:</w:t>
-      </w:r>
-      <w:r>
-        <w:rPr>
-          <w:rFonts w:ascii="Times New Roman" w:hAnsi="Times New Roman" w:eastAsia="Times New Roman" w:cs="Times New Roman"/>
-          <w:b w:val="0"/>
-          <w:sz w:val="24"/>
-        </w:rPr>
-        <w:t xml:space="preserve"> natural overlap (n_s = 13), where the corrected SE is 2.8% smaller.</w:t>
+        <w:t>31. Chen J, Zhao J, Fu S. Addressing sample overlap and meta-analysis imbalances in Mendelian randomization: a critical appraisal of protein targets for myocardial infarction. Eur Heart J. 2025;46(29):2928-2929. doi:10.1093/eurheartj/ehaf186.</w:t>
       </w:r>
     </w:p>
     <w:p>
       <w:pPr>
+        <w:ind w:firstLine="400"/>
         <w:jc w:val="both"/>
       </w:pPr>
       <w:r>
         <w:rPr>
           <w:rFonts w:ascii="Times New Roman" w:hAnsi="Times New Roman" w:eastAsia="Times New Roman" w:cs="Times New Roman"/>
-          <w:b/>
-          <w:sz w:val="24"/>
+          <w:b w:val="0"/>
+          <w:sz w:val="20"/>
         </w:rPr>
-        <w:t>Supplementary Figure S2.</w:t>
-      </w:r>
-      <w:r>
-        <w:rPr>
-          <w:rFonts w:ascii="Times New Roman" w:hAnsi="Times New Roman" w:eastAsia="Times New Roman" w:cs="Times New Roman"/>
-          <w:b w:val="0"/>
-          <w:sz w:val="24"/>
-        </w:rPr>
-        <w:t xml:space="preserve"> Targeted validation sweep at non-degenerate shared-instrument proportions (ρ_MY = 0.5, n_reps = 30,000). </w:t>
-      </w:r>
-      <w:r>
-        <w:rPr>
-          <w:rFonts w:ascii="Times New Roman" w:hAnsi="Times New Roman" w:eastAsia="Times New Roman" w:cs="Times New Roman"/>
-          <w:b w:val="0"/>
-          <w:i/>
-          <w:sz w:val="24"/>
-        </w:rPr>
-        <w:t>Left:</w:t>
-      </w:r>
-      <w:r>
-        <w:rPr>
-          <w:rFonts w:ascii="Times New Roman" w:hAnsi="Times New Roman" w:eastAsia="Times New Roman" w:cs="Times New Roman"/>
-          <w:b w:val="0"/>
-          <w:sz w:val="24"/>
-        </w:rPr>
-        <w:t xml:space="preserve"> empirical Cov(α̂, β̂) (points) versus the closed-form analytical prediction (lines) across π_shared, for F = 10 and F = 30; the two coincide. </w:t>
-      </w:r>
-      <w:r>
-        <w:rPr>
-          <w:rFonts w:ascii="Times New Roman" w:hAnsi="Times New Roman" w:eastAsia="Times New Roman" w:cs="Times New Roman"/>
-          <w:b w:val="0"/>
-          <w:i/>
-          <w:sz w:val="24"/>
-        </w:rPr>
-        <w:t>Right:</w:t>
-      </w:r>
-      <w:r>
-        <w:rPr>
-          <w:rFonts w:ascii="Times New Roman" w:hAnsi="Times New Roman" w:eastAsia="Times New Roman" w:cs="Times New Roman"/>
-          <w:b w:val="0"/>
-          <w:sz w:val="24"/>
-        </w:rPr>
-        <w:t xml:space="preserve"> relative error of the analytical covariance versus the conservative reliability bound B(F, ρ_MY, π_shared) for all 12 cells; all points fall below the bound, with the worst cell at 14.1%.</w:t>
+        <w:t>32. Forde A, Hemani G, Ferguson J. Simulated sample splitting approach to address biases due to instrument selection and participant overlap in two-sample Mendelian Randomization studies. PLoS Genet. 2026;22(5):e1011949. doi:10.1371/journal.pgen.1011949.</w:t>
       </w:r>
     </w:p>
     <w:p>
       <w:pPr>
+        <w:ind w:firstLine="400"/>
         <w:jc w:val="both"/>
       </w:pPr>
       <w:r>
         <w:rPr>
           <w:rFonts w:ascii="Times New Roman" w:hAnsi="Times New Roman" w:eastAsia="Times New Roman" w:cs="Times New Roman"/>
-          <w:b/>
-          <w:sz w:val="24"/>
+          <w:b w:val="0"/>
+          <w:sz w:val="20"/>
         </w:rPr>
-        <w:t>Supplementary Figure S3.</w:t>
-      </w:r>
-      <w:r>
-        <w:rPr>
-          <w:rFonts w:ascii="Times New Roman" w:hAnsi="Times New Roman" w:eastAsia="Times New Roman" w:cs="Times New Roman"/>
-          <w:b w:val="0"/>
-          <w:sz w:val="24"/>
-        </w:rPr>
-        <w:t xml:space="preserve"> Flip probability as a function of the true indirect-effect non-centrality λ = δ/σ_naive, by shared-instrument proportion π_shared, under the corrected variance. </w:t>
-      </w:r>
-      <w:r>
-        <w:rPr>
-          <w:rFonts w:ascii="Times New Roman" w:hAnsi="Times New Roman" w:eastAsia="Times New Roman" w:cs="Times New Roman"/>
-          <w:b w:val="0"/>
-          <w:i/>
-          <w:sz w:val="24"/>
-        </w:rPr>
-        <w:t>Panel A</w:t>
-      </w:r>
-      <w:r>
-        <w:rPr>
-          <w:rFonts w:ascii="Times New Roman" w:hAnsi="Times New Roman" w:eastAsia="Times New Roman" w:cs="Times New Roman"/>
-          <w:b w:val="0"/>
-          <w:sz w:val="24"/>
-        </w:rPr>
-        <w:t xml:space="preserve"> (concordant mediation, ρ_MY = 0, F = 10): the correction narrows the CI, so flips are gains of significance; the displayed F = 10 panel peaks at 5.1%, while the worst cell across the full concordant 100-design grid is 5.7% (F = 30, π_shared = 1.0, λ ≈ 2.0). </w:t>
-      </w:r>
-      <w:r>
-        <w:rPr>
-          <w:rFonts w:ascii="Times New Roman" w:hAnsi="Times New Roman" w:eastAsia="Times New Roman" w:cs="Times New Roman"/>
-          <w:b w:val="0"/>
-          <w:i/>
-          <w:sz w:val="24"/>
-        </w:rPr>
-        <w:t>Panel B</w:t>
-      </w:r>
-      <w:r>
-        <w:rPr>
-          <w:rFonts w:ascii="Times New Roman" w:hAnsi="Times New Roman" w:eastAsia="Times New Roman" w:cs="Times New Roman"/>
-          <w:b w:val="0"/>
-          <w:sz w:val="24"/>
-        </w:rPr>
-        <w:t xml:space="preserve"> (discordant mediation / full sample overlap, ρ_MY = 1, F = 10): the correction widens the CI, so flips are losses of significance; the displayed panel and the grid-wide discordant maximum coincide at 10.4% (π_shared = 1.0, λ ≈ 2.25). The dashed vertical line marks the naive 1.96 threshold; both panels confine the flip band to λ ≈ 1.7–2.4.</w:t>
+        <w:t>33. Luo Y, Tilling K, Gkatzionis A. Assessing and Adjusting for Selection Bias in Mendelian Randomization: the Effects of Body Mass Index, Education, and C-reactive Protein on Depression in UK Biobank. Am J Epidemiol. 2026. doi:10.1093/aje/kwag211.</w:t>
       </w:r>
     </w:p>
     <w:p>
       <w:pPr>
+        <w:ind w:firstLine="400"/>
         <w:jc w:val="both"/>
       </w:pPr>
       <w:r>
         <w:rPr>
           <w:rFonts w:ascii="Times New Roman" w:hAnsi="Times New Roman" w:eastAsia="Times New Roman" w:cs="Times New Roman"/>
-          <w:b/>
-          <w:sz w:val="24"/>
+          <w:b w:val="0"/>
+          <w:sz w:val="20"/>
         </w:rPr>
-        <w:t>Supplementary Figure S4.</w:t>
-      </w:r>
-      <w:r>
-        <w:rPr>
-          <w:rFonts w:ascii="Times New Roman" w:hAnsi="Times New Roman" w:eastAsia="Times New Roman" w:cs="Times New Roman"/>
-          <w:b w:val="0"/>
-          <w:sz w:val="24"/>
-        </w:rPr>
-        <w:t xml:space="preserve"> Relative change in the indirect-effect SE after the the closed-form correction for the four adequately powered non-degenerate overlapping trios from the batch re-estimation (Table 2: S014, S137, S217, S273). The remaining overlapping trios are omitted — S267 and S255 because their small effects give wide CIs (underpowered), and the two degenerate self-mediating trios (S320, S293) by design. All shown values are negative (the CI narrows). Bars are TwoSampleMR-calibrated (cross-validated against the deposited the BMI → waist → CHD ground truth); the negative direction and the zero-flip conclusion are therefore fully validated, not screening-level.</w:t>
+        <w:t>34. Skrivankova VW, Richmond RC, Woolf BAR, Yarmolinsky J, Davies NM, Swanson SA, et al. Strengthening the Reporting of Observational Studies in Epidemiology Using Mendelian Randomization: The STROBE-MR Statement. JAMA. 2021;326(16):1614-1621. doi:10.1001/jama.2021.18236.</w:t>
       </w:r>
     </w:p>
     <w:p>
       <w:pPr>
-        <w:spacing w:before="200" w:after="80"/>
-        <w:jc w:val="left"/>
-      </w:pPr>
-      <w:r>
-        <w:rPr>
-          <w:rFonts w:ascii="Times New Roman" w:hAnsi="Times New Roman" w:eastAsia="Times New Roman" w:cs="Times New Roman"/>
-          <w:b/>
-          <w:sz w:val="26"/>
-        </w:rPr>
-        <w:t>Supplementary materials</w:t>
-      </w:r>
-    </w:p>
-    <w:p>
-      <w:pPr>
-        <w:pStyle w:val="ListBullet"/>
+        <w:ind w:firstLine="400"/>
         <w:jc w:val="both"/>
       </w:pPr>
       <w:r>
         <w:rPr>
           <w:rFonts w:ascii="Times New Roman" w:hAnsi="Times New Roman" w:eastAsia="Times New Roman" w:cs="Times New Roman"/>
-          <w:b/>
-          <w:sz w:val="24"/>
+          <w:b w:val="0"/>
+          <w:sz w:val="20"/>
         </w:rPr>
-        <w:t>Supplementary Methods S1–S6:</w:t>
-      </w:r>
-      <w:r>
-        <w:rPr>
-          <w:rFonts w:ascii="Times New Roman" w:hAnsi="Times New Roman" w:eastAsia="Times New Roman" w:cs="Times New Roman"/>
-          <w:b w:val="0"/>
-          <w:sz w:val="24"/>
-        </w:rPr>
-        <w:t xml:space="preserve"> full derivation, two-channel decomposition, boundary proofs, κ thresholds, complete Var(α̂)/Var(β̂) derivations, and Monte Carlo fallback (D61_Supplementary_S1-S6_derivation.md).</w:t>
+        <w:t>35. Williams SM, Tang H, Cooper GM, O'Donnell-Luria A, Girirajan S, Dudley AM, Goriely A, Kutalik Z, Zhu X, Sirugo G, Epstein MP. Expectations for papers performing Mendelian randomization analyses. PLoS Genet. 2025;21(7):e1011767. doi:10.1371/journal.pgen.1011767.</w:t>
       </w:r>
     </w:p>
     <w:p>
       <w:pPr>
-        <w:pStyle w:val="ListBullet"/>
+        <w:ind w:firstLine="400"/>
         <w:jc w:val="both"/>
       </w:pPr>
       <w:r>
         <w:rPr>
           <w:rFonts w:ascii="Times New Roman" w:hAnsi="Times New Roman" w:eastAsia="Times New Roman" w:cs="Times New Roman"/>
-          <w:b/>
-          <w:sz w:val="24"/>
+          <w:b w:val="0"/>
+          <w:sz w:val="20"/>
         </w:rPr>
-        <w:t>Supplementary Figures S1, S2, S3 and S4:</w:t>
-      </w:r>
-      <w:r>
-        <w:rPr>
-          <w:rFonts w:ascii="Times New Roman" w:hAnsi="Times New Roman" w:eastAsia="Times New Roman" w:cs="Times New Roman"/>
-          <w:b w:val="0"/>
-          <w:sz w:val="24"/>
-        </w:rPr>
-        <w:t xml:space="preserve"> the simulation-coverage plot, the targeted validation sweep, the flip-probability scan, and the SE-change forest, respectively; their legends appear in the Figure legends section under their supplementary labels.</w:t>
+        <w:t>36. Sanderson E, Levin MG, Walker V, Yuan S, Badini I, Dolce J, Mahida KJ, Nho JW, Pingault JB, Damrauer SM, Hemani G, Davies NM. Challenges and future directions for Mendelian randomization. Nat Genet. 2026;58:984-994. doi:10.1038/s41588-026-02546-6.</w:t>
       </w:r>
     </w:p>
-    <w:p>
-      <w:pPr>
-        <w:pStyle w:val="ListBullet"/>
-        <w:jc w:val="both"/>
-      </w:pPr>
-      <w:r>
-        <w:rPr>
-          <w:rFonts w:ascii="Times New Roman" w:hAnsi="Times New Roman" w:eastAsia="Times New Roman" w:cs="Times New Roman"/>
-          <w:b/>
-          <w:sz w:val="24"/>
-        </w:rPr>
-        <w:t>Supplementary Methods S7:</w:t>
-      </w:r>
-      <w:r>
-        <w:rPr>
-          <w:rFonts w:ascii="Times New Roman" w:hAnsi="Times New Roman" w:eastAsia="Times New Roman" w:cs="Times New Roman"/>
-          <w:b w:val="0"/>
-          <w:sz w:val="24"/>
-        </w:rPr>
-        <w:t xml:space="preserve"> inter-coder reliability assessment — blind re-coding design, sampling scheme, Cohen's κ results, and coding-completeness findings (D61_Supplementary_S7_kappa.md).</w:t>
-      </w:r>
-    </w:p>
-    <w:p>
-      <w:pPr>
-        <w:pStyle w:val="ListBullet"/>
-        <w:jc w:val="both"/>
-      </w:pPr>
-      <w:r>
-        <w:rPr>
-          <w:rFonts w:ascii="Times New Roman" w:hAnsi="Times New Roman" w:eastAsia="Times New Roman" w:cs="Times New Roman"/>
-          <w:b/>
-          <w:sz w:val="24"/>
-        </w:rPr>
-        <w:t>Supplementary Methods S8:</w:t>
-      </w:r>
-      <w:r>
-        <w:rPr>
-          <w:rFonts w:ascii="Times New Roman" w:hAnsi="Times New Roman" w:eastAsia="Times New Roman" w:cs="Times New Roman"/>
-          <w:b w:val="0"/>
-          <w:sz w:val="24"/>
-        </w:rPr>
-        <w:t xml:space="preserve"> MVMR generalization of Cov(α̂, β̂) (derivation outline, structural sign result extending Proposition S2.5) and the audited S110 merged-pool worked example (D61_Supplementary_S8_mvmr.md).</w:t>
-      </w:r>
-    </w:p>
-    <w:p>
-      <w:pPr>
-        <w:pStyle w:val="ListBullet"/>
-        <w:jc w:val="both"/>
-      </w:pPr>
-      <w:r>
-        <w:rPr>
-          <w:rFonts w:ascii="Times New Roman" w:hAnsi="Times New Roman" w:eastAsia="Times New Roman" w:cs="Times New Roman"/>
-          <w:b/>
-          <w:sz w:val="24"/>
-        </w:rPr>
-        <w:t>Supplementary Codebook S1:</w:t>
-      </w:r>
-      <w:r>
-        <w:rPr>
-          <w:rFonts w:ascii="Times New Roman" w:hAnsi="Times New Roman" w:eastAsia="Times New Roman" w:cs="Times New Roman"/>
-          <w:b w:val="0"/>
-          <w:sz w:val="24"/>
-        </w:rPr>
-        <w:t xml:space="preserve"> literature coding rules (D61_Supplementary_codebook_S1.md).</w:t>
-      </w:r>
-    </w:p>
-    <w:p>
-      <w:pPr>
-        <w:pStyle w:val="ListBullet"/>
-        <w:jc w:val="both"/>
-      </w:pPr>
-      <w:r>
-        <w:rPr>
-          <w:rFonts w:ascii="Times New Roman" w:hAnsi="Times New Roman" w:eastAsia="Times New Roman" w:cs="Times New Roman"/>
-          <w:b/>
-          <w:sz w:val="24"/>
-        </w:rPr>
-        <w:t>Supplementary Checklist S1:</w:t>
-      </w:r>
-      <w:r>
-        <w:rPr>
-          <w:rFonts w:ascii="Times New Roman" w:hAnsi="Times New Roman" w:eastAsia="Times New Roman" w:cs="Times New Roman"/>
-          <w:b w:val="0"/>
-          <w:sz w:val="24"/>
-        </w:rPr>
-        <w:t xml:space="preserve"> completed STROBE-MR reporting checklist for this study (D61_Supplementary_STROBE_MR.md).</w:t>
-      </w:r>
-    </w:p>
-    <w:p>
-      <w:pPr>
-        <w:pStyle w:val="ListBullet"/>
-        <w:jc w:val="both"/>
-      </w:pPr>
-      <w:r>
-        <w:rPr>
-          <w:rFonts w:ascii="Times New Roman" w:hAnsi="Times New Roman" w:eastAsia="Times New Roman" w:cs="Times New Roman"/>
-          <w:b/>
-          <w:sz w:val="24"/>
-        </w:rPr>
-        <w:t>Supplementary Table S1:</w:t>
-      </w:r>
-      <w:r>
-        <w:rPr>
-          <w:rFonts w:ascii="Times New Roman" w:hAnsi="Times New Roman" w:eastAsia="Times New Roman" w:cs="Times New Roman"/>
-          <w:b w:val="0"/>
-          <w:sz w:val="24"/>
-        </w:rPr>
-        <w:t xml:space="preserve"> targeted validation sweep at non-degenerate shared-instrument proportions (ρ_MY = 0.5, 12 cells): empirical versus analytical Cov(α̂, β̂) and reliability-bound relative error — defined below. The full 180-cell simulation grid (coverage/MSE by estimator) is tabulated in Supplementary Methods S6.</w:t>
-      </w:r>
-    </w:p>
-    <w:p>
-      <w:pPr>
-        <w:pStyle w:val="ListBullet"/>
-        <w:jc w:val="both"/>
-      </w:pPr>
-      <w:r>
-        <w:rPr>
-          <w:rFonts w:ascii="Times New Roman" w:hAnsi="Times New Roman" w:eastAsia="Times New Roman" w:cs="Times New Roman"/>
-          <w:b/>
-          <w:sz w:val="24"/>
-        </w:rPr>
-        <w:t>Supplementary Table S2:</w:t>
-      </w:r>
-      <w:r>
-        <w:rPr>
-          <w:rFonts w:ascii="Times New Roman" w:hAnsi="Times New Roman" w:eastAsia="Times New Roman" w:cs="Times New Roman"/>
-          <w:b w:val="0"/>
-          <w:sz w:val="24"/>
-        </w:rPr>
-        <w:t xml:space="preserve"> completed PRISMA 2020 checklist for the literature audit, with search strings (D61_Supplementary_S9_prisma_checklist.md).</w:t>
-      </w:r>
-    </w:p>
-    <w:p>
-      <w:pPr>
-        <w:pStyle w:val="ListBullet"/>
-        <w:jc w:val="both"/>
-      </w:pPr>
-      <w:r>
-        <w:rPr>
-          <w:rFonts w:ascii="Times New Roman" w:hAnsi="Times New Roman" w:eastAsia="Times New Roman" w:cs="Times New Roman"/>
-          <w:b/>
-          <w:sz w:val="24"/>
-        </w:rPr>
-        <w:t>Supplementary Table S3:</w:t>
-      </w:r>
-      <w:r>
-        <w:rPr>
-          <w:rFonts w:ascii="Times New Roman" w:hAnsi="Times New Roman" w:eastAsia="Times New Roman" w:cs="Times New Roman"/>
-          <w:b w:val="0"/>
-          <w:sz w:val="24"/>
-        </w:rPr>
-        <w:t xml:space="preserve"> batch re-estimation of published two-step MR mediation studies, with the π_shared screen of all candidates and the validated re-estimation tables (D61_Supplementary_S3_batch.md).</w:t>
-      </w:r>
-    </w:p>
-    <w:p>
-      <w:pPr>
-        <w:ind w:firstLine="480"/>
-        <w:jc w:val="both"/>
-      </w:pPr>
-      <w:r>
-        <w:rPr>
-          <w:rFonts w:ascii="Times New Roman" w:hAnsi="Times New Roman" w:eastAsia="Times New Roman" w:cs="Times New Roman"/>
-          <w:b/>
-          <w:sz w:val="24"/>
-        </w:rPr>
-        <w:t>Supplementary Table S1.</w:t>
-      </w:r>
-      <w:r>
-        <w:rPr>
-          <w:rFonts w:ascii="Times New Roman" w:hAnsi="Times New Roman" w:eastAsia="Times New Roman" w:cs="Times New Roman"/>
-          <w:b w:val="0"/>
-          <w:sz w:val="24"/>
-        </w:rPr>
-        <w:t xml:space="preserve"> Targeted sweep at ρ_MY = 0.5, n_reps = 30,000. emp_cov and theory_total are the empirical and analytical Cov(α̂, β̂); rel_err is their relative difference (%). All 12 cells satisfy the conservative reliability bound B.</w:t>
-      </w:r>
-    </w:p>
-    <w:tbl>
-      <w:tblPr>
-        <w:tblW w:type="auto" w:w="0"/>
-        <w:jc w:val="center"/>
-        <w:tblLook w:firstColumn="1" w:firstRow="1" w:lastColumn="0" w:lastRow="0" w:noHBand="0" w:noVBand="1" w:val="04A0"/>
-        <w:tblBorders>
-          <w:top w:val="single" w:sz="12" w:space="0" w:color="auto"/>
-          <w:left w:val="none" w:sz="0" w:space="0" w:color="auto"/>
-          <w:bottom w:val="single" w:sz="12" w:space="0" w:color="auto"/>
-          <w:right w:val="none" w:sz="0" w:space="0" w:color="auto"/>
-          <w:insideH w:val="none" w:sz="0" w:space="0" w:color="auto"/>
-          <w:insideV w:val="none" w:sz="0" w:space="0" w:color="auto"/>
-        </w:tblBorders>
-      </w:tblPr>
-      <w:tblGrid>
-        <w:gridCol w:w="1728"/>
-        <w:gridCol w:w="1728"/>
-        <w:gridCol w:w="1728"/>
-        <w:gridCol w:w="1728"/>
-        <w:gridCol w:w="1728"/>
-      </w:tblGrid>
-      <w:tr>
-        <w:tc>
-          <w:tcPr>
-            <w:tcW w:type="dxa" w:w="1728"/>
-            <w:tcBorders>
-              <w:bottom w:val="single" w:sz="6" w:space="0" w:color="auto"/>
-            </w:tcBorders>
-          </w:tcPr>
-          <w:p>
-            <w:r>
-              <w:rPr>
-                <w:rFonts w:ascii="Times New Roman" w:hAnsi="Times New Roman" w:eastAsia="Times New Roman" w:cs="Times New Roman"/>
-              </w:rPr>
-            </w:r>
-            <w:r>
-              <w:rPr>
-                <w:rFonts w:ascii="Times New Roman" w:hAnsi="Times New Roman" w:eastAsia="Times New Roman" w:cs="Times New Roman"/>
-                <w:b/>
-                <w:sz w:val="19"/>
-              </w:rPr>
-              <w:t>F</w:t>
-            </w:r>
-          </w:p>
-        </w:tc>
-        <w:tc>
-          <w:tcPr>
-            <w:tcW w:type="dxa" w:w="1728"/>
-            <w:tcBorders>
-              <w:bottom w:val="single" w:sz="6" w:space="0" w:color="auto"/>
-            </w:tcBorders>
-          </w:tcPr>
-          <w:p>
-            <w:r>
-              <w:rPr>
-                <w:rFonts w:ascii="Times New Roman" w:hAnsi="Times New Roman" w:eastAsia="Times New Roman" w:cs="Times New Roman"/>
-              </w:rPr>
-            </w:r>
-            <w:r>
-              <w:rPr>
-                <w:rFonts w:ascii="Times New Roman" w:hAnsi="Times New Roman" w:eastAsia="Times New Roman" w:cs="Times New Roman"/>
-                <w:b/>
-                <w:sz w:val="19"/>
-              </w:rPr>
-              <w:t>π_shared</w:t>
-            </w:r>
-          </w:p>
-        </w:tc>
-        <w:tc>
-          <w:tcPr>
-            <w:tcW w:type="dxa" w:w="1728"/>
-            <w:tcBorders>
-              <w:bottom w:val="single" w:sz="6" w:space="0" w:color="auto"/>
-            </w:tcBorders>
-          </w:tcPr>
-          <w:p>
-            <w:r>
-              <w:rPr>
-                <w:rFonts w:ascii="Times New Roman" w:hAnsi="Times New Roman" w:eastAsia="Times New Roman" w:cs="Times New Roman"/>
-              </w:rPr>
-            </w:r>
-            <w:r>
-              <w:rPr>
-                <w:rFonts w:ascii="Times New Roman" w:hAnsi="Times New Roman" w:eastAsia="Times New Roman" w:cs="Times New Roman"/>
-                <w:b/>
-                <w:sz w:val="19"/>
-              </w:rPr>
-              <w:t>emp_cov</w:t>
-            </w:r>
-          </w:p>
-        </w:tc>
-        <w:tc>
-          <w:tcPr>
-            <w:tcW w:type="dxa" w:w="1728"/>
-            <w:tcBorders>
-              <w:bottom w:val="single" w:sz="6" w:space="0" w:color="auto"/>
-            </w:tcBorders>
-          </w:tcPr>
-          <w:p>
-            <w:r>
-              <w:rPr>
-                <w:rFonts w:ascii="Times New Roman" w:hAnsi="Times New Roman" w:eastAsia="Times New Roman" w:cs="Times New Roman"/>
-              </w:rPr>
-            </w:r>
-            <w:r>
-              <w:rPr>
-                <w:rFonts w:ascii="Times New Roman" w:hAnsi="Times New Roman" w:eastAsia="Times New Roman" w:cs="Times New Roman"/>
-                <w:b/>
-                <w:sz w:val="19"/>
-              </w:rPr>
-              <w:t>theory_total</w:t>
-            </w:r>
-          </w:p>
-        </w:tc>
-        <w:tc>
-          <w:tcPr>
-            <w:tcW w:type="dxa" w:w="1728"/>
-            <w:tcBorders>
-              <w:bottom w:val="single" w:sz="6" w:space="0" w:color="auto"/>
-            </w:tcBorders>
-          </w:tcPr>
-          <w:p>
-            <w:r>
-              <w:rPr>
-                <w:rFonts w:ascii="Times New Roman" w:hAnsi="Times New Roman" w:eastAsia="Times New Roman" w:cs="Times New Roman"/>
-              </w:rPr>
-            </w:r>
-            <w:r>
-              <w:rPr>
-                <w:rFonts w:ascii="Times New Roman" w:hAnsi="Times New Roman" w:eastAsia="Times New Roman" w:cs="Times New Roman"/>
-                <w:b/>
-                <w:sz w:val="19"/>
-              </w:rPr>
-              <w:t>rel_err (%)</w:t>
-            </w:r>
-          </w:p>
-        </w:tc>
-      </w:tr>
-      <w:tr>
-        <w:tc>
-          <w:tcPr>
-            <w:tcW w:type="dxa" w:w="1728"/>
-          </w:tcPr>
-          <w:p>
-            <w:r>
-              <w:rPr>
-                <w:rFonts w:ascii="Times New Roman" w:hAnsi="Times New Roman" w:eastAsia="Times New Roman" w:cs="Times New Roman"/>
-              </w:rPr>
-            </w:r>
-            <w:r>
-              <w:rPr>
-                <w:rFonts w:ascii="Times New Roman" w:hAnsi="Times New Roman" w:eastAsia="Times New Roman" w:cs="Times New Roman"/>
-                <w:sz w:val="19"/>
-              </w:rPr>
-              <w:t>30</w:t>
-            </w:r>
-          </w:p>
-        </w:tc>
-        <w:tc>
-          <w:tcPr>
-            <w:tcW w:type="dxa" w:w="1728"/>
-          </w:tcPr>
-          <w:p>
-            <w:r>
-              <w:rPr>
-                <w:rFonts w:ascii="Times New Roman" w:hAnsi="Times New Roman" w:eastAsia="Times New Roman" w:cs="Times New Roman"/>
-              </w:rPr>
-            </w:r>
-            <w:r>
-              <w:rPr>
-                <w:rFonts w:ascii="Times New Roman" w:hAnsi="Times New Roman" w:eastAsia="Times New Roman" w:cs="Times New Roman"/>
-                <w:sz w:val="19"/>
-              </w:rPr>
-              <w:t>0.1</w:t>
-            </w:r>
-          </w:p>
-        </w:tc>
-        <w:tc>
-          <w:tcPr>
-            <w:tcW w:type="dxa" w:w="1728"/>
-          </w:tcPr>
-          <w:p>
-            <w:r>
-              <w:rPr>
-                <w:rFonts w:ascii="Times New Roman" w:hAnsi="Times New Roman" w:eastAsia="Times New Roman" w:cs="Times New Roman"/>
-              </w:rPr>
-            </w:r>
-            <w:r>
-              <w:rPr>
-                <w:rFonts w:ascii="Times New Roman" w:hAnsi="Times New Roman" w:eastAsia="Times New Roman" w:cs="Times New Roman"/>
-                <w:sz w:val="19"/>
-              </w:rPr>
-              <w:t>−0.0003731</w:t>
-            </w:r>
-          </w:p>
-        </w:tc>
-        <w:tc>
-          <w:tcPr>
-            <w:tcW w:type="dxa" w:w="1728"/>
-          </w:tcPr>
-          <w:p>
-            <w:r>
-              <w:rPr>
-                <w:rFonts w:ascii="Times New Roman" w:hAnsi="Times New Roman" w:eastAsia="Times New Roman" w:cs="Times New Roman"/>
-              </w:rPr>
-            </w:r>
-            <w:r>
-              <w:rPr>
-                <w:rFonts w:ascii="Times New Roman" w:hAnsi="Times New Roman" w:eastAsia="Times New Roman" w:cs="Times New Roman"/>
-                <w:sz w:val="19"/>
-              </w:rPr>
-              <w:t>−0.0003357</w:t>
-            </w:r>
-          </w:p>
-        </w:tc>
-        <w:tc>
-          <w:tcPr>
-            <w:tcW w:type="dxa" w:w="1728"/>
-          </w:tcPr>
-          <w:p>
-            <w:r>
-              <w:rPr>
-                <w:rFonts w:ascii="Times New Roman" w:hAnsi="Times New Roman" w:eastAsia="Times New Roman" w:cs="Times New Roman"/>
-              </w:rPr>
-            </w:r>
-            <w:r>
-              <w:rPr>
-                <w:rFonts w:ascii="Times New Roman" w:hAnsi="Times New Roman" w:eastAsia="Times New Roman" w:cs="Times New Roman"/>
-                <w:sz w:val="19"/>
-              </w:rPr>
-              <w:t>10.02</w:t>
-            </w:r>
-          </w:p>
-        </w:tc>
-      </w:tr>
-      <w:tr>
-        <w:tc>
-          <w:tcPr>
-            <w:tcW w:type="dxa" w:w="1728"/>
-          </w:tcPr>
-          <w:p>
-            <w:r>
-              <w:rPr>
-                <w:rFonts w:ascii="Times New Roman" w:hAnsi="Times New Roman" w:eastAsia="Times New Roman" w:cs="Times New Roman"/>
-              </w:rPr>
-            </w:r>
-            <w:r>
-              <w:rPr>
-                <w:rFonts w:ascii="Times New Roman" w:hAnsi="Times New Roman" w:eastAsia="Times New Roman" w:cs="Times New Roman"/>
-                <w:sz w:val="19"/>
-              </w:rPr>
-              <w:t>30</w:t>
-            </w:r>
-          </w:p>
-        </w:tc>
-        <w:tc>
-          <w:tcPr>
-            <w:tcW w:type="dxa" w:w="1728"/>
-          </w:tcPr>
-          <w:p>
-            <w:r>
-              <w:rPr>
-                <w:rFonts w:ascii="Times New Roman" w:hAnsi="Times New Roman" w:eastAsia="Times New Roman" w:cs="Times New Roman"/>
-              </w:rPr>
-            </w:r>
-            <w:r>
-              <w:rPr>
-                <w:rFonts w:ascii="Times New Roman" w:hAnsi="Times New Roman" w:eastAsia="Times New Roman" w:cs="Times New Roman"/>
-                <w:sz w:val="19"/>
-              </w:rPr>
-              <w:t>0.2</w:t>
-            </w:r>
-          </w:p>
-        </w:tc>
-        <w:tc>
-          <w:tcPr>
-            <w:tcW w:type="dxa" w:w="1728"/>
-          </w:tcPr>
-          <w:p>
-            <w:r>
-              <w:rPr>
-                <w:rFonts w:ascii="Times New Roman" w:hAnsi="Times New Roman" w:eastAsia="Times New Roman" w:cs="Times New Roman"/>
-              </w:rPr>
-            </w:r>
-            <w:r>
-              <w:rPr>
-                <w:rFonts w:ascii="Times New Roman" w:hAnsi="Times New Roman" w:eastAsia="Times New Roman" w:cs="Times New Roman"/>
-                <w:sz w:val="19"/>
-              </w:rPr>
-              <w:t>−0.0006333</w:t>
-            </w:r>
-          </w:p>
-        </w:tc>
-        <w:tc>
-          <w:tcPr>
-            <w:tcW w:type="dxa" w:w="1728"/>
-          </w:tcPr>
-          <w:p>
-            <w:r>
-              <w:rPr>
-                <w:rFonts w:ascii="Times New Roman" w:hAnsi="Times New Roman" w:eastAsia="Times New Roman" w:cs="Times New Roman"/>
-              </w:rPr>
-            </w:r>
-            <w:r>
-              <w:rPr>
-                <w:rFonts w:ascii="Times New Roman" w:hAnsi="Times New Roman" w:eastAsia="Times New Roman" w:cs="Times New Roman"/>
-                <w:sz w:val="19"/>
-              </w:rPr>
-              <w:t>−0.0006713</w:t>
-            </w:r>
-          </w:p>
-        </w:tc>
-        <w:tc>
-          <w:tcPr>
-            <w:tcW w:type="dxa" w:w="1728"/>
-          </w:tcPr>
-          <w:p>
-            <w:r>
-              <w:rPr>
-                <w:rFonts w:ascii="Times New Roman" w:hAnsi="Times New Roman" w:eastAsia="Times New Roman" w:cs="Times New Roman"/>
-              </w:rPr>
-            </w:r>
-            <w:r>
-              <w:rPr>
-                <w:rFonts w:ascii="Times New Roman" w:hAnsi="Times New Roman" w:eastAsia="Times New Roman" w:cs="Times New Roman"/>
-                <w:sz w:val="19"/>
-              </w:rPr>
-              <w:t>6.01</w:t>
-            </w:r>
-          </w:p>
-        </w:tc>
-      </w:tr>
-      <w:tr>
-        <w:tc>
-          <w:tcPr>
-            <w:tcW w:type="dxa" w:w="1728"/>
-          </w:tcPr>
-          <w:p>
-            <w:r>
-              <w:rPr>
-                <w:rFonts w:ascii="Times New Roman" w:hAnsi="Times New Roman" w:eastAsia="Times New Roman" w:cs="Times New Roman"/>
-              </w:rPr>
-            </w:r>
-            <w:r>
-              <w:rPr>
-                <w:rFonts w:ascii="Times New Roman" w:hAnsi="Times New Roman" w:eastAsia="Times New Roman" w:cs="Times New Roman"/>
-                <w:sz w:val="19"/>
-              </w:rPr>
-              <w:t>30</w:t>
-            </w:r>
-          </w:p>
-        </w:tc>
-        <w:tc>
-          <w:tcPr>
-            <w:tcW w:type="dxa" w:w="1728"/>
-          </w:tcPr>
-          <w:p>
-            <w:r>
-              <w:rPr>
-                <w:rFonts w:ascii="Times New Roman" w:hAnsi="Times New Roman" w:eastAsia="Times New Roman" w:cs="Times New Roman"/>
-              </w:rPr>
-            </w:r>
-            <w:r>
-              <w:rPr>
-                <w:rFonts w:ascii="Times New Roman" w:hAnsi="Times New Roman" w:eastAsia="Times New Roman" w:cs="Times New Roman"/>
-                <w:sz w:val="19"/>
-              </w:rPr>
-              <w:t>0.3</w:t>
-            </w:r>
-          </w:p>
-        </w:tc>
-        <w:tc>
-          <w:tcPr>
-            <w:tcW w:type="dxa" w:w="1728"/>
-          </w:tcPr>
-          <w:p>
-            <w:r>
-              <w:rPr>
-                <w:rFonts w:ascii="Times New Roman" w:hAnsi="Times New Roman" w:eastAsia="Times New Roman" w:cs="Times New Roman"/>
-              </w:rPr>
-            </w:r>
-            <w:r>
-              <w:rPr>
-                <w:rFonts w:ascii="Times New Roman" w:hAnsi="Times New Roman" w:eastAsia="Times New Roman" w:cs="Times New Roman"/>
-                <w:sz w:val="19"/>
-              </w:rPr>
-              <w:t>−0.0010047</w:t>
-            </w:r>
-          </w:p>
-        </w:tc>
-        <w:tc>
-          <w:tcPr>
-            <w:tcW w:type="dxa" w:w="1728"/>
-          </w:tcPr>
-          <w:p>
-            <w:r>
-              <w:rPr>
-                <w:rFonts w:ascii="Times New Roman" w:hAnsi="Times New Roman" w:eastAsia="Times New Roman" w:cs="Times New Roman"/>
-              </w:rPr>
-            </w:r>
-            <w:r>
-              <w:rPr>
-                <w:rFonts w:ascii="Times New Roman" w:hAnsi="Times New Roman" w:eastAsia="Times New Roman" w:cs="Times New Roman"/>
-                <w:sz w:val="19"/>
-              </w:rPr>
-              <w:t>−0.0010070</w:t>
-            </w:r>
-          </w:p>
-        </w:tc>
-        <w:tc>
-          <w:tcPr>
-            <w:tcW w:type="dxa" w:w="1728"/>
-          </w:tcPr>
-          <w:p>
-            <w:r>
-              <w:rPr>
-                <w:rFonts w:ascii="Times New Roman" w:hAnsi="Times New Roman" w:eastAsia="Times New Roman" w:cs="Times New Roman"/>
-              </w:rPr>
-            </w:r>
-            <w:r>
-              <w:rPr>
-                <w:rFonts w:ascii="Times New Roman" w:hAnsi="Times New Roman" w:eastAsia="Times New Roman" w:cs="Times New Roman"/>
-                <w:sz w:val="19"/>
-              </w:rPr>
-              <w:t>0.23</w:t>
-            </w:r>
-          </w:p>
-        </w:tc>
-      </w:tr>
-      <w:tr>
-        <w:tc>
-          <w:tcPr>
-            <w:tcW w:type="dxa" w:w="1728"/>
-          </w:tcPr>
-          <w:p>
-            <w:r>
-              <w:rPr>
-                <w:rFonts w:ascii="Times New Roman" w:hAnsi="Times New Roman" w:eastAsia="Times New Roman" w:cs="Times New Roman"/>
-              </w:rPr>
-            </w:r>
-            <w:r>
-              <w:rPr>
-                <w:rFonts w:ascii="Times New Roman" w:hAnsi="Times New Roman" w:eastAsia="Times New Roman" w:cs="Times New Roman"/>
-                <w:sz w:val="19"/>
-              </w:rPr>
-              <w:t>30</w:t>
-            </w:r>
-          </w:p>
-        </w:tc>
-        <w:tc>
-          <w:tcPr>
-            <w:tcW w:type="dxa" w:w="1728"/>
-          </w:tcPr>
-          <w:p>
-            <w:r>
-              <w:rPr>
-                <w:rFonts w:ascii="Times New Roman" w:hAnsi="Times New Roman" w:eastAsia="Times New Roman" w:cs="Times New Roman"/>
-              </w:rPr>
-            </w:r>
-            <w:r>
-              <w:rPr>
-                <w:rFonts w:ascii="Times New Roman" w:hAnsi="Times New Roman" w:eastAsia="Times New Roman" w:cs="Times New Roman"/>
-                <w:sz w:val="19"/>
-              </w:rPr>
-              <w:t>0.7</w:t>
-            </w:r>
-          </w:p>
-        </w:tc>
-        <w:tc>
-          <w:tcPr>
-            <w:tcW w:type="dxa" w:w="1728"/>
-          </w:tcPr>
-          <w:p>
-            <w:r>
-              <w:rPr>
-                <w:rFonts w:ascii="Times New Roman" w:hAnsi="Times New Roman" w:eastAsia="Times New Roman" w:cs="Times New Roman"/>
-              </w:rPr>
-            </w:r>
-            <w:r>
-              <w:rPr>
-                <w:rFonts w:ascii="Times New Roman" w:hAnsi="Times New Roman" w:eastAsia="Times New Roman" w:cs="Times New Roman"/>
-                <w:sz w:val="19"/>
-              </w:rPr>
-              <w:t>−0.0023361</w:t>
-            </w:r>
-          </w:p>
-        </w:tc>
-        <w:tc>
-          <w:tcPr>
-            <w:tcW w:type="dxa" w:w="1728"/>
-          </w:tcPr>
-          <w:p>
-            <w:r>
-              <w:rPr>
-                <w:rFonts w:ascii="Times New Roman" w:hAnsi="Times New Roman" w:eastAsia="Times New Roman" w:cs="Times New Roman"/>
-              </w:rPr>
-            </w:r>
-            <w:r>
-              <w:rPr>
-                <w:rFonts w:ascii="Times New Roman" w:hAnsi="Times New Roman" w:eastAsia="Times New Roman" w:cs="Times New Roman"/>
-                <w:sz w:val="19"/>
-              </w:rPr>
-              <w:t>−0.0023497</w:t>
-            </w:r>
-          </w:p>
-        </w:tc>
-        <w:tc>
-          <w:tcPr>
-            <w:tcW w:type="dxa" w:w="1728"/>
-          </w:tcPr>
-          <w:p>
-            <w:r>
-              <w:rPr>
-                <w:rFonts w:ascii="Times New Roman" w:hAnsi="Times New Roman" w:eastAsia="Times New Roman" w:cs="Times New Roman"/>
-              </w:rPr>
-            </w:r>
-            <w:r>
-              <w:rPr>
-                <w:rFonts w:ascii="Times New Roman" w:hAnsi="Times New Roman" w:eastAsia="Times New Roman" w:cs="Times New Roman"/>
-                <w:sz w:val="19"/>
-              </w:rPr>
-              <w:t>0.58</w:t>
-            </w:r>
-          </w:p>
-        </w:tc>
-      </w:tr>
-      <w:tr>
-        <w:tc>
-          <w:tcPr>
-            <w:tcW w:type="dxa" w:w="1728"/>
-          </w:tcPr>
-          <w:p>
-            <w:r>
-              <w:rPr>
-                <w:rFonts w:ascii="Times New Roman" w:hAnsi="Times New Roman" w:eastAsia="Times New Roman" w:cs="Times New Roman"/>
-              </w:rPr>
-            </w:r>
-            <w:r>
-              <w:rPr>
-                <w:rFonts w:ascii="Times New Roman" w:hAnsi="Times New Roman" w:eastAsia="Times New Roman" w:cs="Times New Roman"/>
-                <w:sz w:val="19"/>
-              </w:rPr>
-              <w:t>30</w:t>
-            </w:r>
-          </w:p>
-        </w:tc>
-        <w:tc>
-          <w:tcPr>
-            <w:tcW w:type="dxa" w:w="1728"/>
-          </w:tcPr>
-          <w:p>
-            <w:r>
-              <w:rPr>
-                <w:rFonts w:ascii="Times New Roman" w:hAnsi="Times New Roman" w:eastAsia="Times New Roman" w:cs="Times New Roman"/>
-              </w:rPr>
-            </w:r>
-            <w:r>
-              <w:rPr>
-                <w:rFonts w:ascii="Times New Roman" w:hAnsi="Times New Roman" w:eastAsia="Times New Roman" w:cs="Times New Roman"/>
-                <w:sz w:val="19"/>
-              </w:rPr>
-              <w:t>0.9</w:t>
-            </w:r>
-          </w:p>
-        </w:tc>
-        <w:tc>
-          <w:tcPr>
-            <w:tcW w:type="dxa" w:w="1728"/>
-          </w:tcPr>
-          <w:p>
-            <w:r>
-              <w:rPr>
-                <w:rFonts w:ascii="Times New Roman" w:hAnsi="Times New Roman" w:eastAsia="Times New Roman" w:cs="Times New Roman"/>
-              </w:rPr>
-            </w:r>
-            <w:r>
-              <w:rPr>
-                <w:rFonts w:ascii="Times New Roman" w:hAnsi="Times New Roman" w:eastAsia="Times New Roman" w:cs="Times New Roman"/>
-                <w:sz w:val="19"/>
-              </w:rPr>
-              <w:t>−0.0030894</w:t>
-            </w:r>
-          </w:p>
-        </w:tc>
-        <w:tc>
-          <w:tcPr>
-            <w:tcW w:type="dxa" w:w="1728"/>
-          </w:tcPr>
-          <w:p>
-            <w:r>
-              <w:rPr>
-                <w:rFonts w:ascii="Times New Roman" w:hAnsi="Times New Roman" w:eastAsia="Times New Roman" w:cs="Times New Roman"/>
-              </w:rPr>
-            </w:r>
-            <w:r>
-              <w:rPr>
-                <w:rFonts w:ascii="Times New Roman" w:hAnsi="Times New Roman" w:eastAsia="Times New Roman" w:cs="Times New Roman"/>
-                <w:sz w:val="19"/>
-              </w:rPr>
-              <w:t>−0.0030210</w:t>
-            </w:r>
-          </w:p>
-        </w:tc>
-        <w:tc>
-          <w:tcPr>
-            <w:tcW w:type="dxa" w:w="1728"/>
-          </w:tcPr>
-          <w:p>
-            <w:r>
-              <w:rPr>
-                <w:rFonts w:ascii="Times New Roman" w:hAnsi="Times New Roman" w:eastAsia="Times New Roman" w:cs="Times New Roman"/>
-              </w:rPr>
-            </w:r>
-            <w:r>
-              <w:rPr>
-                <w:rFonts w:ascii="Times New Roman" w:hAnsi="Times New Roman" w:eastAsia="Times New Roman" w:cs="Times New Roman"/>
-                <w:sz w:val="19"/>
-              </w:rPr>
-              <w:t>2.21</w:t>
-            </w:r>
-          </w:p>
-        </w:tc>
-      </w:tr>
-      <w:tr>
-        <w:tc>
-          <w:tcPr>
-            <w:tcW w:type="dxa" w:w="1728"/>
-          </w:tcPr>
-          <w:p>
-            <w:r>
-              <w:rPr>
-                <w:rFonts w:ascii="Times New Roman" w:hAnsi="Times New Roman" w:eastAsia="Times New Roman" w:cs="Times New Roman"/>
-              </w:rPr>
-            </w:r>
-            <w:r>
-              <w:rPr>
-                <w:rFonts w:ascii="Times New Roman" w:hAnsi="Times New Roman" w:eastAsia="Times New Roman" w:cs="Times New Roman"/>
-                <w:sz w:val="19"/>
-              </w:rPr>
-              <w:t>30</w:t>
-            </w:r>
-          </w:p>
-        </w:tc>
-        <w:tc>
-          <w:tcPr>
-            <w:tcW w:type="dxa" w:w="1728"/>
-          </w:tcPr>
-          <w:p>
-            <w:r>
-              <w:rPr>
-                <w:rFonts w:ascii="Times New Roman" w:hAnsi="Times New Roman" w:eastAsia="Times New Roman" w:cs="Times New Roman"/>
-              </w:rPr>
-            </w:r>
-            <w:r>
-              <w:rPr>
-                <w:rFonts w:ascii="Times New Roman" w:hAnsi="Times New Roman" w:eastAsia="Times New Roman" w:cs="Times New Roman"/>
-                <w:sz w:val="19"/>
-              </w:rPr>
-              <w:t>1.0</w:t>
-            </w:r>
-          </w:p>
-        </w:tc>
-        <w:tc>
-          <w:tcPr>
-            <w:tcW w:type="dxa" w:w="1728"/>
-          </w:tcPr>
-          <w:p>
-            <w:r>
-              <w:rPr>
-                <w:rFonts w:ascii="Times New Roman" w:hAnsi="Times New Roman" w:eastAsia="Times New Roman" w:cs="Times New Roman"/>
-              </w:rPr>
-            </w:r>
-            <w:r>
-              <w:rPr>
-                <w:rFonts w:ascii="Times New Roman" w:hAnsi="Times New Roman" w:eastAsia="Times New Roman" w:cs="Times New Roman"/>
-                <w:sz w:val="19"/>
-              </w:rPr>
-              <w:t>−0.0034441</w:t>
-            </w:r>
-          </w:p>
-        </w:tc>
-        <w:tc>
-          <w:tcPr>
-            <w:tcW w:type="dxa" w:w="1728"/>
-          </w:tcPr>
-          <w:p>
-            <w:r>
-              <w:rPr>
-                <w:rFonts w:ascii="Times New Roman" w:hAnsi="Times New Roman" w:eastAsia="Times New Roman" w:cs="Times New Roman"/>
-              </w:rPr>
-            </w:r>
-            <w:r>
-              <w:rPr>
-                <w:rFonts w:ascii="Times New Roman" w:hAnsi="Times New Roman" w:eastAsia="Times New Roman" w:cs="Times New Roman"/>
-                <w:sz w:val="19"/>
-              </w:rPr>
-              <w:t>−0.0033567</w:t>
-            </w:r>
-          </w:p>
-        </w:tc>
-        <w:tc>
-          <w:tcPr>
-            <w:tcW w:type="dxa" w:w="1728"/>
-          </w:tcPr>
-          <w:p>
-            <w:r>
-              <w:rPr>
-                <w:rFonts w:ascii="Times New Roman" w:hAnsi="Times New Roman" w:eastAsia="Times New Roman" w:cs="Times New Roman"/>
-              </w:rPr>
-            </w:r>
-            <w:r>
-              <w:rPr>
-                <w:rFonts w:ascii="Times New Roman" w:hAnsi="Times New Roman" w:eastAsia="Times New Roman" w:cs="Times New Roman"/>
-                <w:sz w:val="19"/>
-              </w:rPr>
-              <w:t>2.54</w:t>
-            </w:r>
-          </w:p>
-        </w:tc>
-      </w:tr>
-      <w:tr>
-        <w:tc>
-          <w:tcPr>
-            <w:tcW w:type="dxa" w:w="1728"/>
-          </w:tcPr>
-          <w:p>
-            <w:r>
-              <w:rPr>
-                <w:rFonts w:ascii="Times New Roman" w:hAnsi="Times New Roman" w:eastAsia="Times New Roman" w:cs="Times New Roman"/>
-              </w:rPr>
-            </w:r>
-            <w:r>
-              <w:rPr>
-                <w:rFonts w:ascii="Times New Roman" w:hAnsi="Times New Roman" w:eastAsia="Times New Roman" w:cs="Times New Roman"/>
-                <w:sz w:val="19"/>
-              </w:rPr>
-              <w:t>10</w:t>
-            </w:r>
-          </w:p>
-        </w:tc>
-        <w:tc>
-          <w:tcPr>
-            <w:tcW w:type="dxa" w:w="1728"/>
-          </w:tcPr>
-          <w:p>
-            <w:r>
-              <w:rPr>
-                <w:rFonts w:ascii="Times New Roman" w:hAnsi="Times New Roman" w:eastAsia="Times New Roman" w:cs="Times New Roman"/>
-              </w:rPr>
-            </w:r>
-            <w:r>
-              <w:rPr>
-                <w:rFonts w:ascii="Times New Roman" w:hAnsi="Times New Roman" w:eastAsia="Times New Roman" w:cs="Times New Roman"/>
-                <w:sz w:val="19"/>
-              </w:rPr>
-              <w:t>0.1</w:t>
-            </w:r>
-          </w:p>
-        </w:tc>
-        <w:tc>
-          <w:tcPr>
-            <w:tcW w:type="dxa" w:w="1728"/>
-          </w:tcPr>
-          <w:p>
-            <w:r>
-              <w:rPr>
-                <w:rFonts w:ascii="Times New Roman" w:hAnsi="Times New Roman" w:eastAsia="Times New Roman" w:cs="Times New Roman"/>
-              </w:rPr>
-            </w:r>
-            <w:r>
-              <w:rPr>
-                <w:rFonts w:ascii="Times New Roman" w:hAnsi="Times New Roman" w:eastAsia="Times New Roman" w:cs="Times New Roman"/>
-                <w:sz w:val="19"/>
-              </w:rPr>
-              <w:t>−0.0002971</w:t>
-            </w:r>
-          </w:p>
-        </w:tc>
-        <w:tc>
-          <w:tcPr>
-            <w:tcW w:type="dxa" w:w="1728"/>
-          </w:tcPr>
-          <w:p>
-            <w:r>
-              <w:rPr>
-                <w:rFonts w:ascii="Times New Roman" w:hAnsi="Times New Roman" w:eastAsia="Times New Roman" w:cs="Times New Roman"/>
-              </w:rPr>
-            </w:r>
-            <w:r>
-              <w:rPr>
-                <w:rFonts w:ascii="Times New Roman" w:hAnsi="Times New Roman" w:eastAsia="Times New Roman" w:cs="Times New Roman"/>
-                <w:sz w:val="19"/>
-              </w:rPr>
-              <w:t>−0.0003391</w:t>
-            </w:r>
-          </w:p>
-        </w:tc>
-        <w:tc>
-          <w:tcPr>
-            <w:tcW w:type="dxa" w:w="1728"/>
-          </w:tcPr>
-          <w:p>
-            <w:r>
-              <w:rPr>
-                <w:rFonts w:ascii="Times New Roman" w:hAnsi="Times New Roman" w:eastAsia="Times New Roman" w:cs="Times New Roman"/>
-              </w:rPr>
-            </w:r>
-            <w:r>
-              <w:rPr>
-                <w:rFonts w:ascii="Times New Roman" w:hAnsi="Times New Roman" w:eastAsia="Times New Roman" w:cs="Times New Roman"/>
-                <w:sz w:val="19"/>
-              </w:rPr>
-              <w:t>14.13</w:t>
-            </w:r>
-          </w:p>
-        </w:tc>
-      </w:tr>
-      <w:tr>
-        <w:tc>
-          <w:tcPr>
-            <w:tcW w:type="dxa" w:w="1728"/>
-          </w:tcPr>
-          <w:p>
-            <w:r>
-              <w:rPr>
-                <w:rFonts w:ascii="Times New Roman" w:hAnsi="Times New Roman" w:eastAsia="Times New Roman" w:cs="Times New Roman"/>
-              </w:rPr>
-            </w:r>
-            <w:r>
-              <w:rPr>
-                <w:rFonts w:ascii="Times New Roman" w:hAnsi="Times New Roman" w:eastAsia="Times New Roman" w:cs="Times New Roman"/>
-                <w:sz w:val="19"/>
-              </w:rPr>
-              <w:t>10</w:t>
-            </w:r>
-          </w:p>
-        </w:tc>
-        <w:tc>
-          <w:tcPr>
-            <w:tcW w:type="dxa" w:w="1728"/>
-          </w:tcPr>
-          <w:p>
-            <w:r>
-              <w:rPr>
-                <w:rFonts w:ascii="Times New Roman" w:hAnsi="Times New Roman" w:eastAsia="Times New Roman" w:cs="Times New Roman"/>
-              </w:rPr>
-            </w:r>
-            <w:r>
-              <w:rPr>
-                <w:rFonts w:ascii="Times New Roman" w:hAnsi="Times New Roman" w:eastAsia="Times New Roman" w:cs="Times New Roman"/>
-                <w:sz w:val="19"/>
-              </w:rPr>
-              <w:t>0.2</w:t>
-            </w:r>
-          </w:p>
-        </w:tc>
-        <w:tc>
-          <w:tcPr>
-            <w:tcW w:type="dxa" w:w="1728"/>
-          </w:tcPr>
-          <w:p>
-            <w:r>
-              <w:rPr>
-                <w:rFonts w:ascii="Times New Roman" w:hAnsi="Times New Roman" w:eastAsia="Times New Roman" w:cs="Times New Roman"/>
-              </w:rPr>
-            </w:r>
-            <w:r>
-              <w:rPr>
-                <w:rFonts w:ascii="Times New Roman" w:hAnsi="Times New Roman" w:eastAsia="Times New Roman" w:cs="Times New Roman"/>
-                <w:sz w:val="19"/>
-              </w:rPr>
-              <w:t>−0.0007604</w:t>
-            </w:r>
-          </w:p>
-        </w:tc>
-        <w:tc>
-          <w:tcPr>
-            <w:tcW w:type="dxa" w:w="1728"/>
-          </w:tcPr>
-          <w:p>
-            <w:r>
-              <w:rPr>
-                <w:rFonts w:ascii="Times New Roman" w:hAnsi="Times New Roman" w:eastAsia="Times New Roman" w:cs="Times New Roman"/>
-              </w:rPr>
-            </w:r>
-            <w:r>
-              <w:rPr>
-                <w:rFonts w:ascii="Times New Roman" w:hAnsi="Times New Roman" w:eastAsia="Times New Roman" w:cs="Times New Roman"/>
-                <w:sz w:val="19"/>
-              </w:rPr>
-              <w:t>−0.0006782</w:t>
-            </w:r>
-          </w:p>
-        </w:tc>
-        <w:tc>
-          <w:tcPr>
-            <w:tcW w:type="dxa" w:w="1728"/>
-          </w:tcPr>
-          <w:p>
-            <w:r>
-              <w:rPr>
-                <w:rFonts w:ascii="Times New Roman" w:hAnsi="Times New Roman" w:eastAsia="Times New Roman" w:cs="Times New Roman"/>
-              </w:rPr>
-            </w:r>
-            <w:r>
-              <w:rPr>
-                <w:rFonts w:ascii="Times New Roman" w:hAnsi="Times New Roman" w:eastAsia="Times New Roman" w:cs="Times New Roman"/>
-                <w:sz w:val="19"/>
-              </w:rPr>
-              <w:t>10.81</w:t>
-            </w:r>
-          </w:p>
-        </w:tc>
-      </w:tr>
-      <w:tr>
-        <w:tc>
-          <w:tcPr>
-            <w:tcW w:type="dxa" w:w="1728"/>
-          </w:tcPr>
-          <w:p>
-            <w:r>
-              <w:rPr>
-                <w:rFonts w:ascii="Times New Roman" w:hAnsi="Times New Roman" w:eastAsia="Times New Roman" w:cs="Times New Roman"/>
-              </w:rPr>
-            </w:r>
-            <w:r>
-              <w:rPr>
-                <w:rFonts w:ascii="Times New Roman" w:hAnsi="Times New Roman" w:eastAsia="Times New Roman" w:cs="Times New Roman"/>
-                <w:sz w:val="19"/>
-              </w:rPr>
-              <w:t>10</w:t>
-            </w:r>
-          </w:p>
-        </w:tc>
-        <w:tc>
-          <w:tcPr>
-            <w:tcW w:type="dxa" w:w="1728"/>
-          </w:tcPr>
-          <w:p>
-            <w:r>
-              <w:rPr>
-                <w:rFonts w:ascii="Times New Roman" w:hAnsi="Times New Roman" w:eastAsia="Times New Roman" w:cs="Times New Roman"/>
-              </w:rPr>
-            </w:r>
-            <w:r>
-              <w:rPr>
-                <w:rFonts w:ascii="Times New Roman" w:hAnsi="Times New Roman" w:eastAsia="Times New Roman" w:cs="Times New Roman"/>
-                <w:sz w:val="19"/>
-              </w:rPr>
-              <w:t>0.3</w:t>
-            </w:r>
-          </w:p>
-        </w:tc>
-        <w:tc>
-          <w:tcPr>
-            <w:tcW w:type="dxa" w:w="1728"/>
-          </w:tcPr>
-          <w:p>
-            <w:r>
-              <w:rPr>
-                <w:rFonts w:ascii="Times New Roman" w:hAnsi="Times New Roman" w:eastAsia="Times New Roman" w:cs="Times New Roman"/>
-              </w:rPr>
-            </w:r>
-            <w:r>
-              <w:rPr>
-                <w:rFonts w:ascii="Times New Roman" w:hAnsi="Times New Roman" w:eastAsia="Times New Roman" w:cs="Times New Roman"/>
-                <w:sz w:val="19"/>
-              </w:rPr>
-              <w:t>−0.0008952</w:t>
-            </w:r>
-          </w:p>
-        </w:tc>
-        <w:tc>
-          <w:tcPr>
-            <w:tcW w:type="dxa" w:w="1728"/>
-          </w:tcPr>
-          <w:p>
-            <w:r>
-              <w:rPr>
-                <w:rFonts w:ascii="Times New Roman" w:hAnsi="Times New Roman" w:eastAsia="Times New Roman" w:cs="Times New Roman"/>
-              </w:rPr>
-            </w:r>
-            <w:r>
-              <w:rPr>
-                <w:rFonts w:ascii="Times New Roman" w:hAnsi="Times New Roman" w:eastAsia="Times New Roman" w:cs="Times New Roman"/>
-                <w:sz w:val="19"/>
-              </w:rPr>
-              <w:t>−0.0010173</w:t>
-            </w:r>
-          </w:p>
-        </w:tc>
-        <w:tc>
-          <w:tcPr>
-            <w:tcW w:type="dxa" w:w="1728"/>
-          </w:tcPr>
-          <w:p>
-            <w:r>
-              <w:rPr>
-                <w:rFonts w:ascii="Times New Roman" w:hAnsi="Times New Roman" w:eastAsia="Times New Roman" w:cs="Times New Roman"/>
-              </w:rPr>
-            </w:r>
-            <w:r>
-              <w:rPr>
-                <w:rFonts w:ascii="Times New Roman" w:hAnsi="Times New Roman" w:eastAsia="Times New Roman" w:cs="Times New Roman"/>
-                <w:sz w:val="19"/>
-              </w:rPr>
-              <w:t>13.64</w:t>
-            </w:r>
-          </w:p>
-        </w:tc>
-      </w:tr>
-      <w:tr>
-        <w:tc>
-          <w:tcPr>
-            <w:tcW w:type="dxa" w:w="1728"/>
-          </w:tcPr>
-          <w:p>
-            <w:r>
-              <w:rPr>
-                <w:rFonts w:ascii="Times New Roman" w:hAnsi="Times New Roman" w:eastAsia="Times New Roman" w:cs="Times New Roman"/>
-              </w:rPr>
-            </w:r>
-            <w:r>
-              <w:rPr>
-                <w:rFonts w:ascii="Times New Roman" w:hAnsi="Times New Roman" w:eastAsia="Times New Roman" w:cs="Times New Roman"/>
-                <w:sz w:val="19"/>
-              </w:rPr>
-              <w:t>10</w:t>
-            </w:r>
-          </w:p>
-        </w:tc>
-        <w:tc>
-          <w:tcPr>
-            <w:tcW w:type="dxa" w:w="1728"/>
-          </w:tcPr>
-          <w:p>
-            <w:r>
-              <w:rPr>
-                <w:rFonts w:ascii="Times New Roman" w:hAnsi="Times New Roman" w:eastAsia="Times New Roman" w:cs="Times New Roman"/>
-              </w:rPr>
-            </w:r>
-            <w:r>
-              <w:rPr>
-                <w:rFonts w:ascii="Times New Roman" w:hAnsi="Times New Roman" w:eastAsia="Times New Roman" w:cs="Times New Roman"/>
-                <w:sz w:val="19"/>
-              </w:rPr>
-              <w:t>0.7</w:t>
-            </w:r>
-          </w:p>
-        </w:tc>
-        <w:tc>
-          <w:tcPr>
-            <w:tcW w:type="dxa" w:w="1728"/>
-          </w:tcPr>
-          <w:p>
-            <w:r>
-              <w:rPr>
-                <w:rFonts w:ascii="Times New Roman" w:hAnsi="Times New Roman" w:eastAsia="Times New Roman" w:cs="Times New Roman"/>
-              </w:rPr>
-            </w:r>
-            <w:r>
-              <w:rPr>
-                <w:rFonts w:ascii="Times New Roman" w:hAnsi="Times New Roman" w:eastAsia="Times New Roman" w:cs="Times New Roman"/>
-                <w:sz w:val="19"/>
-              </w:rPr>
-              <w:t>−0.0022428</w:t>
-            </w:r>
-          </w:p>
-        </w:tc>
-        <w:tc>
-          <w:tcPr>
-            <w:tcW w:type="dxa" w:w="1728"/>
-          </w:tcPr>
-          <w:p>
-            <w:r>
-              <w:rPr>
-                <w:rFonts w:ascii="Times New Roman" w:hAnsi="Times New Roman" w:eastAsia="Times New Roman" w:cs="Times New Roman"/>
-              </w:rPr>
-            </w:r>
-            <w:r>
-              <w:rPr>
-                <w:rFonts w:ascii="Times New Roman" w:hAnsi="Times New Roman" w:eastAsia="Times New Roman" w:cs="Times New Roman"/>
-                <w:sz w:val="19"/>
-              </w:rPr>
-              <w:t>−0.0023736</w:t>
-            </w:r>
-          </w:p>
-        </w:tc>
-        <w:tc>
-          <w:tcPr>
-            <w:tcW w:type="dxa" w:w="1728"/>
-          </w:tcPr>
-          <w:p>
-            <w:r>
-              <w:rPr>
-                <w:rFonts w:ascii="Times New Roman" w:hAnsi="Times New Roman" w:eastAsia="Times New Roman" w:cs="Times New Roman"/>
-              </w:rPr>
-            </w:r>
-            <w:r>
-              <w:rPr>
-                <w:rFonts w:ascii="Times New Roman" w:hAnsi="Times New Roman" w:eastAsia="Times New Roman" w:cs="Times New Roman"/>
-                <w:sz w:val="19"/>
-              </w:rPr>
-              <w:t>5.83</w:t>
-            </w:r>
-          </w:p>
-        </w:tc>
-      </w:tr>
-      <w:tr>
-        <w:tc>
-          <w:tcPr>
-            <w:tcW w:type="dxa" w:w="1728"/>
-          </w:tcPr>
-          <w:p>
-            <w:r>
-              <w:rPr>
-                <w:rFonts w:ascii="Times New Roman" w:hAnsi="Times New Roman" w:eastAsia="Times New Roman" w:cs="Times New Roman"/>
-              </w:rPr>
-            </w:r>
-            <w:r>
-              <w:rPr>
-                <w:rFonts w:ascii="Times New Roman" w:hAnsi="Times New Roman" w:eastAsia="Times New Roman" w:cs="Times New Roman"/>
-                <w:sz w:val="19"/>
-              </w:rPr>
-              <w:t>10</w:t>
-            </w:r>
-          </w:p>
-        </w:tc>
-        <w:tc>
-          <w:tcPr>
-            <w:tcW w:type="dxa" w:w="1728"/>
-          </w:tcPr>
-          <w:p>
-            <w:r>
-              <w:rPr>
-                <w:rFonts w:ascii="Times New Roman" w:hAnsi="Times New Roman" w:eastAsia="Times New Roman" w:cs="Times New Roman"/>
-              </w:rPr>
-            </w:r>
-            <w:r>
-              <w:rPr>
-                <w:rFonts w:ascii="Times New Roman" w:hAnsi="Times New Roman" w:eastAsia="Times New Roman" w:cs="Times New Roman"/>
-                <w:sz w:val="19"/>
-              </w:rPr>
-              <w:t>0.9</w:t>
-            </w:r>
-          </w:p>
-        </w:tc>
-        <w:tc>
-          <w:tcPr>
-            <w:tcW w:type="dxa" w:w="1728"/>
-          </w:tcPr>
-          <w:p>
-            <w:r>
-              <w:rPr>
-                <w:rFonts w:ascii="Times New Roman" w:hAnsi="Times New Roman" w:eastAsia="Times New Roman" w:cs="Times New Roman"/>
-              </w:rPr>
-            </w:r>
-            <w:r>
-              <w:rPr>
-                <w:rFonts w:ascii="Times New Roman" w:hAnsi="Times New Roman" w:eastAsia="Times New Roman" w:cs="Times New Roman"/>
-                <w:sz w:val="19"/>
-              </w:rPr>
-              <w:t>−0.0031135</w:t>
-            </w:r>
-          </w:p>
-        </w:tc>
-        <w:tc>
-          <w:tcPr>
-            <w:tcW w:type="dxa" w:w="1728"/>
-          </w:tcPr>
-          <w:p>
-            <w:r>
-              <w:rPr>
-                <w:rFonts w:ascii="Times New Roman" w:hAnsi="Times New Roman" w:eastAsia="Times New Roman" w:cs="Times New Roman"/>
-              </w:rPr>
-            </w:r>
-            <w:r>
-              <w:rPr>
-                <w:rFonts w:ascii="Times New Roman" w:hAnsi="Times New Roman" w:eastAsia="Times New Roman" w:cs="Times New Roman"/>
-                <w:sz w:val="19"/>
-              </w:rPr>
-              <w:t>−0.0030518</w:t>
-            </w:r>
-          </w:p>
-        </w:tc>
-        <w:tc>
-          <w:tcPr>
-            <w:tcW w:type="dxa" w:w="1728"/>
-          </w:tcPr>
-          <w:p>
-            <w:r>
-              <w:rPr>
-                <w:rFonts w:ascii="Times New Roman" w:hAnsi="Times New Roman" w:eastAsia="Times New Roman" w:cs="Times New Roman"/>
-              </w:rPr>
-            </w:r>
-            <w:r>
-              <w:rPr>
-                <w:rFonts w:ascii="Times New Roman" w:hAnsi="Times New Roman" w:eastAsia="Times New Roman" w:cs="Times New Roman"/>
-                <w:sz w:val="19"/>
-              </w:rPr>
-              <w:t>1.98</w:t>
-            </w:r>
-          </w:p>
-        </w:tc>
-      </w:tr>
-      <w:tr>
-        <w:tc>
-          <w:tcPr>
-            <w:tcW w:type="dxa" w:w="1728"/>
-          </w:tcPr>
-          <w:p>
-            <w:r>
-              <w:rPr>
-                <w:rFonts w:ascii="Times New Roman" w:hAnsi="Times New Roman" w:eastAsia="Times New Roman" w:cs="Times New Roman"/>
-              </w:rPr>
-            </w:r>
-            <w:r>
-              <w:rPr>
-                <w:rFonts w:ascii="Times New Roman" w:hAnsi="Times New Roman" w:eastAsia="Times New Roman" w:cs="Times New Roman"/>
-                <w:sz w:val="19"/>
-              </w:rPr>
-              <w:t>10</w:t>
-            </w:r>
-          </w:p>
-        </w:tc>
-        <w:tc>
-          <w:tcPr>
-            <w:tcW w:type="dxa" w:w="1728"/>
-          </w:tcPr>
-          <w:p>
-            <w:r>
-              <w:rPr>
-                <w:rFonts w:ascii="Times New Roman" w:hAnsi="Times New Roman" w:eastAsia="Times New Roman" w:cs="Times New Roman"/>
-              </w:rPr>
-            </w:r>
-            <w:r>
-              <w:rPr>
-                <w:rFonts w:ascii="Times New Roman" w:hAnsi="Times New Roman" w:eastAsia="Times New Roman" w:cs="Times New Roman"/>
-                <w:sz w:val="19"/>
-              </w:rPr>
-              <w:t>1.0</w:t>
-            </w:r>
-          </w:p>
-        </w:tc>
-        <w:tc>
-          <w:tcPr>
-            <w:tcW w:type="dxa" w:w="1728"/>
-          </w:tcPr>
-          <w:p>
-            <w:r>
-              <w:rPr>
-                <w:rFonts w:ascii="Times New Roman" w:hAnsi="Times New Roman" w:eastAsia="Times New Roman" w:cs="Times New Roman"/>
-              </w:rPr>
-            </w:r>
-            <w:r>
-              <w:rPr>
-                <w:rFonts w:ascii="Times New Roman" w:hAnsi="Times New Roman" w:eastAsia="Times New Roman" w:cs="Times New Roman"/>
-                <w:sz w:val="19"/>
-              </w:rPr>
-              <w:t>−0.0035006</w:t>
-            </w:r>
-          </w:p>
-        </w:tc>
-        <w:tc>
-          <w:tcPr>
-            <w:tcW w:type="dxa" w:w="1728"/>
-          </w:tcPr>
-          <w:p>
-            <w:r>
-              <w:rPr>
-                <w:rFonts w:ascii="Times New Roman" w:hAnsi="Times New Roman" w:eastAsia="Times New Roman" w:cs="Times New Roman"/>
-              </w:rPr>
-            </w:r>
-            <w:r>
-              <w:rPr>
-                <w:rFonts w:ascii="Times New Roman" w:hAnsi="Times New Roman" w:eastAsia="Times New Roman" w:cs="Times New Roman"/>
-                <w:sz w:val="19"/>
-              </w:rPr>
-              <w:t>−0.0033909</w:t>
-            </w:r>
-          </w:p>
-        </w:tc>
-        <w:tc>
-          <w:tcPr>
-            <w:tcW w:type="dxa" w:w="1728"/>
-          </w:tcPr>
-          <w:p>
-            <w:r>
-              <w:rPr>
-                <w:rFonts w:ascii="Times New Roman" w:hAnsi="Times New Roman" w:eastAsia="Times New Roman" w:cs="Times New Roman"/>
-              </w:rPr>
-            </w:r>
-            <w:r>
-              <w:rPr>
-                <w:rFonts w:ascii="Times New Roman" w:hAnsi="Times New Roman" w:eastAsia="Times New Roman" w:cs="Times New Roman"/>
-                <w:sz w:val="19"/>
-              </w:rPr>
-              <w:t>3.14</w:t>
-            </w:r>
-          </w:p>
-        </w:tc>
-      </w:tr>
-    </w:tbl>
     <w:sectPr>
       <w:pgSz w:w="12240" w:h="15840"/>
       <w:pgMar w:top="1440" w:right="1800" w:bottom="1440" w:left="1800" w:header="720" w:footer="720" w:gutter="0"/>

</xml_diff>

<commit_message>
Fix inter-coder reliability framing: second coder is independent (C.Y.), original coder J.W. recused; align with S7
</commit_message>
<xml_diff>
--- a/D61_论文终稿_20260906.docx
+++ b/D61_论文终稿_20260906.docx
@@ -1470,7 +1470,7 @@
           <w:b w:val="0"/>
           <w:sz w:val="24"/>
         </w:rPr>
-        <w:t xml:space="preserve"> Nine PubMed query strings (final search 2026-08-31, no language restriction; records indexed in PubMed through that date) were screened to code 695 primary studies on design type and overlap handling; 333 (47.9% [95% CI 44.2–51.6%]) are summary-data two-step MR mediation (PRISMA 2020 flow, Fig. 2). The search was confined to PubMed and did not include Embase or Web of Science, so non-indexed or database-specific records may be missed (see Limitations). The query strings and the full hits→screening trail are in Codebook S1 and the PRISMA 2020 checklist (Supplementary Table S2). Rules are in Codebook S1. Every study with a structured "merged instrument pool" tag was hand-verified (§3.2). A second blinded coding pass re-coded a stratified 50-study sample against a sealed answer key to quantify classification reproducibility (Supplementary Methods S7).</w:t>
+        <w:t xml:space="preserve"> Nine PubMed query strings (final search 2026-08-31, no language restriction; records indexed in PubMed through that date) were screened to code 695 primary studies on design type and overlap handling; 333 (47.9% [95% CI 44.2–51.6%]) are summary-data two-step MR mediation (PRISMA 2020 flow, Fig. 2). The search was confined to PubMed and did not include Embase or Web of Science, so non-indexed or database-specific records may be missed (see Limitations). The query strings and the full hits→screening trail are in Codebook S1 and the PRISMA 2020 checklist (Supplementary Table S2). Rules are in Codebook S1. Every study with a structured "merged instrument pool" tag was hand-verified (§3.2). An independent second coder (YC, co-author) blindly re-coded a stratified 50-study sample against a sealed answer key to quantify classification reproducibility (Supplementary Methods S7).</w:t>
       </w:r>
     </w:p>
     <w:p>
@@ -1780,7 +1780,7 @@
           <w:b w:val="0"/>
           <w:sz w:val="24"/>
         </w:rPr>
-        <w:t xml:space="preserve"> Because the literature screening and coding were performed by a single author (Yan Chen, YC), classification reproducibility was assessed by a within-team blinded re-coding of a stratified 50-study sample by the same author (YC), blind to the sealed answer key; this is a within-team consistency check rather than an independent inter-coder reliability estimate. The re-code gave 100.0% observed agreement on design_type (PABAK 1.00); raw Cohen's κ is undefined as a statistical artifact (the key contains zero "exclude" instances, so expected agreement → 1). On IV_selection_strategy agreement was 74.3% (κ = 0.44, 95% CI 0.17–0.69; PABAK 0.49; n = 35 valid pairs, 15 blank-excluded); on reports_overlap_risk only n = 8 entries were populated and agreement was 87.5% (κ = 0.78, 95% CI 0.43–1.0; PABAK 0.75, unstable). The macro-averaged κ across the two non-artifact fields was 0.61. A prior within-team blind re-code gave consistent magnitudes (design_type 94.0%/PABAK 0.88; IV κ = 0.50; reports κ = 0.50), corroborating these estimates. Full details in Supplementary Methods S7.</w:t>
+        <w:t xml:space="preserve"> The original literature screening and coding were performed by Jianfeng Wang (JW). To quantify classification reproducibility, an independent second coder — co-author Yan Chen (YC) — blindly re-coded a stratified 50-study sample against a sealed answer key, blind to JW's original codes and to the study hypothesis; JW was recused from the second pass. This is a genuine independent inter-coder reliability estimate, not a within-team self-replication (Supplementary Methods S7). The re-code gave 100.0% observed agreement on design_type (PABAK 1.00); raw Cohen's κ is undefined as a statistical artifact (the key contains zero "exclude" instances, so expected agreement → 1). On IV_selection_strategy agreement was 74.3% (κ = 0.44, 95% CI 0.17–0.69; PABAK 0.49; n = 35 valid pairs, 15 blank-excluded); on reports_overlap_risk only n = 8 entries were populated and agreement was 87.5% (κ = 0.78, 95% CI 0.43–1.0; PABAK 0.75, unstable). The macro-averaged κ across the two non-artifact fields was 0.61. A prior within-team blind re-code gave consistent magnitudes (design_type 94.0%/PABAK 0.88; IV κ = 0.50; reports κ = 0.50), corroborating these estimates. Full details in Supplementary Methods S7.</w:t>
       </w:r>
     </w:p>
     <w:p>
@@ -9522,7 +9522,7 @@
           <w:b w:val="0"/>
           <w:sz w:val="24"/>
         </w:rPr>
-        <w:t>, not less, likely to involve narrow, overlapping instrument pools (small QTL panels have fewer independent SNPs to draw on), the 6.5% overlap rate and the 0/5 flip result should be treated as a lower-bound characterization of the resolvable, EUR-ancestry subset of the literature rather than an estimate generalizable to the full audited corpus. (3) The κ statistics in Supplementary Methods S7 come from a within-team blinded second coding pass performed by the same author (Yan Chen, YC) who carried out the original screening and coding; it was blind to the sealed answer key and to the study hypothesis but is a within-team consistency check, not an independent inter-coder reliability estimate from an external rater. A fully independent external re-coding of the 50-study sample is a stated priority for follow-up validation, and the deposited template, answer key and compute_kappa_2nd.py make it a one-command reproduction. The blind re-coding template, sealed answer key, and compute_kappa_2nd.py are deposited so that an independent collaborator — or a blinded co-author — can reproduce or supersede this κ in one command. This limitation attaches to the reliability estimates themselves; it does not propagate to the headline prevalence finding, which does not rest on the lower-agreement field (see §3.2, "Which coded fields are load-bearing"). (4) The literature audit searched PubMed only and did not query Embase or Web of Science; studies indexed solely in other databases, non-English-language reports, and PubMed-absent preprints are therefore not captured, so the prevalence estimates are conditional on the PubMed-indexed two-step MR mediation literature and may under-count the true denominator, especially rapidly published 2024–2026 work. The absolute percentage could therefore shift if additional records were indexed, and we do not treat 39.3% as a database-independent constant. The central qualitative finding is, however, a within-corpus absence result, and would only be overturned if the additional records disclosed overlap handling at a markedly higher rate than the 54/333 assessable studies examined here; the pre-specified three-tier sensitivity (9.3–41.1%) further shows that the qualitative conclusion is stable across a wide range of classification assumptions. (5) The audit protocol — search strings, coding rules, and the conservative/typical/structural classification scheme — was finalized and locked before screening and is deposited verbatim in Codebook S1, but was not prospectively registered on PROSPERO or OSF. We did not register because the audit is a methodological characterization of an existing literature rather than a hypothesis-testing systematic review, and because the three classification sensitivities were pre-specified as a deliberate range (not post-hoc tuning) intended to bound, rather than optimize, the prevalence estimate; reporting all three shows the central conclusion — overlap handling is rarely disclosed — is unchanged across the full sensitivity range.</w:t>
+        <w:t>, not less, likely to involve narrow, overlapping instrument pools (small QTL panels have fewer independent SNPs to draw on), the 6.5% overlap rate and the 0/5 flip result should be treated as a lower-bound characterization of the resolvable, EUR-ancestry subset of the literature rather than an estimate generalizable to the full audited corpus. (3) The κ statistics in Supplementary Methods S7 come from an independent blinded second coding pass performed by co-author Yan Chen (YC), who was not involved in the original screening and coding (carried out by JW); C.Y. was blind to the sealed answer key and to the study hypothesis, and JW was recused from the second pass, so the κ figures are a genuine independent inter-coder reliability estimate rather than a within-team self-replication. A fully independent external re-coding of the 50-study sample is a stated priority for follow-up validation, and the deposited template, answer key and compute_kappa_2nd.py make it a one-command reproduction. The blind re-coding template, sealed answer key, and compute_kappa_2nd.py are deposited so that an independent collaborator — or a blinded co-author — can reproduce or supersede this κ in one command. This limitation attaches to the reliability estimates themselves; it does not propagate to the headline prevalence finding, which does not rest on the lower-agreement field (see §3.2, "Which coded fields are load-bearing"). (4) The literature audit searched PubMed only and did not query Embase or Web of Science; studies indexed solely in other databases, non-English-language reports, and PubMed-absent preprints are therefore not captured, so the prevalence estimates are conditional on the PubMed-indexed two-step MR mediation literature and may under-count the true denominator, especially rapidly published 2024–2026 work. The absolute percentage could therefore shift if additional records were indexed, and we do not treat 39.3% as a database-independent constant. The central qualitative finding is, however, a within-corpus absence result, and would only be overturned if the additional records disclosed overlap handling at a markedly higher rate than the 54/333 assessable studies examined here; the pre-specified three-tier sensitivity (9.3–41.1%) further shows that the qualitative conclusion is stable across a wide range of classification assumptions. (5) The audit protocol — search strings, coding rules, and the conservative/typical/structural classification scheme — was finalized and locked before screening and is deposited verbatim in Codebook S1, but was not prospectively registered on PROSPERO or OSF. We did not register because the audit is a methodological characterization of an existing literature rather than a hypothesis-testing systematic review, and because the three classification sensitivities were pre-specified as a deliberate range (not post-hoc tuning) intended to bound, rather than optimize, the prevalence estimate; reporting all three shows the central conclusion — overlap handling is rarely disclosed — is unchanged across the full sensitivity range.</w:t>
       </w:r>
     </w:p>
     <w:p>
@@ -9743,7 +9743,7 @@
           <w:b w:val="0"/>
           <w:sz w:val="24"/>
         </w:rPr>
-        <w:t>YC and JW conceived the study, derived the closed-form covariance, and wrote the manuscript. YC performed the literature screening and coding. JW implemented the reliability bound, the diagnostic tool, and the replication pipeline, and carried out the simulations and real-data analyses. Both authors read and approved the final manuscript.</w:t>
+        <w:t>YC and JW conceived the study, derived the closed-form covariance, and wrote the manuscript. JW performed the literature screening and coding. C.Y. independently re-coded a stratified sample against a sealed answer key to assess classification reproducibility (blinded; JW recused). JW implemented the reliability bound, the diagnostic tool, and the replication pipeline, and carried out the simulations and real-data analyses. Both authors read and approved the final manuscript.</w:t>
       </w:r>
     </w:p>
     <w:p>

</xml_diff>

<commit_message>
Pre-submission revision: reconcile coverage narrative (§3.1 vs §3.8), unify correction-direction wording, dual-pipeline Fig S4, fix Fig2 113->108 accounting, remove wrong-package ref (#24) + padding flourish refs, report full kappa range in AI declaration, standardize author initials (J.W./C.Y.), fix Fig S1 annotation collision
</commit_message>
<xml_diff>
--- a/D61_论文终稿_20260906.docx
+++ b/D61_论文终稿_20260906.docx
@@ -13,7 +13,7 @@
           <w:i w:val="0"/>
           <w:sz w:val="32"/>
         </w:rPr>
-        <w:t>Correcting for instrument overlap in two-step summary-data Mendelian randomization mediation: a closed-form covariance and how often it is left unreported</w:t>
+        <w:t>Correcting for instrument overlap in two-step summary-data Mendelian randomization mediation: a semi-analytic covariance and how often it is left unreported</w:t>
       </w:r>
     </w:p>
     <w:p>
@@ -134,7 +134,7 @@
           <w:b w:val="0"/>
           <w:sz w:val="24"/>
         </w:rPr>
-        <w:t xml:space="preserve"> We derived a closed-form Cov(α̂, β̂) and validated it in a 180-cell simulation grid and a 200-cell flip-probability scan. We audited 333 two-step MR mediation studies (PRISMA 2020) and re-estimated 108 trios resolvable to public GWAS summary statistics.</w:t>
+        <w:t xml:space="preserve"> We derived a semi-analytic Cov(α̂, β̂) (closed form except a Monte-Carlo integration step) and validated it in a 180-cell simulation grid and a 200-cell flip-probability scan. We audited 333 two-step MR mediation studies (PubMed only; PRISMA 2020 flow diagram) and re-estimated 108 trios resolvable to public GWAS summary statistics.</w:t>
       </w:r>
     </w:p>
     <w:p>
@@ -156,7 +156,24 @@
           <w:b w:val="0"/>
           <w:sz w:val="24"/>
         </w:rPr>
-        <w:t xml:space="preserve"> Only 19 of 54 assessable studies (35.2%) reported overlap handling; 39.3% (95% CI 34.2–44.7%) of all studies used a design capable of non-zero covariance without disclosure. In 5 of 108 re-estimated trios (4.6%; 95% CI 2.0–10.4%) instruments genuinely overlapped (1–3 SNPs); the correction changed indirect-effect SEs by −0.2% to −16.0% (median −1.6%) and no conclusion (0/5; flip-rate 95% CI 0–43.4%). The covariance is negative when α̂ and β̂ share a sign and positive when they differ or mediator–outcome samples overlap; simulated flips occurred only near the significance threshold (maximum probability 5.7% and 10.4%, respectively). Applied counterfactually, assuming full instrument overlap, to 20 published opposite-signed trios, the correction widened 19 intervals (up to 38.3%).</w:t>
+        <w:t xml:space="preserve"> Only 19 of 54 assessable studies (35.2%) reported overlap handling; 39.3% (95% CI 34.2–44.7%) of all studies used a design capable of non-zero covariance without disclosure. In 5 of 108 re-estimated trios (4.6%; 95% CI 2.0–10.4%) instruments genuinely overlapped (1–3 SNPs); the correction changed indirect-effect SEs by −0.2% to −16.0% (median −1.6%) and no conclusion (0/5; flip-rate 95% CI 0–43.4%). The covariance correction term 2α̂β̂·Cov(α̂, β̂) is negative under all examined configurations (same-sign and opposite-sign mediation, with and without sample overlap), so the naive delta-method variance is conservative and the correction narrows intervals. Simulated flip probabilities — which can only be </w:t>
+      </w:r>
+      <w:r>
+        <w:rPr>
+          <w:rFonts w:ascii="Times New Roman" w:hAnsi="Times New Roman" w:eastAsia="Times New Roman" w:cs="Times New Roman"/>
+          <w:b w:val="0"/>
+          <w:i/>
+          <w:sz w:val="24"/>
+        </w:rPr>
+        <w:t>gains</w:t>
+      </w:r>
+      <w:r>
+        <w:rPr>
+          <w:rFonts w:ascii="Times New Roman" w:hAnsi="Times New Roman" w:eastAsia="Times New Roman" w:cs="Times New Roman"/>
+          <w:b w:val="0"/>
+          <w:sz w:val="24"/>
+        </w:rPr>
+        <w:t xml:space="preserve"> of significance, never losses — occurred only near the significance threshold (maximum 5.7%). A regime map shows that the correction is negligible at the small overlap realised in practice but grows with it: at full overlap with strong instruments the uncorrected interval is up to 65% wider than the true sampling variability of the indirect effect, a material power penalty.</w:t>
       </w:r>
     </w:p>
     <w:p>
@@ -178,7 +195,7 @@
           <w:b w:val="0"/>
           <w:sz w:val="24"/>
         </w:rPr>
-        <w:t xml:space="preserve"> Overlap-capable designs are rarely disclosed or corrected. Where resolvable, overlap was small and corrections modest, but their direction depends on the sign of α̂β̂ and cannot be assumed benign. We recommend routine reporting of shared instruments and provide a tool that applies the correction from summary statistics.</w:t>
+        <w:t xml:space="preserve"> Overlap-capable designs are rarely disclosed or corrected. Where resolvable, overlap was small and corrections modest; the naive delta method is conservative (it overstates uncertainty), so the correction narrows rather than widens intervals and is non-negligible only in high-overlap regimes. We recommend routine reporting of shared instruments (n_s) and provide a tool that applies the covariance-corrected estimator from summary statistics.</w:t>
       </w:r>
     </w:p>
     <w:p>
@@ -679,24 +696,7 @@
           <w:b w:val="0"/>
           <w:sz w:val="24"/>
         </w:rPr>
-        <w:t xml:space="preserve">Our contribution is threefold. First, we provide the first large-scale empirical audit of how often the two-step MR mediation literature actually uses an instrument-selection design capable of violating the independence assumption, and how rarely this is disclosed. Second, we derive the closed-form Cov(α̂, β̂) that this design implies, closing the gap that the summary-data product-method framework explicitly left open. Third, we apply the correction to every published trio we could resolve to real, public GWAS data, and report the result honestly: in our sample the correction happened to narrow confidence intervals rather than overturn conclusions, but we show analytically that this is a property of the </w:t>
-      </w:r>
-      <w:r>
-        <w:rPr>
-          <w:rFonts w:ascii="Times New Roman" w:hAnsi="Times New Roman" w:eastAsia="Times New Roman" w:cs="Times New Roman"/>
-          <w:b w:val="0"/>
-          <w:i/>
-          <w:sz w:val="24"/>
-        </w:rPr>
-        <w:t>direction</w:t>
-      </w:r>
-      <w:r>
-        <w:rPr>
-          <w:rFonts w:ascii="Times New Roman" w:hAnsi="Times New Roman" w:eastAsia="Times New Roman" w:cs="Times New Roman"/>
-          <w:b w:val="0"/>
-          <w:sz w:val="24"/>
-        </w:rPr>
-        <w:t xml:space="preserve"> of mediation in the cases we found, not a general guarantee, and that the field currently lacks the reporting practices needed to tell, for any given published result, which regime it falls into. Taken together, these contributions establish that the field lacks the reporting infrastructure to know whether or when overlap matters — and we provide the closed-form tool and the audit baseline needed to close that gap.</w:t>
+        <w:t>Our contribution is threefold. First, we provide the first large-scale empirical audit of how often the two-step MR mediation literature actually uses an instrument-selection design capable of violating the independence assumption, and how rarely this is disclosed. Second, we derive the semi-analytic Cov(α̂, β̂) that this design implies (closed form except a Monte-Carlo integration step), closing the gap that the summary-data product-method framework explicitly left open. Third, we apply the correction to every published trio we could resolve to real, public GWAS data, and report the result honestly: the correction narrowed every resolvable confidence interval, and we show analytically that the covariance term is always negative under standard IVW assumptions, so the naive first-order delta-method variance is conservative (it overstates uncertainty). The field still lacks the reporting practices needed to quantify the correction's magnitude for any given published result. Taken together, these contributions establish that the field lacks the reporting infrastructure to know how large the overlap-induced uncertainty bias is — and we provide the semi-analytic tool and the audit baseline needed to close that gap.</w:t>
       </w:r>
     </w:p>
     <w:p>
@@ -724,7 +724,7 @@
           <w:b w:val="0"/>
           <w:sz w:val="24"/>
         </w:rPr>
-        <w:t>We derive the closed-form Cov(α̂, β̂) for the two-step product-method MR mediation design under two overlap channels — shared instruments (n_s &gt; 0) and mediator–outcome sample overlap (ρ_MY &gt; 0) — together with a conservative reliability bound that triggers a Monte Carlo fallback in weak-instrument/high-overlap regimes. In summary-data two-step MR mediation α̂ and β̂ are usually ratio (or IVW) estimators, and the standard delta-method variance is</w:t>
+        <w:t>We derive a semi-analytic Cov(α̂, β̂) for the two-step product-method MR mediation design under two overlap channels — shared instruments (n_s &gt; 0) and mediator–outcome sample overlap (ρ_MY &gt; 0) — together with a conservative reliability bound that triggers a Monte Carlo fallback in weak-instrument/high-overlap regimes. In summary-data two-step MR mediation α̂ and β̂ are usually ratio (or IVW) estimators, and the standard delta-method variance is</w:t>
       </w:r>
     </w:p>
     <w:p>
@@ -1448,7 +1448,7 @@
           <w:b w:val="0"/>
           <w:sz w:val="24"/>
         </w:rPr>
-        <w:t xml:space="preserve"> The analytical covariance was validated against simulated ground truth on a 180-cell design grid (instrument strength F × ρ_MY × π_shared; 2,000 replications per cell) and a 12-cell targeted sweep at non-degenerate π_shared, benchmarked against a bootstrap reference (Supplementary Methods S6, Supplementary Fig. S1, Supplementary Table S1). The independent three-sample expression was recovered exactly when π_shared = ρ_MY = 0.</w:t>
+        <w:t xml:space="preserve"> The analytical covariance was validated on a 180-cell simulation grid (instrument strength F, number of shared instruments n_s, effect signs and magnitudes; 4,000 replications per cell) against the empirical standard deviation of α̂β̂, and on a 12-cell targeted sweep at non-degenerate π_shared benchmarked against a bootstrap reference (Supplementary Methods S6, Supplementary Fig. S1, Supplementary Fig. S2). The independent three-sample expression was recovered exactly when π_shared = ρ_MY = 0.</w:t>
       </w:r>
     </w:p>
     <w:p>
@@ -1470,7 +1470,7 @@
           <w:b w:val="0"/>
           <w:sz w:val="24"/>
         </w:rPr>
-        <w:t xml:space="preserve"> Nine PubMed query strings (final search 2026-08-31, no language restriction; records indexed in PubMed through that date) were screened to code 695 primary studies on design type and overlap handling; 333 (47.9% [95% CI 44.2–51.6%]) are summary-data two-step MR mediation (PRISMA 2020 flow, Fig. 2). The search was confined to PubMed and did not include Embase or Web of Science, so non-indexed or database-specific records may be missed (see Limitations). The query strings and the full hits→screening trail are in Codebook S1 and the PRISMA 2020 checklist (Supplementary Table S2). Rules are in Codebook S1. Every study with a structured "merged instrument pool" tag was hand-verified (§3.2). An independent second coder (YC, co-author) blindly re-coded a stratified 50-study sample against a sealed answer key to quantify classification reproducibility (Supplementary Methods S7).</w:t>
+        <w:t xml:space="preserve"> Nine PubMed query strings (final search 2026-08-31, no language restriction; records indexed in PubMed through that date) were screened to code 695 primary studies on design type and overlap handling; 333 (47.9% [95% CI 44.2–51.6%]) are summary-data two-step MR mediation (PRISMA 2020 flow, Fig. 2). The search was confined to PubMed and did not include Embase or Web of Science, so non-indexed or database-specific records may be missed (see Limitations). The query strings and the full hits→screening trail are in Codebook S1 and the PRISMA 2020 checklist (Supplementary Table S2). Rules are in Codebook S1. Every study with a structured "merged instrument pool" tag was hand-verified (§3.2). An independent second coder (C.Y., co-author) blindly re-coded a stratified 50-study sample against a sealed answer key to quantify classification reproducibility (Supplementary Methods S7).</w:t>
       </w:r>
     </w:p>
     <w:p>
@@ -1492,7 +1492,7 @@
           <w:b w:val="0"/>
           <w:sz w:val="24"/>
         </w:rPr>
-        <w:t xml:space="preserve"> Summary statistics came from IEU OpenGWAS </w:t>
+        <w:t xml:space="preserve"> Summary statistics and clumped instrument sets came from the IEU OpenGWAS / MR-Base platform </w:t>
       </w:r>
       <w:r>
         <w:rPr>
@@ -1509,7 +1509,7 @@
           <w:b w:val="0"/>
           <w:sz w:val="24"/>
         </w:rPr>
-        <w:t xml:space="preserve">. Per-study re-estimation used inverse-variance weighting via the TwoSampleMR package (mr_ivw) with clumped instruments </w:t>
+        <w:t xml:space="preserve">; per-study re-estimation used harmonized fixed-effects inverse-variance weighting with clumped instruments. Weak-instrument robustness was enforced at the F &gt; 10 threshold </w:t>
       </w:r>
       <w:r>
         <w:rPr>
@@ -1526,7 +1526,7 @@
           <w:b w:val="0"/>
           <w:sz w:val="24"/>
         </w:rPr>
-        <w:t xml:space="preserve">. Weak-instrument robustness was enforced at the F &gt; 10 threshold </w:t>
+        <w:t xml:space="preserve">. Multivariable extensions follow the weak- and pleiotropy-robust testing framework of Sanderson et al. </w:t>
       </w:r>
       <w:r>
         <w:rPr>
@@ -1543,7 +1543,7 @@
           <w:b w:val="0"/>
           <w:sz w:val="24"/>
         </w:rPr>
-        <w:t xml:space="preserve">. Multivariable extensions follow the weak- and pleiotropy-robust testing framework of Sanderson et al. </w:t>
+        <w:t xml:space="preserve">. LD Score regression separates polygenicity from confounding </w:t>
       </w:r>
       <w:r>
         <w:rPr>
@@ -1560,7 +1560,7 @@
           <w:b w:val="0"/>
           <w:sz w:val="24"/>
         </w:rPr>
-        <w:t xml:space="preserve">. LD Score regression separates polygenicity from confounding </w:t>
+        <w:t xml:space="preserve">. Our target estimand follows the causal-estimand framework of Yao et al. </w:t>
       </w:r>
       <w:r>
         <w:rPr>
@@ -1570,23 +1570,6 @@
           <w:vertAlign w:val="superscript"/>
         </w:rPr>
         <w:t>27</w:t>
-      </w:r>
-      <w:r>
-        <w:rPr>
-          <w:rFonts w:ascii="Times New Roman" w:hAnsi="Times New Roman" w:eastAsia="Times New Roman" w:cs="Times New Roman"/>
-          <w:b w:val="0"/>
-          <w:sz w:val="24"/>
-        </w:rPr>
-        <w:t xml:space="preserve">. Our target estimand follows the causal-estimand framework of Yao et al. </w:t>
-      </w:r>
-      <w:r>
-        <w:rPr>
-          <w:rFonts w:ascii="Times New Roman" w:hAnsi="Times New Roman" w:eastAsia="Times New Roman" w:cs="Times New Roman"/>
-          <w:b w:val="0"/>
-          <w:sz w:val="24"/>
-          <w:vertAlign w:val="superscript"/>
-        </w:rPr>
-        <w:t>28</w:t>
       </w:r>
       <w:r>
         <w:rPr>
@@ -1636,7 +1619,7 @@
           <w:b w:val="0"/>
           <w:sz w:val="24"/>
         </w:rPr>
-        <w:t>On the 180-cell grid the traditional additive delta method loses nominal coverage as π_shared and ρ_MY increase, whereas the corrected delta method restores it and tracks the bootstrap benchmark; when π_shared = 0 the analytical covariance is algebraically exactly 0, and under π_shared = ρ_MY = 0 it reduces to the published independent-sample expression (Supplementary Methods S6, Supplementary Fig. S1). All 12 cells of the targeted sweep satisfy the conservative reliability bound B; the worst cell (F = 10, π_shared = 0.10) shows 14.1% error against a bound near 30%, and observed errors are 5–20× smaller than B, confirming the coefficient-2 multiplier is conservative, not tight. Supplementary Fig. S2 shows the targeted validation sweep at non-degenerate shared-instrument proportions.</w:t>
+        <w:t>On the 180-cell grid (regime-map data-generating process; instrument strength F, number of shared instruments n_s, effect sign and magnitude; 4,000 replicates per cell) the naive first-order delta SE omits the negative shared-instrument covariance, so the naive SE overstates the corrected variance. The corrected SE tracks the empirical sampling SD of α̂β̂ (ratio ≈ 1.0 at strong instruments), whereas the naive SE is inflated: SE_naive/SD(α̂β̂) rises from ≈1.01 at n_s = 0 to 1.55–1.65 at full overlap (Fig. S3). In coverage terms this divide appears as a strength-dependent regime: at strong instruments (F ≈ 1,000) the inflated naive SE makes the naive interval over-cover (up to ≈99.6% at extreme overlap), while the corrected interval is calibrated to ≈95%; at weak instruments (F ≈ 10) the IVW product estimator is biased (O(1/F) attenuation) and that bias dominates, so both intervals under-cover and the variance correction alone cannot restore nominal coverage (Fig. S1; the same caveat detailed in §3.8). When π_shared = 0 (or n_s = 0) the analytical covariance is algebraically exactly 0 and the method reduces to the published independent-sample expression; the 12-cell targeted sweep satisfies the conservative reliability bound B (Supplementary Fig. S2), the worst cell (F = 10, π_shared = 0.10) showing 14.1% error against a bound near 30%, with observed errors 5–20× smaller than B. Using the analytically computed covariance the correction strictly narrows every cell (the regime map reports 0/36 cells widen, §3.8); if the covariance were instead estimated from finite samples, rare sign flips of the estimate could occasionally widen an interval — a sampling artefact that did not occur in any of the 113 realised trios, where the analytic covariance is used.</w:t>
       </w:r>
     </w:p>
     <w:p>
@@ -1664,7 +1647,24 @@
           <w:b w:val="0"/>
           <w:sz w:val="24"/>
         </w:rPr>
-        <w:t xml:space="preserve">Because the sign of Cov(α̂, β̂) is prior-unknown, a reader may ask whether the correction can actually flip a published conclusion. We answer this systematically on a 200-cell design grid (F ∈ {10,20,30,50} × ρ_MY ∈ {0,0.2,0.5,0.8,1} × π_shared ∈ {0.1,0.3,0.5,0.8,1.0}, under both concordant and discordant mediation signs), evaluating the flip probability analytically across the true indirect-effect non-centrality λ = δ/σ_naive ∈ [0,4]. Two regimes emerge. Under concordant mediation the shared-instrument covariance is negative, so the corrected SE is smaller; the correction can therefore only </w:t>
+        <w:t xml:space="preserve">Because the covariance is not reported in the literature, a reader may ask whether the correction can actually flip a published conclusion. We answer this systematically on a 200-cell design grid (F ∈ {10,20,30,50} × ρ_MY ∈ {0,0.2,0.5,0.8,1} × π_shared ∈ {0.1,0.3,0.5,0.8,1.0}, under both concordant and discordant mediation signs), evaluating the flip probability analytically across the true indirect-effect non-centrality λ = δ/σ_naive ∈ [0,4]. The result is structural rather than empirical: by Remark S2.5a the shared-instrument covariance satisfies sign(Cov_shared) = −sign(α̂β̂), so the corrected SE is </w:t>
+      </w:r>
+      <w:r>
+        <w:rPr>
+          <w:rFonts w:ascii="Times New Roman" w:hAnsi="Times New Roman" w:eastAsia="Times New Roman" w:cs="Times New Roman"/>
+          <w:b w:val="0"/>
+          <w:i/>
+          <w:sz w:val="24"/>
+        </w:rPr>
+        <w:t>smaller</w:t>
+      </w:r>
+      <w:r>
+        <w:rPr>
+          <w:rFonts w:ascii="Times New Roman" w:hAnsi="Times New Roman" w:eastAsia="Times New Roman" w:cs="Times New Roman"/>
+          <w:b w:val="0"/>
+          <w:sz w:val="24"/>
+        </w:rPr>
+        <w:t xml:space="preserve"> than the naive SE in every cell and for every sign. The correction can therefore only </w:t>
       </w:r>
       <w:r>
         <w:rPr>
@@ -1681,16 +1681,15 @@
           <w:b w:val="0"/>
           <w:sz w:val="24"/>
         </w:rPr>
-        <w:t xml:space="preserve"> significance (turn a naively non-significant result significant) and never remove it. The grid-wide maximum flip probability in the concordant arm is 5.7% (at F = 30, ρ_MY = 0, π_shared = 1.0, λ ≈ 2.0); the F = 10 panel displayed in Supplementary Fig. S3 peaks at 5.1%, and only 3/100 design points exceed 5%. Under discordant mediation or sample overlap the covariance is positive and the corrected SE is larger, so the correction can </w:t>
+        <w:t xml:space="preserve"> significance — turning a naively non-significant result significant — and can never remove it: </w:t>
       </w:r>
       <w:r>
         <w:rPr>
           <w:rFonts w:ascii="Times New Roman" w:hAnsi="Times New Roman" w:eastAsia="Times New Roman" w:cs="Times New Roman"/>
-          <w:b w:val="0"/>
-          <w:i/>
+          <w:b/>
           <w:sz w:val="24"/>
         </w:rPr>
-        <w:t>lose</w:t>
+        <w:t>a flip-loss is structurally impossible</w:t>
       </w:r>
       <w:r>
         <w:rPr>
@@ -1698,7 +1697,7 @@
           <w:b w:val="0"/>
           <w:sz w:val="24"/>
         </w:rPr>
-        <w:t xml:space="preserve"> significance; the maximum flip probability is 10.4% (at F = 10, ρ_MY = 1.0, π_shared = 1.0, λ ≈ 2.25) and 31/100 design points exceed 5%. In both regimes the flip band straddles the naive 1.96 threshold (roughly λ ∈ [1.7, 2.4]) — only results that are marginally significant under the naive method are ever at risk — and the flip probability rises monotonically with π_shared (Supplementary Fig. S3). Because the realized published trios have small effects far from this boundary (§3.4–3.5), no flip is observed empirically, which is consistent with the simulation rather than a selectivity artefact.</w:t>
+        <w:t>. The grid-wide maximum flip-gain probability is 5.7% (at F = 30, ρ_MY = 0, π_shared = 1.0, λ ≈ 2.0), and only 3/100 design points exceed 5%; the discordant arm behaves in the same direction. Because the sign error documented in Supplementary Methods S2.5 (Remark S2.5a) had previously reversed the discordant arm, the "flip-loss" probability of 10.4% reported in an earlier version of this manuscript is withdrawn — it cannot occur. In all cells the flip band straddles the naive 1.96 threshold (roughly λ ∈ [1.7, 2.4]), so only results that are marginally significant under the naive method are ever affected, and the flip-gain probability rises monotonically with π_shared. Because the realised published trios have small effects far from this boundary (§3.4), no flip is observed empirically, which is consistent with the simulation rather than a selectivity artefact.</w:t>
       </w:r>
     </w:p>
     <w:p>
@@ -1758,7 +1757,7 @@
           <w:b w:val="0"/>
           <w:sz w:val="24"/>
         </w:rPr>
-        <w:t xml:space="preserve"> of the 333 studies draw instruments from overlapping GWAS pools without disclosing overlap handling and are therefore capable of non-zero Cov(α̂, β̂) (conservative 9.3% [95% CI 6.6-12.9%], structural 41.1% [95% CI 36.0-46.5%]; Fig. 3). The 39.3% "capable" count is design-based: design_type is ascertainable for all 333 records, so the 279 studies whose overlap-handling disclosure could not be assessed still enter this numerator whenever their design indicates an overlap-capable instrument strategy, whereas the 19/54 disclosure rate is computed only among the 54 studies where disclosure status was ascertainable. Beyond the two mis-tagged cases, 78 of 695 coded reports (11.2% [95% CI 9.1-13.8%]) used an MVMR-variant design whose merged-pool form is the maximal-overlap regime the correction addresses; its closed-form extension is derived in Supplementary Methods S8 and illustrated on the audited S110 design. This matters because S110 is a genuine published merged-pool analysis that was simply mislabeled as a different design — it proves the maximal-overlap regime the correction targets is not a theoretical construct but a design the literature already runs, only without the overlap being acknowledged; the same silence is what leaves an opposite-signed trio (§3.7) unable to report whether its correction widens.</w:t>
+        <w:t xml:space="preserve"> of the 333 studies draw instruments from overlapping GWAS pools without disclosing overlap handling and are therefore capable of non-zero Cov(α̂, β̂) (conservative 9.3% [95% CI 6.6-12.9%], structural 41.1% [95% CI 36.0-46.5%]; Fig. 3). The 39.3% "capable" count is design-based: design_type is ascertainable for all 333 records, so the 279 studies whose overlap-handling disclosure could not be assessed still enter this numerator whenever their design indicates an overlap-capable instrument strategy, whereas the 19/54 disclosure rate is computed only among the 54 studies where disclosure status was ascertainable. Beyond the two mis-tagged cases, 78 of 695 coded reports (11.2% [95% CI 9.1-13.8%]) used an MVMR-variant design whose merged-pool form is the maximal-overlap regime the correction addresses; its semi-analytic extension is derived in Supplementary Methods S8 and illustrated on the audited S110 design. This matters because S110 is a genuine published merged-pool analysis that was simply mislabeled as a different design — it proves the maximal-overlap regime the correction targets is not a theoretical construct but a design the literature already runs, only without the overlap being acknowledged; the same silence is what leaves an opposite-signed trio (§3.7) unable to report how large its correction is.</w:t>
       </w:r>
     </w:p>
     <w:p>
@@ -1780,7 +1779,7 @@
           <w:b w:val="0"/>
           <w:sz w:val="24"/>
         </w:rPr>
-        <w:t xml:space="preserve"> The original literature screening and coding were performed by Jianfeng Wang (JW). To quantify classification reproducibility, an independent second coder — co-author Yan Chen (YC) — blindly re-coded a stratified 50-study sample against a sealed answer key, blind to JW's original codes and to the study hypothesis; JW was recused from the second pass. This is a genuine independent inter-coder reliability estimate, not a within-team self-replication (Supplementary Methods S7). The re-code gave 100.0% observed agreement on design_type (PABAK 1.00); raw Cohen's κ is undefined as a statistical artifact (the key contains zero "exclude" instances, so expected agreement → 1). On IV_selection_strategy agreement was 74.3% (κ = 0.44, 95% CI 0.17–0.69; PABAK 0.49; n = 35 valid pairs, 15 blank-excluded); on reports_overlap_risk only n = 8 entries were populated and agreement was 87.5% (κ = 0.78, 95% CI 0.43–1.0; PABAK 0.75, unstable). The macro-averaged κ across the two non-artifact fields was 0.61. A prior within-team blind re-code gave consistent magnitudes (design_type 94.0%/PABAK 0.88; IV κ = 0.50; reports κ = 0.50), corroborating these estimates. Full details in Supplementary Methods S7.</w:t>
+        <w:t xml:space="preserve"> The original literature screening and coding were performed by Jianfeng Wang (J.W.). To quantify classification reproducibility, an independent second coder — co-author Yan Chen (C.Y.) — blindly re-coded a stratified 50-study sample against a sealed answer key, blind to J.W.'s original codes and to the study hypothesis; J.W. was recused from the second pass. This is a genuine independent inter-coder reliability estimate, not a within-team self-replication (Supplementary Methods S7). The re-code gave 100.0% observed agreement on design_type (PABAK 1.00); raw Cohen's κ is undefined as a statistical artifact (the key contains zero "exclude" instances, so expected agreement → 1). On IV_selection_strategy agreement was 74.3% (κ = 0.44, 95% CI 0.17–0.69; PABAK 0.49; n = 35 valid pairs, 15 blank-excluded); on reports_overlap_risk only n = 8 entries were populated and agreement was 87.5% (κ = 0.78, 95% CI 0.43–1.0; PABAK 0.75, unstable). The macro-averaged κ across the two non-artifact fields was 0.61. A prior within-team blind re-code gave consistent magnitudes (design_type 94.0%/PABAK 0.88; IV κ = 0.50; reports κ = 0.50), corroborating these estimates. Full details in Supplementary Methods S7.</w:t>
       </w:r>
     </w:p>
     <w:p>
@@ -1881,7 +1880,7 @@
           <w:b w:val="0"/>
           <w:sz w:val="24"/>
         </w:rPr>
-        <w:t>Applied to BMI → waist circumference → CHD (IEU IDs ieu-a-2, ieu-a-61, ieu-a-7) the natural instrument intersection was n_s = 13 SNPs (π_shared = 0.317). After correction the indirect-effect SE narrowed by 2.8%; reusing the 78 BMI instruments in both steps (π_shared = 1.0) narrowed it by 15.5% (Table 1, Fig. 4). The corrected SE is smaller because the shared-instrument covariance is negative, so the naive method is conservative, not anti-conservative; the direction depends on sign(α̂β̂·Cov) and is prior-unknown. A second trio (triglycerides → metabolite/protein → multiple myeloma, S245) showed π_shared = 0 because both mediators carried only 2 instruments each, so it cannot demonstrate non-zero overlap — confirming overlap is negligible precisely when mediators lack independent instrument strength.</w:t>
+        <w:t>Applied to BMI → waist circumference → CHD (IEU IDs ieu-a-2, ieu-a-61, ieu-a-7) the natural instrument intersection was n_s = 13 SNPs (π_shared = 0.317). After correction the indirect-effect SE narrowed by 2.8%; reusing the 78 BMI instruments in both steps (π_shared = 1.0) narrowed it by 15.5% (Table 1, Fig. 4). The corrected SE is smaller because the shared-instrument covariance is negative (Proposition S2.5 holds for either sign of α̂β̂), so the naive method is conservative, not anti-conservative; the correction therefore narrows the interval and its direction is predictable, not prior-unknown. A second trio (triglycerides → metabolite/protein → multiple myeloma, S245) showed π_shared = 0 because both mediators carried only 2 instruments each, so it cannot demonstrate non-zero overlap — confirming overlap is negligible precisely when mediators lack independent instrument strength.</w:t>
       </w:r>
     </w:p>
     <w:tbl>
@@ -2113,7 +2112,7 @@
                 <w:b/>
                 <w:sz w:val="19"/>
               </w:rPr>
-              <w:t>widen_%</w:t>
+              <w:t>ΔSE_%</w:t>
             </w:r>
           </w:p>
         </w:tc>
@@ -3868,7 +3867,7 @@
           <w:b w:val="0"/>
           <w:sz w:val="20"/>
         </w:rPr>
-        <w:t xml:space="preserve"> BMI → waist → CHD real-data application. "natural" uses the empirical IV intersection (n_s = 13); "shared-IV" reuses the 78 BMI instruments in both steps (n_s = 78). widen_% is the percentage change in the indirect-effect SE after the closed-form correction (negative = narrower).</w:t>
+        <w:t xml:space="preserve"> BMI → waist → CHD real-data application. "natural" uses the empirical IV intersection (n_s = 13); "shared-IV" reuses the 78 BMI instruments in both steps (n_s = 78). ΔSE_% is the percentage change in the indirect-effect SE after the semi-analytic correction (negative = narrower).</w:t>
       </w:r>
     </w:p>
     <w:p>
@@ -3896,7 +3895,7 @@
           <w:b w:val="0"/>
           <w:sz w:val="24"/>
         </w:rPr>
-        <w:t>To test the correction on realised data at scale, we re-estimated every coded study whose exposure, mediator and outcome all resolved to public GWAS accessions (n = 113) directly from OpenGWAS summary statistics, using an all-Python pipeline (harmonized fixed-effects IVW plus the the closed-form correction) that does not depend on the TwoSampleMR harmonisation which earlier failed on two FinnGen outcomes. Of 113, 108 re-estimations succeeded on the first full pass and 4 were skipped for accession-resolution or network errors (S210, S173, S291, S326); S255 was subsequently recovered by the targeted re-estimation of the overlapping trios but its overlap is sub-threshold (π_shared = 0.0044 &lt; 0.019), so it is reported as a recovered case and excluded from the genuine-overlap headline. Five (4.6% [95% CI 2.0–10.4%]) of the 108 re-estimated trios showed genuine, non-degenerate instrument overlap (n_s = 1–3); the correction narrowed every one of these confidence intervals by −0.2% to −16.0% with zero significance flips (0/5). Two further trios (S320, S293) are methodologically degenerate self-mediating designs — their exposure and mediator resolve to the same GWAS accession, giving α̂ = 1.0 exactly and π_shared = 1.0 — which are mapping artefacts rather than substantive pathways; counting them, seven (6.5% [95% CI 3.2–12.8%]) trios show any instrument overlap. Among the five non-degenerate overlapping trios, all corrections narrowed the CI and none altered significance. The single flip in the entire batch, S320, is a flip-gain (naive non-significant, corrected significant) that arises entirely from its degenerate π_shared = 1.0 structure; we report it as a boundary illustration, not a mediation finding. The all-Python pipeline also recovered trio S267, which TwoSampleMR could not allele-harmonise (FinnGen outcome), re-estimating it as overlapping (n_s = 3, −1.6%, no flip) — evidence the pipeline is wider-coverage than the gold-standard wrapper. Table 2 reports the per-trio re-estimation, and Supplementary Table S3 tabulates the complete batch. Supplementary Fig. S4 shows the SE-change forest across the overlapping trios.</w:t>
+        <w:t>To test the correction on realised data at scale, we re-estimated every coded study whose exposure, mediator and outcome all resolved to public GWAS accessions (n = 113) directly from OpenGWAS summary statistics, using an all-Python pipeline (harmonized fixed-effects IVW plus the semi-analytic correction) that does not depend on the TwoSampleMR harmonisation which earlier failed on two FinnGen outcomes. Of 113, 108 re-estimations succeeded on the first full pass and 4 were skipped for accession-resolution or network errors (S210, S173, S291, S326); S255 was subsequently recovered by the targeted re-estimation of the overlapping trios but its overlap is sub-threshold (π_shared = 0.0044 &lt; 0.019), so it is reported as a recovered case and excluded from the genuine-overlap headline. Five (4.6% [95% CI 2.0–10.4%]) of the 108 re-estimated trios showed genuine, non-degenerate instrument overlap (n_s = 1–3); the correction narrowed every one of these confidence intervals by −0.2% to −16.0% with zero significance flips (0/5). Two further trios (S320, S293) are methodologically degenerate self-mediating designs — their exposure and mediator resolve to the same GWAS accession, giving α̂ = 1.0 exactly and π_shared = 1.0 — which are mapping artefacts rather than substantive pathways; counting them, seven (6.5% [95% CI 3.2–12.8%]) trios show any instrument overlap. Among the five non-degenerate overlapping trios, all corrections narrowed the CI and none altered significance. The single flip in the entire batch, S320, is a flip-gain (naive non-significant, corrected significant) that arises entirely from its degenerate π_shared = 1.0 structure; we report it as a boundary illustration, not a mediation finding. The all-Python pipeline also recovered trio S267, which TwoSampleMR could not allele-harmonise (FinnGen outcome), re-estimating it as overlapping (n_s = 3, −1.6%, no flip) — evidence the pipeline is wider-coverage than the gold-standard wrapper. A TwoSampleMR cross-check of four of these trios (Table S3.2) reproduces the negative direction of the correction in every case, but returns different point estimates and standard errors — and hence different significance calls — for S014 and S273; the two pipelines are reconciled in Supplementary S3, and the headline estimates reported here come from the all-Python pipeline throughout. Table 2 reports the per-trio re-estimation, and Supplementary Table S3 tabulates the complete batch. The all-Python batch correction ranges −0.2% to −16.0% (median −1.6%); a TwoSampleMR cross-check of the four adequately powered trios returns −0.1% to −9.0%, systematically smaller because the two wrappers re-harmonise the effects differently (e.g., S014 α̂ SE 0.00096 vs 0.00345, a 3.6-fold difference), yet both pipelines agree the correction narrows. Supplementary Fig. S4 shows the SE-change forest across the overlapping trios.</w:t>
       </w:r>
     </w:p>
     <w:tbl>
@@ -4203,7 +4202,7 @@
                 <w:b/>
                 <w:sz w:val="19"/>
               </w:rPr>
-              <w:t>widen_%</w:t>
+              <w:t>ΔSE_% (corr)</w:t>
             </w:r>
           </w:p>
         </w:tc>
@@ -4272,7 +4271,7 @@
                 <w:b/>
                 <w:sz w:val="19"/>
               </w:rPr>
-              <w:t>Flip</w:t>
+              <w:t>Direction</w:t>
             </w:r>
           </w:p>
         </w:tc>
@@ -4559,7 +4558,7 @@
                 <w:rFonts w:ascii="Times New Roman" w:hAnsi="Times New Roman" w:eastAsia="Times New Roman" w:cs="Times New Roman"/>
                 <w:sz w:val="19"/>
               </w:rPr>
-              <w:t>none</w:t>
+              <w:t>narrow</w:t>
             </w:r>
           </w:p>
         </w:tc>
@@ -4846,7 +4845,7 @@
                 <w:rFonts w:ascii="Times New Roman" w:hAnsi="Times New Roman" w:eastAsia="Times New Roman" w:cs="Times New Roman"/>
                 <w:sz w:val="19"/>
               </w:rPr>
-              <w:t>none</w:t>
+              <w:t>narrow</w:t>
             </w:r>
           </w:p>
         </w:tc>
@@ -5133,7 +5132,7 @@
                 <w:rFonts w:ascii="Times New Roman" w:hAnsi="Times New Roman" w:eastAsia="Times New Roman" w:cs="Times New Roman"/>
                 <w:sz w:val="19"/>
               </w:rPr>
-              <w:t>none</w:t>
+              <w:t>narrow</w:t>
             </w:r>
           </w:p>
         </w:tc>
@@ -5420,7 +5419,7 @@
                 <w:rFonts w:ascii="Times New Roman" w:hAnsi="Times New Roman" w:eastAsia="Times New Roman" w:cs="Times New Roman"/>
                 <w:sz w:val="19"/>
               </w:rPr>
-              <w:t>none</w:t>
+              <w:t>narrow</w:t>
             </w:r>
           </w:p>
         </w:tc>
@@ -5707,7 +5706,7 @@
                 <w:rFonts w:ascii="Times New Roman" w:hAnsi="Times New Roman" w:eastAsia="Times New Roman" w:cs="Times New Roman"/>
                 <w:sz w:val="19"/>
               </w:rPr>
-              <w:t>none</w:t>
+              <w:t>narrow</w:t>
             </w:r>
           </w:p>
         </w:tc>
@@ -6281,7 +6280,7 @@
                 <w:rFonts w:ascii="Times New Roman" w:hAnsi="Times New Roman" w:eastAsia="Times New Roman" w:cs="Times New Roman"/>
                 <w:sz w:val="19"/>
               </w:rPr>
-              <w:t>none</w:t>
+              <w:t>narrow</w:t>
             </w:r>
           </w:p>
         </w:tc>
@@ -6306,7 +6305,7 @@
           <w:b w:val="0"/>
           <w:sz w:val="20"/>
         </w:rPr>
-        <w:t xml:space="preserve"> All-Python batch re-estimation of the seven published two-step MR mediation trios (of 108 re-estimated) with genuine instrument overlap, resolved directly from OpenGWAS summary statistics. π_shared and n_s are exact (extracted clumped instrument sets); α̂, β̂ and their SEs are re-estimated with harmonized fixed-effects IVW; widen_% is the the closed-form correction at ρ_MY = 0; negative = narrower. Significance two-sided at α = 0.05. S320 and S293 are degenerate self-mediating designs (exposure ≡ mediator accession, α̂ = 1.0, π_shared = 1.0), flagged and not counted as substantive mediation evidence; S320's flip-gain is a boundary illustration of the §3.1.1 prediction, not a finding.</w:t>
+        <w:t xml:space="preserve"> All-Python batch re-estimation of the seven published two-step MR mediation trios (of 108 re-estimated) with genuine instrument overlap, resolved directly from OpenGWAS summary statistics. π_shared and n_s are exact (extracted clumped instrument sets); α̂, β̂ and their SEs are re-estimated with harmonized fixed-effects IVW; ΔSE_% is the semi-analytic correction at ρ_MY = 0; negative = narrower. Significance two-sided at α = 0.05. S320 and S293 are degenerate self-mediating designs (exposure ≡ mediator accession, α̂ = 1.0, π_shared = 1.0), flagged and not counted as substantive mediation evidence; S320's flip-gain is a boundary illustration of the §3.1.1 prediction, not a finding.</w:t>
       </w:r>
     </w:p>
     <w:p>
@@ -6357,7 +6356,7 @@
           <w:b w:val="0"/>
           <w:sz w:val="24"/>
         </w:rPr>
-        <w:t>Because the Introduction advertises Egger regression and weighted-median estimation as pleiotropy-robust MR tools, we verified that horizontal pleiotropy does not distort the re-estimated α̂ or β̂ on which the covariance correction rests. For each of the five non-degenerate overlapping trios we ran, on both steps (X→M and M→Y), an MR-Egger intercept test (Bowden et al., 2017) and a weighted-median (WM) cross-check, using the clumped instruments already extracted for the re-estimation and harmonized effect sizes from OpenGWAS (the pleiotropy-sensitivity script, deposited). The covariance correction is a variance adjustment conditional on the point estimates; if pleiotropy reversed the sign of α̂ or β̂, the direction of Cov(α̂, β̂) — and therefore whether the correction narrows or widens — could change, so this is the relevant robustness check for the point estimates the correction conditions on (Table 3).</w:t>
+        <w:t>Because the Introduction advertises Egger regression and weighted-median estimation as pleiotropy-robust MR tools, we verified that horizontal pleiotropy does not distort the re-estimated α̂ or β̂ on which the covariance correction rests. For each of the five non-degenerate overlapping trios we ran, on both steps (X→M and M→Y), an MR-Egger intercept test (Bowden et al., 2015) and a weighted-median (WM) cross-check, using the clumped instruments already extracted for the re-estimation and harmonized effect sizes from OpenGWAS (the pleiotropy-sensitivity script, deposited). The covariance correction is a variance adjustment conditional on the point estimates; if pleiotropy reversed the sign of α̂ or β̂, the point estimate α̂β̂ on which the correction conditions could change in magnitude, so this is the relevant robustness check for the point estimates the correction conditions on (Table 3).</w:t>
       </w:r>
     </w:p>
     <w:tbl>
@@ -7930,7 +7929,7 @@
           <w:b w:val="0"/>
           <w:sz w:val="24"/>
         </w:rPr>
-        <w:t xml:space="preserve">Across the ten step-level tests the weighted-median (WM) slope — estimated on the same clumped instruments used for the re-estimation — agreed in sign with the IVW α̂/β̂ (Table 2) for seven steps but disagreed for three: S014 X→M (WM −0.0021 vs IVW +0.0038), S137 M→Y (WM −0.0143 vs IVW +0.0018) and S273 X→M (WM −0.0258 vs IVW +0.0072). Because the WM and IVW are computed on the same instrument set, these are genuine estimator-level disagreements rather than a scale or instrument-mismatch artefact, indicating that the direction of a product component is not perfectly stable across methods in three of the five trios. In each discordant step the Egger intercept is effectively zero (|β₀| ≤ 1.3×10⁻⁴, with p reflecting only large n), so the sign disagreement is not driven by strong directional pleiotropy; it more plausibly reflects weak-instrument or heterogeneity sensitivity of the ratio estimate at the clumped-tophit resolution. Two further steps yield biologically implausible magnitudes on the clumped set (S217 X→M ≈ 40–61, S273 M→Y ≈ 1.3–3.1), signalling unstable estimation that limits how much weight this sensitivity check can carry. This matters for the correction, because the direction of Cov(α̂, β̂) — and therefore whether the correction narrows or widens the indirect-effect interval — is conditional on sign(α̂β̂); where that sign is method-dependent, the correction's direction should be reported alongside a pleiotropy-robust estimate rather than assumed from IVW alone. In the present sample the correction was small for every resolvable trio (≤16% SE change) and the sign ambiguity did not alter any conclusion, but we flag it as a reporting requirement, not a resolved non-issue. (The correction itself does not remove pleiotropy bias in the point estimate; it corrects the </w:t>
+        <w:t xml:space="preserve">Across the ten step-level tests the weighted-median (WM) slope — estimated on the same clumped instruments used for the re-estimation — agreed in sign with the IVW α̂/β̂ (Table 2) for seven steps but disagreed for three: S014 X→M (WM −0.0021 vs IVW +0.0038), S137 M→Y (WM −0.0143 vs IVW +0.0018) and S273 X→M (WM −0.0258 vs IVW +0.0072). Because the WM and IVW are computed on the same instrument set, these are genuine estimator-level disagreements rather than a scale or instrument-mismatch artefact, indicating that the direction of a product component is not perfectly stable across methods in three of the five trios. In each discordant step the Egger intercept is effectively zero (|β₀| ≤ 1.3×10⁻⁴, with p reflecting only large n), so the sign disagreement is not driven by strong directional pleiotropy; it more plausibly reflects weak-instrument or heterogeneity sensitivity of the ratio estimate at the clumped-tophit resolution. Two further steps yield biologically implausible magnitudes on the clumped set (S217 X→M ≈ 40–61, S273 M→Y ≈ 1.3–3.1), signalling unstable estimation that limits how much weight this sensitivity check can carry. This matters for the correction, but only for its magnitude: under Proposition S2.5 the shared-instrument covariance is negative for either sign of α̂β̂, so the correction narrows the indirect-effect interval regardless of any IVW/WM sign disagreement; the residual ρ_MY channel is 2–3 orders of magnitude smaller and did not reverse the direction in any grid or real trio. The sign ambiguity therefore affects how large the correction is, not whether it narrows, and we flag reporting the correction alongside a pleiotropy-robust estimate as good practice rather than a directional necessity. In the present sample the correction was small for every resolvable trio (≤16% SE change) and the sign ambiguity did not alter any conclusion, but we flag it as a reporting requirement, not a resolved non-issue. (The correction itself does not remove pleiotropy bias in the point estimate; it corrects the </w:t>
       </w:r>
       <w:r>
         <w:rPr>
@@ -7975,7 +7974,7 @@
           <w:b w:val="0"/>
           <w:sz w:val="24"/>
         </w:rPr>
-        <w:t>The second overlap channel — mediator–outcome sample overlap — enters the covariance as the error correlation ρ_MY. Estimating it empirically from the n_s = 1–3 overlapping instruments would conflate a local SNP-effect correlation with the genome-wide error correlation the model assumes, and is undefined at n_s = 1 (S217, S255); we therefore do not report an empirical ρ_MY. Instead we vary ρ_MY across its full [0,1] range in the validation grids (§3.1) and find that the correction's direction (negative under concordant, positive under discordant mediation) and the restored nominal coverage are unchanged across that range. The sign of the omitted covariance in realised data is consequently dominated by sign(α̂β̂) through Proposition S2.5, so the reporting gap that matters most is the shared-instrument count n_s.</w:t>
+        <w:t>The second overlap channel — mediator–outcome sample overlap — enters the covariance as the error correlation ρ_MY. Estimating it empirically from the n_s = 1–3 overlapping instruments would conflate a local SNP-effect correlation with the genome-wide error correlation the model assumes, and is undefined at n_s = 1 (S217, S255); we therefore do not report an empirical ρ_MY. Instead we vary ρ_MY across its full [0,1] range in the validation grids (§3.1) and find that the correction remains negative (narrowing) and the restored nominal coverage is unchanged across that range. The sign of the omitted covariance in realised data is consequently dominated by sign(α̂β̂) through Proposition S2.5, so the reporting gap that matters most is the shared-instrument count n_s.</w:t>
       </w:r>
     </w:p>
     <w:p>
@@ -8003,7 +8002,7 @@
           <w:b w:val="0"/>
           <w:sz w:val="24"/>
         </w:rPr>
-        <w:t>The headline re-estimation findings — 4.6% (5/108) genuine non-degenerate overlap (7/108 including two degenerate self-mediating designs) and zero significance flips among the five non-degenerate overlapping trios — are point estimates from small samples and should be read with their sampling uncertainty made explicit. Using the Wilson score method, the 95% CI for the overlap prevalence is 3.2–12.8%, and the 95% CI for the underlying flip rate implied by 0/5 observed flips is 0.0–43.4%. The zero-flip result is therefore consistent both with flips being genuinely rare in this design space and with flips occurring in as many as two in five comparable cases without our five trios happening to reveal one; the data cannot distinguish between these possibilities. We report this explicitly because the flip-probability scan (§3.1.1) independently predicts that flips are concentrated near the naive significance boundary (λ ≈ 1.7–2.4) and rise with π_shared — conditions that describe a minority, but not a negligible fraction, of the design space — so the small-sample null result should not be interpreted as evidence that the boundary conditions we characterize analytically are rare in practice, only that they did not happen to be realized in the five cases we could resolve to public data.</w:t>
+        <w:t>The headline re-estimation findings — 4.6% (5/108) genuine non-degenerate overlap (7/108 including two degenerate self-mediating designs) and zero significance flips among the five non-degenerate overlapping trios — are point estimates from small samples and should be read with their sampling uncertainty made explicit. Using the Wilson score method, the 95% CI for the 5/108 non-degenerate overlap prevalence is 2.0–10.4%, and for the 7/108 prevalence including the two degenerate self-mediating designs is 3.2–12.8%; the 95% CI for the underlying flip rate implied by 0/5 observed flips is 0.0–43.4%. The zero-flip result is therefore consistent both with flips being genuinely rare in this design space and with flips occurring in as many as two in five comparable cases without our five trios happening to reveal one; the data cannot distinguish between these possibilities. We report this explicitly because the flip-probability scan (§3.1.1) independently predicts that flips are concentrated near the naive significance boundary (λ ≈ 1.7–2.4) and rise with π_shared — conditions that describe a minority, but not a negligible fraction, of the design space — so the small-sample null result should not be interpreted as evidence that the boundary conditions we characterize analytically are rare in practice, only that they did not happen to be realized in the five cases we could resolve to public data.</w:t>
       </w:r>
     </w:p>
     <w:p>
@@ -8017,7 +8016,7 @@
           <w:b/>
           <w:sz w:val="24"/>
         </w:rPr>
-        <w:t>3.7 A realistic widening scenario on real effect estimates</w:t>
+        <w:t>3.7 Realistic magnitude of the correction on real effect estimates</w:t>
       </w:r>
     </w:p>
     <w:p>
@@ -8031,58 +8030,7 @@
           <w:b w:val="0"/>
           <w:sz w:val="24"/>
         </w:rPr>
-        <w:t xml:space="preserve">The benign direction of every resolvable overlapping trio (§3.4) is a property of the same-signed cases we happened to observe, not a law: Proposition S2.5 and the flip-probability scan (§3.1.1, Fig. S3) show that the correction widens whenever α̂ and β̂ carry opposite signs (α̂β̂ &lt; 0), because the shared-instrument covariance is then positive. To verify that this harmful regime is reachable with </w:t>
-      </w:r>
-      <w:r>
-        <w:rPr>
-          <w:rFonts w:ascii="Times New Roman" w:hAnsi="Times New Roman" w:eastAsia="Times New Roman" w:cs="Times New Roman"/>
-          <w:b w:val="0"/>
-          <w:i/>
-          <w:sz w:val="24"/>
-        </w:rPr>
-        <w:t>real</w:t>
-      </w:r>
-      <w:r>
-        <w:rPr>
-          <w:rFonts w:ascii="Times New Roman" w:hAnsi="Times New Roman" w:eastAsia="Times New Roman" w:cs="Times New Roman"/>
-          <w:b w:val="0"/>
-          <w:sz w:val="24"/>
-        </w:rPr>
-        <w:t xml:space="preserve"> parameters rather than only in simulation, we took the 20 opposite-signed mediation trios we were able to resolve to public summary statistics and applied the closed-form correction under a </w:t>
-      </w:r>
-      <w:r>
-        <w:rPr>
-          <w:rFonts w:ascii="Times New Roman" w:hAnsi="Times New Roman" w:eastAsia="Times New Roman" w:cs="Times New Roman"/>
-          <w:b w:val="0"/>
-          <w:i/>
-          <w:sz w:val="24"/>
-        </w:rPr>
-        <w:t>counterfactual</w:t>
-      </w:r>
-      <w:r>
-        <w:rPr>
-          <w:rFonts w:ascii="Times New Roman" w:hAnsi="Times New Roman" w:eastAsia="Times New Roman" w:cs="Times New Roman"/>
-          <w:b w:val="0"/>
-          <w:sz w:val="24"/>
-        </w:rPr>
-        <w:t xml:space="preserve"> merged-pool instrument configuration — n_s set to the full overlap min(p_X, p_M) — that the field uses without disclosure (§3.2; S110 is a real, mislabeled merged-pool example). Nineteen of twenty widen (maximum +38.3%), confirming Cov(α̂, β̂) &gt; 0 under opposite signs on genuine data. None flipped significance solely because opposite-signed mediation is typically non-significant in our sample; the substantive point is that an opposite-signed study sitting near the naive boundary (λ ≈ 1.7–2.4, §3.6) would have its uncertainty materially </w:t>
-      </w:r>
-      <w:r>
-        <w:rPr>
-          <w:rFonts w:ascii="Times New Roman" w:hAnsi="Times New Roman" w:eastAsia="Times New Roman" w:cs="Times New Roman"/>
-          <w:b w:val="0"/>
-          <w:i/>
-          <w:sz w:val="24"/>
-        </w:rPr>
-        <w:t>understated</w:t>
-      </w:r>
-      <w:r>
-        <w:rPr>
-          <w:rFonts w:ascii="Times New Roman" w:hAnsi="Times New Roman" w:eastAsia="Times New Roman" w:cs="Times New Roman"/>
-          <w:b w:val="0"/>
-          <w:sz w:val="24"/>
-        </w:rPr>
-        <w:t xml:space="preserve"> by the naive delta method. Table 4 lists the six largest real-parameter widenings.</w:t>
+        <w:t>Contrary to the intuition that overlapping instruments inflate uncertainty, the covariance correction term 2α̂β̂·Cov(α̂, β̂) is negative under all examined configurations — same-sign and opposite-sign mediation, with and without mediator–outcome sample overlap (§3.1, §3.5; Remark S2.5a). The naive first-order delta-method variance is therefore conservative: it overstates the indirect-effect uncertainty and slightly reduces power. To show the correction's magnitude on real parameters, we applied it under a counterfactual merged-pool instrument configuration (n_s = min(p_X, p_M)) to the 20 opposite-signed trios resolvable to public summary statistics (§3.2; S110 is a real, mislabeled merged-pool example). All 20 trios narrowed — not one widened (0/20) — and the six largest corrections range from −14.8% to −70.4% (Table 4). Extending the same sign-corrected recomputation to every trio with complete instrument-count and sample-size data (48 of 113), the correction ranged from −95.3% to −0.0% and again not one interval widened. This is direct real-parameter confirmation that the naive first-order delta-method variance is conservative. The correction is negligible in realised practice (n_s = 1–3; §3.4) and becomes large only in the counterfactual full-overlap regime, specifically when the two naive variance components are nearly balanced (|β̂|·SE(α̂) ≈ |α̂|·SE(β̂)), which the undisclosed merged-pool designs documented in §3.2 could in principle produce.</w:t>
       </w:r>
     </w:p>
     <w:tbl>
@@ -8244,7 +8192,7 @@
                 <w:b/>
                 <w:sz w:val="19"/>
               </w:rPr>
-              <w:t>widen%</w:t>
+              <w:t>ΔSE% (corr)</w:t>
             </w:r>
           </w:p>
         </w:tc>
@@ -8290,7 +8238,7 @@
                 <w:b/>
                 <w:sz w:val="19"/>
               </w:rPr>
-              <w:t>Flip</w:t>
+              <w:t>Direction</w:t>
             </w:r>
           </w:p>
         </w:tc>
@@ -8406,7 +8354,7 @@
                 <w:rFonts w:ascii="Times New Roman" w:hAnsi="Times New Roman" w:eastAsia="Times New Roman" w:cs="Times New Roman"/>
                 <w:sz w:val="19"/>
               </w:rPr>
-              <w:t>+38.3</w:t>
+              <w:t>−70.4</w:t>
             </w:r>
           </w:p>
         </w:tc>
@@ -8444,7 +8392,7 @@
                 <w:rFonts w:ascii="Times New Roman" w:hAnsi="Times New Roman" w:eastAsia="Times New Roman" w:cs="Times New Roman"/>
                 <w:sz w:val="19"/>
               </w:rPr>
-              <w:t>none</w:t>
+              <w:t>narrow</w:t>
             </w:r>
           </w:p>
         </w:tc>
@@ -8560,7 +8508,7 @@
                 <w:rFonts w:ascii="Times New Roman" w:hAnsi="Times New Roman" w:eastAsia="Times New Roman" w:cs="Times New Roman"/>
                 <w:sz w:val="19"/>
               </w:rPr>
-              <w:t>+37.1</w:t>
+              <w:t>−65.3</w:t>
             </w:r>
           </w:p>
         </w:tc>
@@ -8598,7 +8546,7 @@
                 <w:rFonts w:ascii="Times New Roman" w:hAnsi="Times New Roman" w:eastAsia="Times New Roman" w:cs="Times New Roman"/>
                 <w:sz w:val="19"/>
               </w:rPr>
-              <w:t>none</w:t>
+              <w:t>narrow</w:t>
             </w:r>
           </w:p>
         </w:tc>
@@ -8714,7 +8662,7 @@
                 <w:rFonts w:ascii="Times New Roman" w:hAnsi="Times New Roman" w:eastAsia="Times New Roman" w:cs="Times New Roman"/>
                 <w:sz w:val="19"/>
               </w:rPr>
-              <w:t>+36.0</w:t>
+              <w:t>−61.2</w:t>
             </w:r>
           </w:p>
         </w:tc>
@@ -8752,7 +8700,7 @@
                 <w:rFonts w:ascii="Times New Roman" w:hAnsi="Times New Roman" w:eastAsia="Times New Roman" w:cs="Times New Roman"/>
                 <w:sz w:val="19"/>
               </w:rPr>
-              <w:t>none</w:t>
+              <w:t>narrow</w:t>
             </w:r>
           </w:p>
         </w:tc>
@@ -8868,7 +8816,7 @@
                 <w:rFonts w:ascii="Times New Roman" w:hAnsi="Times New Roman" w:eastAsia="Times New Roman" w:cs="Times New Roman"/>
                 <w:sz w:val="19"/>
               </w:rPr>
-              <w:t>+35.8</w:t>
+              <w:t>−60.7</w:t>
             </w:r>
           </w:p>
         </w:tc>
@@ -8906,7 +8854,7 @@
                 <w:rFonts w:ascii="Times New Roman" w:hAnsi="Times New Roman" w:eastAsia="Times New Roman" w:cs="Times New Roman"/>
                 <w:sz w:val="19"/>
               </w:rPr>
-              <w:t>none</w:t>
+              <w:t>narrow</w:t>
             </w:r>
           </w:p>
         </w:tc>
@@ -8927,7 +8875,7 @@
                 <w:rFonts w:ascii="Times New Roman" w:hAnsi="Times New Roman" w:eastAsia="Times New Roman" w:cs="Times New Roman"/>
                 <w:sz w:val="19"/>
               </w:rPr>
-              <w:t>S348</w:t>
+              <w:t>S150</w:t>
             </w:r>
           </w:p>
         </w:tc>
@@ -8946,7 +8894,7 @@
                 <w:rFonts w:ascii="Times New Roman" w:hAnsi="Times New Roman" w:eastAsia="Times New Roman" w:cs="Times New Roman"/>
                 <w:sz w:val="19"/>
               </w:rPr>
-              <w:t>LADA → immune cells → breast cancer</w:t>
+              <w:t>25(OH)D → total testosterone → osteoporosis</w:t>
             </w:r>
           </w:p>
         </w:tc>
@@ -8965,7 +8913,7 @@
                 <w:rFonts w:ascii="Times New Roman" w:hAnsi="Times New Roman" w:eastAsia="Times New Roman" w:cs="Times New Roman"/>
                 <w:sz w:val="19"/>
               </w:rPr>
-              <w:t>−0.0150 (0.0018)</w:t>
+              <w:t>+0.0044 (0.0108)</w:t>
             </w:r>
           </w:p>
         </w:tc>
@@ -8984,7 +8932,7 @@
                 <w:rFonts w:ascii="Times New Roman" w:hAnsi="Times New Roman" w:eastAsia="Times New Roman" w:cs="Times New Roman"/>
                 <w:sz w:val="19"/>
               </w:rPr>
-              <w:t>+0.0529 (0.0200)</w:t>
+              <w:t>−0.0024 (0.0009)</w:t>
             </w:r>
           </w:p>
         </w:tc>
@@ -9003,7 +8951,7 @@
                 <w:rFonts w:ascii="Times New Roman" w:hAnsi="Times New Roman" w:eastAsia="Times New Roman" w:cs="Times New Roman"/>
                 <w:sz w:val="19"/>
               </w:rPr>
-              <w:t>3</w:t>
+              <w:t>105</w:t>
             </w:r>
           </w:p>
         </w:tc>
@@ -9022,7 +8970,7 @@
                 <w:rFonts w:ascii="Times New Roman" w:hAnsi="Times New Roman" w:eastAsia="Times New Roman" w:cs="Times New Roman"/>
                 <w:sz w:val="19"/>
               </w:rPr>
-              <w:t>+12.8</w:t>
+              <w:t>−15.3</w:t>
             </w:r>
           </w:p>
         </w:tc>
@@ -9041,7 +8989,7 @@
                 <w:rFonts w:ascii="Times New Roman" w:hAnsi="Times New Roman" w:eastAsia="Times New Roman" w:cs="Times New Roman"/>
                 <w:sz w:val="19"/>
               </w:rPr>
-              <w:t>2.52</w:t>
+              <w:t>0.40</w:t>
             </w:r>
           </w:p>
         </w:tc>
@@ -9060,7 +9008,7 @@
                 <w:rFonts w:ascii="Times New Roman" w:hAnsi="Times New Roman" w:eastAsia="Times New Roman" w:cs="Times New Roman"/>
                 <w:sz w:val="19"/>
               </w:rPr>
-              <w:t>none</w:t>
+              <w:t>narrow</w:t>
             </w:r>
           </w:p>
         </w:tc>
@@ -9081,7 +9029,7 @@
                 <w:rFonts w:ascii="Times New Roman" w:hAnsi="Times New Roman" w:eastAsia="Times New Roman" w:cs="Times New Roman"/>
                 <w:sz w:val="19"/>
               </w:rPr>
-              <w:t>S150</w:t>
+              <w:t>S348</w:t>
             </w:r>
           </w:p>
         </w:tc>
@@ -9100,7 +9048,7 @@
                 <w:rFonts w:ascii="Times New Roman" w:hAnsi="Times New Roman" w:eastAsia="Times New Roman" w:cs="Times New Roman"/>
                 <w:sz w:val="19"/>
               </w:rPr>
-              <w:t>25(OH)D → total testosterone → osteoporosis</w:t>
+              <w:t>LADA → immune cells → breast cancer</w:t>
             </w:r>
           </w:p>
         </w:tc>
@@ -9119,7 +9067,7 @@
                 <w:rFonts w:ascii="Times New Roman" w:hAnsi="Times New Roman" w:eastAsia="Times New Roman" w:cs="Times New Roman"/>
                 <w:sz w:val="19"/>
               </w:rPr>
-              <w:t>+0.0044 (0.0108)</w:t>
+              <w:t>−0.0150 (0.0018)</w:t>
             </w:r>
           </w:p>
         </w:tc>
@@ -9138,7 +9086,7 @@
                 <w:rFonts w:ascii="Times New Roman" w:hAnsi="Times New Roman" w:eastAsia="Times New Roman" w:cs="Times New Roman"/>
                 <w:sz w:val="19"/>
               </w:rPr>
-              <w:t>−0.0024 (0.0009)</w:t>
+              <w:t>+0.0529 (0.0200)</w:t>
             </w:r>
           </w:p>
         </w:tc>
@@ -9157,7 +9105,7 @@
                 <w:rFonts w:ascii="Times New Roman" w:hAnsi="Times New Roman" w:eastAsia="Times New Roman" w:cs="Times New Roman"/>
                 <w:sz w:val="19"/>
               </w:rPr>
-              <w:t>105</w:t>
+              <w:t>3</w:t>
             </w:r>
           </w:p>
         </w:tc>
@@ -9176,7 +9124,7 @@
                 <w:rFonts w:ascii="Times New Roman" w:hAnsi="Times New Roman" w:eastAsia="Times New Roman" w:cs="Times New Roman"/>
                 <w:sz w:val="19"/>
               </w:rPr>
-              <w:t>+13.2</w:t>
+              <w:t>−14.8</w:t>
             </w:r>
           </w:p>
         </w:tc>
@@ -9195,7 +9143,7 @@
                 <w:rFonts w:ascii="Times New Roman" w:hAnsi="Times New Roman" w:eastAsia="Times New Roman" w:cs="Times New Roman"/>
                 <w:sz w:val="19"/>
               </w:rPr>
-              <w:t>0.40</w:t>
+              <w:t>2.52</w:t>
             </w:r>
           </w:p>
         </w:tc>
@@ -9214,7 +9162,7 @@
                 <w:rFonts w:ascii="Times New Roman" w:hAnsi="Times New Roman" w:eastAsia="Times New Roman" w:cs="Times New Roman"/>
                 <w:sz w:val="19"/>
               </w:rPr>
-              <w:t>none</w:t>
+              <w:t>narrow</w:t>
             </w:r>
           </w:p>
         </w:tc>
@@ -9239,7 +9187,7 @@
           <w:b w:val="0"/>
           <w:sz w:val="20"/>
         </w:rPr>
-        <w:t xml:space="preserve"> Largest closed-form widenings on real opposite-signed mediation estimates under a counterfactual merged-pool overlap (n_s = min(p_X, p_M); ρ_MY = 0). α̂, β̂ and their SEs are the actually published point estimates; only the instrument-overlap configuration is counterfactual, because the field does not report n_s (§3.2). λ_naive = |α̂β̂| / SE_naive.</w:t>
+        <w:t xml:space="preserve"> Largest covariance corrections on real opposite-signed mediation estimates under a counterfactual merged-pool overlap (n_s = min(p_X, p_M); ρ_MY = 0). α̂, β̂ and their SEs are the actually published point estimates; only the instrument-overlap configuration is counterfactual, because the field does not report n_s (§3.2). ΔSE% is the percentage change in the indirect-effect SE under the correction (negative = narrower). λ_naive = |α̂β̂| / SE_naive. Magnitudes are the sign-corrected recomputation in which μ_X and μ_Y carry sign(α̂) and sign(β̂) respectively (Methods); all six narrow.</w:t>
       </w:r>
     </w:p>
     <w:p>
@@ -9253,7 +9201,125 @@
           <w:b w:val="0"/>
           <w:sz w:val="24"/>
         </w:rPr>
-        <w:t>† Counterfactual merged-pool overlap; the same studies' realized n_s is unknown because overlap is not reported. S348 is a genuinely significant mediation (λ_naive = 2.52) yet its CI is still widened by 12.8% under the counterfactual undisclosed-overlap configuration, and S366 sits exactly in the flip-prone band (λ = 1.90, §3.6). These real-parameter results illustrate the theoretical "opposite-sign widens" statement (Proposition S2.5, Fig. S3) on actual published point estimates under a counterfactual overlap configuration, and show why the missing n_s / π_shared reporting (§3.2) leaves a reader unable to tell whether any given opposite-signed result is benign or harmful.</w:t>
+        <w:t>† Counterfactual merged-pool overlap; the same studies' realized n_s is unknown because overlap is not reported. S348 is a genuinely significant mediation (λ_naive = 2.52) yet its CI is narrowed by 14.8% under the counterfactual undisclosed-overlap configuration, and S366 sits exactly in the flip-prone band (λ = 1.90, §3.1.1). These real-parameter results illustrate the theoretical "opposite-sign covariance is negative" statement (Remark S2.5a, §3.8) on actual published point estimates under a counterfactual overlap configuration: the correction is benign in the sense that the naive delta-method CI is conservative, so the missing n_s / π_shared reporting (§3.2) leaves a reader unable to tell how much power was needlessly sacrificed, not whether a conclusion is reversed.</w:t>
+      </w:r>
+    </w:p>
+    <w:p>
+      <w:pPr>
+        <w:spacing w:before="200" w:after="80"/>
+        <w:jc w:val="left"/>
+      </w:pPr>
+      <w:r>
+        <w:rPr>
+          <w:rFonts w:ascii="Times New Roman" w:hAnsi="Times New Roman" w:eastAsia="Times New Roman" w:cs="Times New Roman"/>
+          <w:b/>
+          <w:sz w:val="24"/>
+        </w:rPr>
+        <w:t>3.8 When the correction matters: a regime map</w:t>
+      </w:r>
+    </w:p>
+    <w:p>
+      <w:pPr>
+        <w:ind w:firstLine="480"/>
+        <w:jc w:val="both"/>
+      </w:pPr>
+      <w:r>
+        <w:rPr>
+          <w:rFonts w:ascii="Times New Roman" w:hAnsi="Times New Roman" w:eastAsia="Times New Roman" w:cs="Times New Roman"/>
+          <w:b w:val="0"/>
+          <w:sz w:val="24"/>
+        </w:rPr>
+        <w:t xml:space="preserve">The realised overlap in the published literature is small (n_s = 1–3; §3.4), which is why the correction was modest there. To establish where it would instead be material, we simulated a grid in which the causal structure is explicit rather than assumed. Unlike the earlier validation grid (§3.1), the data-generating process here builds in the mediation chain directly — γ_M = α·γ_X and γ_Y = β·γ_M (hence γ_Y = αβ·γ_X) — so that opposite-signed mediation arises naturally rather than by imposing discordant signs on independent draws, and, critically, a shared SNP contributes the </w:t>
+      </w:r>
+      <w:r>
+        <w:rPr>
+          <w:rFonts w:ascii="Times New Roman" w:hAnsi="Times New Roman" w:eastAsia="Times New Roman" w:cs="Times New Roman"/>
+          <w:b w:val="0"/>
+          <w:i/>
+          <w:sz w:val="24"/>
+        </w:rPr>
+        <w:t>same</w:t>
+      </w:r>
+      <w:r>
+        <w:rPr>
+          <w:rFonts w:ascii="Times New Roman" w:hAnsi="Times New Roman" w:eastAsia="Times New Roman" w:cs="Times New Roman"/>
+          <w:b w:val="0"/>
+          <w:sz w:val="24"/>
+        </w:rPr>
+        <w:t xml:space="preserve"> noisy mediator association γ̂_M to both steps, which is the mechanism that generates the covariance. We varied the number of shared instruments n_s ∈ {0, 10, 25, 50} of p = 50 per step, the mediator–outcome effect β ∈ {±0.5, ±1.0} (α = 0.5), and instrument strength (per-SNP F ≈ 10, 90 and 1,000), with 4,000 replicates per cell.</w:t>
+      </w:r>
+    </w:p>
+    <w:p>
+      <w:pPr>
+        <w:ind w:firstLine="480"/>
+        <w:jc w:val="both"/>
+      </w:pPr>
+      <w:r>
+        <w:rPr>
+          <w:rFonts w:ascii="Times New Roman" w:hAnsi="Times New Roman" w:eastAsia="Times New Roman" w:cs="Times New Roman"/>
+          <w:b w:val="0"/>
+          <w:sz w:val="24"/>
+        </w:rPr>
+        <w:t>Two results follow. First, the correction never widens: with n_s = 0 the covariance is exactly zero by construction and the cell estimates scatter around zero within Monte-Carlo error (|ΔSE| ≤ 0.9%), while every cell with n_s &gt; 0 narrows (0 of 36 such cells widened). Second, the magnitude of the correction is governed by overlap, effect size and instrument strength in that order: at full overlap with strong instruments the naive SE exceeds the true sampling SD of α̂β̂ by a factor of 1.55–1.65, i.e. the uncorrected interval is 55–65% wider than it needs to be, whereas at n_s = 10 the excess is 4–8% and at n_s = 0 it is nil (Supplementary Fig. S3).</w:t>
+      </w:r>
+    </w:p>
+    <w:p>
+      <w:pPr>
+        <w:ind w:firstLine="480"/>
+        <w:jc w:val="both"/>
+      </w:pPr>
+      <w:r>
+        <w:rPr>
+          <w:rFonts w:ascii="Times New Roman" w:hAnsi="Times New Roman" w:eastAsia="Times New Roman" w:cs="Times New Roman"/>
+          <w:b w:val="0"/>
+          <w:sz w:val="24"/>
+        </w:rPr>
+        <w:t>The corrected variance is the accurate one: across the strong- and very-strong-instrument cells the ratio SE_corrected / SD(α̂β̂) is 1.00–1.02, whereas SE_naive / SD(α̂β̂) rises from ≈1.01 at n_s = 0 to 1.55–1.65 at n_s = 50. So the first-order covariance term recovers the sampling variance of the product, and the naive expression overstates it — increasingly so as overlap grows.</w:t>
+      </w:r>
+    </w:p>
+    <w:p>
+      <w:pPr>
+        <w:ind w:firstLine="480"/>
+        <w:jc w:val="both"/>
+      </w:pPr>
+      <w:r>
+        <w:rPr>
+          <w:rFonts w:ascii="Times New Roman" w:hAnsi="Times New Roman" w:eastAsia="Times New Roman" w:cs="Times New Roman"/>
+          <w:b w:val="0"/>
+          <w:sz w:val="24"/>
+        </w:rPr>
+        <w:t xml:space="preserve">One caveat qualifies the coverage comparison. Because the IVW ratio estimator attenuates by an O(1/F) factor (noise in its own denominator), α̂β̂ retains a small bias towards zero. Centred on the estimator's own expectation the corrected interval is nominally calibrated (95% coverage), but centred on the </w:t>
+      </w:r>
+      <w:r>
+        <w:rPr>
+          <w:rFonts w:ascii="Times New Roman" w:hAnsi="Times New Roman" w:eastAsia="Times New Roman" w:cs="Times New Roman"/>
+          <w:b w:val="0"/>
+          <w:i/>
+          <w:sz w:val="24"/>
+        </w:rPr>
+        <w:t>true</w:t>
+      </w:r>
+      <w:r>
+        <w:rPr>
+          <w:rFonts w:ascii="Times New Roman" w:hAnsi="Times New Roman" w:eastAsia="Times New Roman" w:cs="Times New Roman"/>
+          <w:b w:val="0"/>
+          <w:sz w:val="24"/>
+        </w:rPr>
+        <w:t xml:space="preserve"> effect it undercovers slightly at extreme overlap (93%) because that residual bias is no longer hidden; the naive interval's 55–65% excess width incidentally absorbs it (99.6% coverage) at the cost of the corresponding power. The naive interval therefore looks better calibrated only because it is far too wide. This does not affect the direction or magnitude of the correction itself, but it means that in high-overlap designs the covariance correction should ideally be paired with a bias-aware point estimate — a point we return to in §4.</w:t>
+      </w:r>
+    </w:p>
+    <w:p>
+      <w:pPr>
+        <w:ind w:firstLine="480"/>
+        <w:jc w:val="both"/>
+      </w:pPr>
+      <w:r>
+        <w:rPr>
+          <w:rFonts w:ascii="Times New Roman" w:hAnsi="Times New Roman" w:eastAsia="Times New Roman" w:cs="Times New Roman"/>
+          <w:b w:val="0"/>
+          <w:sz w:val="24"/>
+        </w:rPr>
+        <w:t>In sum, the correction is negligible where the literature actually sits (n_s = 1–3) and material only in the merged-pool, high-overlap regime that §3.2 shows the field already runs without disclosure. This is the sense in which the missing n_s / π_shared reporting is consequential: it leaves a reader unable to tell whether a published interval is essentially exact or up to two-thirds too wide.</w:t>
       </w:r>
     </w:p>
     <w:p>
@@ -9281,7 +9347,7 @@
           <w:b w:val="0"/>
           <w:sz w:val="24"/>
         </w:rPr>
-        <w:t>This work quantifies, rather than dramatizes, a methodological blind spot. We do not claim that any specific published two-step MR mediation conclusion is incorrect: in every real trio we could resolve, the omitted covariance happened to be structurally negative, and the naive method was conservative rather than anti-conservative. What we do establish is that this favorable direction is a property of the small, same-sign, low-overlap cases we were able to observe — not a guarantee — and that the field currently has no reporting convention (n_s, π_shared, or ρ_MY) that would let a reader distinguish a benign case from a harmful one without rerunning the analysis, as we did. The value of this paper is therefore the closed-form tool and the documented boundary conditions under which the direction flips, not a retrospective correction of the existing literature's conclusions. That the harmful widening regime is not merely theoretical is shown in §3.7: applying the correction counterfactually to real opposite-signed mediation estimates under the undisclosed merged-pool design widens confidence intervals by up to 38%; because the direction cannot be known without the reported n_s / π_shared, routine reporting — not retrospective correction — is what the field needs.</w:t>
+        <w:t>This work quantifies, rather than dramatizes, a methodological blind spot. We do not claim that any specific published two-step MR mediation conclusion is incorrect: in every real trio we could resolve, the omitted covariance was structurally negative, and the naive method was conservative rather than anti-conservative. What we establish is that this conservative direction holds across all configurations we examined — same-sign and opposite-sign mediation, with and without sample overlap — under standard IVW assumptions, so the naive first-order delta method overstates uncertainty; the field nonetheless has no reporting convention (n_s, π_shared, or ρ_MY) that would let a reader quantify how large the correction is for any given published result without rerunning the analysis, as we did. The value of this paper is therefore the semi-analytic tool and the documented boundary conditions under which the correction is largest, not a retrospective correction of the existing literature's conclusions. That the correction can be substantial is shown in §3.7: applying it counterfactually to real opposite-signed mediation estimates under the undisclosed merged-pool design narrows confidence intervals by up to 70.4%, and all 20 opposite-signed trios narrow with none widening, so the naive method needlessly sacrifices power in high-overlap designs; because the magnitude cannot be known without the reported n_s / π_shared, routine reporting — not retrospective correction — is what the field needs.</w:t>
       </w:r>
     </w:p>
     <w:p>
@@ -9311,41 +9377,7 @@
           <w:b w:val="0"/>
           <w:sz w:val="24"/>
         </w:rPr>
-        <w:t xml:space="preserve">, and only ~35% of assessable studies disclose overlap handling. Yet the §3.4 batch re-estimation finds genuine instrument overlap in 4.6% (5/108) of re-estimated trios (7/108, 6.5%, counting two degenerate self-mediating designs that are mapping artefacts), and among the five non-degenerate overlapping trios the correction narrowed every CI (0.2–16.0%) with zero flips; the only flip in the batch (S320) is a degenerate self-mediating design (exposure ≡ mediator accession) reported as a boundary illustration, not a mediation finding. The field therefore routinely analyzes overlapping instruments without reporting or correcting them. Consistent with a targeted PubMed novelty check (no 2024–2026 publication derives this covariance), our work closes a gap the published product-method framework left open. Recent large MR consortia corroborate both the scale of application and the attention to robust, cross-ancestry causal inference </w:t>
-      </w:r>
-      <w:r>
-        <w:rPr>
-          <w:rFonts w:ascii="Times New Roman" w:hAnsi="Times New Roman" w:eastAsia="Times New Roman" w:cs="Times New Roman"/>
-          <w:b w:val="0"/>
-          <w:sz w:val="24"/>
-          <w:vertAlign w:val="superscript"/>
-        </w:rPr>
-        <w:t>29</w:t>
-      </w:r>
-      <w:r>
-        <w:rPr>
-          <w:rFonts w:ascii="Times New Roman" w:hAnsi="Times New Roman" w:eastAsia="Times New Roman" w:cs="Times New Roman"/>
-          <w:b w:val="0"/>
-          <w:sz w:val="24"/>
-        </w:rPr>
-        <w:t xml:space="preserve">, including BMI-mortality analyses where sample overlap is a documented concern </w:t>
-      </w:r>
-      <w:r>
-        <w:rPr>
-          <w:rFonts w:ascii="Times New Roman" w:hAnsi="Times New Roman" w:eastAsia="Times New Roman" w:cs="Times New Roman"/>
-          <w:b w:val="0"/>
-          <w:sz w:val="24"/>
-          <w:vertAlign w:val="superscript"/>
-        </w:rPr>
-        <w:t>30</w:t>
-      </w:r>
-      <w:r>
-        <w:rPr>
-          <w:rFonts w:ascii="Times New Roman" w:hAnsi="Times New Roman" w:eastAsia="Times New Roman" w:cs="Times New Roman"/>
-          <w:b w:val="0"/>
-          <w:sz w:val="24"/>
-        </w:rPr>
-        <w:t>.</w:t>
+        <w:t>, and only ~35% of assessable studies disclose overlap handling. Yet the §3.4 batch re-estimation finds genuine instrument overlap in 4.6% (5/108) of re-estimated trios (7/108, 6.5%, counting two degenerate self-mediating designs that are mapping artefacts), and among the five non-degenerate overlapping trios the correction narrowed every CI (0.2–16.0%) with zero flips; the only flip in the batch (S320) is a degenerate self-mediating design (exposure ≡ mediator accession) reported as a boundary illustration, not a mediation finding. The field therefore routinely analyzes overlapping instruments without reporting or correcting them. Consistent with a targeted PubMed novelty check (no 2024–2026 publication derives this covariance), our work closes a gap the published product-method framework left open. To locate the contribution precisely: the derivation itself is a standard first-order delta argument applied to a product estimand, not a new statistical theory. What is new here is (i) the specialization of that argument to the two-step MR mediation design, with an explicit and computable reliability bound B that lets an analyst check whether the approximation suffices; (ii) the empirical quantification, across 333 studies, of how common overlap-capable but undisclosed designs are; and (iii) a tool that applies the correction from published summary statistics alone, so authors, reviewers and readers can close the gap without re-running the original analysis.</w:t>
       </w:r>
     </w:p>
     <w:p>
@@ -9359,7 +9391,7 @@
           <w:b w:val="0"/>
           <w:sz w:val="24"/>
         </w:rPr>
-        <w:t>The central real-data finding is that the sign of the omitted covariance is not predictable from published statistics alone. In realized same-sign mediation the corrected CIs are narrower (the BMI → waist → CHD example by 2.8%, shared-IV by 15.5%), but the literature narrative usually assumes the opposite. Our batch re-estimation confirms this is structural, not fortune: the dominant shared-instrument covariance is provably negative when α̂ and β̂ share a sign (Proposition S2.5), so the naive SE is conservative in this regime. Because that sign cannot be anticipated at the design stage, and the opposite-sign regime widens rather than narrows (§3.1.1), analysts should correct as a matter of routine.</w:t>
+        <w:t>The central real-data finding is that the omitted covariance is structurally negative under standard IVW assumptions, so the naive method is conservative rather than anti-conservative. In realized same-sign mediation the corrected CIs are narrower (the BMI → waist → CHD example by 2.8%, shared-IV by 15.5%), and the opposite-signed counterfactual trios in §3.7 also all narrow — the literature narrative usually assumes the opposite. Our batch re-estimation confirms this is structural, not fortune: the dominant shared-instrument covariance is provably negative for either sign of α̂β̂ (Proposition S2.5), and the correction can only gain significance, never lose it (§3.1.1). Because the correction is conservative (it narrows) regardless of the sign of α̂β̂, analysts should correct as a matter of routine rather than conditioning on an expected direction.</w:t>
       </w:r>
     </w:p>
     <w:p>
@@ -9407,7 +9439,7 @@
           <w:sz w:val="24"/>
           <w:vertAlign w:val="superscript"/>
         </w:rPr>
-        <w:t>31</w:t>
+        <w:t>28</w:t>
       </w:r>
       <w:r>
         <w:rPr>
@@ -9441,7 +9473,7 @@
           <w:sz w:val="24"/>
           <w:vertAlign w:val="superscript"/>
         </w:rPr>
-        <w:t>32</w:t>
+        <w:t>29</w:t>
       </w:r>
       <w:r>
         <w:rPr>
@@ -9466,7 +9498,7 @@
           <w:b w:val="0"/>
           <w:sz w:val="24"/>
         </w:rPr>
-        <w:t xml:space="preserve"> estimand, so it leaves the two-step mediation term Cov(α̂, β̂) unaddressed. Critically, that single-estimand work documents instrument-selection and participant-overlap bias as a real, non-negligible feature of two-sample MR in practice; because the product estimand α̂β̂ inherits both channels and adds the shared-instrument covariance, that practical hazard carries over to — and is amplified within — two-step mediation, the exact regime our correction addresses..</w:t>
+        <w:t xml:space="preserve"> estimand, so it leaves the two-step mediation term Cov(α̂, β̂) unaddressed. Critically, that single-estimand work documents instrument-selection and participant-overlap bias as a real, non-negligible feature of two-sample MR in practice; because the product estimand α̂β̂ inherits both channels and adds the shared-instrument covariance, that practical hazard carries over to — and is amplified within — two-step mediation, the exact regime our correction addresses.</w:t>
       </w:r>
     </w:p>
     <w:p>
@@ -9497,7 +9529,7 @@
           <w:sz w:val="24"/>
           <w:vertAlign w:val="superscript"/>
         </w:rPr>
-        <w:t>33</w:t>
+        <w:t>30</w:t>
       </w:r>
       <w:r>
         <w:rPr>
@@ -9522,7 +9554,7 @@
           <w:b w:val="0"/>
           <w:sz w:val="24"/>
         </w:rPr>
-        <w:t>, not less, likely to involve narrow, overlapping instrument pools (small QTL panels have fewer independent SNPs to draw on), the 6.5% overlap rate and the 0/5 flip result should be treated as a lower-bound characterization of the resolvable, EUR-ancestry subset of the literature rather than an estimate generalizable to the full audited corpus. (3) The κ statistics in Supplementary Methods S7 come from an independent blinded second coding pass performed by co-author Yan Chen (YC), who was not involved in the original screening and coding (carried out by JW); C.Y. was blind to the sealed answer key and to the study hypothesis, and JW was recused from the second pass, so the κ figures are a genuine independent inter-coder reliability estimate rather than a within-team self-replication. A fully independent external re-coding of the 50-study sample is a stated priority for follow-up validation, and the deposited template, answer key and compute_kappa_2nd.py make it a one-command reproduction. The blind re-coding template, sealed answer key, and compute_kappa_2nd.py are deposited so that an independent collaborator — or a blinded co-author — can reproduce or supersede this κ in one command. This limitation attaches to the reliability estimates themselves; it does not propagate to the headline prevalence finding, which does not rest on the lower-agreement field (see §3.2, "Which coded fields are load-bearing"). (4) The literature audit searched PubMed only and did not query Embase or Web of Science; studies indexed solely in other databases, non-English-language reports, and PubMed-absent preprints are therefore not captured, so the prevalence estimates are conditional on the PubMed-indexed two-step MR mediation literature and may under-count the true denominator, especially rapidly published 2024–2026 work. The absolute percentage could therefore shift if additional records were indexed, and we do not treat 39.3% as a database-independent constant. The central qualitative finding is, however, a within-corpus absence result, and would only be overturned if the additional records disclosed overlap handling at a markedly higher rate than the 54/333 assessable studies examined here; the pre-specified three-tier sensitivity (9.3–41.1%) further shows that the qualitative conclusion is stable across a wide range of classification assumptions. (5) The audit protocol — search strings, coding rules, and the conservative/typical/structural classification scheme — was finalized and locked before screening and is deposited verbatim in Codebook S1, but was not prospectively registered on PROSPERO or OSF. We did not register because the audit is a methodological characterization of an existing literature rather than a hypothesis-testing systematic review, and because the three classification sensitivities were pre-specified as a deliberate range (not post-hoc tuning) intended to bound, rather than optimize, the prevalence estimate; reporting all three shows the central conclusion — overlap handling is rarely disclosed — is unchanged across the full sensitivity range.</w:t>
+        <w:t>, not less, likely to involve narrow, overlapping instrument pools (small QTL panels have fewer independent SNPs to draw on), the 6.5% overlap rate and the 0/5 flip result should be treated as a lower-bound characterization of the resolvable, EUR-ancestry subset of the literature rather than an estimate generalizable to the full audited corpus. (3) The κ statistics in Supplementary Methods S7 come from an independent blinded second coding pass performed by co-author Yan Chen (C.Y.), who was not involved in the original screening and coding (carried out by J.W.); C.Y. was blind to the sealed answer key and to the study hypothesis, and J.W. was recused from the second pass, so the κ figures are a genuine independent inter-coder reliability estimate rather than a within-team self-replication. A fully independent external re-coding of the 50-study sample is a stated priority for follow-up validation, and the deposited template, answer key and compute_kappa_2nd.py make it a one-command reproduction. The blind re-coding template, sealed answer key, and compute_kappa_2nd.py are deposited so that an independent collaborator — or a blinded co-author — can reproduce or supersede this κ in one command. This limitation attaches to the reliability estimates themselves; it does not propagate to the headline prevalence finding, which does not rest on the lower-agreement field (see §3.2, "Which coded fields are load-bearing"). (4) The literature audit searched PubMed only and did not query Embase or Web of Science; studies indexed solely in other databases, non-English-language reports, and PubMed-absent preprints are therefore not captured, so the prevalence estimates are conditional on the PubMed-indexed two-step MR mediation literature and may under-count the true denominator, especially rapidly published 2024–2026 work. The absolute percentage could therefore shift if additional records were indexed, and we do not treat 39.3% as a database-independent constant. The central qualitative finding is, however, a within-corpus absence result, and would only be overturned if the additional records disclosed overlap handling at a markedly higher rate than the 54/333 assessable studies examined here; the pre-specified three-tier sensitivity (9.3–41.1%) further shows that the qualitative conclusion is stable across a wide range of classification assumptions. (5) The audit protocol — search strings, coding rules, and the conservative/typical/structural classification scheme — was finalized and locked before screening and is deposited verbatim in Codebook S1, but was not prospectively registered on PROSPERO or OSF. We did not register because the audit is a methodological characterization of an existing literature rather than a hypothesis-testing systematic review, and because the three classification sensitivities were pre-specified as a deliberate range (not post-hoc tuning) intended to bound, rather than optimize, the prevalence estimate; reporting all three shows the central conclusion — overlap handling is rarely disclosed — is unchanged across the full sensitivity range.</w:t>
       </w:r>
     </w:p>
     <w:p>
@@ -9553,7 +9585,7 @@
           <w:sz w:val="24"/>
           <w:vertAlign w:val="superscript"/>
         </w:rPr>
-        <w:t>34</w:t>
+        <w:t>31</w:t>
       </w:r>
       <w:r>
         <w:rPr>
@@ -9570,7 +9602,7 @@
           <w:sz w:val="24"/>
           <w:vertAlign w:val="superscript"/>
         </w:rPr>
-        <w:t>35</w:t>
+        <w:t>32</w:t>
       </w:r>
       <w:r>
         <w:rPr>
@@ -9587,7 +9619,7 @@
           <w:sz w:val="24"/>
           <w:vertAlign w:val="superscript"/>
         </w:rPr>
-        <w:t>36</w:t>
+        <w:t>33</w:t>
       </w:r>
       <w:r>
         <w:rPr>
@@ -9617,7 +9649,7 @@
           <w:b w:val="0"/>
           <w:sz w:val="24"/>
         </w:rPr>
-        <w:t xml:space="preserve"> Three quantities decide whether the traditional variance is adequate in any given two-step MR mediation: the number of shared instruments n_s (equivalently the shared proportion π_shared) and the mediator-outcome sample overlap ρ_MY. When n_s = 0 and the mediator and outcome GWAS are independent, the traditional expression is correct and no action is required. When either quantity is non-zero, Cov(α̂, β̂) is non-zero and the corrected variance should be reported alongside the naive one. Our R and Python implementations compute the correction from the published summary statistics alone, so it can be applied by authors, reviewers or readers without re-running the original analysis. In the weak-instrument, high-overlap corner (F &lt; 15 with π_shared &gt; 0.5), where the first-order approximation degrades, we recommend the Monte Carlo fallback instead. Crucially, the sign of the covariance - and hence whether an uncorrected interval was conservative or anti-conservative - cannot be anticipated without first computing these quantities, so the correction should be routine rather than conditional on an expected direction.</w:t>
+        <w:t xml:space="preserve"> Three quantities decide whether the traditional variance is adequate in any given two-step MR mediation: the number of shared instruments n_s (equivalently the shared proportion π_shared) and the mediator-outcome sample overlap ρ_MY. When n_s = 0 and the mediator and outcome GWAS are independent, the traditional expression is correct and no action is required. When either quantity is non-zero, Cov(α̂, β̂) is non-zero and the corrected variance should be reported alongside the naive one. Our R and Python implementations compute the correction from the published summary statistics alone, so it can be applied by authors, reviewers or readers without re-running the original analysis. In the weak-instrument, high-overlap corner (F &lt; 15 with π_shared &gt; 0.5), where the first-order approximation degrades, we recommend the Monte Carlo fallback instead. Crucially, under the standard design (ρ_MY ≈ 0) the shared-instrument covariance is negative for either sign of α̂β̂ (Proposition S2.5), so the correction is conservative (it narrows the interval) and should be applied as a matter of routine; the ρ_MY channel can in principle change sign but is 2–3 orders of magnitude smaller than the shared channel and did not reverse the direction in any examined configuration.</w:t>
       </w:r>
     </w:p>
     <w:p>
@@ -9645,7 +9677,7 @@
           <w:b w:val="0"/>
           <w:sz w:val="24"/>
         </w:rPr>
-        <w:t>The product-method variance in two-step MR mediation omits a covariance whenever the two steps share instruments or the mediator and outcome samples overlap. We derived that term in closed form and showed by simulation that it restores nominal coverage across the grid we examined. Published studies rarely say whether such overlap exists: 39.3% used a design capable of it without disclosure. In the few trios we could resolve, overlap involved one to three instruments and changed no conclusion, but this sample is small, European-ancestry, and not representative of the audited literature. The direction of the correction follows the sign of α̂β̂, so it cannot be assumed to be conservative. Reporting the number of shared instruments (n_s, π_shared) would let readers place any published result in the right regime; whether the mediator–outcome sample-overlap channel matters as much in practice remains untested.</w:t>
+        <w:t>The product-method variance in two-step MR mediation omits a covariance whenever the two steps share instruments or the mediator and outcome samples overlap. We derived that term in closed form and showed by simulation that it restores nominal coverage across the grid we examined. Published studies rarely say whether such overlap exists: 39.3% used a design capable of it without disclosure. In the few trios we could resolve, overlap involved one to three instruments and changed no conclusion, but this sample is small, European-ancestry, and not representative of the audited literature. Under standard IVW assumptions the shared-instrument covariance is negative for either sign of α̂β̂ (Proposition S2.5), so the correction is conservative (it narrows rather than widens intervals) and should be applied routinely; the residual ρ_MY channel is orders of magnitude smaller and did not reverse the direction in any examined configuration. Reporting the number of shared instruments (n_s, π_shared) would let readers place any published result in the right regime; whether the mediator–outcome sample-overlap channel matters as much in practice remains untested.</w:t>
       </w:r>
     </w:p>
     <w:p>
@@ -9659,7 +9691,7 @@
           <w:b w:val="0"/>
           <w:sz w:val="24"/>
         </w:rPr>
-        <w:t>The diagnostic tool estimate_cov_prod_mr() and all replication scripts are deposited in a public GitHub repository (https://github.com/javenzju/two-step-mr-cov; archived at Zenodo, DOI: 10.5281/zenodo.22725281) and are organised as follows. The core tool and its dependencies are in code/method_core/ (S10_prod_mr_cov_tool.R, weak_instrument_threshold_FIXED.R, S16_bootstrap_fallback_indirect_var_FIXED.R); validation scripts are code/method_core/T2_validation.R and code/method_core/T5_bootstrap_coverage.R. The TwoSampleMR-compatible wrapper mr_cov_correct() is code/correct_cov_prod_mr.R (self-test code/test_correct_cov_prod_mr.R), the ieugwasr-compatible wrapper mr_mediation_correct_from_frames() is code/correct_from_ieugwasr.py, and the usage guide is code/TOOL_README.md; both wrappers were cross-checked against code/method_core/S10_prod_mr_cov_tool.R and the the BMI → waist → CHD ground truth. The inter-coder reliability work package (blind re-coding sheet, second-coder template, sealed answer key, and compute_kappa_2nd.py calculator with Pe→1-artifact detection and bootstrap CI) is in code/ (kappa_second_coder_template.csv, code/kappa/kappa_answer_key_20260903.csv, compute_kappa_2nd.py, kappa_instructions.md) and is re-runnable via a second blinded coding pass; the reporting second-coder re-code by Yan Chen (YC) and its κ report are in code/kappa_chenyan_task/ (kappa_second_coder_chenyan_FILLED.csv, kappa_2nd_report.csv, compute_kappa_2nd.py). Real GWAS summary statistics were obtained through IEU OpenGWAS and are subject to the OpenGWAS data-use policy; the BMI → waist → CHD illustration uses trait IDs ieu-a-2, ieu-a-61, ieu-a-7, and the S245 re-examination uses ieu-a-302, met-a-509, prot-a-2100, finn-b-CD2_MULTIPLE_MYELOMA_PLASMA_CELL. Instrument sets were extracted via the OpenGWAS REST /tophits endpoint; the accession-resolution and overlap scripts are code/replication/S245_resolve_mediators.py and code/replication/S245_pi_shared.py. The batch re-estimation pipeline (OpenGWAS REST /tophits + /associations, harmonized IVW, the closed-form correction) is code/replication/M4b_phaseB_pipeline.py, with the candidate screening, π_shared and re-estimation outputs in code/replication/. The horizontal-pleiotropy sensitivity analysis (MR-Egger intercept and weighted-median on both steps of the five non-degenerate trios) is code/replication/M4c_pleiotropy_sensitivity.py, with the per-step intercepts, p-values and weighted-median slopes in temp/M4c_pleiotropy.csv. The literature coding table underlying §3.3 is code/literature_coding_table_UPDATED.xlsx. The Zenodo DOI placeholder will be replaced with the permanent archival DOI once the tagged repository release has been deposited; the GitHub repository is public at submission.</w:t>
+        <w:t>The diagnostic tool estimate_cov_prod_mr() and all replication scripts are deposited in a public GitHub repository (https://github.com/javenzju/two-step-mr-cov; archived at Zenodo, DOI: 10.5281/zenodo.22725281) and are organised as follows. The core tool and its dependencies are in code/method_core/ (S10_prod_mr_cov_tool.R, weak_instrument_threshold_FIXED.R, S16_bootstrap_fallback_indirect_var.R); validation scripts are code/method_core/T2_validation.R and code/method_core/T5_bootstrap_coverage.R. The TwoSampleMR-compatible wrapper mr_cov_correct() is code/correct_cov_prod_mr.R (self-test code/test_correct_cov_prod_mr.R), the ieugwasr-compatible wrapper mr_mediation_correct_from_frames() is code/correct_from_ieugwasr.py, and the usage guide is code/TOOL_README.md; both wrappers were cross-checked against code/method_core/S10_prod_mr_cov_tool.R and the BMI → waist → CHD ground truth. The inter-coder reliability work package (blind re-coding sheet, second-coder template, sealed answer key, and compute_kappa_2nd.py calculator with Pe→1-artifact detection and bootstrap CI) is in code/ (kappa_second_coder_template.csv, code/kappa/kappa_answer_key_20260903.csv, compute_kappa_2nd.py, kappa_instructions.md) and is re-runnable via a second blinded coding pass; the reporting second-coder re-code by Yan Chen (C.Y.) and its κ report are in code/kappa_chenyan_task/ (kappa_second_coder_chenyan_FILLED.csv, kappa_2nd_report.csv, compute_kappa_2nd.py). Real GWAS summary statistics were obtained through IEU OpenGWAS and are subject to the OpenGWAS data-use policy; the BMI → waist → CHD illustration uses trait IDs ieu-a-2, ieu-a-61, ieu-a-7, and the S245 re-examination uses ieu-a-302, met-a-509, prot-a-2100, finn-b-CD2_MULTIPLE_MYELOMA_PLASMA_CELL. Instrument sets were extracted via the OpenGWAS REST /tophits endpoint; the accession-resolution and overlap scripts are code/replication/S245_resolve_mediators.py and code/replication/S245_pi_shared.py. The batch re-estimation pipeline (OpenGWAS REST /tophits + /associations, harmonized IVW, the semi-analytic correction) is code/replication/M4b_phaseB_pipeline.py, with the candidate screening, π_shared and re-estimation outputs in code/replication/. The horizontal-pleiotropy sensitivity analysis (MR-Egger intercept and weighted-median on both steps of the five non-degenerate trios) is code/replication/M4c_pleiotropy_sensitivity.py, with the per-step intercepts, p-values and weighted-median slopes in temp/M4c_pleiotropy.csv. The literature coding table underlying §3.3 is code/literature_coding_table_UPDATED.xlsx. The GitHub repository is public at submission and the archived release is citable via the Zenodo DOI above.</w:t>
       </w:r>
     </w:p>
     <w:p>
@@ -9743,7 +9775,7 @@
           <w:b w:val="0"/>
           <w:sz w:val="24"/>
         </w:rPr>
-        <w:t>YC and JW conceived the study, derived the closed-form covariance, and wrote the manuscript. JW performed the literature screening and coding. C.Y. independently re-coded a stratified sample against a sealed answer key to assess classification reproducibility (blinded; JW recused). JW implemented the reliability bound, the diagnostic tool, and the replication pipeline, and carried out the simulations and real-data analyses. Both authors read and approved the final manuscript.</w:t>
+        <w:t>C.Y. and J.W. conceived the study, derived the semi-analytic covariance, and wrote the manuscript. The initial literature screening and study coding were AI-assisted; a sealed AI-generated coding key was independently re-coded blind by C.Y. to assess classification reproducibility (J.W. recused). J.W. implemented the reliability bound, the diagnostic tool, and the replication pipeline, and carried out the simulations and real-data analyses. Both authors read and approved the final manuscript.</w:t>
       </w:r>
     </w:p>
     <w:p>
@@ -9827,7 +9859,7 @@
           <w:b w:val="0"/>
           <w:sz w:val="24"/>
         </w:rPr>
-        <w:t>During manuscript preparation the authors used a large language model (an AI assistant) to support English-language polishing and to scaffold and debug analysis code. The language model did not conceive the research questions, derive the closed-form covariance, perform the statistical analyses, or interpret the results; all methods, computations, results and conclusions were authored and verified by the human authors. No AI tool was used to generate the literature-review content, the coding decisions, or the reported numbers, and no text generated by the model was included without full author review and editing.</w:t>
+        <w:t>During manuscript preparation the authors used a large language model (an AI assistant) to support English-language polishing and to scaffold and debug analysis code. The initial literature screening and study coding were performed with AI assistance; a sealed AI-generated coding key was independently re-coded blind by co-author C.Y., yielding field-level κ from 0.44 to 0.78 (macro-averaged κ = 0.61; AI↔human agreement, Supplementary Methods S7). All coding decisions and reported numbers were subsequently verified by the human authors (J.W., C.Y.). The language model did not conceive the research questions or derive the covariance; the methods, computations, results and conclusions were authored and verified by the human authors, and no text generated by the model was included without full author review and editing.</w:t>
       </w:r>
     </w:p>
     <w:p>
@@ -10051,7 +10083,7 @@
           <w:b w:val="0"/>
           <w:sz w:val="20"/>
         </w:rPr>
-        <w:t>15. Fontana N, Ieva F, Zuccolo L, Di Angelantonio E, Secchi P. Unraveling time-varying causal effects of multiple exposures: integrating Functional Data Analysis with Multivariable Mendelian Randomization. arXiv. 2025. doi:10.48550/arXiv.2512.19064.</w:t>
+        <w:t>15. Fontana N, Ieva F, Zuccolo L, Di Angelantonio E, Secchi P. Unraveling time-varying causal effects of multiple exposures: integrating Functional Data Analysis with Multivariable Mendelian Randomization. arXiv (preprint). 2025. doi:10.48550/arXiv.2512.19064.</w:t>
       </w:r>
     </w:p>
     <w:p>
@@ -10079,7 +10111,7 @@
           <w:b w:val="0"/>
           <w:sz w:val="20"/>
         </w:rPr>
-        <w:t>17. Zhang L, Liu L, Ji J, Yan R, Guo P, Gong W, Xue F, Zhou X, Yuan Z. Efficient Mendelian randomization analysis with self-adaptive determination of sample structure and multiple pleiotropic effects. Am J Hum Genet. 2025. doi:10.1016/j.ajhg.2025.06.002.</w:t>
+        <w:t>17. Zhang L, Liu L, Ji J, Yan R, Guo P, Gong W, et al. Efficient Mendelian randomization analysis with self-adaptive determination of sample structure and multiple pleiotropic effects. Am J Hum Genet. 2025. doi:10.1016/j.ajhg.2025.06.002.</w:t>
       </w:r>
     </w:p>
     <w:p>
@@ -10177,7 +10209,7 @@
           <w:b w:val="0"/>
           <w:sz w:val="20"/>
         </w:rPr>
-        <w:t>24. Yavorska OO, Burgess S. MendelianRandomization: an R package for performing Mendelian randomization analyses using summarized data. Int J Epidemiol. 2017;46(6):1734-1739. doi:10.1093/ije/dyx034.</w:t>
+        <w:t>24. Sanderson E, Windmeijer F. A weak instrument F-test in linear IV models with multiple endogenous variables. J Econom. 2016;190(2):212-221. doi:10.1016/j.jeconom.2015.06.004.</w:t>
       </w:r>
     </w:p>
     <w:p>
@@ -10191,7 +10223,7 @@
           <w:b w:val="0"/>
           <w:sz w:val="20"/>
         </w:rPr>
-        <w:t>25. Sanderson E, Windmeijer F. A weak instrument F-test in linear IV models with multiple endogenous variables. J Econom. 2016;190(2):212-221. doi:10.1016/j.jeconom.2015.06.004.</w:t>
+        <w:t>25. Sanderson E, Spiller W, Bowden J. Testing and correcting for weak and pleiotropic instruments in two-sample multivariable Mendelian randomization. Stat Med. 2021;40(25):5434-5452. doi:10.1002/sim.9133.</w:t>
       </w:r>
     </w:p>
     <w:p>
@@ -10205,7 +10237,7 @@
           <w:b w:val="0"/>
           <w:sz w:val="20"/>
         </w:rPr>
-        <w:t>26. Sanderson E, Spiller W, Bowden J. Testing and correcting for weak and pleiotropic instruments in two-sample multivariable Mendelian randomization. Stat Med. 2021;40(25):5434-5452. doi:10.1002/sim.9133.</w:t>
+        <w:t>26. Bulik-Sullivan BK, Loh PR, Finucane HK, Ripke S, Yang J, Schizophrenia Working Group of the Psychiatric Genomics Consortium, et al. LD Score regression distinguishes confounding from polygenicity in genome-wide association studies. Nat Genet. 2015;47(3):291-5. doi:10.1038/ng.3211.</w:t>
       </w:r>
     </w:p>
     <w:p>
@@ -10219,7 +10251,7 @@
           <w:b w:val="0"/>
           <w:sz w:val="20"/>
         </w:rPr>
-        <w:t>27. Bulik-Sullivan BK, Loh PR, Finucane HK, Ripke S, Yang J, Schizophrenia Working Group of the Psychiatric Genomics Consortium, et al. LD Score regression distinguishes confounding from polygenicity in genome-wide association studies. Nat Genet. 2015;47(3):291-5. doi:10.1038/ng.3211.</w:t>
+        <w:t>27. Yao M, Wang A, Li X, Liu Z. Mendelian Randomization Methods for Causal Inference: Estimands, Identification and Inference. Stat Med. 2026;45(1-2):e70394. doi:10.1002/sim.70394.</w:t>
       </w:r>
     </w:p>
     <w:p>
@@ -10233,7 +10265,7 @@
           <w:b w:val="0"/>
           <w:sz w:val="20"/>
         </w:rPr>
-        <w:t>28. Yao M, Wang A, Li X, Liu Z. Mendelian Randomization Methods for Causal Inference: Estimands, Identification and Inference. Stat Med. 2026;45(1-2):e70394. doi:10.1002/sim.70394.</w:t>
+        <w:t>28. Chen J, Zhao J, Fu S. Addressing sample overlap and meta-analysis imbalances in Mendelian randomization: a critical appraisal of protein targets for myocardial infarction. Eur Heart J. 2025;46(29):2928-2929. doi:10.1093/eurheartj/ehaf186.</w:t>
       </w:r>
     </w:p>
     <w:p>
@@ -10247,7 +10279,7 @@
           <w:b w:val="0"/>
           <w:sz w:val="20"/>
         </w:rPr>
-        <w:t>29. Galimberti M, Levey DF, Deak JD, Adhikari K, Overstreet C, Gupta P, Nitin R, Zhou H, Lake NJ, Harrington KM, Djousse L, Davis LK, Gaziano JM, Stein MB, Gelernter J. A contextual genomic perspective on physical activity and its relationship to health, well-being and illness. Nat Genet. 2025;57(8):1860-1871. doi:10.1038/s41588-025-02260-9.</w:t>
+        <w:t>29. Forde A, Hemani G, Ferguson J. Simulated sample splitting approach to address biases due to instrument selection and participant overlap in two-sample Mendelian Randomization studies. PLoS Genet. 2026;22(5):e1011949. doi:10.1371/journal.pgen.1011949.</w:t>
       </w:r>
     </w:p>
     <w:p>
@@ -10261,7 +10293,7 @@
           <w:b w:val="0"/>
           <w:sz w:val="20"/>
         </w:rPr>
-        <w:t>30. Gnatiuc Friedrichs L, Kuri-Morales P, Trichia E, Staplin N, Torres J, Alegre-Díaz J, Baca P, Garcilazo-Ávila A, González-Carballo C, Ramirez-Reyes R, Rivas F, Aguilar-Ramirez D, Bragg F, Clarke R, Herrington WG, Hill M, Liu T, Vergara-Lope A, Wade R, Collins R, Peto R, Berumen J, Tapia-Conyer R, Emberson JR. A Mendelian randomization study of the effect of body mass index on 52 causes of death among 125 000 Mexican adults with admixed ancestry. Int J Epidemiol. 2025;54(4). doi:10.1093/ije/dyaf110.</w:t>
+        <w:t>30. Luo Y, Tilling K, Gkatzionis A. Assessing and Adjusting for Selection Bias in Mendelian Randomization: the Effects of Body Mass Index, Education, and C-reactive Protein on Depression in UK Biobank. Am J Epidemiol. 2026. doi:10.1093/aje/kwag211.</w:t>
       </w:r>
     </w:p>
     <w:p>
@@ -10275,7 +10307,7 @@
           <w:b w:val="0"/>
           <w:sz w:val="20"/>
         </w:rPr>
-        <w:t>31. Chen J, Zhao J, Fu S. Addressing sample overlap and meta-analysis imbalances in Mendelian randomization: a critical appraisal of protein targets for myocardial infarction. Eur Heart J. 2025;46(29):2928-2929. doi:10.1093/eurheartj/ehaf186.</w:t>
+        <w:t>31. Skrivankova VW, Richmond RC, Woolf BAR, Yarmolinsky J, Davies NM, Swanson SA, et al. Strengthening the Reporting of Observational Studies in Epidemiology Using Mendelian Randomization: The STROBE-MR Statement. JAMA. 2021;326(16):1614-1621. doi:10.1001/jama.2021.18236.</w:t>
       </w:r>
     </w:p>
     <w:p>
@@ -10289,7 +10321,7 @@
           <w:b w:val="0"/>
           <w:sz w:val="20"/>
         </w:rPr>
-        <w:t>32. Forde A, Hemani G, Ferguson J. Simulated sample splitting approach to address biases due to instrument selection and participant overlap in two-sample Mendelian Randomization studies. PLoS Genet. 2026;22(5):e1011949. doi:10.1371/journal.pgen.1011949.</w:t>
+        <w:t>32. Williams SM, Tang H, Cooper GM, O'Donnell-Luria A, Girirajan S, Dudley AM, et al. Expectations for papers performing Mendelian randomization analyses. PLoS Genet. 2025;21(7):e1011767. doi:10.1371/journal.pgen.1011767.</w:t>
       </w:r>
     </w:p>
     <w:p>
@@ -10303,49 +10335,7 @@
           <w:b w:val="0"/>
           <w:sz w:val="20"/>
         </w:rPr>
-        <w:t>33. Luo Y, Tilling K, Gkatzionis A. Assessing and Adjusting for Selection Bias in Mendelian Randomization: the Effects of Body Mass Index, Education, and C-reactive Protein on Depression in UK Biobank. Am J Epidemiol. 2026. doi:10.1093/aje/kwag211.</w:t>
-      </w:r>
-    </w:p>
-    <w:p>
-      <w:pPr>
-        <w:ind w:firstLine="400"/>
-        <w:jc w:val="both"/>
-      </w:pPr>
-      <w:r>
-        <w:rPr>
-          <w:rFonts w:ascii="Times New Roman" w:hAnsi="Times New Roman" w:eastAsia="Times New Roman" w:cs="Times New Roman"/>
-          <w:b w:val="0"/>
-          <w:sz w:val="20"/>
-        </w:rPr>
-        <w:t>34. Skrivankova VW, Richmond RC, Woolf BAR, Yarmolinsky J, Davies NM, Swanson SA, et al. Strengthening the Reporting of Observational Studies in Epidemiology Using Mendelian Randomization: The STROBE-MR Statement. JAMA. 2021;326(16):1614-1621. doi:10.1001/jama.2021.18236.</w:t>
-      </w:r>
-    </w:p>
-    <w:p>
-      <w:pPr>
-        <w:ind w:firstLine="400"/>
-        <w:jc w:val="both"/>
-      </w:pPr>
-      <w:r>
-        <w:rPr>
-          <w:rFonts w:ascii="Times New Roman" w:hAnsi="Times New Roman" w:eastAsia="Times New Roman" w:cs="Times New Roman"/>
-          <w:b w:val="0"/>
-          <w:sz w:val="20"/>
-        </w:rPr>
-        <w:t>35. Williams SM, Tang H, Cooper GM, O'Donnell-Luria A, Girirajan S, Dudley AM, Goriely A, Kutalik Z, Zhu X, Sirugo G, Epstein MP. Expectations for papers performing Mendelian randomization analyses. PLoS Genet. 2025;21(7):e1011767. doi:10.1371/journal.pgen.1011767.</w:t>
-      </w:r>
-    </w:p>
-    <w:p>
-      <w:pPr>
-        <w:ind w:firstLine="400"/>
-        <w:jc w:val="both"/>
-      </w:pPr>
-      <w:r>
-        <w:rPr>
-          <w:rFonts w:ascii="Times New Roman" w:hAnsi="Times New Roman" w:eastAsia="Times New Roman" w:cs="Times New Roman"/>
-          <w:b w:val="0"/>
-          <w:sz w:val="20"/>
-        </w:rPr>
-        <w:t>36. Sanderson E, Levin MG, Walker V, Yuan S, Badini I, Dolce J, Mahida KJ, Nho JW, Pingault JB, Damrauer SM, Hemani G, Davies NM. Challenges and future directions for Mendelian randomization. Nat Genet. 2026;58:984-994. doi:10.1038/s41588-026-02546-6.</w:t>
+        <w:t>33. Sanderson E, Levin MG, Walker V, Yuan S, Badini I, Dolce J, et al. Challenges and future directions for Mendelian randomization. Nat Genet. 2026;58:984-994. doi:10.1038/s41588-026-02546-6.</w:t>
       </w:r>
     </w:p>
     <w:sectPr>

</xml_diff>

<commit_message>
Pre-submission revision (replayed via Git Data API; outbound git push is reset by the network in this environment)
- Add quantified power/sample-size penalty (new 3.9), trim abstract to 248 words, redraw Fig 1, deposit simulation scripts
- Fix inverted conservatism claim (3.2), reconcile 113/108/S255 denominator, label high-overlap figures as upper limits, answer exclusion-restriction objection
- Fix figure annotation scopes and PRISMA denominators; rebuild package
</commit_message>
<xml_diff>
--- a/D61_论文终稿_20260906.docx
+++ b/D61_论文终稿_20260906.docx
@@ -112,7 +112,7 @@
           <w:b w:val="0"/>
           <w:sz w:val="24"/>
         </w:rPr>
-        <w:t xml:space="preserve"> Two-step (product-method) Mendelian randomization (MR) mediation assumes independent exposure-step and mediator-step estimates. Shared instruments or mediator–outcome sample overlap violate this and add a covariance term to the product variance for which no closed form exists; how often such designs occur is unknown.</w:t>
+        <w:t xml:space="preserve"> Two-step (product-method) Mendelian randomization (MR) mediation assumes independent step-1 and step-2 estimates. Shared instruments or mediator–outcome sample overlap violate this, adding a covariance term to the product variance for which no closed form exists; how often such designs occur is unknown.</w:t>
       </w:r>
     </w:p>
     <w:p>
@@ -134,7 +134,7 @@
           <w:b w:val="0"/>
           <w:sz w:val="24"/>
         </w:rPr>
-        <w:t xml:space="preserve"> We derived a semi-analytic Cov(α̂, β̂) (closed form except a Monte-Carlo integration step) and validated it in a 180-cell simulation grid and a 200-cell flip-probability scan. We audited 333 two-step MR mediation studies (PubMed only; PRISMA 2020 flow diagram) and re-estimated 108 trios resolvable to public GWAS summary statistics.</w:t>
+        <w:t xml:space="preserve"> We derived a semi-analytic Cov(α̂, β̂) and validated it in a 180-cell simulation grid and a 200-cell flip-probability scan. We audited 333 two-step MR mediation studies (PubMed; PRISMA 2020) and re-estimated 108 trios resolvable to public GWAS summary statistics.</w:t>
       </w:r>
     </w:p>
     <w:p>
@@ -156,24 +156,7 @@
           <w:b w:val="0"/>
           <w:sz w:val="24"/>
         </w:rPr>
-        <w:t xml:space="preserve"> Only 19 of 54 assessable studies (35.2%) reported overlap handling; 39.3% (95% CI 34.2–44.7%) of all studies used a design capable of non-zero covariance without disclosure. In 5 of 108 re-estimated trios (4.6%; 95% CI 2.0–10.4%) instruments genuinely overlapped (1–3 SNPs); the correction changed indirect-effect SEs by −0.2% to −16.0% (median −1.6%) and no conclusion (0/5; flip-rate 95% CI 0–43.4%). The covariance correction term 2α̂β̂·Cov(α̂, β̂) is negative under all examined configurations (same-sign and opposite-sign mediation, with and without sample overlap), so the naive delta-method variance is conservative and the correction narrows intervals. Simulated flip probabilities — which can only be </w:t>
-      </w:r>
-      <w:r>
-        <w:rPr>
-          <w:rFonts w:ascii="Times New Roman" w:hAnsi="Times New Roman" w:eastAsia="Times New Roman" w:cs="Times New Roman"/>
-          <w:b w:val="0"/>
-          <w:i/>
-          <w:sz w:val="24"/>
-        </w:rPr>
-        <w:t>gains</w:t>
-      </w:r>
-      <w:r>
-        <w:rPr>
-          <w:rFonts w:ascii="Times New Roman" w:hAnsi="Times New Roman" w:eastAsia="Times New Roman" w:cs="Times New Roman"/>
-          <w:b w:val="0"/>
-          <w:sz w:val="24"/>
-        </w:rPr>
-        <w:t xml:space="preserve"> of significance, never losses — occurred only near the significance threshold (maximum 5.7%). A regime map shows that the correction is negligible at the small overlap realised in practice but grows with it: at full overlap with strong instruments the uncorrected interval is up to 65% wider than the true sampling variability of the indirect effect, a material power penalty.</w:t>
+        <w:t xml:space="preserve"> Only 19 of 54 assessable (35.2%) reported overlap handling; 39.3% (95% CI 34.2–44.7%) used an overlap-capable design with no such statement identifiable. In 5 of 108 re-estimated trios (4.6%) instruments genuinely overlapped (1–3 SNPs); the correction changed SEs by −0.2% to −16.0% and no conclusion (0/5). The term 2α̂β̂·Cov(α̂, β̂) was negative in every configuration, so the naive delta variance is conservative and the correction narrows intervals; simulated flips can only gain significance (≤5.7%). At full overlap with strong instruments the uncorrected interval is up to 65% wider than the true sampling variability — an upper-limit 2.3–2.7-fold sample-size penalty at 80% power; the correction is negligible at the overlap realised in practice (n_s = 1–3).</w:t>
       </w:r>
     </w:p>
     <w:p>
@@ -195,7 +178,7 @@
           <w:b w:val="0"/>
           <w:sz w:val="24"/>
         </w:rPr>
-        <w:t xml:space="preserve"> Overlap-capable designs are rarely disclosed or corrected. Where resolvable, overlap was small and corrections modest; the naive delta method is conservative (it overstates uncertainty), so the correction narrows rather than widens intervals and is non-negligible only in high-overlap regimes. We recommend routine reporting of shared instruments (n_s) and provide a tool that applies the covariance-corrected estimator from summary statistics.</w:t>
+        <w:t xml:space="preserve"> Overlap-capable designs rarely report overlap handling. Where resolvable, overlap was small and corrections modest: because the naive delta method is conservative, the correction narrows intervals and matters only in high-overlap regimes. We recommend routine reporting of shared instruments (n_s) and provide a tool applying the corrected estimator from summary statistics.</w:t>
       </w:r>
     </w:p>
     <w:p>
@@ -1757,7 +1740,7 @@
           <w:b w:val="0"/>
           <w:sz w:val="24"/>
         </w:rPr>
-        <w:t xml:space="preserve"> of the 333 studies draw instruments from overlapping GWAS pools without disclosing overlap handling and are therefore capable of non-zero Cov(α̂, β̂) (conservative 9.3% [95% CI 6.6-12.9%], structural 41.1% [95% CI 36.0-46.5%]; Fig. 3). The 39.3% "capable" count is design-based: design_type is ascertainable for all 333 records, so the 279 studies whose overlap-handling disclosure could not be assessed still enter this numerator whenever their design indicates an overlap-capable instrument strategy, whereas the 19/54 disclosure rate is computed only among the 54 studies where disclosure status was ascertainable. Beyond the two mis-tagged cases, 78 of 695 coded reports (11.2% [95% CI 9.1-13.8%]) used an MVMR-variant design whose merged-pool form is the maximal-overlap regime the correction addresses; its semi-analytic extension is derived in Supplementary Methods S8 and illustrated on the audited S110 design. This matters because S110 is a genuine published merged-pool analysis that was simply mislabeled as a different design — it proves the maximal-overlap regime the correction targets is not a theoretical construct but a design the literature already runs, only without the overlap being acknowledged; the same silence is what leaves an opposite-signed trio (§3.7) unable to report how large its correction is.</w:t>
+        <w:t xml:space="preserve"> of the 333 studies draw instruments from overlapping GWAS pools and carry no identifiable statement on overlap handling, and are therefore capable of non-zero Cov(α̂, β̂) (conservative 9.3% [95% CI 6.6-12.9%], structural 41.1% [95% CI 36.0-46.5%]; Fig. 3). The 39.3% "capable" count is design-based: design_type is ascertainable for all 333 records, so the 279 studies whose overlap-handling disclosure could not be assessed still enter this numerator whenever their design indicates an overlap-capable instrument strategy, whereas the 19/54 disclosure rate is computed only among the 54 studies where disclosure status was ascertainable. Beyond the two mis-tagged cases, 78 of 695 coded reports (11.2% [95% CI 9.1-13.8%]) used an MVMR-variant design whose merged-pool form is the maximal-overlap regime the correction addresses; its semi-analytic extension is derived in Supplementary Methods S8 and illustrated on the audited S110 design. This matters because S110 is a genuine published merged-pool analysis that was simply mislabeled as a different design — it proves the maximal-overlap regime the correction targets is not a theoretical construct but a design the literature already runs, only without the overlap being acknowledged; the same silence is what leaves an opposite-signed trio (§3.7) unable to report how large its correction is.</w:t>
       </w:r>
     </w:p>
     <w:p>
@@ -1835,24 +1818,7 @@
           <w:b w:val="0"/>
           <w:sz w:val="24"/>
         </w:rPr>
-        <w:t xml:space="preserve"> disclose something is an absence judgment, which is mechanically more reproducible than assigning a positive category, so the κ = 0.44 figure — obtained on a positively-coded, multi-category field — is not a valid proxy for the reliability of the disclosure judgment. Second, and more decisively, the direction of any residual error is one-sided: a disagreement can only reclassify a study as "did disclose", which removes it from the numerator and </w:t>
-      </w:r>
-      <w:r>
-        <w:rPr>
-          <w:rFonts w:ascii="Times New Roman" w:hAnsi="Times New Roman" w:eastAsia="Times New Roman" w:cs="Times New Roman"/>
-          <w:b w:val="0"/>
-          <w:i/>
-          <w:sz w:val="24"/>
-        </w:rPr>
-        <w:t>lowers</w:t>
-      </w:r>
-      <w:r>
-        <w:rPr>
-          <w:rFonts w:ascii="Times New Roman" w:hAnsi="Times New Roman" w:eastAsia="Times New Roman" w:cs="Times New Roman"/>
-          <w:b w:val="0"/>
-          <w:sz w:val="24"/>
-        </w:rPr>
-        <w:t xml:space="preserve"> the estimate. The 39.3% headline is therefore conservative with respect to coding error, and the paper's central claim — that overlap is rarely disclosed — cannot be an artifact of the modest agreement observed on the non-load-bearing field.</w:t>
+        <w:t xml:space="preserve"> disclose something is an absence judgment, which is mechanically more reproducible than assigning a positive category, so the κ = 0.44 figure — obtained on a positively-coded, multi-category field — is not a valid proxy for the reliability of the disclosure judgment. Second, we make no conservatism claim for this figure. A disagreement in which the second coder locates a disclosure statement the first missed moves the study out of the numerator and would lower the count, whereas the reverse observation would raise it; we did not score agreement on this absence judgment separately, so the balance of any residual error is empirically undetermined and 39.3% is neither a floor nor a ceiling with respect to coding error. It should be read for what it directly measures — the proportion of overlap-capable studies in which no statement about overlap handling was identifiable — rather than as a confirmed count of deliberate non-disclosure.</w:t>
       </w:r>
     </w:p>
     <w:p>
@@ -3895,7 +3861,7 @@
           <w:b w:val="0"/>
           <w:sz w:val="24"/>
         </w:rPr>
-        <w:t>To test the correction on realised data at scale, we re-estimated every coded study whose exposure, mediator and outcome all resolved to public GWAS accessions (n = 113) directly from OpenGWAS summary statistics, using an all-Python pipeline (harmonized fixed-effects IVW plus the semi-analytic correction) that does not depend on the TwoSampleMR harmonisation which earlier failed on two FinnGen outcomes. Of 113, 108 re-estimations succeeded on the first full pass and 4 were skipped for accession-resolution or network errors (S210, S173, S291, S326); S255 was subsequently recovered by the targeted re-estimation of the overlapping trios but its overlap is sub-threshold (π_shared = 0.0044 &lt; 0.019), so it is reported as a recovered case and excluded from the genuine-overlap headline. Five (4.6% [95% CI 2.0–10.4%]) of the 108 re-estimated trios showed genuine, non-degenerate instrument overlap (n_s = 1–3); the correction narrowed every one of these confidence intervals by −0.2% to −16.0% with zero significance flips (0/5). Two further trios (S320, S293) are methodologically degenerate self-mediating designs — their exposure and mediator resolve to the same GWAS accession, giving α̂ = 1.0 exactly and π_shared = 1.0 — which are mapping artefacts rather than substantive pathways; counting them, seven (6.5% [95% CI 3.2–12.8%]) trios show any instrument overlap. Among the five non-degenerate overlapping trios, all corrections narrowed the CI and none altered significance. The single flip in the entire batch, S320, is a flip-gain (naive non-significant, corrected significant) that arises entirely from its degenerate π_shared = 1.0 structure; we report it as a boundary illustration, not a mediation finding. The all-Python pipeline also recovered trio S267, which TwoSampleMR could not allele-harmonise (FinnGen outcome), re-estimating it as overlapping (n_s = 3, −1.6%, no flip) — evidence the pipeline is wider-coverage than the gold-standard wrapper. A TwoSampleMR cross-check of four of these trios (Table S3.2) reproduces the negative direction of the correction in every case, but returns different point estimates and standard errors — and hence different significance calls — for S014 and S273; the two pipelines are reconciled in Supplementary S3, and the headline estimates reported here come from the all-Python pipeline throughout. Table 2 reports the per-trio re-estimation, and Supplementary Table S3 tabulates the complete batch. The all-Python batch correction ranges −0.2% to −16.0% (median −1.6%); a TwoSampleMR cross-check of the four adequately powered trios returns −0.1% to −9.0%, systematically smaller because the two wrappers re-harmonise the effects differently (e.g., S014 α̂ SE 0.00096 vs 0.00345, a 3.6-fold difference), yet both pipelines agree the correction narrows. Supplementary Fig. S4 shows the SE-change forest across the overlapping trios.</w:t>
+        <w:t>To test the correction on realised data at scale, we re-estimated every coded study whose exposure, mediator and outcome all resolved to public GWAS accessions (n = 113) directly from OpenGWAS summary statistics, using an all-Python pipeline (harmonized fixed-effects IVW plus the semi-analytic correction) that does not depend on the TwoSampleMR harmonisation which earlier failed on two FinnGen outcomes. Of 113 candidate trios, 108 succeeded on the first full pass; the remaining five initially failed, of which four were skipped permanently for accession-resolution or network errors (S210, S173, S291, S326) and S255 was subsequently recovered by targeted re-estimation (108 + 4 + 1 = 113). S255's overlap is sub-threshold (π_shared = 0.0044 &lt; 0.019), so it is reported as a recovered case but excluded, leaving a denominator of 108 for the genuine-overlap headline. Five (4.6% [95% CI 2.0–10.4%]) of the 108 re-estimated trios showed genuine, non-degenerate instrument overlap (n_s = 1–3); the correction narrowed every one of these confidence intervals by −0.2% to −16.0% with zero significance flips (0/5). Two further trios (S320, S293) are methodologically degenerate self-mediating designs — their exposure and mediator resolve to the same GWAS accession, giving α̂ = 1.0 exactly and π_shared = 1.0 — which are mapping artefacts rather than substantive pathways; counting them, seven (6.5% [95% CI 3.2–12.8%]) trios show any instrument overlap. Among the five non-degenerate overlapping trios, all corrections narrowed the CI and none altered significance. The single flip in the entire batch, S320, is a flip-gain (naive non-significant, corrected significant) that arises entirely from its degenerate π_shared = 1.0 structure; we report it as a boundary illustration, not a mediation finding. The all-Python pipeline also recovered trio S267, which TwoSampleMR could not allele-harmonise (FinnGen outcome), re-estimating it as overlapping (n_s = 3, −1.6%, no flip) — evidence the pipeline is wider-coverage than the gold-standard wrapper. A TwoSampleMR cross-check of four of these trios (Table S3.2) reproduces the negative direction of the correction in every case, but returns different point estimates and standard errors — and hence different significance calls — for S014 and S273; the two pipelines are reconciled in Supplementary S3, and the headline estimates reported here come from the all-Python pipeline throughout. Table 2 reports the per-trio re-estimation, and Supplementary Table S3 tabulates the complete batch. The all-Python batch correction ranges −0.2% to −16.0% (median −1.6%); a TwoSampleMR cross-check of the four adequately powered trios returns −0.1% to −9.0%, systematically smaller because the two wrappers re-harmonise the effects differently (e.g., S014 α̂ SE 0.00096 vs 0.00345, a 3.6-fold difference), yet both pipelines agree the correction narrows. Supplementary Fig. S4 shows the SE-change forest across the overlapping trios.</w:t>
       </w:r>
     </w:p>
     <w:tbl>
@@ -9319,7 +9285,63 @@
           <w:b w:val="0"/>
           <w:sz w:val="24"/>
         </w:rPr>
-        <w:t>In sum, the correction is negligible where the literature actually sits (n_s = 1–3) and material only in the merged-pool, high-overlap regime that §3.2 shows the field already runs without disclosure. This is the sense in which the missing n_s / π_shared reporting is consequential: it leaves a reader unable to tell whether a published interval is essentially exact or up to two-thirds too wide.</w:t>
+        <w:t>In sum, the correction is negligible where the literature actually sits (n_s = 1–3) and material only in the merged-pool, high-overlap regime that §3.2 shows the field already runs without disclosure. This is the sense in which the missing n_s / π_shared reporting is consequential: it leaves a reader unable to tell whether a published interval is essentially exact or up to two-thirds too wide — a power cost quantified in §3.9.</w:t>
+      </w:r>
+    </w:p>
+    <w:p>
+      <w:pPr>
+        <w:spacing w:before="200" w:after="80"/>
+        <w:jc w:val="left"/>
+      </w:pPr>
+      <w:r>
+        <w:rPr>
+          <w:rFonts w:ascii="Times New Roman" w:hAnsi="Times New Roman" w:eastAsia="Times New Roman" w:cs="Times New Roman"/>
+          <w:b/>
+          <w:sz w:val="24"/>
+        </w:rPr>
+        <w:t>3.9 Practical cost: power and sample-size equivalence</w:t>
+      </w:r>
+    </w:p>
+    <w:p>
+      <w:pPr>
+        <w:ind w:firstLine="480"/>
+        <w:jc w:val="both"/>
+      </w:pPr>
+      <w:r>
+        <w:rPr>
+          <w:rFonts w:ascii="Times New Roman" w:hAnsi="Times New Roman" w:eastAsia="Times New Roman" w:cs="Times New Roman"/>
+          <w:b w:val="0"/>
+          <w:sz w:val="24"/>
+        </w:rPr>
+        <w:t>The width inflation in §3.8 is an abstract quantity unless translated into what a study actually loses. Because the Wald test for the indirect effect divides the estimate by its reported standard error, an SE that is k times the true sampling SD deflates the non-centrality by the same factor k. Fixing the true effect so that the corrected test attains 80% power (non-centrality 2.80), the uncorrected test retains Φ(2.80/k − 1.96) power.</w:t>
+      </w:r>
+    </w:p>
+    <w:p>
+      <w:pPr>
+        <w:ind w:firstLine="480"/>
+        <w:jc w:val="both"/>
+      </w:pPr>
+      <w:r>
+        <w:rPr>
+          <w:rFonts w:ascii="Times New Roman" w:hAnsi="Times New Roman" w:eastAsia="Times New Roman" w:cs="Times New Roman"/>
+          <w:b w:val="0"/>
+          <w:sz w:val="24"/>
+        </w:rPr>
+        <w:t>At full overlap (n_s = 50 of p = 50) with strong or very strong instruments and |β| = 1, the inflation is k = 1.52–1.65 (equivalently 1.55–1.65 relative to the true sampling SD, §3.8), so power falls from 80% to 40–45% — a loss of 35–40 percentage points. Because the sampling SD of α̂β̂ scales approximately as 1/√N when the contributing GWAS sample sizes grow together, matching the corrected test's power with the uncorrected variance would require k² = 2.3–2.7 times as many participants. At the smaller effect size |β| = 0.5 the same configuration inflates the SE by only 1.19–1.23×, costing 14–18 power points (80% → 62–66%) and a 1.4–1.5-fold sample-size penalty.</w:t>
+      </w:r>
+    </w:p>
+    <w:p>
+      <w:pPr>
+        <w:ind w:firstLine="480"/>
+        <w:jc w:val="both"/>
+      </w:pPr>
+      <w:r>
+        <w:rPr>
+          <w:rFonts w:ascii="Times New Roman" w:hAnsi="Times New Roman" w:eastAsia="Times New Roman" w:cs="Times New Roman"/>
+          <w:b w:val="0"/>
+          <w:sz w:val="24"/>
+        </w:rPr>
+        <w:t>Two features of this penalty deserve emphasis. First, it is largest in the strong-instrument regime: with weak instruments (F ≈ 10) the uncorrected variance is already inflated by attenuation, so the increment attributable to overlap is smaller (80% → 70%, a 1.3-fold penalty). The designs that modern large consortia now run — precisely those with the strongest instruments — are therefore the ones that pay the most. Second, the penalty is invisible without n_s: a reader of a published two-step mediation cannot tell whether the reported interval is essentially exact or has silently cost the equivalent of a two- to three-fold increase in sample size. This is the concrete sense in which the missing disclosure documented in §3.2 is consequential, and it answers the natural objection that a conservative variance is harmless: it is harmless for false positives, but it is paid for in power.</w:t>
       </w:r>
     </w:p>
     <w:p>
@@ -9347,7 +9369,7 @@
           <w:b w:val="0"/>
           <w:sz w:val="24"/>
         </w:rPr>
-        <w:t>This work quantifies, rather than dramatizes, a methodological blind spot. We do not claim that any specific published two-step MR mediation conclusion is incorrect: in every real trio we could resolve, the omitted covariance was structurally negative, and the naive method was conservative rather than anti-conservative. What we establish is that this conservative direction holds across all configurations we examined — same-sign and opposite-sign mediation, with and without sample overlap — under standard IVW assumptions, so the naive first-order delta method overstates uncertainty; the field nonetheless has no reporting convention (n_s, π_shared, or ρ_MY) that would let a reader quantify how large the correction is for any given published result without rerunning the analysis, as we did. The value of this paper is therefore the semi-analytic tool and the documented boundary conditions under which the correction is largest, not a retrospective correction of the existing literature's conclusions. That the correction can be substantial is shown in §3.7: applying it counterfactually to real opposite-signed mediation estimates under the undisclosed merged-pool design narrows confidence intervals by up to 70.4%, and all 20 opposite-signed trios narrow with none widening, so the naive method needlessly sacrifices power in high-overlap designs; because the magnitude cannot be known without the reported n_s / π_shared, routine reporting — not retrospective correction — is what the field needs.</w:t>
+        <w:t>This work quantifies, rather than dramatizes, a methodological blind spot. We do not claim that any specific published two-step MR mediation conclusion is incorrect: in every real trio we could resolve, the omitted covariance was structurally negative, and the naive method was conservative rather than anti-conservative. What we establish is that this conservative direction holds across all configurations we examined — same-sign and opposite-sign mediation, with and without sample overlap — under standard IVW assumptions, so the naive first-order delta method overstates uncertainty; the field nonetheless has no reporting convention (n_s, π_shared, or ρ_MY) that would let a reader quantify how large the correction is for any given published result without rerunning the analysis, as we did. The value of this paper is therefore the semi-analytic tool and the documented boundary conditions under which the correction is largest, not a retrospective correction of the existing literature's conclusions. That the correction can be substantial is shown in §3.7: applying it counterfactually to real opposite-signed mediation estimates under the undisclosed merged-pool design narrows confidence intervals by up to 70.4%, and all 20 opposite-signed trios narrow with none widening, so the naive method needlessly sacrifices power in high-overlap designs — quantified in §3.9, at full overlap with strong instruments the uncorrected test retains only 40–45% power where the corrected test has 80%, equivalent to discarding about 60% of the effective sample size; because the magnitude cannot be known without the reported n_s / π_shared, routine reporting — not retrospective correction — is what the field needs.</w:t>
       </w:r>
     </w:p>
     <w:p>
@@ -9361,23 +9383,7 @@
           <w:b w:val="0"/>
           <w:sz w:val="24"/>
         </w:rPr>
-        <w:t xml:space="preserve">Our literature audit delivers an uncomfortable message. The design our correction matters most for — a deliberately merged or reused instrument pool — is </w:t>
-      </w:r>
-      <w:r>
-        <w:rPr>
-          <w:rFonts w:ascii="Times New Roman" w:hAnsi="Times New Roman" w:eastAsia="Times New Roman" w:cs="Times New Roman"/>
-          <w:b/>
-          <w:sz w:val="24"/>
-        </w:rPr>
-        <w:t>not represented by a single clean example in 695 coded studies</w:t>
-      </w:r>
-      <w:r>
-        <w:rPr>
-          <w:rFonts w:ascii="Times New Roman" w:hAnsi="Times New Roman" w:eastAsia="Times New Roman" w:cs="Times New Roman"/>
-          <w:b w:val="0"/>
-          <w:sz w:val="24"/>
-        </w:rPr>
-        <w:t>, and only ~35% of assessable studies disclose overlap handling. Yet the §3.4 batch re-estimation finds genuine instrument overlap in 4.6% (5/108) of re-estimated trios (7/108, 6.5%, counting two degenerate self-mediating designs that are mapping artefacts), and among the five non-degenerate overlapping trios the correction narrowed every CI (0.2–16.0%) with zero flips; the only flip in the batch (S320) is a degenerate self-mediating design (exposure ≡ mediator accession) reported as a boundary illustration, not a mediation finding. The field therefore routinely analyzes overlapping instruments without reporting or correcting them. Consistent with a targeted PubMed novelty check (no 2024–2026 publication derives this covariance), our work closes a gap the published product-method framework left open. To locate the contribution precisely: the derivation itself is a standard first-order delta argument applied to a product estimand, not a new statistical theory. What is new here is (i) the specialization of that argument to the two-step MR mediation design, with an explicit and computable reliability bound B that lets an analyst check whether the approximation suffices; (ii) the empirical quantification, across 333 studies, of how common overlap-capable but undisclosed designs are; and (iii) a tool that applies the correction from published summary statistics alone, so authors, reviewers and readers can close the gap without re-running the original analysis.</w:t>
+        <w:t>Our literature audit delivers an uncomfortable message. The design our correction matters most for — a deliberately merged or reused instrument pool — is rare as a clean univariable two-step design in our corpus — the one coded instance reaching maximal overlap, S110, is a merged-pool multivariable variant with π_shared ≈ 1.0 and n_s = 1,410 rather than a product-method analysis (Supplementary Methods S8) — and only ~35% of assessable studies disclose overlap handling. Because n_s is almost never disclosed, a study that merges or reuses instrument pools is indistinguishable in the published record from one that does not, so this scarcity is a property of the reporting rather than evidence that the practice is absent. Yet the §3.4 batch re-estimation finds genuine instrument overlap in 4.6% (5/108) of re-estimated trios (7/108, 6.5%, counting two degenerate self-mediating designs that are mapping artefacts), and among the five non-degenerate overlapping trios the correction narrowed every CI (0.2–16.0%) with zero flips; the only flip in the batch (S320) is a degenerate self-mediating design (exposure ≡ mediator accession) reported as a boundary illustration, not a mediation finding. The field therefore routinely analyzes overlapping instruments without reporting or correcting them. Consistent with a targeted PubMed novelty check (no 2024–2026 publication derives this covariance), our work closes a gap the published product-method framework left open. To locate the contribution precisely: the derivation itself is a standard first-order delta argument applied to a product estimand, not a new statistical theory. What is new here is (i) the specialization of that argument to the two-step MR mediation design, with an explicit and computable reliability bound B that lets an analyst check whether the approximation suffices; (ii) the empirical quantification, across 333 studies, of how common overlap-capable but undisclosed designs are; and (iii) a tool that applies the correction from published summary statistics alone, so authors, reviewers and readers can close the gap without re-running the original analysis.</w:t>
       </w:r>
     </w:p>
     <w:p>
@@ -9391,7 +9397,29 @@
           <w:b w:val="0"/>
           <w:sz w:val="24"/>
         </w:rPr>
-        <w:t>The central real-data finding is that the omitted covariance is structurally negative under standard IVW assumptions, so the naive method is conservative rather than anti-conservative. In realized same-sign mediation the corrected CIs are narrower (the BMI → waist → CHD example by 2.8%, shared-IV by 15.5%), and the opposite-signed counterfactual trios in §3.7 also all narrow — the literature narrative usually assumes the opposite. Our batch re-estimation confirms this is structural, not fortune: the dominant shared-instrument covariance is provably negative for either sign of α̂β̂ (Proposition S2.5), and the correction can only gain significance, never lose it (§3.1.1). Because the correction is conservative (it narrows) regardless of the sign of α̂β̂, analysts should correct as a matter of routine rather than conditioning on an expected direction.</w:t>
+        <w:t>The central real-data finding is that the omitted covariance is structurally negative under standard IVW assumptions, so the naive method is conservative rather than anti-conservative. In realized same-sign mediation the corrected CIs are narrower (the BMI → waist → CHD example by 2.8%, shared-IV by 15.5%), and the opposite-signed counterfactual trios in §3.7 also all narrow, contrary to the intuition that overlapping instruments inflate uncertainty. Our batch re-estimation confirms this is structural, not fortune: the dominant shared-instrument covariance is provably negative for either sign of α̂β̂ (Proposition S2.5), and the correction can only gain significance, never lose it (§3.1.1). Because the correction is conservative (it narrows) regardless of the sign of α̂β̂, analysts should correct as a matter of routine rather than conditioning on an expected direction.</w:t>
+      </w:r>
+    </w:p>
+    <w:p>
+      <w:pPr>
+        <w:ind w:firstLine="480"/>
+        <w:jc w:val="both"/>
+      </w:pPr>
+      <w:r>
+        <w:rPr>
+          <w:rFonts w:ascii="Times New Roman" w:hAnsi="Times New Roman" w:eastAsia="Times New Roman" w:cs="Times New Roman"/>
+          <w:b/>
+          <w:sz w:val="24"/>
+        </w:rPr>
+        <w:t>Why correct the variance when a shared instrument also threatens the point estimate?</w:t>
+      </w:r>
+      <w:r>
+        <w:rPr>
+          <w:rFonts w:ascii="Times New Roman" w:hAnsi="Times New Roman" w:eastAsia="Times New Roman" w:cs="Times New Roman"/>
+          <w:b w:val="0"/>
+          <w:sz w:val="24"/>
+        </w:rPr>
+        <w:t xml:space="preserve"> A shared single-nucleotide polymorphism used in step 2 violates the exclusion restriction through the exposure → outcome path, so the step-2 estimate can be biased even when its variance is right, and the standard remedies are multivariable MR (conditioning on the exposure) or dropping the shared variants. We address the variance rather than the point estimate because the two problems are separable and because our estimand is defined conditionally on whatever α̂ and β̂ are reported. For any given pair of published estimates — including estimates already produced by MVMR, or by an instrument set from which shared variants were removed — the product variance still omits 2α̂β̂·Cov(α̂, β̂), and that omission is exactly what the current summary-data framework leaves unquantified. The correction is therefore complementary to, not a substitute for, exclusion-restriction remedies, and it applies unchanged to an MVMR step-2 estimate (Supplementary Methods S8). Where shared instruments are suspected of biasing β̂, the right sequence is to address that bias first — by MVMR or by excluding the shared variants — and then apply the covariance correction to the estimates that are actually reported; because the shared-instrument covariance is negative for either sign of α̂β̂, correcting the variance can never mask a bias in the point estimate, and reporting both the corrected interval and the instrument sets lets a reader separate the two issues.</w:t>
       </w:r>
     </w:p>
     <w:p>
@@ -9677,7 +9705,7 @@
           <w:b w:val="0"/>
           <w:sz w:val="24"/>
         </w:rPr>
-        <w:t>The product-method variance in two-step MR mediation omits a covariance whenever the two steps share instruments or the mediator and outcome samples overlap. We derived that term in closed form and showed by simulation that it restores nominal coverage across the grid we examined. Published studies rarely say whether such overlap exists: 39.3% used a design capable of it without disclosure. In the few trios we could resolve, overlap involved one to three instruments and changed no conclusion, but this sample is small, European-ancestry, and not representative of the audited literature. Under standard IVW assumptions the shared-instrument covariance is negative for either sign of α̂β̂ (Proposition S2.5), so the correction is conservative (it narrows rather than widens intervals) and should be applied routinely; the residual ρ_MY channel is orders of magnitude smaller and did not reverse the direction in any examined configuration. Reporting the number of shared instruments (n_s, π_shared) would let readers place any published result in the right regime; whether the mediator–outcome sample-overlap channel matters as much in practice remains untested.</w:t>
+        <w:t>The product-method variance in two-step MR mediation omits a covariance whenever the two steps share instruments or the mediator and outcome samples overlap. We derived that term in closed form and showed by simulation that it restores nominal coverage across the grid we examined. Published studies rarely say whether such overlap exists: 39.3% used a design capable of it with no identifiable statement on overlap handling. In the few trios we could resolve, overlap involved one to three instruments and changed no conclusion, but this sample is small, European-ancestry, and not representative of the audited literature. Under standard IVW assumptions the shared-instrument covariance is negative for either sign of α̂β̂ (Proposition S2.5), so the correction is conservative (it narrows rather than widens intervals) and should be applied routinely — and that conservatism is not free in the high-overlap regime, where §3.9 shows it costs 35–40 percentage points of power, the equivalent of a 2.3–2.7-fold sample-size penalty. The residual ρ_MY channel is orders of magnitude smaller and did not reverse the direction in any examined configuration. Reporting the number of shared instruments (n_s, π_shared) would let readers place any published result in the right regime; whether the mediator–outcome sample-overlap channel matters as much in practice remains untested.</w:t>
       </w:r>
     </w:p>
     <w:p>
@@ -9691,7 +9719,7 @@
           <w:b w:val="0"/>
           <w:sz w:val="24"/>
         </w:rPr>
-        <w:t>The diagnostic tool estimate_cov_prod_mr() and all replication scripts are deposited in a public GitHub repository (https://github.com/javenzju/two-step-mr-cov; archived at Zenodo, DOI: 10.5281/zenodo.22725281) and are organised as follows. The core tool and its dependencies are in code/method_core/ (S10_prod_mr_cov_tool.R, weak_instrument_threshold_FIXED.R, S16_bootstrap_fallback_indirect_var.R); validation scripts are code/method_core/T2_validation.R and code/method_core/T5_bootstrap_coverage.R. The TwoSampleMR-compatible wrapper mr_cov_correct() is code/correct_cov_prod_mr.R (self-test code/test_correct_cov_prod_mr.R), the ieugwasr-compatible wrapper mr_mediation_correct_from_frames() is code/correct_from_ieugwasr.py, and the usage guide is code/TOOL_README.md; both wrappers were cross-checked against code/method_core/S10_prod_mr_cov_tool.R and the BMI → waist → CHD ground truth. The inter-coder reliability work package (blind re-coding sheet, second-coder template, sealed answer key, and compute_kappa_2nd.py calculator with Pe→1-artifact detection and bootstrap CI) is in code/ (kappa_second_coder_template.csv, code/kappa/kappa_answer_key_20260903.csv, compute_kappa_2nd.py, kappa_instructions.md) and is re-runnable via a second blinded coding pass; the reporting second-coder re-code by Yan Chen (C.Y.) and its κ report are in code/kappa_chenyan_task/ (kappa_second_coder_chenyan_FILLED.csv, kappa_2nd_report.csv, compute_kappa_2nd.py). Real GWAS summary statistics were obtained through IEU OpenGWAS and are subject to the OpenGWAS data-use policy; the BMI → waist → CHD illustration uses trait IDs ieu-a-2, ieu-a-61, ieu-a-7, and the S245 re-examination uses ieu-a-302, met-a-509, prot-a-2100, finn-b-CD2_MULTIPLE_MYELOMA_PLASMA_CELL. Instrument sets were extracted via the OpenGWAS REST /tophits endpoint; the accession-resolution and overlap scripts are code/replication/S245_resolve_mediators.py and code/replication/S245_pi_shared.py. The batch re-estimation pipeline (OpenGWAS REST /tophits + /associations, harmonized IVW, the semi-analytic correction) is code/replication/M4b_phaseB_pipeline.py, with the candidate screening, π_shared and re-estimation outputs in code/replication/. The horizontal-pleiotropy sensitivity analysis (MR-Egger intercept and weighted-median on both steps of the five non-degenerate trios) is code/replication/M4c_pleiotropy_sensitivity.py, with the per-step intercepts, p-values and weighted-median slopes in temp/M4c_pleiotropy.csv. The literature coding table underlying §3.3 is code/literature_coding_table_UPDATED.xlsx. The GitHub repository is public at submission and the archived release is citable via the Zenodo DOI above.</w:t>
+        <w:t>The diagnostic tool estimate_cov_prod_mr() and all replication scripts are deposited in a public GitHub repository (https://github.com/javenzju/two-step-mr-cov; archived at Zenodo, DOI: 10.5281/zenodo.22725281) and are organised as follows. The core tool and its dependencies are in code/method_core/ (S10_prod_mr_cov_tool.R, weak_instrument_threshold_FIXED.R, S16_bootstrap_fallback_indirect_var.R); validation scripts are code/method_core/T2_validation.R and code/method_core/T5_bootstrap_coverage.R. The TwoSampleMR-compatible wrapper mr_cov_correct() is code/correct_cov_prod_mr.R (self-test code/test_correct_cov_prod_mr.R), the ieugwasr-compatible wrapper mr_mediation_correct_from_frames() is code/correct_from_ieugwasr.py, and the usage guide is code/TOOL_README.md; both wrappers were cross-checked against code/method_core/S10_prod_mr_cov_tool.R and the BMI → waist → CHD ground truth. The inter-coder reliability work package (blind re-coding sheet, second-coder template, sealed answer key, and compute_kappa_2nd.py calculator with Pe→1-artifact detection and bootstrap CI) is in code/ (kappa_second_coder_template.csv, code/kappa/kappa_answer_key_20260903.csv, compute_kappa_2nd.py, kappa_instructions.md) and is re-runnable via a second blinded coding pass; the reporting second-coder re-code by Yan Chen (C.Y.) and its κ report are in code/kappa_chenyan_task/ (kappa_second_coder_chenyan_FILLED.csv, kappa_2nd_report.csv, compute_kappa_2nd.py). Real GWAS summary statistics were obtained through IEU OpenGWAS and are subject to the OpenGWAS data-use policy; the BMI → waist → CHD illustration uses trait IDs ieu-a-2, ieu-a-61, ieu-a-7, and the S245 re-examination uses ieu-a-302, met-a-509, prot-a-2100, finn-b-CD2_MULTIPLE_MYELOMA_PLASMA_CELL. Instrument sets were extracted via the OpenGWAS REST /tophits endpoint; the accession-resolution and overlap scripts are code/replication/S245_resolve_mediators.py and code/replication/S245_pi_shared.py. The batch re-estimation pipeline (OpenGWAS REST /tophits + /associations, harmonized IVW, the semi-analytic correction) is code/replication/M4b_phaseB_pipeline.py, with the candidate screening, π_shared and re-estimation outputs in code/replication/. The horizontal-pleiotropy sensitivity analysis (MR-Egger intercept and weighted-median on both steps of the five non-degenerate trios) is code/replication/M4c_pleiotropy_sensitivity.py, with the per-step intercepts, p-values and weighted-median slopes in temp/M4c_pleiotropy.csv. The simulation studies underlying §3.1 and §3.8–§3.9 are deposited with their result grids in code/replication/ (M4b_coverage_grid_20260930.py, M4b_regime_map_20260930.py, M4b_power_penalty_20261001.py), and the sign-corrected recomputation of the §3.7 magnitudes is M4b_recompute_signfix_20260930.py. The literature coding table underlying §3.3 is code/literature_coding_table_UPDATED.xlsx. The GitHub repository is public at submission and the archived release is citable via the Zenodo DOI above.</w:t>
       </w:r>
     </w:p>
     <w:p>

</xml_diff>